<commit_message>
Added further comments to VP Zhukov nodel.
</commit_message>
<xml_diff>
--- a/Keldysh/Zhukov/mart-2018-Translation for Thibault.docx
+++ b/Keldysh/Zhukov/mart-2018-Translation for Thibault.docx
@@ -446,7 +446,7 @@
           <v:shape id="_x0000_i1025" type="#_x0000_t75" style="width:31.5pt;height:19.5pt" o:ole="">
             <v:imagedata r:id="rId8" o:title=""/>
           </v:shape>
-          <o:OLEObject Type="Embed" ProgID="Equation.DSMT4" ShapeID="_x0000_i1025" DrawAspect="Content" ObjectID="_1611676559" r:id="rId9"/>
+          <o:OLEObject Type="Embed" ProgID="Equation.DSMT4" ShapeID="_x0000_i1025" DrawAspect="Content" ObjectID="_1611677450" r:id="rId9"/>
         </w:object>
       </w:r>
       <w:r>
@@ -511,7 +511,7 @@
           <v:shape id="_x0000_i1026" type="#_x0000_t75" style="width:88.5pt;height:19.5pt" o:ole="">
             <v:imagedata r:id="rId10" o:title=""/>
           </v:shape>
-          <o:OLEObject Type="Embed" ProgID="Equation.DSMT4" ShapeID="_x0000_i1026" DrawAspect="Content" ObjectID="_1611676560" r:id="rId11"/>
+          <o:OLEObject Type="Embed" ProgID="Equation.DSMT4" ShapeID="_x0000_i1026" DrawAspect="Content" ObjectID="_1611677451" r:id="rId11"/>
         </w:object>
       </w:r>
       <w:r>
@@ -534,7 +534,7 @@
           <v:shape id="_x0000_i1027" type="#_x0000_t75" style="width:40.5pt;height:16.5pt" o:ole="">
             <v:imagedata r:id="rId12" o:title=""/>
           </v:shape>
-          <o:OLEObject Type="Embed" ProgID="Equation.DSMT4" ShapeID="_x0000_i1027" DrawAspect="Content" ObjectID="_1611676561" r:id="rId13"/>
+          <o:OLEObject Type="Embed" ProgID="Equation.DSMT4" ShapeID="_x0000_i1027" DrawAspect="Content" ObjectID="_1611677452" r:id="rId13"/>
         </w:object>
       </w:r>
       <w:r>
@@ -646,7 +646,7 @@
           <v:shape id="_x0000_i1028" type="#_x0000_t75" style="width:109.5pt;height:19.5pt" o:ole="">
             <v:imagedata r:id="rId14" o:title=""/>
           </v:shape>
-          <o:OLEObject Type="Embed" ProgID="Equation.DSMT4" ShapeID="_x0000_i1028" DrawAspect="Content" ObjectID="_1611676562" r:id="rId15"/>
+          <o:OLEObject Type="Embed" ProgID="Equation.DSMT4" ShapeID="_x0000_i1028" DrawAspect="Content" ObjectID="_1611677453" r:id="rId15"/>
         </w:object>
       </w:r>
       <w:r>
@@ -669,7 +669,7 @@
           <v:shape id="_x0000_i1029" type="#_x0000_t75" style="width:1in;height:19.5pt" o:ole="">
             <v:imagedata r:id="rId16" o:title=""/>
           </v:shape>
-          <o:OLEObject Type="Embed" ProgID="Equation.DSMT4" ShapeID="_x0000_i1029" DrawAspect="Content" ObjectID="_1611676563" r:id="rId17"/>
+          <o:OLEObject Type="Embed" ProgID="Equation.DSMT4" ShapeID="_x0000_i1029" DrawAspect="Content" ObjectID="_1611677454" r:id="rId17"/>
         </w:object>
       </w:r>
       <w:r>
@@ -692,7 +692,7 @@
           <v:shape id="_x0000_i1030" type="#_x0000_t75" style="width:87pt;height:19.5pt" o:ole="">
             <v:imagedata r:id="rId18" o:title=""/>
           </v:shape>
-          <o:OLEObject Type="Embed" ProgID="Equation.DSMT4" ShapeID="_x0000_i1030" DrawAspect="Content" ObjectID="_1611676564" r:id="rId19"/>
+          <o:OLEObject Type="Embed" ProgID="Equation.DSMT4" ShapeID="_x0000_i1030" DrawAspect="Content" ObjectID="_1611677455" r:id="rId19"/>
         </w:object>
       </w:r>
       <w:r>
@@ -876,7 +876,7 @@
           <v:shape id="_x0000_i1031" type="#_x0000_t75" style="width:39pt;height:16.5pt" o:ole="">
             <v:imagedata r:id="rId20" o:title=""/>
           </v:shape>
-          <o:OLEObject Type="Embed" ProgID="Equation.DSMT4" ShapeID="_x0000_i1031" DrawAspect="Content" ObjectID="_1611676565" r:id="rId21"/>
+          <o:OLEObject Type="Embed" ProgID="Equation.DSMT4" ShapeID="_x0000_i1031" DrawAspect="Content" ObjectID="_1611677456" r:id="rId21"/>
         </w:object>
       </w:r>
       <w:r>
@@ -1112,7 +1112,7 @@
           <v:shape id="_x0000_i1032" type="#_x0000_t75" style="width:15pt;height:18pt" o:ole="">
             <v:imagedata r:id="rId22" o:title=""/>
           </v:shape>
-          <o:OLEObject Type="Embed" ProgID="Equation.DSMT4" ShapeID="_x0000_i1032" DrawAspect="Content" ObjectID="_1611676566" r:id="rId23"/>
+          <o:OLEObject Type="Embed" ProgID="Equation.DSMT4" ShapeID="_x0000_i1032" DrawAspect="Content" ObjectID="_1611677457" r:id="rId23"/>
         </w:object>
       </w:r>
       <w:r>
@@ -1192,7 +1192,7 @@
           <v:shape id="_x0000_i1033" type="#_x0000_t75" style="width:32.25pt;height:19.5pt" o:ole="">
             <v:imagedata r:id="rId24" o:title=""/>
           </v:shape>
-          <o:OLEObject Type="Embed" ProgID="Equation.DSMT4" ShapeID="_x0000_i1033" DrawAspect="Content" ObjectID="_1611676567" r:id="rId25"/>
+          <o:OLEObject Type="Embed" ProgID="Equation.DSMT4" ShapeID="_x0000_i1033" DrawAspect="Content" ObjectID="_1611677458" r:id="rId25"/>
         </w:object>
       </w:r>
       <w:r>
@@ -1242,7 +1242,7 @@
           <v:shape id="_x0000_i1034" type="#_x0000_t75" style="width:15pt;height:18pt" o:ole="">
             <v:imagedata r:id="rId26" o:title=""/>
           </v:shape>
-          <o:OLEObject Type="Embed" ProgID="Equation.DSMT4" ShapeID="_x0000_i1034" DrawAspect="Content" ObjectID="_1611676568" r:id="rId27"/>
+          <o:OLEObject Type="Embed" ProgID="Equation.DSMT4" ShapeID="_x0000_i1034" DrawAspect="Content" ObjectID="_1611677459" r:id="rId27"/>
         </w:object>
       </w:r>
       <w:r>
@@ -1372,7 +1372,7 @@
           <v:shape id="_x0000_i1035" type="#_x0000_t75" style="width:33.75pt;height:20.25pt" o:ole="">
             <v:imagedata r:id="rId28" o:title=""/>
           </v:shape>
-          <o:OLEObject Type="Embed" ProgID="Equation.DSMT4" ShapeID="_x0000_i1035" DrawAspect="Content" ObjectID="_1611676569" r:id="rId29"/>
+          <o:OLEObject Type="Embed" ProgID="Equation.DSMT4" ShapeID="_x0000_i1035" DrawAspect="Content" ObjectID="_1611677460" r:id="rId29"/>
         </w:object>
       </w:r>
       <w:r>
@@ -1404,7 +1404,7 @@
           <v:shape id="_x0000_i1036" type="#_x0000_t75" style="width:16.5pt;height:18pt" o:ole="">
             <v:imagedata r:id="rId30" o:title=""/>
           </v:shape>
-          <o:OLEObject Type="Embed" ProgID="Equation.DSMT4" ShapeID="_x0000_i1036" DrawAspect="Content" ObjectID="_1611676570" r:id="rId31"/>
+          <o:OLEObject Type="Embed" ProgID="Equation.DSMT4" ShapeID="_x0000_i1036" DrawAspect="Content" ObjectID="_1611677461" r:id="rId31"/>
         </w:object>
       </w:r>
       <w:r>
@@ -1560,7 +1560,7 @@
           <v:shape id="_x0000_i1037" type="#_x0000_t75" style="width:55.5pt;height:19.5pt" o:ole="">
             <v:imagedata r:id="rId32" o:title=""/>
           </v:shape>
-          <o:OLEObject Type="Embed" ProgID="Equation.DSMT4" ShapeID="_x0000_i1037" DrawAspect="Content" ObjectID="_1611676571" r:id="rId33"/>
+          <o:OLEObject Type="Embed" ProgID="Equation.DSMT4" ShapeID="_x0000_i1037" DrawAspect="Content" ObjectID="_1611677462" r:id="rId33"/>
         </w:object>
       </w:r>
       <w:r>
@@ -1709,7 +1709,7 @@
           <v:shape id="_x0000_i1038" type="#_x0000_t75" style="width:17.25pt;height:18pt" o:ole="">
             <v:imagedata r:id="rId34" o:title=""/>
           </v:shape>
-          <o:OLEObject Type="Embed" ProgID="Equation.DSMT4" ShapeID="_x0000_i1038" DrawAspect="Content" ObjectID="_1611676572" r:id="rId35"/>
+          <o:OLEObject Type="Embed" ProgID="Equation.DSMT4" ShapeID="_x0000_i1038" DrawAspect="Content" ObjectID="_1611677463" r:id="rId35"/>
         </w:object>
       </w:r>
       <w:r>
@@ -1867,7 +1867,7 @@
           <v:shape id="_x0000_i1039" type="#_x0000_t75" style="width:15pt;height:16.5pt" o:ole="">
             <v:imagedata r:id="rId36" o:title=""/>
           </v:shape>
-          <o:OLEObject Type="Embed" ProgID="Equation.DSMT4" ShapeID="_x0000_i1039" DrawAspect="Content" ObjectID="_1611676573" r:id="rId37"/>
+          <o:OLEObject Type="Embed" ProgID="Equation.DSMT4" ShapeID="_x0000_i1039" DrawAspect="Content" ObjectID="_1611677464" r:id="rId37"/>
         </w:object>
       </w:r>
       <w:r>
@@ -1940,7 +1940,7 @@
           <v:shape id="_x0000_i1040" type="#_x0000_t75" style="width:15pt;height:18pt" o:ole="">
             <v:imagedata r:id="rId38" o:title=""/>
           </v:shape>
-          <o:OLEObject Type="Embed" ProgID="Equation.DSMT4" ShapeID="_x0000_i1040" DrawAspect="Content" ObjectID="_1611676574" r:id="rId39"/>
+          <o:OLEObject Type="Embed" ProgID="Equation.DSMT4" ShapeID="_x0000_i1040" DrawAspect="Content" ObjectID="_1611677465" r:id="rId39"/>
         </w:object>
       </w:r>
       <w:r>
@@ -1966,7 +1966,7 @@
           <v:shape id="_x0000_i1041" type="#_x0000_t75" style="width:16.5pt;height:18pt" o:ole="">
             <v:imagedata r:id="rId40" o:title=""/>
           </v:shape>
-          <o:OLEObject Type="Embed" ProgID="Equation.DSMT4" ShapeID="_x0000_i1041" DrawAspect="Content" ObjectID="_1611676575" r:id="rId41"/>
+          <o:OLEObject Type="Embed" ProgID="Equation.DSMT4" ShapeID="_x0000_i1041" DrawAspect="Content" ObjectID="_1611677466" r:id="rId41"/>
         </w:object>
       </w:r>
       <w:r>
@@ -2188,7 +2188,7 @@
           <v:shape id="_x0000_i1042" type="#_x0000_t75" style="width:57pt;height:21pt" o:ole="">
             <v:imagedata r:id="rId42" o:title=""/>
           </v:shape>
-          <o:OLEObject Type="Embed" ProgID="Equation.DSMT4" ShapeID="_x0000_i1042" DrawAspect="Content" ObjectID="_1611676576" r:id="rId43"/>
+          <o:OLEObject Type="Embed" ProgID="Equation.DSMT4" ShapeID="_x0000_i1042" DrawAspect="Content" ObjectID="_1611677467" r:id="rId43"/>
         </w:object>
       </w:r>
       <w:r>
@@ -2231,7 +2231,7 @@
           <v:shape id="_x0000_i1043" type="#_x0000_t75" style="width:42pt;height:21pt" o:ole="">
             <v:imagedata r:id="rId44" o:title=""/>
           </v:shape>
-          <o:OLEObject Type="Embed" ProgID="Equation.DSMT4" ShapeID="_x0000_i1043" DrawAspect="Content" ObjectID="_1611676577" r:id="rId45"/>
+          <o:OLEObject Type="Embed" ProgID="Equation.DSMT4" ShapeID="_x0000_i1043" DrawAspect="Content" ObjectID="_1611677468" r:id="rId45"/>
         </w:object>
       </w:r>
       <w:r>
@@ -2292,7 +2292,7 @@
           <v:shape id="_x0000_i1044" type="#_x0000_t75" style="width:16.5pt;height:18pt" o:ole="">
             <v:imagedata r:id="rId46" o:title=""/>
           </v:shape>
-          <o:OLEObject Type="Embed" ProgID="Equation.DSMT4" ShapeID="_x0000_i1044" DrawAspect="Content" ObjectID="_1611676578" r:id="rId47"/>
+          <o:OLEObject Type="Embed" ProgID="Equation.DSMT4" ShapeID="_x0000_i1044" DrawAspect="Content" ObjectID="_1611677469" r:id="rId47"/>
         </w:object>
       </w:r>
       <w:r>
@@ -2339,7 +2339,7 @@
           <v:shape id="_x0000_i1045" type="#_x0000_t75" style="width:327pt;height:46.5pt" o:ole="">
             <v:imagedata r:id="rId48" o:title=""/>
           </v:shape>
-          <o:OLEObject Type="Embed" ProgID="Equation.DSMT4" ShapeID="_x0000_i1045" DrawAspect="Content" ObjectID="_1611676579" r:id="rId49"/>
+          <o:OLEObject Type="Embed" ProgID="Equation.DSMT4" ShapeID="_x0000_i1045" DrawAspect="Content" ObjectID="_1611677470" r:id="rId49"/>
         </w:object>
       </w:r>
     </w:p>
@@ -2368,7 +2368,7 @@
           <v:shape id="_x0000_i1046" type="#_x0000_t75" style="width:244.5pt;height:46.5pt" o:ole="">
             <v:imagedata r:id="rId50" o:title=""/>
           </v:shape>
-          <o:OLEObject Type="Embed" ProgID="Equation.DSMT4" ShapeID="_x0000_i1046" DrawAspect="Content" ObjectID="_1611676580" r:id="rId51"/>
+          <o:OLEObject Type="Embed" ProgID="Equation.DSMT4" ShapeID="_x0000_i1046" DrawAspect="Content" ObjectID="_1611677471" r:id="rId51"/>
         </w:object>
       </w:r>
     </w:p>
@@ -2397,7 +2397,7 @@
           <v:shape id="_x0000_i1047" type="#_x0000_t75" style="width:232.5pt;height:46.5pt" o:ole="">
             <v:imagedata r:id="rId52" o:title=""/>
           </v:shape>
-          <o:OLEObject Type="Embed" ProgID="Equation.DSMT4" ShapeID="_x0000_i1047" DrawAspect="Content" ObjectID="_1611676581" r:id="rId53"/>
+          <o:OLEObject Type="Embed" ProgID="Equation.DSMT4" ShapeID="_x0000_i1047" DrawAspect="Content" ObjectID="_1611677472" r:id="rId53"/>
         </w:object>
       </w:r>
       <w:r>
@@ -2435,7 +2435,7 @@
           <v:shape id="_x0000_i1048" type="#_x0000_t75" style="width:43.5pt;height:31.5pt" o:ole="">
             <v:imagedata r:id="rId54" o:title=""/>
           </v:shape>
-          <o:OLEObject Type="Embed" ProgID="Equation.DSMT4" ShapeID="_x0000_i1048" DrawAspect="Content" ObjectID="_1611676582" r:id="rId55"/>
+          <o:OLEObject Type="Embed" ProgID="Equation.DSMT4" ShapeID="_x0000_i1048" DrawAspect="Content" ObjectID="_1611677473" r:id="rId55"/>
         </w:object>
       </w:r>
     </w:p>
@@ -2464,7 +2464,7 @@
           <v:shape id="_x0000_i1049" type="#_x0000_t75" style="width:48pt;height:18pt" o:ole="">
             <v:imagedata r:id="rId56" o:title=""/>
           </v:shape>
-          <o:OLEObject Type="Embed" ProgID="Equation.DSMT4" ShapeID="_x0000_i1049" DrawAspect="Content" ObjectID="_1611676583" r:id="rId57"/>
+          <o:OLEObject Type="Embed" ProgID="Equation.DSMT4" ShapeID="_x0000_i1049" DrawAspect="Content" ObjectID="_1611677474" r:id="rId57"/>
         </w:object>
       </w:r>
       <w:r>
@@ -2489,7 +2489,7 @@
           <v:shape id="_x0000_i1050" type="#_x0000_t75" style="width:97.5pt;height:19.5pt" o:ole="">
             <v:imagedata r:id="rId58" o:title=""/>
           </v:shape>
-          <o:OLEObject Type="Embed" ProgID="Equation.DSMT4" ShapeID="_x0000_i1050" DrawAspect="Content" ObjectID="_1611676584" r:id="rId59"/>
+          <o:OLEObject Type="Embed" ProgID="Equation.DSMT4" ShapeID="_x0000_i1050" DrawAspect="Content" ObjectID="_1611677475" r:id="rId59"/>
         </w:object>
       </w:r>
       <w:r>
@@ -2528,7 +2528,7 @@
           <v:shape id="_x0000_i1051" type="#_x0000_t75" style="width:79.5pt;height:19.5pt" o:ole="">
             <v:imagedata r:id="rId60" o:title=""/>
           </v:shape>
-          <o:OLEObject Type="Embed" ProgID="Equation.DSMT4" ShapeID="_x0000_i1051" DrawAspect="Content" ObjectID="_1611676585" r:id="rId61"/>
+          <o:OLEObject Type="Embed" ProgID="Equation.DSMT4" ShapeID="_x0000_i1051" DrawAspect="Content" ObjectID="_1611677476" r:id="rId61"/>
         </w:object>
       </w:r>
     </w:p>
@@ -2557,7 +2557,7 @@
           <v:shape id="_x0000_i1052" type="#_x0000_t75" style="width:157.5pt;height:46.5pt" o:ole="">
             <v:imagedata r:id="rId62" o:title=""/>
           </v:shape>
-          <o:OLEObject Type="Embed" ProgID="Equation.DSMT4" ShapeID="_x0000_i1052" DrawAspect="Content" ObjectID="_1611676586" r:id="rId63"/>
+          <o:OLEObject Type="Embed" ProgID="Equation.DSMT4" ShapeID="_x0000_i1052" DrawAspect="Content" ObjectID="_1611677477" r:id="rId63"/>
         </w:object>
       </w:r>
     </w:p>
@@ -2586,7 +2586,7 @@
           <v:shape id="_x0000_i1053" type="#_x0000_t75" style="width:36pt;height:18pt" o:ole="">
             <v:imagedata r:id="rId64" o:title=""/>
           </v:shape>
-          <o:OLEObject Type="Embed" ProgID="Equation.DSMT4" ShapeID="_x0000_i1053" DrawAspect="Content" ObjectID="_1611676587" r:id="rId65"/>
+          <o:OLEObject Type="Embed" ProgID="Equation.DSMT4" ShapeID="_x0000_i1053" DrawAspect="Content" ObjectID="_1611677478" r:id="rId65"/>
         </w:object>
       </w:r>
     </w:p>
@@ -2615,7 +2615,7 @@
           <v:shape id="_x0000_i1054" type="#_x0000_t75" style="width:82.5pt;height:37.5pt" o:ole="">
             <v:imagedata r:id="rId66" o:title=""/>
           </v:shape>
-          <o:OLEObject Type="Embed" ProgID="Equation.DSMT4" ShapeID="_x0000_i1054" DrawAspect="Content" ObjectID="_1611676588" r:id="rId67"/>
+          <o:OLEObject Type="Embed" ProgID="Equation.DSMT4" ShapeID="_x0000_i1054" DrawAspect="Content" ObjectID="_1611677479" r:id="rId67"/>
         </w:object>
       </w:r>
       <w:r>
@@ -2648,7 +2648,7 @@
           <v:shape id="_x0000_i1055" type="#_x0000_t75" style="width:34.5pt;height:10.5pt" o:ole="">
             <v:imagedata r:id="rId68" o:title=""/>
           </v:shape>
-          <o:OLEObject Type="Embed" ProgID="Equation.DSMT4" ShapeID="_x0000_i1055" DrawAspect="Content" ObjectID="_1611676589" r:id="rId69"/>
+          <o:OLEObject Type="Embed" ProgID="Equation.DSMT4" ShapeID="_x0000_i1055" DrawAspect="Content" ObjectID="_1611677480" r:id="rId69"/>
         </w:object>
       </w:r>
       <w:r>
@@ -2672,7 +2672,7 @@
           <v:shape id="_x0000_i1056" type="#_x0000_t75" style="width:52.5pt;height:18pt" o:ole="">
             <v:imagedata r:id="rId70" o:title=""/>
           </v:shape>
-          <o:OLEObject Type="Embed" ProgID="Equation.DSMT4" ShapeID="_x0000_i1056" DrawAspect="Content" ObjectID="_1611676590" r:id="rId71"/>
+          <o:OLEObject Type="Embed" ProgID="Equation.DSMT4" ShapeID="_x0000_i1056" DrawAspect="Content" ObjectID="_1611677481" r:id="rId71"/>
         </w:object>
       </w:r>
       <w:r>
@@ -2733,7 +2733,7 @@
           <v:shape id="_x0000_i1057" type="#_x0000_t75" style="width:472.5pt;height:46.5pt" o:ole="">
             <v:imagedata r:id="rId72" o:title=""/>
           </v:shape>
-          <o:OLEObject Type="Embed" ProgID="Equation.DSMT4" ShapeID="_x0000_i1057" DrawAspect="Content" ObjectID="_1611676591" r:id="rId73"/>
+          <o:OLEObject Type="Embed" ProgID="Equation.DSMT4" ShapeID="_x0000_i1057" DrawAspect="Content" ObjectID="_1611677482" r:id="rId73"/>
         </w:object>
       </w:r>
     </w:p>
@@ -2762,7 +2762,7 @@
           <v:shape id="_x0000_i1058" type="#_x0000_t75" style="width:267pt;height:46.5pt" o:ole="">
             <v:imagedata r:id="rId74" o:title=""/>
           </v:shape>
-          <o:OLEObject Type="Embed" ProgID="Equation.DSMT4" ShapeID="_x0000_i1058" DrawAspect="Content" ObjectID="_1611676592" r:id="rId75"/>
+          <o:OLEObject Type="Embed" ProgID="Equation.DSMT4" ShapeID="_x0000_i1058" DrawAspect="Content" ObjectID="_1611677483" r:id="rId75"/>
         </w:object>
       </w:r>
       <w:r>
@@ -2964,7 +2964,7 @@
           <v:shape id="_x0000_i1059" type="#_x0000_t75" style="width:15pt;height:18pt" o:ole="">
             <v:imagedata r:id="rId76" o:title=""/>
           </v:shape>
-          <o:OLEObject Type="Embed" ProgID="Equation.DSMT4" ShapeID="_x0000_i1059" DrawAspect="Content" ObjectID="_1611676593" r:id="rId77"/>
+          <o:OLEObject Type="Embed" ProgID="Equation.DSMT4" ShapeID="_x0000_i1059" DrawAspect="Content" ObjectID="_1611677484" r:id="rId77"/>
         </w:object>
       </w:r>
       <w:r>
@@ -3079,7 +3079,7 @@
           <v:shape id="_x0000_i1060" type="#_x0000_t75" style="width:15pt;height:18pt" o:ole="">
             <v:imagedata r:id="rId78" o:title=""/>
           </v:shape>
-          <o:OLEObject Type="Embed" ProgID="Equation.DSMT4" ShapeID="_x0000_i1060" DrawAspect="Content" ObjectID="_1611676594" r:id="rId79"/>
+          <o:OLEObject Type="Embed" ProgID="Equation.DSMT4" ShapeID="_x0000_i1060" DrawAspect="Content" ObjectID="_1611677485" r:id="rId79"/>
         </w:object>
       </w:r>
       <w:r>
@@ -3123,7 +3123,7 @@
           <v:shape id="_x0000_i1061" type="#_x0000_t75" style="width:169.5pt;height:31.5pt" o:ole="">
             <v:imagedata r:id="rId80" o:title=""/>
           </v:shape>
-          <o:OLEObject Type="Embed" ProgID="Equation.DSMT4" ShapeID="_x0000_i1061" DrawAspect="Content" ObjectID="_1611676595" r:id="rId81"/>
+          <o:OLEObject Type="Embed" ProgID="Equation.DSMT4" ShapeID="_x0000_i1061" DrawAspect="Content" ObjectID="_1611677486" r:id="rId81"/>
         </w:object>
       </w:r>
       <w:r>
@@ -3163,7 +3163,7 @@
           <v:shape id="_x0000_i1062" type="#_x0000_t75" style="width:15pt;height:18pt" o:ole="">
             <v:imagedata r:id="rId78" o:title=""/>
           </v:shape>
-          <o:OLEObject Type="Embed" ProgID="Equation.DSMT4" ShapeID="_x0000_i1062" DrawAspect="Content" ObjectID="_1611676596" r:id="rId84"/>
+          <o:OLEObject Type="Embed" ProgID="Equation.DSMT4" ShapeID="_x0000_i1062" DrawAspect="Content" ObjectID="_1611677487" r:id="rId84"/>
         </w:object>
       </w:r>
       <w:r>
@@ -3197,7 +3197,7 @@
           <v:shape id="_x0000_i1063" type="#_x0000_t75" style="width:16.5pt;height:18pt" o:ole="">
             <v:imagedata r:id="rId85" o:title=""/>
           </v:shape>
-          <o:OLEObject Type="Embed" ProgID="Equation.DSMT4" ShapeID="_x0000_i1063" DrawAspect="Content" ObjectID="_1611676597" r:id="rId86"/>
+          <o:OLEObject Type="Embed" ProgID="Equation.DSMT4" ShapeID="_x0000_i1063" DrawAspect="Content" ObjectID="_1611677488" r:id="rId86"/>
         </w:object>
       </w:r>
       <w:r>
@@ -3381,7 +3381,7 @@
           <v:shape id="_x0000_i1064" type="#_x0000_t75" style="width:123pt;height:19.5pt" o:ole="">
             <v:imagedata r:id="rId87" o:title=""/>
           </v:shape>
-          <o:OLEObject Type="Embed" ProgID="Equation.DSMT4" ShapeID="_x0000_i1064" DrawAspect="Content" ObjectID="_1611676598" r:id="rId88"/>
+          <o:OLEObject Type="Embed" ProgID="Equation.DSMT4" ShapeID="_x0000_i1064" DrawAspect="Content" ObjectID="_1611677489" r:id="rId88"/>
         </w:object>
       </w:r>
       <w:r>
@@ -3450,7 +3450,7 @@
           <v:shape id="_x0000_i1065" type="#_x0000_t75" style="width:265.5pt;height:33pt" o:ole="">
             <v:imagedata r:id="rId89" o:title=""/>
           </v:shape>
-          <o:OLEObject Type="Embed" ProgID="Equation.DSMT4" ShapeID="_x0000_i1065" DrawAspect="Content" ObjectID="_1611676599" r:id="rId90"/>
+          <o:OLEObject Type="Embed" ProgID="Equation.DSMT4" ShapeID="_x0000_i1065" DrawAspect="Content" ObjectID="_1611677490" r:id="rId90"/>
         </w:object>
       </w:r>
       <w:r>
@@ -3611,7 +3611,7 @@
           <v:shape id="_x0000_i1066" type="#_x0000_t75" style="width:97.5pt;height:19.5pt" o:ole="">
             <v:imagedata r:id="rId58" o:title=""/>
           </v:shape>
-          <o:OLEObject Type="Embed" ProgID="Equation.DSMT4" ShapeID="_x0000_i1066" DrawAspect="Content" ObjectID="_1611676600" r:id="rId91"/>
+          <o:OLEObject Type="Embed" ProgID="Equation.DSMT4" ShapeID="_x0000_i1066" DrawAspect="Content" ObjectID="_1611677491" r:id="rId91"/>
         </w:object>
       </w:r>
       <w:r>
@@ -3756,7 +3756,7 @@
           <v:shape id="_x0000_i1067" type="#_x0000_t75" style="width:67.5pt;height:19.5pt" o:ole="">
             <v:imagedata r:id="rId93" o:title=""/>
           </v:shape>
-          <o:OLEObject Type="Embed" ProgID="Equation.DSMT4" ShapeID="_x0000_i1067" DrawAspect="Content" ObjectID="_1611676601" r:id="rId94"/>
+          <o:OLEObject Type="Embed" ProgID="Equation.DSMT4" ShapeID="_x0000_i1067" DrawAspect="Content" ObjectID="_1611677492" r:id="rId94"/>
         </w:object>
       </w:r>
       <w:r>
@@ -3780,7 +3780,7 @@
           <v:shape id="_x0000_i1068" type="#_x0000_t75" style="width:69pt;height:19.5pt" o:ole="">
             <v:imagedata r:id="rId95" o:title=""/>
           </v:shape>
-          <o:OLEObject Type="Embed" ProgID="Equation.DSMT4" ShapeID="_x0000_i1068" DrawAspect="Content" ObjectID="_1611676602" r:id="rId96"/>
+          <o:OLEObject Type="Embed" ProgID="Equation.DSMT4" ShapeID="_x0000_i1068" DrawAspect="Content" ObjectID="_1611677493" r:id="rId96"/>
         </w:object>
       </w:r>
       <w:r>
@@ -3822,7 +3822,7 @@
           <v:shape id="_x0000_i1069" type="#_x0000_t75" style="width:75pt;height:18pt" o:ole="">
             <v:imagedata r:id="rId97" o:title=""/>
           </v:shape>
-          <o:OLEObject Type="Embed" ProgID="Equation.DSMT4" ShapeID="_x0000_i1069" DrawAspect="Content" ObjectID="_1611676603" r:id="rId98"/>
+          <o:OLEObject Type="Embed" ProgID="Equation.DSMT4" ShapeID="_x0000_i1069" DrawAspect="Content" ObjectID="_1611677494" r:id="rId98"/>
         </w:object>
       </w:r>
     </w:p>
@@ -3964,7 +3964,7 @@
           <v:shape id="_x0000_i1070" type="#_x0000_t75" style="width:10.5pt;height:10.5pt" o:ole="">
             <v:imagedata r:id="rId99" o:title=""/>
           </v:shape>
-          <o:OLEObject Type="Embed" ProgID="Equation.DSMT4" ShapeID="_x0000_i1070" DrawAspect="Content" ObjectID="_1611676604" r:id="rId100"/>
+          <o:OLEObject Type="Embed" ProgID="Equation.DSMT4" ShapeID="_x0000_i1070" DrawAspect="Content" ObjectID="_1611677495" r:id="rId100"/>
         </w:object>
       </w:r>
       <w:r>
@@ -4035,7 +4035,7 @@
           <v:shape id="_x0000_i1071" type="#_x0000_t75" style="width:63pt;height:19.5pt" o:ole="">
             <v:imagedata r:id="rId101" o:title=""/>
           </v:shape>
-          <o:OLEObject Type="Embed" ProgID="Equation.DSMT4" ShapeID="_x0000_i1071" DrawAspect="Content" ObjectID="_1611676605" r:id="rId102"/>
+          <o:OLEObject Type="Embed" ProgID="Equation.DSMT4" ShapeID="_x0000_i1071" DrawAspect="Content" ObjectID="_1611677496" r:id="rId102"/>
         </w:object>
       </w:r>
       <w:r>
@@ -4060,7 +4060,7 @@
           <v:shape id="_x0000_i1072" type="#_x0000_t75" style="width:63pt;height:19.5pt" o:ole="">
             <v:imagedata r:id="rId103" o:title=""/>
           </v:shape>
-          <o:OLEObject Type="Embed" ProgID="Equation.DSMT4" ShapeID="_x0000_i1072" DrawAspect="Content" ObjectID="_1611676606" r:id="rId104"/>
+          <o:OLEObject Type="Embed" ProgID="Equation.DSMT4" ShapeID="_x0000_i1072" DrawAspect="Content" ObjectID="_1611677497" r:id="rId104"/>
         </w:object>
       </w:r>
       <w:commentRangeEnd w:id="3"/>
@@ -4293,7 +4293,7 @@
           <v:shape id="_x0000_i1073" type="#_x0000_t75" style="width:126pt;height:18pt" o:ole="">
             <v:imagedata r:id="rId105" o:title=""/>
           </v:shape>
-          <o:OLEObject Type="Embed" ProgID="Equation.DSMT4" ShapeID="_x0000_i1073" DrawAspect="Content" ObjectID="_1611676607" r:id="rId106"/>
+          <o:OLEObject Type="Embed" ProgID="Equation.DSMT4" ShapeID="_x0000_i1073" DrawAspect="Content" ObjectID="_1611677498" r:id="rId106"/>
         </w:object>
       </w:r>
       <w:r>
@@ -4789,7 +4789,7 @@
           <v:shape id="_x0000_i1074" type="#_x0000_t75" style="width:82.5pt;height:19.5pt" o:ole="">
             <v:imagedata r:id="rId108" o:title=""/>
           </v:shape>
-          <o:OLEObject Type="Embed" ProgID="Equation.DSMT4" ShapeID="_x0000_i1074" DrawAspect="Content" ObjectID="_1611676608" r:id="rId109"/>
+          <o:OLEObject Type="Embed" ProgID="Equation.DSMT4" ShapeID="_x0000_i1074" DrawAspect="Content" ObjectID="_1611677499" r:id="rId109"/>
         </w:object>
       </w:r>
       <w:r>
@@ -4815,7 +4815,7 @@
           <v:shape id="_x0000_i1075" type="#_x0000_t75" style="width:84pt;height:19.5pt" o:ole="">
             <v:imagedata r:id="rId110" o:title=""/>
           </v:shape>
-          <o:OLEObject Type="Embed" ProgID="Equation.DSMT4" ShapeID="_x0000_i1075" DrawAspect="Content" ObjectID="_1611676609" r:id="rId111"/>
+          <o:OLEObject Type="Embed" ProgID="Equation.DSMT4" ShapeID="_x0000_i1075" DrawAspect="Content" ObjectID="_1611677500" r:id="rId111"/>
         </w:object>
       </w:r>
       <w:r>
@@ -4866,7 +4866,7 @@
           <v:shape id="_x0000_i1076" type="#_x0000_t75" style="width:67.5pt;height:19.5pt" o:ole="">
             <v:imagedata r:id="rId93" o:title=""/>
           </v:shape>
-          <o:OLEObject Type="Embed" ProgID="Equation.DSMT4" ShapeID="_x0000_i1076" DrawAspect="Content" ObjectID="_1611676610" r:id="rId112"/>
+          <o:OLEObject Type="Embed" ProgID="Equation.DSMT4" ShapeID="_x0000_i1076" DrawAspect="Content" ObjectID="_1611677501" r:id="rId112"/>
         </w:object>
       </w:r>
       <w:r>
@@ -4926,7 +4926,7 @@
           <v:shape id="_x0000_i1077" type="#_x0000_t75" style="width:69pt;height:19.5pt" o:ole="">
             <v:imagedata r:id="rId113" o:title=""/>
           </v:shape>
-          <o:OLEObject Type="Embed" ProgID="Equation.DSMT4" ShapeID="_x0000_i1077" DrawAspect="Content" ObjectID="_1611676611" r:id="rId114"/>
+          <o:OLEObject Type="Embed" ProgID="Equation.DSMT4" ShapeID="_x0000_i1077" DrawAspect="Content" ObjectID="_1611677502" r:id="rId114"/>
         </w:object>
       </w:r>
       <w:r>
@@ -4977,7 +4977,7 @@
           <v:shape id="_x0000_i1078" type="#_x0000_t75" style="width:75pt;height:18pt" o:ole="">
             <v:imagedata r:id="rId97" o:title=""/>
           </v:shape>
-          <o:OLEObject Type="Embed" ProgID="Equation.DSMT4" ShapeID="_x0000_i1078" DrawAspect="Content" ObjectID="_1611676612" r:id="rId115"/>
+          <o:OLEObject Type="Embed" ProgID="Equation.DSMT4" ShapeID="_x0000_i1078" DrawAspect="Content" ObjectID="_1611677503" r:id="rId115"/>
         </w:object>
       </w:r>
       <w:r>
@@ -5110,7 +5110,7 @@
           <v:shape id="_x0000_i1079" type="#_x0000_t75" style="width:12pt;height:13.5pt" o:ole="">
             <v:imagedata r:id="rId117" o:title=""/>
           </v:shape>
-          <o:OLEObject Type="Embed" ProgID="Equation.DSMT4" ShapeID="_x0000_i1079" DrawAspect="Content" ObjectID="_1611676613" r:id="rId118"/>
+          <o:OLEObject Type="Embed" ProgID="Equation.DSMT4" ShapeID="_x0000_i1079" DrawAspect="Content" ObjectID="_1611677504" r:id="rId118"/>
         </w:object>
       </w:r>
       <w:r>
@@ -5326,7 +5326,7 @@
           <v:shape id="_x0000_i1080" type="#_x0000_t75" style="width:63pt;height:19.5pt" o:ole="">
             <v:imagedata r:id="rId119" o:title=""/>
           </v:shape>
-          <o:OLEObject Type="Embed" ProgID="Equation.DSMT4" ShapeID="_x0000_i1080" DrawAspect="Content" ObjectID="_1611676614" r:id="rId120"/>
+          <o:OLEObject Type="Embed" ProgID="Equation.DSMT4" ShapeID="_x0000_i1080" DrawAspect="Content" ObjectID="_1611677505" r:id="rId120"/>
         </w:object>
       </w:r>
       <w:r>
@@ -6347,7 +6347,7 @@
           <v:shape id="_x0000_i1081" type="#_x0000_t75" style="width:63pt;height:19.5pt" o:ole="">
             <v:imagedata r:id="rId119" o:title=""/>
           </v:shape>
-          <o:OLEObject Type="Embed" ProgID="Equation.DSMT4" ShapeID="_x0000_i1081" DrawAspect="Content" ObjectID="_1611676615" r:id="rId121"/>
+          <o:OLEObject Type="Embed" ProgID="Equation.DSMT4" ShapeID="_x0000_i1081" DrawAspect="Content" ObjectID="_1611677506" r:id="rId121"/>
         </w:object>
       </w:r>
       <w:r>
@@ -6763,7 +6763,7 @@
           <v:shape id="_x0000_i1082" type="#_x0000_t75" style="width:112.5pt;height:28.5pt" o:ole="">
             <v:imagedata r:id="rId122" o:title=""/>
           </v:shape>
-          <o:OLEObject Type="Embed" ProgID="Equation.DSMT4" ShapeID="_x0000_i1082" DrawAspect="Content" ObjectID="_1611676616" r:id="rId123"/>
+          <o:OLEObject Type="Embed" ProgID="Equation.DSMT4" ShapeID="_x0000_i1082" DrawAspect="Content" ObjectID="_1611677507" r:id="rId123"/>
         </w:object>
       </w:r>
       <w:commentRangeEnd w:id="9"/>
@@ -7173,7 +7173,7 @@
           <v:shape id="_x0000_i1083" type="#_x0000_t75" style="width:321pt;height:46.5pt" o:ole="">
             <v:imagedata r:id="rId124" o:title=""/>
           </v:shape>
-          <o:OLEObject Type="Embed" ProgID="Equation.DSMT4" ShapeID="_x0000_i1083" DrawAspect="Content" ObjectID="_1611676617" r:id="rId125"/>
+          <o:OLEObject Type="Embed" ProgID="Equation.DSMT4" ShapeID="_x0000_i1083" DrawAspect="Content" ObjectID="_1611677508" r:id="rId125"/>
         </w:object>
       </w:r>
     </w:p>
@@ -7201,7 +7201,7 @@
           <v:shape id="_x0000_i1084" type="#_x0000_t75" style="width:244.5pt;height:46.5pt" o:ole="">
             <v:imagedata r:id="rId50" o:title=""/>
           </v:shape>
-          <o:OLEObject Type="Embed" ProgID="Equation.DSMT4" ShapeID="_x0000_i1084" DrawAspect="Content" ObjectID="_1611676618" r:id="rId126"/>
+          <o:OLEObject Type="Embed" ProgID="Equation.DSMT4" ShapeID="_x0000_i1084" DrawAspect="Content" ObjectID="_1611677509" r:id="rId126"/>
         </w:object>
       </w:r>
     </w:p>
@@ -7230,7 +7230,7 @@
           <v:shape id="_x0000_i1085" type="#_x0000_t75" style="width:232.5pt;height:46.5pt" o:ole="">
             <v:imagedata r:id="rId127" o:title=""/>
           </v:shape>
-          <o:OLEObject Type="Embed" ProgID="Equation.DSMT4" ShapeID="_x0000_i1085" DrawAspect="Content" ObjectID="_1611676619" r:id="rId128"/>
+          <o:OLEObject Type="Embed" ProgID="Equation.DSMT4" ShapeID="_x0000_i1085" DrawAspect="Content" ObjectID="_1611677510" r:id="rId128"/>
         </w:object>
       </w:r>
       <w:r>
@@ -7358,7 +7358,7 @@
           <v:shape id="_x0000_i1086" type="#_x0000_t75" style="width:27pt;height:16.5pt" o:ole="">
             <v:imagedata r:id="rId129" o:title=""/>
           </v:shape>
-          <o:OLEObject Type="Embed" ProgID="Equation.DSMT4" ShapeID="_x0000_i1086" DrawAspect="Content" ObjectID="_1611676620" r:id="rId130"/>
+          <o:OLEObject Type="Embed" ProgID="Equation.DSMT4" ShapeID="_x0000_i1086" DrawAspect="Content" ObjectID="_1611677511" r:id="rId130"/>
         </w:object>
       </w:r>
       <w:r>
@@ -7454,7 +7454,7 @@
           <v:shape id="_x0000_i1087" type="#_x0000_t75" style="width:10.5pt;height:10.5pt" o:ole="">
             <v:imagedata r:id="rId131" o:title=""/>
           </v:shape>
-          <o:OLEObject Type="Embed" ProgID="Equation.DSMT4" ShapeID="_x0000_i1087" DrawAspect="Content" ObjectID="_1611676621" r:id="rId132"/>
+          <o:OLEObject Type="Embed" ProgID="Equation.DSMT4" ShapeID="_x0000_i1087" DrawAspect="Content" ObjectID="_1611677512" r:id="rId132"/>
         </w:object>
       </w:r>
       <w:r>
@@ -7591,7 +7591,7 @@
           <v:shape id="_x0000_i1088" type="#_x0000_t75" style="width:30pt;height:16.5pt" o:ole="">
             <v:imagedata r:id="rId133" o:title=""/>
           </v:shape>
-          <o:OLEObject Type="Embed" ProgID="Equation.DSMT4" ShapeID="_x0000_i1088" DrawAspect="Content" ObjectID="_1611676622" r:id="rId134"/>
+          <o:OLEObject Type="Embed" ProgID="Equation.DSMT4" ShapeID="_x0000_i1088" DrawAspect="Content" ObjectID="_1611677513" r:id="rId134"/>
         </w:object>
       </w:r>
       <w:r>
@@ -7693,7 +7693,7 @@
           <v:shape id="_x0000_i1089" type="#_x0000_t75" style="width:238.5pt;height:37.5pt" o:ole="">
             <v:imagedata r:id="rId135" o:title=""/>
           </v:shape>
-          <o:OLEObject Type="Embed" ProgID="Equation.DSMT4" ShapeID="_x0000_i1089" DrawAspect="Content" ObjectID="_1611676623" r:id="rId136"/>
+          <o:OLEObject Type="Embed" ProgID="Equation.DSMT4" ShapeID="_x0000_i1089" DrawAspect="Content" ObjectID="_1611677514" r:id="rId136"/>
         </w:object>
       </w:r>
       <w:r>
@@ -7729,7 +7729,7 @@
           <v:shape id="_x0000_i1090" type="#_x0000_t75" style="width:117pt;height:25.5pt" o:ole="">
             <v:imagedata r:id="rId137" o:title=""/>
           </v:shape>
-          <o:OLEObject Type="Embed" ProgID="Equation.DSMT4" ShapeID="_x0000_i1090" DrawAspect="Content" ObjectID="_1611676624" r:id="rId138"/>
+          <o:OLEObject Type="Embed" ProgID="Equation.DSMT4" ShapeID="_x0000_i1090" DrawAspect="Content" ObjectID="_1611677515" r:id="rId138"/>
         </w:object>
       </w:r>
     </w:p>
@@ -7846,7 +7846,7 @@
           <v:shape id="_x0000_i1091" type="#_x0000_t75" style="width:232.5pt;height:37.5pt" o:ole="">
             <v:imagedata r:id="rId139" o:title=""/>
           </v:shape>
-          <o:OLEObject Type="Embed" ProgID="Equation.DSMT4" ShapeID="_x0000_i1091" DrawAspect="Content" ObjectID="_1611676625" r:id="rId140"/>
+          <o:OLEObject Type="Embed" ProgID="Equation.DSMT4" ShapeID="_x0000_i1091" DrawAspect="Content" ObjectID="_1611677516" r:id="rId140"/>
         </w:object>
       </w:r>
       <w:r>
@@ -9298,7 +9298,7 @@
           <v:shape id="_x0000_i1092" type="#_x0000_t75" style="width:451.5pt;height:40.5pt" o:ole="">
             <v:imagedata r:id="rId141" o:title=""/>
           </v:shape>
-          <o:OLEObject Type="Embed" ProgID="Equation.DSMT4" ShapeID="_x0000_i1092" DrawAspect="Content" ObjectID="_1611676626" r:id="rId142"/>
+          <o:OLEObject Type="Embed" ProgID="Equation.DSMT4" ShapeID="_x0000_i1092" DrawAspect="Content" ObjectID="_1611677517" r:id="rId142"/>
         </w:object>
       </w:r>
       <w:r>
@@ -9336,7 +9336,7 @@
           <v:shape id="_x0000_i1093" type="#_x0000_t75" style="width:358.5pt;height:43.5pt" o:ole="">
             <v:imagedata r:id="rId143" o:title=""/>
           </v:shape>
-          <o:OLEObject Type="Embed" ProgID="Equation.DSMT4" ShapeID="_x0000_i1093" DrawAspect="Content" ObjectID="_1611676627" r:id="rId144"/>
+          <o:OLEObject Type="Embed" ProgID="Equation.DSMT4" ShapeID="_x0000_i1093" DrawAspect="Content" ObjectID="_1611677518" r:id="rId144"/>
         </w:object>
       </w:r>
       <w:r>
@@ -9374,7 +9374,7 @@
           <v:shape id="_x0000_i1094" type="#_x0000_t75" style="width:145.5pt;height:36pt" o:ole="">
             <v:imagedata r:id="rId145" o:title=""/>
           </v:shape>
-          <o:OLEObject Type="Embed" ProgID="Equation.DSMT4" ShapeID="_x0000_i1094" DrawAspect="Content" ObjectID="_1611676628" r:id="rId146"/>
+          <o:OLEObject Type="Embed" ProgID="Equation.DSMT4" ShapeID="_x0000_i1094" DrawAspect="Content" ObjectID="_1611677519" r:id="rId146"/>
         </w:object>
       </w:r>
       <w:r>
@@ -9416,7 +9416,7 @@
           <v:shape id="_x0000_i1095" type="#_x0000_t75" style="width:133.5pt;height:34.5pt" o:ole="">
             <v:imagedata r:id="rId147" o:title=""/>
           </v:shape>
-          <o:OLEObject Type="Embed" ProgID="Equation.DSMT4" ShapeID="_x0000_i1095" DrawAspect="Content" ObjectID="_1611676629" r:id="rId148"/>
+          <o:OLEObject Type="Embed" ProgID="Equation.DSMT4" ShapeID="_x0000_i1095" DrawAspect="Content" ObjectID="_1611677520" r:id="rId148"/>
         </w:object>
       </w:r>
     </w:p>
@@ -9467,7 +9467,7 @@
           <v:shape id="_x0000_i1096" type="#_x0000_t75" style="width:283.5pt;height:31.5pt" o:ole="">
             <v:imagedata r:id="rId149" o:title=""/>
           </v:shape>
-          <o:OLEObject Type="Embed" ProgID="Equation.DSMT4" ShapeID="_x0000_i1096" DrawAspect="Content" ObjectID="_1611676630" r:id="rId150"/>
+          <o:OLEObject Type="Embed" ProgID="Equation.DSMT4" ShapeID="_x0000_i1096" DrawAspect="Content" ObjectID="_1611677521" r:id="rId150"/>
         </w:object>
       </w:r>
     </w:p>
@@ -9514,7 +9514,7 @@
           <v:shape id="_x0000_i1097" type="#_x0000_t75" style="width:152.25pt;height:34.5pt" o:ole="">
             <v:imagedata r:id="rId151" o:title=""/>
           </v:shape>
-          <o:OLEObject Type="Embed" ProgID="Equation.DSMT4" ShapeID="_x0000_i1097" DrawAspect="Content" ObjectID="_1611676631" r:id="rId152"/>
+          <o:OLEObject Type="Embed" ProgID="Equation.DSMT4" ShapeID="_x0000_i1097" DrawAspect="Content" ObjectID="_1611677522" r:id="rId152"/>
         </w:object>
       </w:r>
     </w:p>
@@ -9543,7 +9543,7 @@
           <v:shape id="_x0000_i1098" type="#_x0000_t75" style="width:28.5pt;height:16.5pt" o:ole="">
             <v:imagedata r:id="rId153" o:title=""/>
           </v:shape>
-          <o:OLEObject Type="Embed" ProgID="Equation.DSMT4" ShapeID="_x0000_i1098" DrawAspect="Content" ObjectID="_1611676632" r:id="rId154"/>
+          <o:OLEObject Type="Embed" ProgID="Equation.DSMT4" ShapeID="_x0000_i1098" DrawAspect="Content" ObjectID="_1611677523" r:id="rId154"/>
         </w:object>
       </w:r>
       <w:r>
@@ -9603,7 +9603,7 @@
           <v:shape id="_x0000_i1099" type="#_x0000_t75" style="width:67.5pt;height:31.5pt" o:ole="">
             <v:imagedata r:id="rId155" o:title=""/>
           </v:shape>
-          <o:OLEObject Type="Embed" ProgID="Equation.DSMT4" ShapeID="_x0000_i1099" DrawAspect="Content" ObjectID="_1611676633" r:id="rId156"/>
+          <o:OLEObject Type="Embed" ProgID="Equation.DSMT4" ShapeID="_x0000_i1099" DrawAspect="Content" ObjectID="_1611677524" r:id="rId156"/>
         </w:object>
       </w:r>
       <w:r>
@@ -9627,7 +9627,7 @@
           <v:shape id="_x0000_i1100" type="#_x0000_t75" style="width:61.5pt;height:21pt" o:ole="">
             <v:imagedata r:id="rId157" o:title=""/>
           </v:shape>
-          <o:OLEObject Type="Embed" ProgID="Equation.DSMT4" ShapeID="_x0000_i1100" DrawAspect="Content" ObjectID="_1611676634" r:id="rId158"/>
+          <o:OLEObject Type="Embed" ProgID="Equation.DSMT4" ShapeID="_x0000_i1100" DrawAspect="Content" ObjectID="_1611677525" r:id="rId158"/>
         </w:object>
       </w:r>
       <w:r>
@@ -9696,7 +9696,7 @@
           <v:shape id="_x0000_i1101" type="#_x0000_t75" style="width:33pt;height:18pt" o:ole="">
             <v:imagedata r:id="rId159" o:title=""/>
           </v:shape>
-          <o:OLEObject Type="Embed" ProgID="Equation.DSMT4" ShapeID="_x0000_i1101" DrawAspect="Content" ObjectID="_1611676635" r:id="rId160"/>
+          <o:OLEObject Type="Embed" ProgID="Equation.DSMT4" ShapeID="_x0000_i1101" DrawAspect="Content" ObjectID="_1611677526" r:id="rId160"/>
         </w:object>
       </w:r>
       <w:r>
@@ -9720,7 +9720,7 @@
           <v:shape id="_x0000_i1102" type="#_x0000_t75" style="width:60pt;height:22.5pt" o:ole="">
             <v:imagedata r:id="rId161" o:title=""/>
           </v:shape>
-          <o:OLEObject Type="Embed" ProgID="Equation.DSMT4" ShapeID="_x0000_i1102" DrawAspect="Content" ObjectID="_1611676636" r:id="rId162"/>
+          <o:OLEObject Type="Embed" ProgID="Equation.DSMT4" ShapeID="_x0000_i1102" DrawAspect="Content" ObjectID="_1611677527" r:id="rId162"/>
         </w:object>
       </w:r>
       <w:r>
@@ -9799,7 +9799,7 @@
           <v:shape id="_x0000_i1103" type="#_x0000_t75" style="width:34.5pt;height:18pt" o:ole="">
             <v:imagedata r:id="rId163" o:title=""/>
           </v:shape>
-          <o:OLEObject Type="Embed" ProgID="Equation.DSMT4" ShapeID="_x0000_i1103" DrawAspect="Content" ObjectID="_1611676637" r:id="rId164"/>
+          <o:OLEObject Type="Embed" ProgID="Equation.DSMT4" ShapeID="_x0000_i1103" DrawAspect="Content" ObjectID="_1611677528" r:id="rId164"/>
         </w:object>
       </w:r>
       <w:r>
@@ -9859,7 +9859,7 @@
           <v:shape id="_x0000_i1104" type="#_x0000_t75" style="width:58.5pt;height:34.5pt" o:ole="">
             <v:imagedata r:id="rId165" o:title=""/>
           </v:shape>
-          <o:OLEObject Type="Embed" ProgID="Equation.DSMT4" ShapeID="_x0000_i1104" DrawAspect="Content" ObjectID="_1611676638" r:id="rId166"/>
+          <o:OLEObject Type="Embed" ProgID="Equation.DSMT4" ShapeID="_x0000_i1104" DrawAspect="Content" ObjectID="_1611677529" r:id="rId166"/>
         </w:object>
       </w:r>
       <w:r>
@@ -9988,7 +9988,7 @@
           <v:shape id="_x0000_i1105" type="#_x0000_t75" style="width:130.5pt;height:24pt" o:ole="">
             <v:imagedata r:id="rId167" o:title=""/>
           </v:shape>
-          <o:OLEObject Type="Embed" ProgID="Equation.DSMT4" ShapeID="_x0000_i1105" DrawAspect="Content" ObjectID="_1611676639" r:id="rId168"/>
+          <o:OLEObject Type="Embed" ProgID="Equation.DSMT4" ShapeID="_x0000_i1105" DrawAspect="Content" ObjectID="_1611677530" r:id="rId168"/>
         </w:object>
       </w:r>
       <w:r>
@@ -10193,7 +10193,7 @@
           <v:shape id="_x0000_i1106" type="#_x0000_t75" style="width:181.5pt;height:19.5pt" o:ole="">
             <v:imagedata r:id="rId169" o:title=""/>
           </v:shape>
-          <o:OLEObject Type="Embed" ProgID="Equation.DSMT4" ShapeID="_x0000_i1106" DrawAspect="Content" ObjectID="_1611676640" r:id="rId170"/>
+          <o:OLEObject Type="Embed" ProgID="Equation.DSMT4" ShapeID="_x0000_i1106" DrawAspect="Content" ObjectID="_1611677531" r:id="rId170"/>
         </w:object>
       </w:r>
       <w:r>
@@ -10543,7 +10543,7 @@
           <v:shape id="_x0000_i1107" type="#_x0000_t75" style="width:16.5pt;height:18pt" o:ole="">
             <v:imagedata r:id="rId171" o:title=""/>
           </v:shape>
-          <o:OLEObject Type="Embed" ProgID="Equation.DSMT4" ShapeID="_x0000_i1107" DrawAspect="Content" ObjectID="_1611676641" r:id="rId172"/>
+          <o:OLEObject Type="Embed" ProgID="Equation.DSMT4" ShapeID="_x0000_i1107" DrawAspect="Content" ObjectID="_1611677532" r:id="rId172"/>
         </w:object>
       </w:r>
       <w:r>
@@ -10568,7 +10568,7 @@
           <v:shape id="_x0000_i1108" type="#_x0000_t75" style="width:37.5pt;height:16.5pt" o:ole="">
             <v:imagedata r:id="rId173" o:title=""/>
           </v:shape>
-          <o:OLEObject Type="Embed" ProgID="Equation.DSMT4" ShapeID="_x0000_i1108" DrawAspect="Content" ObjectID="_1611676642" r:id="rId174"/>
+          <o:OLEObject Type="Embed" ProgID="Equation.DSMT4" ShapeID="_x0000_i1108" DrawAspect="Content" ObjectID="_1611677533" r:id="rId174"/>
         </w:object>
       </w:r>
       <w:commentRangeEnd w:id="16"/>
@@ -10707,7 +10707,7 @@
           <v:shape id="_x0000_i1109" type="#_x0000_t75" style="width:16.5pt;height:18pt" o:ole="">
             <v:imagedata r:id="rId175" o:title=""/>
           </v:shape>
-          <o:OLEObject Type="Embed" ProgID="Equation.DSMT4" ShapeID="_x0000_i1109" DrawAspect="Content" ObjectID="_1611676643" r:id="rId176"/>
+          <o:OLEObject Type="Embed" ProgID="Equation.DSMT4" ShapeID="_x0000_i1109" DrawAspect="Content" ObjectID="_1611677534" r:id="rId176"/>
         </w:object>
       </w:r>
       <w:r>
@@ -11018,7 +11018,7 @@
           <v:shape id="_x0000_i1110" type="#_x0000_t75" style="width:31.5pt;height:13.5pt" o:ole="">
             <v:imagedata r:id="rId177" o:title=""/>
           </v:shape>
-          <o:OLEObject Type="Embed" ProgID="Equation.DSMT4" ShapeID="_x0000_i1110" DrawAspect="Content" ObjectID="_1611676644" r:id="rId178"/>
+          <o:OLEObject Type="Embed" ProgID="Equation.DSMT4" ShapeID="_x0000_i1110" DrawAspect="Content" ObjectID="_1611677535" r:id="rId178"/>
         </w:object>
       </w:r>
       <w:r>
@@ -11042,7 +11042,7 @@
           <v:shape id="_x0000_i1111" type="#_x0000_t75" style="width:31.5pt;height:13.5pt" o:ole="">
             <v:imagedata r:id="rId179" o:title=""/>
           </v:shape>
-          <o:OLEObject Type="Embed" ProgID="Equation.DSMT4" ShapeID="_x0000_i1111" DrawAspect="Content" ObjectID="_1611676645" r:id="rId180"/>
+          <o:OLEObject Type="Embed" ProgID="Equation.DSMT4" ShapeID="_x0000_i1111" DrawAspect="Content" ObjectID="_1611677536" r:id="rId180"/>
         </w:object>
       </w:r>
       <w:r>
@@ -11551,7 +11551,7 @@
           <v:shape id="_x0000_i1112" type="#_x0000_t75" style="width:262.5pt;height:39pt" o:ole="">
             <v:imagedata r:id="rId181" o:title=""/>
           </v:shape>
-          <o:OLEObject Type="Embed" ProgID="Equation.DSMT4" ShapeID="_x0000_i1112" DrawAspect="Content" ObjectID="_1611676646" r:id="rId182"/>
+          <o:OLEObject Type="Embed" ProgID="Equation.DSMT4" ShapeID="_x0000_i1112" DrawAspect="Content" ObjectID="_1611677537" r:id="rId182"/>
         </w:object>
       </w:r>
       <w:r>
@@ -11842,7 +11842,7 @@
           <v:shape id="_x0000_i1113" type="#_x0000_t75" style="width:1in;height:19.5pt" o:ole="">
             <v:imagedata r:id="rId183" o:title=""/>
           </v:shape>
-          <o:OLEObject Type="Embed" ProgID="Equation.DSMT4" ShapeID="_x0000_i1113" DrawAspect="Content" ObjectID="_1611676647" r:id="rId184"/>
+          <o:OLEObject Type="Embed" ProgID="Equation.DSMT4" ShapeID="_x0000_i1113" DrawAspect="Content" ObjectID="_1611677538" r:id="rId184"/>
         </w:object>
       </w:r>
       <w:r>
@@ -12744,7 +12744,7 @@
           <v:shape id="_x0000_i1114" type="#_x0000_t75" style="width:25.5pt;height:18pt" o:ole="">
             <v:imagedata r:id="rId185" o:title=""/>
           </v:shape>
-          <o:OLEObject Type="Embed" ProgID="Equation.DSMT4" ShapeID="_x0000_i1114" DrawAspect="Content" ObjectID="_1611676648" r:id="rId186"/>
+          <o:OLEObject Type="Embed" ProgID="Equation.DSMT4" ShapeID="_x0000_i1114" DrawAspect="Content" ObjectID="_1611677539" r:id="rId186"/>
         </w:object>
       </w:r>
       <w:r>
@@ -13609,7 +13609,7 @@
           <v:shape id="_x0000_i1115" type="#_x0000_t75" style="width:10.5pt;height:13.5pt" o:ole="">
             <v:imagedata r:id="rId187" o:title=""/>
           </v:shape>
-          <o:OLEObject Type="Embed" ProgID="Equation.DSMT4" ShapeID="_x0000_i1115" DrawAspect="Content" ObjectID="_1611676649" r:id="rId188"/>
+          <o:OLEObject Type="Embed" ProgID="Equation.DSMT4" ShapeID="_x0000_i1115" DrawAspect="Content" ObjectID="_1611677540" r:id="rId188"/>
         </w:object>
       </w:r>
       <w:r>
@@ -13696,7 +13696,7 @@
           <v:shape id="_x0000_i1116" type="#_x0000_t75" style="width:25.5pt;height:13.5pt" o:ole="">
             <v:imagedata r:id="rId189" o:title=""/>
           </v:shape>
-          <o:OLEObject Type="Embed" ProgID="Equation.DSMT4" ShapeID="_x0000_i1116" DrawAspect="Content" ObjectID="_1611676650" r:id="rId190"/>
+          <o:OLEObject Type="Embed" ProgID="Equation.DSMT4" ShapeID="_x0000_i1116" DrawAspect="Content" ObjectID="_1611677541" r:id="rId190"/>
         </w:object>
       </w:r>
       <w:r>
@@ -14679,7 +14679,7 @@
           <v:shape id="_x0000_i1117" type="#_x0000_t75" style="width:49.5pt;height:18pt" o:ole="">
             <v:imagedata r:id="rId192" o:title=""/>
           </v:shape>
-          <o:OLEObject Type="Embed" ProgID="Equation.DSMT4" ShapeID="_x0000_i1117" DrawAspect="Content" ObjectID="_1611676651" r:id="rId193"/>
+          <o:OLEObject Type="Embed" ProgID="Equation.DSMT4" ShapeID="_x0000_i1117" DrawAspect="Content" ObjectID="_1611677542" r:id="rId193"/>
         </w:object>
       </w:r>
       <w:r>
@@ -14730,7 +14730,7 @@
           <v:shape id="_x0000_i1118" type="#_x0000_t75" style="width:42pt;height:18pt" o:ole="">
             <v:imagedata r:id="rId194" o:title=""/>
           </v:shape>
-          <o:OLEObject Type="Embed" ProgID="Equation.DSMT4" ShapeID="_x0000_i1118" DrawAspect="Content" ObjectID="_1611676652" r:id="rId195"/>
+          <o:OLEObject Type="Embed" ProgID="Equation.DSMT4" ShapeID="_x0000_i1118" DrawAspect="Content" ObjectID="_1611677543" r:id="rId195"/>
         </w:object>
       </w:r>
       <w:r>
@@ -15004,7 +15004,7 @@
           <v:shape id="_x0000_i1119" type="#_x0000_t75" style="width:205.5pt;height:18pt" o:ole="">
             <v:imagedata r:id="rId196" o:title=""/>
           </v:shape>
-          <o:OLEObject Type="Embed" ProgID="Equation.DSMT4" ShapeID="_x0000_i1119" DrawAspect="Content" ObjectID="_1611676653" r:id="rId197"/>
+          <o:OLEObject Type="Embed" ProgID="Equation.DSMT4" ShapeID="_x0000_i1119" DrawAspect="Content" ObjectID="_1611677544" r:id="rId197"/>
         </w:object>
       </w:r>
       <w:commentRangeEnd w:id="19"/>
@@ -15069,7 +15069,7 @@
           <v:shape id="_x0000_i1120" type="#_x0000_t75" style="width:31.5pt;height:18pt" o:ole="">
             <v:imagedata r:id="rId198" o:title=""/>
           </v:shape>
-          <o:OLEObject Type="Embed" ProgID="Equation.DSMT4" ShapeID="_x0000_i1120" DrawAspect="Content" ObjectID="_1611676654" r:id="rId199"/>
+          <o:OLEObject Type="Embed" ProgID="Equation.DSMT4" ShapeID="_x0000_i1120" DrawAspect="Content" ObjectID="_1611677545" r:id="rId199"/>
         </w:object>
       </w:r>
       <w:r>
@@ -15310,7 +15310,7 @@
           <v:shape id="_x0000_i1121" type="#_x0000_t75" style="width:25.5pt;height:18pt" o:ole="">
             <v:imagedata r:id="rId200" o:title=""/>
           </v:shape>
-          <o:OLEObject Type="Embed" ProgID="Equation.DSMT4" ShapeID="_x0000_i1121" DrawAspect="Content" ObjectID="_1611676655" r:id="rId201"/>
+          <o:OLEObject Type="Embed" ProgID="Equation.DSMT4" ShapeID="_x0000_i1121" DrawAspect="Content" ObjectID="_1611677546" r:id="rId201"/>
         </w:object>
       </w:r>
       <w:r>
@@ -15425,7 +15425,7 @@
           <v:shape id="_x0000_i1122" type="#_x0000_t75" style="width:31.5pt;height:18pt" o:ole="">
             <v:imagedata r:id="rId198" o:title=""/>
           </v:shape>
-          <o:OLEObject Type="Embed" ProgID="Equation.DSMT4" ShapeID="_x0000_i1122" DrawAspect="Content" ObjectID="_1611676656" r:id="rId202"/>
+          <o:OLEObject Type="Embed" ProgID="Equation.DSMT4" ShapeID="_x0000_i1122" DrawAspect="Content" ObjectID="_1611677547" r:id="rId202"/>
         </w:object>
       </w:r>
       <w:r>
@@ -15486,7 +15486,7 @@
           <v:shape id="_x0000_i1123" type="#_x0000_t75" style="width:13.5pt;height:18pt" o:ole="">
             <v:imagedata r:id="rId203" o:title=""/>
           </v:shape>
-          <o:OLEObject Type="Embed" ProgID="Equation.DSMT4" ShapeID="_x0000_i1123" DrawAspect="Content" ObjectID="_1611676657" r:id="rId204"/>
+          <o:OLEObject Type="Embed" ProgID="Equation.DSMT4" ShapeID="_x0000_i1123" DrawAspect="Content" ObjectID="_1611677548" r:id="rId204"/>
         </w:object>
       </w:r>
       <w:r>
@@ -15520,7 +15520,7 @@
           <v:shape id="_x0000_i1124" type="#_x0000_t75" style="width:30pt;height:19.5pt" o:ole="">
             <v:imagedata r:id="rId205" o:title=""/>
           </v:shape>
-          <o:OLEObject Type="Embed" ProgID="Equation.DSMT4" ShapeID="_x0000_i1124" DrawAspect="Content" ObjectID="_1611676658" r:id="rId206"/>
+          <o:OLEObject Type="Embed" ProgID="Equation.DSMT4" ShapeID="_x0000_i1124" DrawAspect="Content" ObjectID="_1611677549" r:id="rId206"/>
         </w:object>
       </w:r>
       <w:r>
@@ -15617,7 +15617,7 @@
           <v:shape id="_x0000_i1125" type="#_x0000_t75" style="width:24pt;height:18pt" o:ole="">
             <v:imagedata r:id="rId207" o:title=""/>
           </v:shape>
-          <o:OLEObject Type="Embed" ProgID="Equation.DSMT4" ShapeID="_x0000_i1125" DrawAspect="Content" ObjectID="_1611676659" r:id="rId208"/>
+          <o:OLEObject Type="Embed" ProgID="Equation.DSMT4" ShapeID="_x0000_i1125" DrawAspect="Content" ObjectID="_1611677550" r:id="rId208"/>
         </w:object>
       </w:r>
       <w:r>
@@ -15660,7 +15660,7 @@
           <v:shape id="_x0000_i1126" type="#_x0000_t75" style="width:34.5pt;height:18pt" o:ole="">
             <v:imagedata r:id="rId209" o:title=""/>
           </v:shape>
-          <o:OLEObject Type="Embed" ProgID="Equation.DSMT4" ShapeID="_x0000_i1126" DrawAspect="Content" ObjectID="_1611676660" r:id="rId210"/>
+          <o:OLEObject Type="Embed" ProgID="Equation.DSMT4" ShapeID="_x0000_i1126" DrawAspect="Content" ObjectID="_1611677551" r:id="rId210"/>
         </w:object>
       </w:r>
       <w:r>
@@ -15851,7 +15851,7 @@
           <v:shape id="_x0000_i1127" type="#_x0000_t75" style="width:1in;height:19.5pt" o:ole="">
             <v:imagedata r:id="rId16" o:title=""/>
           </v:shape>
-          <o:OLEObject Type="Embed" ProgID="Equation.DSMT4" ShapeID="_x0000_i1127" DrawAspect="Content" ObjectID="_1611676661" r:id="rId211"/>
+          <o:OLEObject Type="Embed" ProgID="Equation.DSMT4" ShapeID="_x0000_i1127" DrawAspect="Content" ObjectID="_1611677552" r:id="rId211"/>
         </w:object>
       </w:r>
       <w:commentRangeEnd w:id="20"/>
@@ -15914,7 +15914,7 @@
           <v:shape id="_x0000_i1128" type="#_x0000_t75" style="width:34.5pt;height:19.5pt" o:ole="">
             <v:imagedata r:id="rId212" o:title=""/>
           </v:shape>
-          <o:OLEObject Type="Embed" ProgID="Equation.DSMT4" ShapeID="_x0000_i1128" DrawAspect="Content" ObjectID="_1611676662" r:id="rId213"/>
+          <o:OLEObject Type="Embed" ProgID="Equation.DSMT4" ShapeID="_x0000_i1128" DrawAspect="Content" ObjectID="_1611677553" r:id="rId213"/>
         </w:object>
       </w:r>
       <w:r>
@@ -15950,7 +15950,7 @@
           <v:shape id="_x0000_i1129" type="#_x0000_t75" style="width:60pt;height:33pt" o:ole="">
             <v:imagedata r:id="rId214" o:title=""/>
           </v:shape>
-          <o:OLEObject Type="Embed" ProgID="Equation.DSMT4" ShapeID="_x0000_i1129" DrawAspect="Content" ObjectID="_1611676663" r:id="rId215"/>
+          <o:OLEObject Type="Embed" ProgID="Equation.DSMT4" ShapeID="_x0000_i1129" DrawAspect="Content" ObjectID="_1611677554" r:id="rId215"/>
         </w:object>
       </w:r>
       <w:r>
@@ -16056,7 +16056,7 @@
           <v:shape id="_x0000_i1130" type="#_x0000_t75" style="width:34.5pt;height:19.5pt" o:ole="">
             <v:imagedata r:id="rId216" o:title=""/>
           </v:shape>
-          <o:OLEObject Type="Embed" ProgID="Equation.DSMT4" ShapeID="_x0000_i1130" DrawAspect="Content" ObjectID="_1611676664" r:id="rId217"/>
+          <o:OLEObject Type="Embed" ProgID="Equation.DSMT4" ShapeID="_x0000_i1130" DrawAspect="Content" ObjectID="_1611677555" r:id="rId217"/>
         </w:object>
       </w:r>
       <w:r>
@@ -16102,7 +16102,7 @@
           <v:shape id="_x0000_i1131" type="#_x0000_t75" style="width:121.5pt;height:19.5pt" o:ole="">
             <v:imagedata r:id="rId218" o:title=""/>
           </v:shape>
-          <o:OLEObject Type="Embed" ProgID="Equation.DSMT4" ShapeID="_x0000_i1131" DrawAspect="Content" ObjectID="_1611676665" r:id="rId219"/>
+          <o:OLEObject Type="Embed" ProgID="Equation.DSMT4" ShapeID="_x0000_i1131" DrawAspect="Content" ObjectID="_1611677556" r:id="rId219"/>
         </w:object>
       </w:r>
       <w:r>
@@ -16178,7 +16178,7 @@
           <v:shape id="_x0000_i1132" type="#_x0000_t75" style="width:75pt;height:19.5pt" o:ole="">
             <v:imagedata r:id="rId220" o:title=""/>
           </v:shape>
-          <o:OLEObject Type="Embed" ProgID="Equation.DSMT4" ShapeID="_x0000_i1132" DrawAspect="Content" ObjectID="_1611676666" r:id="rId221"/>
+          <o:OLEObject Type="Embed" ProgID="Equation.DSMT4" ShapeID="_x0000_i1132" DrawAspect="Content" ObjectID="_1611677557" r:id="rId221"/>
         </w:object>
       </w:r>
       <w:r>
@@ -16314,7 +16314,7 @@
           <v:shape id="_x0000_i1133" type="#_x0000_t75" style="width:12pt;height:13.5pt" o:ole="">
             <v:imagedata r:id="rId222" o:title=""/>
           </v:shape>
-          <o:OLEObject Type="Embed" ProgID="Equation.DSMT4" ShapeID="_x0000_i1133" DrawAspect="Content" ObjectID="_1611676667" r:id="rId223"/>
+          <o:OLEObject Type="Embed" ProgID="Equation.DSMT4" ShapeID="_x0000_i1133" DrawAspect="Content" ObjectID="_1611677558" r:id="rId223"/>
         </w:object>
       </w:r>
       <w:r>
@@ -16391,7 +16391,7 @@
           <v:shape id="_x0000_i1134" type="#_x0000_t75" style="width:46.5pt;height:18pt" o:ole="">
             <v:imagedata r:id="rId224" o:title=""/>
           </v:shape>
-          <o:OLEObject Type="Embed" ProgID="Equation.DSMT4" ShapeID="_x0000_i1134" DrawAspect="Content" ObjectID="_1611676668" r:id="rId225"/>
+          <o:OLEObject Type="Embed" ProgID="Equation.DSMT4" ShapeID="_x0000_i1134" DrawAspect="Content" ObjectID="_1611677559" r:id="rId225"/>
         </w:object>
       </w:r>
       <w:r>
@@ -16415,7 +16415,7 @@
           <v:shape id="_x0000_i1135" type="#_x0000_t75" style="width:58.5pt;height:16.5pt" o:ole="">
             <v:imagedata r:id="rId226" o:title=""/>
           </v:shape>
-          <o:OLEObject Type="Embed" ProgID="Equation.DSMT4" ShapeID="_x0000_i1135" DrawAspect="Content" ObjectID="_1611676669" r:id="rId227"/>
+          <o:OLEObject Type="Embed" ProgID="Equation.DSMT4" ShapeID="_x0000_i1135" DrawAspect="Content" ObjectID="_1611677560" r:id="rId227"/>
         </w:object>
       </w:r>
     </w:p>
@@ -16443,7 +16443,7 @@
           <v:shape id="_x0000_i1136" type="#_x0000_t75" style="width:184.5pt;height:22.5pt" o:ole="">
             <v:imagedata r:id="rId228" o:title=""/>
           </v:shape>
-          <o:OLEObject Type="Embed" ProgID="Equation.DSMT4" ShapeID="_x0000_i1136" DrawAspect="Content" ObjectID="_1611676670" r:id="rId229"/>
+          <o:OLEObject Type="Embed" ProgID="Equation.DSMT4" ShapeID="_x0000_i1136" DrawAspect="Content" ObjectID="_1611677561" r:id="rId229"/>
         </w:object>
       </w:r>
     </w:p>
@@ -16470,7 +16470,7 @@
           <v:shape id="_x0000_i1137" type="#_x0000_t75" style="width:126pt;height:34.5pt" o:ole="">
             <v:imagedata r:id="rId230" o:title=""/>
           </v:shape>
-          <o:OLEObject Type="Embed" ProgID="Equation.DSMT4" ShapeID="_x0000_i1137" DrawAspect="Content" ObjectID="_1611676671" r:id="rId231"/>
+          <o:OLEObject Type="Embed" ProgID="Equation.DSMT4" ShapeID="_x0000_i1137" DrawAspect="Content" ObjectID="_1611677562" r:id="rId231"/>
         </w:object>
       </w:r>
       <w:r>
@@ -16493,7 +16493,7 @@
           <v:shape id="_x0000_i1138" type="#_x0000_t75" style="width:109.5pt;height:22.5pt" o:ole="">
             <v:imagedata r:id="rId232" o:title=""/>
           </v:shape>
-          <o:OLEObject Type="Embed" ProgID="Equation.DSMT4" ShapeID="_x0000_i1138" DrawAspect="Content" ObjectID="_1611676672" r:id="rId233"/>
+          <o:OLEObject Type="Embed" ProgID="Equation.DSMT4" ShapeID="_x0000_i1138" DrawAspect="Content" ObjectID="_1611677563" r:id="rId233"/>
         </w:object>
       </w:r>
     </w:p>
@@ -16520,7 +16520,7 @@
           <v:shape id="_x0000_i1139" type="#_x0000_t75" style="width:46.5pt;height:33pt" o:ole="">
             <v:imagedata r:id="rId234" o:title=""/>
           </v:shape>
-          <o:OLEObject Type="Embed" ProgID="Equation.DSMT4" ShapeID="_x0000_i1139" DrawAspect="Content" ObjectID="_1611676673" r:id="rId235"/>
+          <o:OLEObject Type="Embed" ProgID="Equation.DSMT4" ShapeID="_x0000_i1139" DrawAspect="Content" ObjectID="_1611677564" r:id="rId235"/>
         </w:object>
       </w:r>
     </w:p>
@@ -16547,7 +16547,7 @@
           <v:shape id="_x0000_i1140" type="#_x0000_t75" style="width:142.5pt;height:34.5pt" o:ole="">
             <v:imagedata r:id="rId236" o:title=""/>
           </v:shape>
-          <o:OLEObject Type="Embed" ProgID="Equation.DSMT4" ShapeID="_x0000_i1140" DrawAspect="Content" ObjectID="_1611676674" r:id="rId237"/>
+          <o:OLEObject Type="Embed" ProgID="Equation.DSMT4" ShapeID="_x0000_i1140" DrawAspect="Content" ObjectID="_1611677565" r:id="rId237"/>
         </w:object>
       </w:r>
     </w:p>
@@ -16575,7 +16575,7 @@
           <v:shape id="_x0000_i1141" type="#_x0000_t75" style="width:111pt;height:33pt" o:ole="">
             <v:imagedata r:id="rId238" o:title=""/>
           </v:shape>
-          <o:OLEObject Type="Embed" ProgID="Equation.DSMT4" ShapeID="_x0000_i1141" DrawAspect="Content" ObjectID="_1611676675" r:id="rId239"/>
+          <o:OLEObject Type="Embed" ProgID="Equation.DSMT4" ShapeID="_x0000_i1141" DrawAspect="Content" ObjectID="_1611677566" r:id="rId239"/>
         </w:object>
       </w:r>
       <w:r>
@@ -16599,7 +16599,7 @@
           <v:shape id="_x0000_i1142" type="#_x0000_t75" style="width:49.5pt;height:13.5pt" o:ole="">
             <v:imagedata r:id="rId240" o:title=""/>
           </v:shape>
-          <o:OLEObject Type="Embed" ProgID="Equation.DSMT4" ShapeID="_x0000_i1142" DrawAspect="Content" ObjectID="_1611676676" r:id="rId241"/>
+          <o:OLEObject Type="Embed" ProgID="Equation.DSMT4" ShapeID="_x0000_i1142" DrawAspect="Content" ObjectID="_1611677567" r:id="rId241"/>
         </w:object>
       </w:r>
       <w:r>
@@ -16624,7 +16624,7 @@
           <v:shape id="_x0000_i1143" type="#_x0000_t75" style="width:57pt;height:16.5pt" o:ole="">
             <v:imagedata r:id="rId242" o:title=""/>
           </v:shape>
-          <o:OLEObject Type="Embed" ProgID="Equation.DSMT4" ShapeID="_x0000_i1143" DrawAspect="Content" ObjectID="_1611676677" r:id="rId243"/>
+          <o:OLEObject Type="Embed" ProgID="Equation.DSMT4" ShapeID="_x0000_i1143" DrawAspect="Content" ObjectID="_1611677568" r:id="rId243"/>
         </w:object>
       </w:r>
       <w:commentRangeEnd w:id="21"/>
@@ -16655,7 +16655,7 @@
           <v:shape id="_x0000_i1144" type="#_x0000_t75" style="width:27pt;height:13.5pt" o:ole="">
             <v:imagedata r:id="rId244" o:title=""/>
           </v:shape>
-          <o:OLEObject Type="Embed" ProgID="Equation.DSMT4" ShapeID="_x0000_i1144" DrawAspect="Content" ObjectID="_1611676678" r:id="rId245"/>
+          <o:OLEObject Type="Embed" ProgID="Equation.DSMT4" ShapeID="_x0000_i1144" DrawAspect="Content" ObjectID="_1611677569" r:id="rId245"/>
         </w:object>
       </w:r>
     </w:p>
@@ -16696,7 +16696,7 @@
           <v:shape id="_x0000_i1145" type="#_x0000_t75" style="width:430.5pt;height:43.5pt" o:ole="">
             <v:imagedata r:id="rId246" o:title=""/>
           </v:shape>
-          <o:OLEObject Type="Embed" ProgID="Equation.DSMT4" ShapeID="_x0000_i1145" DrawAspect="Content" ObjectID="_1611676679" r:id="rId247"/>
+          <o:OLEObject Type="Embed" ProgID="Equation.DSMT4" ShapeID="_x0000_i1145" DrawAspect="Content" ObjectID="_1611677570" r:id="rId247"/>
         </w:object>
       </w:r>
     </w:p>
@@ -16737,7 +16737,7 @@
           <v:shape id="_x0000_i1146" type="#_x0000_t75" style="width:357pt;height:33pt" o:ole="">
             <v:imagedata r:id="rId248" o:title=""/>
           </v:shape>
-          <o:OLEObject Type="Embed" ProgID="Equation.DSMT4" ShapeID="_x0000_i1146" DrawAspect="Content" ObjectID="_1611676680" r:id="rId249"/>
+          <o:OLEObject Type="Embed" ProgID="Equation.DSMT4" ShapeID="_x0000_i1146" DrawAspect="Content" ObjectID="_1611677571" r:id="rId249"/>
         </w:object>
       </w:r>
     </w:p>
@@ -16773,7 +16773,7 @@
           <v:shape id="_x0000_i1147" type="#_x0000_t75" style="width:353.25pt;height:40.5pt" o:ole="">
             <v:imagedata r:id="rId250" o:title=""/>
           </v:shape>
-          <o:OLEObject Type="Embed" ProgID="Equation.DSMT4" ShapeID="_x0000_i1147" DrawAspect="Content" ObjectID="_1611676681" r:id="rId251"/>
+          <o:OLEObject Type="Embed" ProgID="Equation.DSMT4" ShapeID="_x0000_i1147" DrawAspect="Content" ObjectID="_1611677572" r:id="rId251"/>
         </w:object>
       </w:r>
     </w:p>
@@ -16801,7 +16801,7 @@
           <v:shape id="_x0000_i1148" type="#_x0000_t75" style="width:412.5pt;height:42pt" o:ole="">
             <v:imagedata r:id="rId252" o:title=""/>
           </v:shape>
-          <o:OLEObject Type="Embed" ProgID="Equation.DSMT4" ShapeID="_x0000_i1148" DrawAspect="Content" ObjectID="_1611676682" r:id="rId253"/>
+          <o:OLEObject Type="Embed" ProgID="Equation.DSMT4" ShapeID="_x0000_i1148" DrawAspect="Content" ObjectID="_1611677573" r:id="rId253"/>
         </w:object>
       </w:r>
       <w:r>
@@ -16837,7 +16837,7 @@
           <v:shape id="_x0000_i1149" type="#_x0000_t75" style="width:271.5pt;height:39pt" o:ole="">
             <v:imagedata r:id="rId254" o:title=""/>
           </v:shape>
-          <o:OLEObject Type="Embed" ProgID="Equation.DSMT4" ShapeID="_x0000_i1149" DrawAspect="Content" ObjectID="_1611676683" r:id="rId255"/>
+          <o:OLEObject Type="Embed" ProgID="Equation.DSMT4" ShapeID="_x0000_i1149" DrawAspect="Content" ObjectID="_1611677574" r:id="rId255"/>
         </w:object>
       </w:r>
       <w:r>
@@ -16890,7 +16890,7 @@
           <v:shape id="_x0000_i1150" type="#_x0000_t75" style="width:97.5pt;height:19.5pt" o:ole="">
             <v:imagedata r:id="rId58" o:title=""/>
           </v:shape>
-          <o:OLEObject Type="Embed" ProgID="Equation.DSMT4" ShapeID="_x0000_i1150" DrawAspect="Content" ObjectID="_1611676684" r:id="rId256"/>
+          <o:OLEObject Type="Embed" ProgID="Equation.DSMT4" ShapeID="_x0000_i1150" DrawAspect="Content" ObjectID="_1611677575" r:id="rId256"/>
         </w:object>
       </w:r>
       <w:r>
@@ -16924,7 +16924,7 @@
           <v:shape id="_x0000_i1151" type="#_x0000_t75" style="width:61.5pt;height:33pt" o:ole="">
             <v:imagedata r:id="rId257" o:title=""/>
           </v:shape>
-          <o:OLEObject Type="Embed" ProgID="Equation.DSMT4" ShapeID="_x0000_i1151" DrawAspect="Content" ObjectID="_1611676685" r:id="rId258"/>
+          <o:OLEObject Type="Embed" ProgID="Equation.DSMT4" ShapeID="_x0000_i1151" DrawAspect="Content" ObjectID="_1611677576" r:id="rId258"/>
         </w:object>
       </w:r>
       <w:r>
@@ -16974,7 +16974,7 @@
           <v:shape id="_x0000_i1152" type="#_x0000_t75" style="width:357pt;height:33pt" o:ole="">
             <v:imagedata r:id="rId259" o:title=""/>
           </v:shape>
-          <o:OLEObject Type="Embed" ProgID="Equation.DSMT4" ShapeID="_x0000_i1152" DrawAspect="Content" ObjectID="_1611676686" r:id="rId260"/>
+          <o:OLEObject Type="Embed" ProgID="Equation.DSMT4" ShapeID="_x0000_i1152" DrawAspect="Content" ObjectID="_1611677577" r:id="rId260"/>
         </w:object>
       </w:r>
     </w:p>
@@ -17002,7 +17002,7 @@
           <v:shape id="_x0000_i1153" type="#_x0000_t75" style="width:418.5pt;height:34.5pt" o:ole="">
             <v:imagedata r:id="rId261" o:title=""/>
           </v:shape>
-          <o:OLEObject Type="Embed" ProgID="Equation.DSMT4" ShapeID="_x0000_i1153" DrawAspect="Content" ObjectID="_1611676687" r:id="rId262"/>
+          <o:OLEObject Type="Embed" ProgID="Equation.DSMT4" ShapeID="_x0000_i1153" DrawAspect="Content" ObjectID="_1611677578" r:id="rId262"/>
         </w:object>
       </w:r>
     </w:p>
@@ -17046,7 +17046,7 @@
           <v:shape id="_x0000_i1154" type="#_x0000_t75" style="width:76.5pt;height:19.5pt" o:ole="">
             <v:imagedata r:id="rId263" o:title=""/>
           </v:shape>
-          <o:OLEObject Type="Embed" ProgID="Equation.DSMT4" ShapeID="_x0000_i1154" DrawAspect="Content" ObjectID="_1611676688" r:id="rId264"/>
+          <o:OLEObject Type="Embed" ProgID="Equation.DSMT4" ShapeID="_x0000_i1154" DrawAspect="Content" ObjectID="_1611677579" r:id="rId264"/>
         </w:object>
       </w:r>
       <w:r>
@@ -17070,7 +17070,7 @@
           <v:shape id="_x0000_i1155" type="#_x0000_t75" style="width:277.5pt;height:19.5pt" o:ole="">
             <v:imagedata r:id="rId265" o:title=""/>
           </v:shape>
-          <o:OLEObject Type="Embed" ProgID="Equation.DSMT4" ShapeID="_x0000_i1155" DrawAspect="Content" ObjectID="_1611676689" r:id="rId266"/>
+          <o:OLEObject Type="Embed" ProgID="Equation.DSMT4" ShapeID="_x0000_i1155" DrawAspect="Content" ObjectID="_1611677580" r:id="rId266"/>
         </w:object>
       </w:r>
     </w:p>
@@ -17098,7 +17098,7 @@
           <v:shape id="_x0000_i1156" type="#_x0000_t75" style="width:205.5pt;height:19.5pt" o:ole="">
             <v:imagedata r:id="rId267" o:title=""/>
           </v:shape>
-          <o:OLEObject Type="Embed" ProgID="Equation.DSMT4" ShapeID="_x0000_i1156" DrawAspect="Content" ObjectID="_1611676690" r:id="rId268"/>
+          <o:OLEObject Type="Embed" ProgID="Equation.DSMT4" ShapeID="_x0000_i1156" DrawAspect="Content" ObjectID="_1611677581" r:id="rId268"/>
         </w:object>
       </w:r>
     </w:p>
@@ -17145,7 +17145,7 @@
           <v:shape id="_x0000_i1157" type="#_x0000_t75" style="width:58.5pt;height:16.5pt" o:ole="">
             <v:imagedata r:id="rId269" o:title=""/>
           </v:shape>
-          <o:OLEObject Type="Embed" ProgID="Equation.DSMT4" ShapeID="_x0000_i1157" DrawAspect="Content" ObjectID="_1611676691" r:id="rId270"/>
+          <o:OLEObject Type="Embed" ProgID="Equation.DSMT4" ShapeID="_x0000_i1157" DrawAspect="Content" ObjectID="_1611677582" r:id="rId270"/>
         </w:object>
       </w:r>
       <w:r>
@@ -17170,7 +17170,7 @@
           <v:shape id="_x0000_i1158" type="#_x0000_t75" style="width:373.5pt;height:34.5pt" o:ole="">
             <v:imagedata r:id="rId271" o:title=""/>
           </v:shape>
-          <o:OLEObject Type="Embed" ProgID="Equation.DSMT4" ShapeID="_x0000_i1158" DrawAspect="Content" ObjectID="_1611676692" r:id="rId272"/>
+          <o:OLEObject Type="Embed" ProgID="Equation.DSMT4" ShapeID="_x0000_i1158" DrawAspect="Content" ObjectID="_1611677583" r:id="rId272"/>
         </w:object>
       </w:r>
       <w:r>
@@ -17216,7 +17216,7 @@
           <v:shape id="_x0000_i1159" type="#_x0000_t75" style="width:361.5pt;height:43.5pt" o:ole="">
             <v:imagedata r:id="rId273" o:title=""/>
           </v:shape>
-          <o:OLEObject Type="Embed" ProgID="Equation.DSMT4" ShapeID="_x0000_i1159" DrawAspect="Content" ObjectID="_1611676693" r:id="rId274"/>
+          <o:OLEObject Type="Embed" ProgID="Equation.DSMT4" ShapeID="_x0000_i1159" DrawAspect="Content" ObjectID="_1611677584" r:id="rId274"/>
         </w:object>
       </w:r>
     </w:p>
@@ -17345,7 +17345,7 @@
           <v:shape id="_x0000_i1160" type="#_x0000_t75" style="width:27pt;height:13.5pt" o:ole="">
             <v:imagedata r:id="rId275" o:title=""/>
           </v:shape>
-          <o:OLEObject Type="Embed" ProgID="Equation.DSMT4" ShapeID="_x0000_i1160" DrawAspect="Content" ObjectID="_1611676694" r:id="rId276"/>
+          <o:OLEObject Type="Embed" ProgID="Equation.DSMT4" ShapeID="_x0000_i1160" DrawAspect="Content" ObjectID="_1611677585" r:id="rId276"/>
         </w:object>
       </w:r>
       <w:r>
@@ -17388,7 +17388,7 @@
           <v:shape id="_x0000_i1161" type="#_x0000_t75" style="width:81pt;height:33pt" o:ole="">
             <v:imagedata r:id="rId277" o:title=""/>
           </v:shape>
-          <o:OLEObject Type="Embed" ProgID="Equation.DSMT4" ShapeID="_x0000_i1161" DrawAspect="Content" ObjectID="_1611676695" r:id="rId278"/>
+          <o:OLEObject Type="Embed" ProgID="Equation.DSMT4" ShapeID="_x0000_i1161" DrawAspect="Content" ObjectID="_1611677586" r:id="rId278"/>
         </w:object>
       </w:r>
     </w:p>
@@ -17478,7 +17478,7 @@
           <v:shape id="_x0000_i1162" type="#_x0000_t75" style="width:19.5pt;height:18pt" o:ole="">
             <v:imagedata r:id="rId279" o:title=""/>
           </v:shape>
-          <o:OLEObject Type="Embed" ProgID="Equation.DSMT4" ShapeID="_x0000_i1162" DrawAspect="Content" ObjectID="_1611676696" r:id="rId280"/>
+          <o:OLEObject Type="Embed" ProgID="Equation.DSMT4" ShapeID="_x0000_i1162" DrawAspect="Content" ObjectID="_1611677587" r:id="rId280"/>
         </w:object>
       </w:r>
     </w:p>
@@ -17517,7 +17517,7 @@
           <v:shape id="_x0000_i1163" type="#_x0000_t75" style="width:103.5pt;height:46.5pt" o:ole="">
             <v:imagedata r:id="rId281" o:title=""/>
           </v:shape>
-          <o:OLEObject Type="Embed" ProgID="Equation.DSMT4" ShapeID="_x0000_i1163" DrawAspect="Content" ObjectID="_1611676697" r:id="rId282"/>
+          <o:OLEObject Type="Embed" ProgID="Equation.DSMT4" ShapeID="_x0000_i1163" DrawAspect="Content" ObjectID="_1611677588" r:id="rId282"/>
         </w:object>
       </w:r>
       <w:commentRangeEnd w:id="23"/>
@@ -17611,7 +17611,7 @@
           <v:shape id="_x0000_i1164" type="#_x0000_t75" style="width:129pt;height:19.5pt" o:ole="">
             <v:imagedata r:id="rId283" o:title=""/>
           </v:shape>
-          <o:OLEObject Type="Embed" ProgID="Equation.DSMT4" ShapeID="_x0000_i1164" DrawAspect="Content" ObjectID="_1611676698" r:id="rId284"/>
+          <o:OLEObject Type="Embed" ProgID="Equation.DSMT4" ShapeID="_x0000_i1164" DrawAspect="Content" ObjectID="_1611677589" r:id="rId284"/>
         </w:object>
       </w:r>
       <w:commentRangeEnd w:id="24"/>
@@ -17674,7 +17674,7 @@
           <v:shape id="_x0000_i1165" type="#_x0000_t75" style="width:34.5pt;height:18pt" o:ole="">
             <v:imagedata r:id="rId285" o:title=""/>
           </v:shape>
-          <o:OLEObject Type="Embed" ProgID="Equation.DSMT4" ShapeID="_x0000_i1165" DrawAspect="Content" ObjectID="_1611676699" r:id="rId286"/>
+          <o:OLEObject Type="Embed" ProgID="Equation.DSMT4" ShapeID="_x0000_i1165" DrawAspect="Content" ObjectID="_1611677590" r:id="rId286"/>
         </w:object>
       </w:r>
       <w:r>
@@ -17733,7 +17733,7 @@
           <v:shape id="_x0000_i1166" type="#_x0000_t75" style="width:118.5pt;height:46.5pt" o:ole="">
             <v:imagedata r:id="rId287" o:title=""/>
           </v:shape>
-          <o:OLEObject Type="Embed" ProgID="Equation.DSMT4" ShapeID="_x0000_i1166" DrawAspect="Content" ObjectID="_1611676700" r:id="rId288"/>
+          <o:OLEObject Type="Embed" ProgID="Equation.DSMT4" ShapeID="_x0000_i1166" DrawAspect="Content" ObjectID="_1611677591" r:id="rId288"/>
         </w:object>
       </w:r>
       <w:commentRangeEnd w:id="25"/>
@@ -17766,7 +17766,7 @@
           <v:shape id="_x0000_i1167" type="#_x0000_t75" style="width:99pt;height:24pt" o:ole="">
             <v:imagedata r:id="rId289" o:title=""/>
           </v:shape>
-          <o:OLEObject Type="Embed" ProgID="Equation.DSMT4" ShapeID="_x0000_i1167" DrawAspect="Content" ObjectID="_1611676701" r:id="rId290"/>
+          <o:OLEObject Type="Embed" ProgID="Equation.DSMT4" ShapeID="_x0000_i1167" DrawAspect="Content" ObjectID="_1611677592" r:id="rId290"/>
         </w:object>
       </w:r>
       <w:r>
@@ -17891,7 +17891,7 @@
           <v:shape id="_x0000_i1168" type="#_x0000_t75" style="width:145.5pt;height:18pt" o:ole="">
             <v:imagedata r:id="rId291" o:title=""/>
           </v:shape>
-          <o:OLEObject Type="Embed" ProgID="Equation.DSMT4" ShapeID="_x0000_i1168" DrawAspect="Content" ObjectID="_1611676702" r:id="rId292"/>
+          <o:OLEObject Type="Embed" ProgID="Equation.DSMT4" ShapeID="_x0000_i1168" DrawAspect="Content" ObjectID="_1611677593" r:id="rId292"/>
         </w:object>
       </w:r>
       <w:r>
@@ -18015,7 +18015,7 @@
           <v:shape id="_x0000_i1169" type="#_x0000_t75" style="width:40.5pt;height:16.5pt" o:ole="">
             <v:imagedata r:id="rId293" o:title=""/>
           </v:shape>
-          <o:OLEObject Type="Embed" ProgID="Equation.DSMT4" ShapeID="_x0000_i1169" DrawAspect="Content" ObjectID="_1611676703" r:id="rId294"/>
+          <o:OLEObject Type="Embed" ProgID="Equation.DSMT4" ShapeID="_x0000_i1169" DrawAspect="Content" ObjectID="_1611677594" r:id="rId294"/>
         </w:object>
       </w:r>
       <w:r>
@@ -18102,7 +18102,7 @@
           <v:shape id="_x0000_i1170" type="#_x0000_t75" style="width:49.5pt;height:18pt" o:ole="">
             <v:imagedata r:id="rId295" o:title=""/>
           </v:shape>
-          <o:OLEObject Type="Embed" ProgID="Equation.DSMT4" ShapeID="_x0000_i1170" DrawAspect="Content" ObjectID="_1611676704" r:id="rId296"/>
+          <o:OLEObject Type="Embed" ProgID="Equation.DSMT4" ShapeID="_x0000_i1170" DrawAspect="Content" ObjectID="_1611677595" r:id="rId296"/>
         </w:object>
       </w:r>
       <w:r>
@@ -18231,7 +18231,7 @@
           <v:shape id="_x0000_i1171" type="#_x0000_t75" style="width:193.5pt;height:46.5pt" o:ole="">
             <v:imagedata r:id="rId297" o:title=""/>
           </v:shape>
-          <o:OLEObject Type="Embed" ProgID="Equation.DSMT4" ShapeID="_x0000_i1171" DrawAspect="Content" ObjectID="_1611676705" r:id="rId298"/>
+          <o:OLEObject Type="Embed" ProgID="Equation.DSMT4" ShapeID="_x0000_i1171" DrawAspect="Content" ObjectID="_1611677596" r:id="rId298"/>
         </w:object>
       </w:r>
     </w:p>
@@ -18264,7 +18264,7 @@
           <v:shape id="_x0000_i1172" type="#_x0000_t75" style="width:358.5pt;height:55.5pt" o:ole="">
             <v:imagedata r:id="rId299" o:title=""/>
           </v:shape>
-          <o:OLEObject Type="Embed" ProgID="Equation.DSMT4" ShapeID="_x0000_i1172" DrawAspect="Content" ObjectID="_1611676706" r:id="rId300"/>
+          <o:OLEObject Type="Embed" ProgID="Equation.DSMT4" ShapeID="_x0000_i1172" DrawAspect="Content" ObjectID="_1611677597" r:id="rId300"/>
         </w:object>
       </w:r>
       <w:commentRangeEnd w:id="26"/>
@@ -18273,13 +18273,13 @@
         <w:rPr>
           <w:rStyle w:val="CommentReference"/>
         </w:rPr>
+        <w:commentReference w:id="26"/>
+      </w:r>
+      <w:r>
+        <w:rPr>
+          <w:rStyle w:val="CommentReference"/>
+        </w:rPr>
         <w:commentReference w:id="27"/>
-      </w:r>
-      <w:r>
-        <w:rPr>
-          <w:rStyle w:val="CommentReference"/>
-        </w:rPr>
-        <w:commentReference w:id="26"/>
       </w:r>
     </w:p>
     <w:p>
@@ -18307,7 +18307,7 @@
           <v:shape id="_x0000_i1173" type="#_x0000_t75" style="width:333pt;height:55.5pt" o:ole="">
             <v:imagedata r:id="rId301" o:title=""/>
           </v:shape>
-          <o:OLEObject Type="Embed" ProgID="Equation.DSMT4" ShapeID="_x0000_i1173" DrawAspect="Content" ObjectID="_1611676707" r:id="rId302"/>
+          <o:OLEObject Type="Embed" ProgID="Equation.DSMT4" ShapeID="_x0000_i1173" DrawAspect="Content" ObjectID="_1611677598" r:id="rId302"/>
         </w:object>
       </w:r>
     </w:p>
@@ -18364,7 +18364,7 @@
           <v:shape id="_x0000_i1174" type="#_x0000_t75" style="width:169.5pt;height:18pt" o:ole="">
             <v:imagedata r:id="rId303" o:title=""/>
           </v:shape>
-          <o:OLEObject Type="Embed" ProgID="Equation.DSMT4" ShapeID="_x0000_i1174" DrawAspect="Content" ObjectID="_1611676708" r:id="rId304"/>
+          <o:OLEObject Type="Embed" ProgID="Equation.DSMT4" ShapeID="_x0000_i1174" DrawAspect="Content" ObjectID="_1611677599" r:id="rId304"/>
         </w:object>
       </w:r>
       <w:r>
@@ -18438,7 +18438,7 @@
           <v:shape id="_x0000_i1175" type="#_x0000_t75" style="width:34.5pt;height:19.5pt" o:ole="">
             <v:imagedata r:id="rId212" o:title=""/>
           </v:shape>
-          <o:OLEObject Type="Embed" ProgID="Equation.DSMT4" ShapeID="_x0000_i1175" DrawAspect="Content" ObjectID="_1611676709" r:id="rId305"/>
+          <o:OLEObject Type="Embed" ProgID="Equation.DSMT4" ShapeID="_x0000_i1175" DrawAspect="Content" ObjectID="_1611677600" r:id="rId305"/>
         </w:object>
       </w:r>
       <w:r>
@@ -18484,7 +18484,7 @@
           <v:shape id="_x0000_i1176" type="#_x0000_t75" style="width:34.5pt;height:19.5pt" o:ole="">
             <v:imagedata r:id="rId216" o:title=""/>
           </v:shape>
-          <o:OLEObject Type="Embed" ProgID="Equation.DSMT4" ShapeID="_x0000_i1176" DrawAspect="Content" ObjectID="_1611676710" r:id="rId306"/>
+          <o:OLEObject Type="Embed" ProgID="Equation.DSMT4" ShapeID="_x0000_i1176" DrawAspect="Content" ObjectID="_1611677601" r:id="rId306"/>
         </w:object>
       </w:r>
       <w:r>
@@ -18533,7 +18533,7 @@
           <v:shape id="_x0000_i1177" type="#_x0000_t75" style="width:301.5pt;height:55.5pt" o:ole="">
             <v:imagedata r:id="rId307" o:title=""/>
           </v:shape>
-          <o:OLEObject Type="Embed" ProgID="Equation.DSMT4" ShapeID="_x0000_i1177" DrawAspect="Content" ObjectID="_1611676711" r:id="rId308"/>
+          <o:OLEObject Type="Embed" ProgID="Equation.DSMT4" ShapeID="_x0000_i1177" DrawAspect="Content" ObjectID="_1611677602" r:id="rId308"/>
         </w:object>
       </w:r>
     </w:p>
@@ -18581,7 +18581,7 @@
           <v:shape id="_x0000_i1178" type="#_x0000_t75" style="width:139.5pt;height:36pt" o:ole="">
             <v:imagedata r:id="rId309" o:title=""/>
           </v:shape>
-          <o:OLEObject Type="Embed" ProgID="Equation.DSMT4" ShapeID="_x0000_i1178" DrawAspect="Content" ObjectID="_1611676712" r:id="rId310"/>
+          <o:OLEObject Type="Embed" ProgID="Equation.DSMT4" ShapeID="_x0000_i1178" DrawAspect="Content" ObjectID="_1611677603" r:id="rId310"/>
         </w:object>
       </w:r>
     </w:p>
@@ -18608,7 +18608,7 @@
           <v:shape id="_x0000_i1179" type="#_x0000_t75" style="width:380.25pt;height:37.5pt" o:ole="">
             <v:imagedata r:id="rId311" o:title=""/>
           </v:shape>
-          <o:OLEObject Type="Embed" ProgID="Equation.DSMT4" ShapeID="_x0000_i1179" DrawAspect="Content" ObjectID="_1611676713" r:id="rId312"/>
+          <o:OLEObject Type="Embed" ProgID="Equation.DSMT4" ShapeID="_x0000_i1179" DrawAspect="Content" ObjectID="_1611677604" r:id="rId312"/>
         </w:object>
       </w:r>
     </w:p>
@@ -18637,7 +18637,7 @@
           <v:shape id="_x0000_i1180" type="#_x0000_t75" style="width:152.25pt;height:61.5pt" o:ole="">
             <v:imagedata r:id="rId313" o:title=""/>
           </v:shape>
-          <o:OLEObject Type="Embed" ProgID="Equation.DSMT4" ShapeID="_x0000_i1180" DrawAspect="Content" ObjectID="_1611676714" r:id="rId314"/>
+          <o:OLEObject Type="Embed" ProgID="Equation.DSMT4" ShapeID="_x0000_i1180" DrawAspect="Content" ObjectID="_1611677605" r:id="rId314"/>
         </w:object>
       </w:r>
     </w:p>
@@ -18666,7 +18666,7 @@
           <v:shape id="_x0000_i1181" type="#_x0000_t75" style="width:142.5pt;height:37.5pt" o:ole="">
             <v:imagedata r:id="rId315" o:title=""/>
           </v:shape>
-          <o:OLEObject Type="Embed" ProgID="Equation.DSMT4" ShapeID="_x0000_i1181" DrawAspect="Content" ObjectID="_1611676715" r:id="rId316"/>
+          <o:OLEObject Type="Embed" ProgID="Equation.DSMT4" ShapeID="_x0000_i1181" DrawAspect="Content" ObjectID="_1611677606" r:id="rId316"/>
         </w:object>
       </w:r>
     </w:p>
@@ -18696,7 +18696,7 @@
           <v:shape id="_x0000_i1182" type="#_x0000_t75" style="width:31.5pt;height:18pt" o:ole="">
             <v:imagedata r:id="rId317" o:title=""/>
           </v:shape>
-          <o:OLEObject Type="Embed" ProgID="Equation.DSMT4" ShapeID="_x0000_i1182" DrawAspect="Content" ObjectID="_1611676716" r:id="rId318"/>
+          <o:OLEObject Type="Embed" ProgID="Equation.DSMT4" ShapeID="_x0000_i1182" DrawAspect="Content" ObjectID="_1611677607" r:id="rId318"/>
         </w:object>
       </w:r>
       <w:r>
@@ -18748,7 +18748,7 @@
           <v:shape id="_x0000_i1183" type="#_x0000_t75" style="width:256.5pt;height:37.5pt" o:ole="">
             <v:imagedata r:id="rId319" o:title=""/>
           </v:shape>
-          <o:OLEObject Type="Embed" ProgID="Equation.DSMT4" ShapeID="_x0000_i1183" DrawAspect="Content" ObjectID="_1611676717" r:id="rId320"/>
+          <o:OLEObject Type="Embed" ProgID="Equation.DSMT4" ShapeID="_x0000_i1183" DrawAspect="Content" ObjectID="_1611677608" r:id="rId320"/>
         </w:object>
       </w:r>
       <w:r>
@@ -18786,7 +18786,7 @@
           <v:shape id="_x0000_i1184" type="#_x0000_t75" style="width:118.5pt;height:19.5pt" o:ole="">
             <v:imagedata r:id="rId321" o:title=""/>
           </v:shape>
-          <o:OLEObject Type="Embed" ProgID="Equation.DSMT4" ShapeID="_x0000_i1184" DrawAspect="Content" ObjectID="_1611676718" r:id="rId322"/>
+          <o:OLEObject Type="Embed" ProgID="Equation.DSMT4" ShapeID="_x0000_i1184" DrawAspect="Content" ObjectID="_1611677609" r:id="rId322"/>
         </w:object>
       </w:r>
     </w:p>
@@ -18815,7 +18815,7 @@
           <v:shape id="_x0000_i1185" type="#_x0000_t75" style="width:361.5pt;height:37.5pt" o:ole="">
             <v:imagedata r:id="rId323" o:title=""/>
           </v:shape>
-          <o:OLEObject Type="Embed" ProgID="Equation.DSMT4" ShapeID="_x0000_i1185" DrawAspect="Content" ObjectID="_1611676719" r:id="rId324"/>
+          <o:OLEObject Type="Embed" ProgID="Equation.DSMT4" ShapeID="_x0000_i1185" DrawAspect="Content" ObjectID="_1611677610" r:id="rId324"/>
         </w:object>
       </w:r>
     </w:p>
@@ -18860,7 +18860,7 @@
           <v:shape id="_x0000_i1186" type="#_x0000_t75" style="width:31.5pt;height:13.5pt" o:ole="">
             <v:imagedata r:id="rId325" o:title=""/>
           </v:shape>
-          <o:OLEObject Type="Embed" ProgID="Equation.DSMT4" ShapeID="_x0000_i1186" DrawAspect="Content" ObjectID="_1611676720" r:id="rId326"/>
+          <o:OLEObject Type="Embed" ProgID="Equation.DSMT4" ShapeID="_x0000_i1186" DrawAspect="Content" ObjectID="_1611677611" r:id="rId326"/>
         </w:object>
       </w:r>
       <w:r>
@@ -18892,7 +18892,7 @@
           <v:shape id="_x0000_i1187" type="#_x0000_t75" style="width:37.5pt;height:13.5pt" o:ole="">
             <v:imagedata r:id="rId327" o:title=""/>
           </v:shape>
-          <o:OLEObject Type="Embed" ProgID="Equation.DSMT4" ShapeID="_x0000_i1187" DrawAspect="Content" ObjectID="_1611676721" r:id="rId328"/>
+          <o:OLEObject Type="Embed" ProgID="Equation.DSMT4" ShapeID="_x0000_i1187" DrawAspect="Content" ObjectID="_1611677612" r:id="rId328"/>
         </w:object>
       </w:r>
       <w:r>
@@ -18937,7 +18937,7 @@
           <v:shape id="_x0000_i1188" type="#_x0000_t75" style="width:328.5pt;height:36pt" o:ole="">
             <v:imagedata r:id="rId329" o:title=""/>
           </v:shape>
-          <o:OLEObject Type="Embed" ProgID="Equation.DSMT4" ShapeID="_x0000_i1188" DrawAspect="Content" ObjectID="_1611676722" r:id="rId330"/>
+          <o:OLEObject Type="Embed" ProgID="Equation.DSMT4" ShapeID="_x0000_i1188" DrawAspect="Content" ObjectID="_1611677613" r:id="rId330"/>
         </w:object>
       </w:r>
     </w:p>
@@ -18966,7 +18966,7 @@
           <v:shape id="_x0000_i1189" type="#_x0000_t75" style="width:231.75pt;height:17.25pt" o:ole="">
             <v:imagedata r:id="rId331" o:title=""/>
           </v:shape>
-          <o:OLEObject Type="Embed" ProgID="Equation.DSMT4" ShapeID="_x0000_i1189" DrawAspect="Content" ObjectID="_1611676723" r:id="rId332"/>
+          <o:OLEObject Type="Embed" ProgID="Equation.DSMT4" ShapeID="_x0000_i1189" DrawAspect="Content" ObjectID="_1611677614" r:id="rId332"/>
         </w:object>
       </w:r>
     </w:p>
@@ -19014,7 +19014,7 @@
           <v:shape id="_x0000_i1190" type="#_x0000_t75" style="width:31.5pt;height:13.5pt" o:ole="">
             <v:imagedata r:id="rId333" o:title=""/>
           </v:shape>
-          <o:OLEObject Type="Embed" ProgID="Equation.DSMT4" ShapeID="_x0000_i1190" DrawAspect="Content" ObjectID="_1611676724" r:id="rId334"/>
+          <o:OLEObject Type="Embed" ProgID="Equation.DSMT4" ShapeID="_x0000_i1190" DrawAspect="Content" ObjectID="_1611677615" r:id="rId334"/>
         </w:object>
       </w:r>
       <w:r>
@@ -19048,7 +19048,7 @@
           <v:shape id="_x0000_i1191" type="#_x0000_t75" style="width:37.5pt;height:13.5pt" o:ole="">
             <v:imagedata r:id="rId335" o:title=""/>
           </v:shape>
-          <o:OLEObject Type="Embed" ProgID="Equation.DSMT4" ShapeID="_x0000_i1191" DrawAspect="Content" ObjectID="_1611676725" r:id="rId336"/>
+          <o:OLEObject Type="Embed" ProgID="Equation.DSMT4" ShapeID="_x0000_i1191" DrawAspect="Content" ObjectID="_1611677616" r:id="rId336"/>
         </w:object>
       </w:r>
       <w:r>
@@ -19091,7 +19091,7 @@
           <v:shape id="_x0000_i1192" type="#_x0000_t75" style="width:12pt;height:10.5pt" o:ole="">
             <v:imagedata r:id="rId337" o:title=""/>
           </v:shape>
-          <o:OLEObject Type="Embed" ProgID="Equation.DSMT4" ShapeID="_x0000_i1192" DrawAspect="Content" ObjectID="_1611676726" r:id="rId338"/>
+          <o:OLEObject Type="Embed" ProgID="Equation.DSMT4" ShapeID="_x0000_i1192" DrawAspect="Content" ObjectID="_1611677617" r:id="rId338"/>
         </w:object>
       </w:r>
       <w:r>
@@ -19138,7 +19138,7 @@
           <v:shape id="_x0000_i1193" type="#_x0000_t75" style="width:436.5pt;height:36pt" o:ole="">
             <v:imagedata r:id="rId339" o:title=""/>
           </v:shape>
-          <o:OLEObject Type="Embed" ProgID="Equation.DSMT4" ShapeID="_x0000_i1193" DrawAspect="Content" ObjectID="_1611676727" r:id="rId340"/>
+          <o:OLEObject Type="Embed" ProgID="Equation.DSMT4" ShapeID="_x0000_i1193" DrawAspect="Content" ObjectID="_1611677618" r:id="rId340"/>
         </w:object>
       </w:r>
     </w:p>
@@ -19222,7 +19222,7 @@
           <v:shape id="_x0000_i1194" type="#_x0000_t75" style="width:223.5pt;height:36pt" o:ole="">
             <v:imagedata r:id="rId341" o:title=""/>
           </v:shape>
-          <o:OLEObject Type="Embed" ProgID="Equation.DSMT4" ShapeID="_x0000_i1194" DrawAspect="Content" ObjectID="_1611676728" r:id="rId342"/>
+          <o:OLEObject Type="Embed" ProgID="Equation.DSMT4" ShapeID="_x0000_i1194" DrawAspect="Content" ObjectID="_1611677619" r:id="rId342"/>
         </w:object>
       </w:r>
       <w:r>
@@ -19427,7 +19427,7 @@
           <v:shape id="_x0000_i1195" type="#_x0000_t75" style="width:301.5pt;height:22.5pt" o:ole="">
             <v:imagedata r:id="rId343" o:title=""/>
           </v:shape>
-          <o:OLEObject Type="Embed" ProgID="Equation.DSMT4" ShapeID="_x0000_i1195" DrawAspect="Content" ObjectID="_1611676729" r:id="rId344"/>
+          <o:OLEObject Type="Embed" ProgID="Equation.DSMT4" ShapeID="_x0000_i1195" DrawAspect="Content" ObjectID="_1611677620" r:id="rId344"/>
         </w:object>
       </w:r>
       <w:r>
@@ -19587,7 +19587,7 @@
           <v:shape id="_x0000_i1196" type="#_x0000_t75" style="width:31.5pt;height:13.5pt" o:ole="">
             <v:imagedata r:id="rId333" o:title=""/>
           </v:shape>
-          <o:OLEObject Type="Embed" ProgID="Equation.DSMT4" ShapeID="_x0000_i1196" DrawAspect="Content" ObjectID="_1611676730" r:id="rId345"/>
+          <o:OLEObject Type="Embed" ProgID="Equation.DSMT4" ShapeID="_x0000_i1196" DrawAspect="Content" ObjectID="_1611677621" r:id="rId345"/>
         </w:object>
       </w:r>
       <w:r>
@@ -19621,7 +19621,7 @@
           <v:shape id="_x0000_i1197" type="#_x0000_t75" style="width:37.5pt;height:13.5pt" o:ole="">
             <v:imagedata r:id="rId335" o:title=""/>
           </v:shape>
-          <o:OLEObject Type="Embed" ProgID="Equation.DSMT4" ShapeID="_x0000_i1197" DrawAspect="Content" ObjectID="_1611676731" r:id="rId346"/>
+          <o:OLEObject Type="Embed" ProgID="Equation.DSMT4" ShapeID="_x0000_i1197" DrawAspect="Content" ObjectID="_1611677622" r:id="rId346"/>
         </w:object>
       </w:r>
       <w:r>
@@ -19664,7 +19664,7 @@
           <v:shape id="_x0000_i1198" type="#_x0000_t75" style="width:12pt;height:10.5pt" o:ole="">
             <v:imagedata r:id="rId337" o:title=""/>
           </v:shape>
-          <o:OLEObject Type="Embed" ProgID="Equation.DSMT4" ShapeID="_x0000_i1198" DrawAspect="Content" ObjectID="_1611676732" r:id="rId347"/>
+          <o:OLEObject Type="Embed" ProgID="Equation.DSMT4" ShapeID="_x0000_i1198" DrawAspect="Content" ObjectID="_1611677623" r:id="rId347"/>
         </w:object>
       </w:r>
       <w:r>
@@ -19734,7 +19734,7 @@
           <v:shape id="_x0000_i1199" type="#_x0000_t75" style="width:301.5pt;height:37.5pt" o:ole="">
             <v:imagedata r:id="rId348" o:title=""/>
           </v:shape>
-          <o:OLEObject Type="Embed" ProgID="Equation.DSMT4" ShapeID="_x0000_i1199" DrawAspect="Content" ObjectID="_1611676733" r:id="rId349"/>
+          <o:OLEObject Type="Embed" ProgID="Equation.DSMT4" ShapeID="_x0000_i1199" DrawAspect="Content" ObjectID="_1611677624" r:id="rId349"/>
         </w:object>
       </w:r>
     </w:p>
@@ -19763,7 +19763,7 @@
           <v:shape id="_x0000_i1200" type="#_x0000_t75" style="width:331.5pt;height:28.5pt" o:ole="">
             <v:imagedata r:id="rId350" o:title=""/>
           </v:shape>
-          <o:OLEObject Type="Embed" ProgID="Equation.DSMT4" ShapeID="_x0000_i1200" DrawAspect="Content" ObjectID="_1611676734" r:id="rId351"/>
+          <o:OLEObject Type="Embed" ProgID="Equation.DSMT4" ShapeID="_x0000_i1200" DrawAspect="Content" ObjectID="_1611677625" r:id="rId351"/>
         </w:object>
       </w:r>
       <w:r>
@@ -19787,7 +19787,7 @@
           <v:shape id="_x0000_i1201" type="#_x0000_t75" style="width:10.5pt;height:15pt" o:ole="">
             <v:imagedata r:id="rId352" o:title=""/>
           </v:shape>
-          <o:OLEObject Type="Embed" ProgID="Equation.DSMT4" ShapeID="_x0000_i1201" DrawAspect="Content" ObjectID="_1611676735" r:id="rId353"/>
+          <o:OLEObject Type="Embed" ProgID="Equation.DSMT4" ShapeID="_x0000_i1201" DrawAspect="Content" ObjectID="_1611677626" r:id="rId353"/>
         </w:object>
       </w:r>
       <w:r>
@@ -19822,7 +19822,7 @@
           <v:shape id="_x0000_i1202" type="#_x0000_t75" style="width:247.5pt;height:22.5pt" o:ole="">
             <v:imagedata r:id="rId354" o:title=""/>
           </v:shape>
-          <o:OLEObject Type="Embed" ProgID="Equation.DSMT4" ShapeID="_x0000_i1202" DrawAspect="Content" ObjectID="_1611676736" r:id="rId355"/>
+          <o:OLEObject Type="Embed" ProgID="Equation.DSMT4" ShapeID="_x0000_i1202" DrawAspect="Content" ObjectID="_1611677627" r:id="rId355"/>
         </w:object>
       </w:r>
       <w:r>
@@ -19857,7 +19857,7 @@
           <v:shape id="_x0000_i1203" type="#_x0000_t75" style="width:289.5pt;height:22.5pt" o:ole="">
             <v:imagedata r:id="rId356" o:title=""/>
           </v:shape>
-          <o:OLEObject Type="Embed" ProgID="Equation.DSMT4" ShapeID="_x0000_i1203" DrawAspect="Content" ObjectID="_1611676737" r:id="rId357"/>
+          <o:OLEObject Type="Embed" ProgID="Equation.DSMT4" ShapeID="_x0000_i1203" DrawAspect="Content" ObjectID="_1611677628" r:id="rId357"/>
         </w:object>
       </w:r>
       <w:r>
@@ -19892,7 +19892,7 @@
           <v:shape id="_x0000_i1204" type="#_x0000_t75" style="width:400.5pt;height:40.5pt" o:ole="">
             <v:imagedata r:id="rId358" o:title=""/>
           </v:shape>
-          <o:OLEObject Type="Embed" ProgID="Equation.DSMT4" ShapeID="_x0000_i1204" DrawAspect="Content" ObjectID="_1611676738" r:id="rId359"/>
+          <o:OLEObject Type="Embed" ProgID="Equation.DSMT4" ShapeID="_x0000_i1204" DrawAspect="Content" ObjectID="_1611677629" r:id="rId359"/>
         </w:object>
       </w:r>
     </w:p>
@@ -20001,7 +20001,7 @@
           <v:shape id="_x0000_i1205" type="#_x0000_t75" style="width:39pt;height:28.5pt" o:ole="">
             <v:imagedata r:id="rId360" o:title=""/>
           </v:shape>
-          <o:OLEObject Type="Embed" ProgID="Equation.DSMT4" ShapeID="_x0000_i1205" DrawAspect="Content" ObjectID="_1611676739" r:id="rId361"/>
+          <o:OLEObject Type="Embed" ProgID="Equation.DSMT4" ShapeID="_x0000_i1205" DrawAspect="Content" ObjectID="_1611677630" r:id="rId361"/>
         </w:object>
       </w:r>
       <w:r>
@@ -20141,7 +20141,7 @@
           <v:shape id="_x0000_i1206" type="#_x0000_t75" style="width:102pt;height:34.5pt" o:ole="">
             <v:imagedata r:id="rId362" o:title=""/>
           </v:shape>
-          <o:OLEObject Type="Embed" ProgID="Equation.DSMT4" ShapeID="_x0000_i1206" DrawAspect="Content" ObjectID="_1611676740" r:id="rId363"/>
+          <o:OLEObject Type="Embed" ProgID="Equation.DSMT4" ShapeID="_x0000_i1206" DrawAspect="Content" ObjectID="_1611677631" r:id="rId363"/>
         </w:object>
       </w:r>
       <w:r>
@@ -20196,7 +20196,7 @@
           <v:shape id="_x0000_i1207" type="#_x0000_t75" style="width:190.5pt;height:31.5pt" o:ole="">
             <v:imagedata r:id="rId364" o:title=""/>
           </v:shape>
-          <o:OLEObject Type="Embed" ProgID="Equation.DSMT4" ShapeID="_x0000_i1207" DrawAspect="Content" ObjectID="_1611676741" r:id="rId365"/>
+          <o:OLEObject Type="Embed" ProgID="Equation.DSMT4" ShapeID="_x0000_i1207" DrawAspect="Content" ObjectID="_1611677632" r:id="rId365"/>
         </w:object>
       </w:r>
       <w:r>
@@ -20234,7 +20234,7 @@
           <v:shape id="_x0000_i1208" type="#_x0000_t75" style="width:9pt;height:13.5pt" o:ole="">
             <v:imagedata r:id="rId366" o:title=""/>
           </v:shape>
-          <o:OLEObject Type="Embed" ProgID="Equation.DSMT4" ShapeID="_x0000_i1208" DrawAspect="Content" ObjectID="_1611676742" r:id="rId367"/>
+          <o:OLEObject Type="Embed" ProgID="Equation.DSMT4" ShapeID="_x0000_i1208" DrawAspect="Content" ObjectID="_1611677633" r:id="rId367"/>
         </w:object>
       </w:r>
       <w:r>
@@ -20250,7 +20250,7 @@
           <v:shape id="_x0000_i1209" type="#_x0000_t75" style="width:301.5pt;height:37.5pt" o:ole="">
             <v:imagedata r:id="rId348" o:title=""/>
           </v:shape>
-          <o:OLEObject Type="Embed" ProgID="Equation.DSMT4" ShapeID="_x0000_i1209" DrawAspect="Content" ObjectID="_1611676743" r:id="rId368"/>
+          <o:OLEObject Type="Embed" ProgID="Equation.DSMT4" ShapeID="_x0000_i1209" DrawAspect="Content" ObjectID="_1611677634" r:id="rId368"/>
         </w:object>
       </w:r>
       <w:r>
@@ -20266,7 +20266,7 @@
           <v:shape id="_x0000_i1210" type="#_x0000_t75" style="width:336.75pt;height:30pt" o:ole="">
             <v:imagedata r:id="rId369" o:title=""/>
           </v:shape>
-          <o:OLEObject Type="Embed" ProgID="Equation.DSMT4" ShapeID="_x0000_i1210" DrawAspect="Content" ObjectID="_1611676744" r:id="rId370"/>
+          <o:OLEObject Type="Embed" ProgID="Equation.DSMT4" ShapeID="_x0000_i1210" DrawAspect="Content" ObjectID="_1611677635" r:id="rId370"/>
         </w:object>
       </w:r>
     </w:p>
@@ -20304,7 +20304,7 @@
           <v:shape id="_x0000_i1211" type="#_x0000_t75" style="width:93pt;height:19.5pt" o:ole="">
             <v:imagedata r:id="rId371" o:title=""/>
           </v:shape>
-          <o:OLEObject Type="Embed" ProgID="Equation.DSMT4" ShapeID="_x0000_i1211" DrawAspect="Content" ObjectID="_1611676745" r:id="rId372"/>
+          <o:OLEObject Type="Embed" ProgID="Equation.DSMT4" ShapeID="_x0000_i1211" DrawAspect="Content" ObjectID="_1611677636" r:id="rId372"/>
         </w:object>
       </w:r>
       <w:r>
@@ -20348,7 +20348,7 @@
           <v:shape id="_x0000_i1212" type="#_x0000_t75" style="width:168pt;height:19.5pt" o:ole="">
             <v:imagedata r:id="rId373" o:title=""/>
           </v:shape>
-          <o:OLEObject Type="Embed" ProgID="Equation.DSMT4" ShapeID="_x0000_i1212" DrawAspect="Content" ObjectID="_1611676746" r:id="rId374"/>
+          <o:OLEObject Type="Embed" ProgID="Equation.DSMT4" ShapeID="_x0000_i1212" DrawAspect="Content" ObjectID="_1611677637" r:id="rId374"/>
         </w:object>
       </w:r>
       <w:commentRangeEnd w:id="28"/>
@@ -20430,7 +20430,7 @@
           <v:shape id="_x0000_i1213" type="#_x0000_t75" style="width:57pt;height:16.5pt" o:ole="">
             <v:imagedata r:id="rId375" o:title=""/>
           </v:shape>
-          <o:OLEObject Type="Embed" ProgID="Equation.DSMT4" ShapeID="_x0000_i1213" DrawAspect="Content" ObjectID="_1611676747" r:id="rId376"/>
+          <o:OLEObject Type="Embed" ProgID="Equation.DSMT4" ShapeID="_x0000_i1213" DrawAspect="Content" ObjectID="_1611677638" r:id="rId376"/>
         </w:object>
       </w:r>
       <w:r>
@@ -20464,7 +20464,7 @@
           <v:shape id="_x0000_i1214" type="#_x0000_t75" style="width:81pt;height:16.5pt" o:ole="">
             <v:imagedata r:id="rId377" o:title=""/>
           </v:shape>
-          <o:OLEObject Type="Embed" ProgID="Equation.DSMT4" ShapeID="_x0000_i1214" DrawAspect="Content" ObjectID="_1611676748" r:id="rId378"/>
+          <o:OLEObject Type="Embed" ProgID="Equation.DSMT4" ShapeID="_x0000_i1214" DrawAspect="Content" ObjectID="_1611677639" r:id="rId378"/>
         </w:object>
       </w:r>
       <w:r>
@@ -20561,7 +20561,7 @@
           <v:shape id="_x0000_i1215" type="#_x0000_t75" style="width:42pt;height:16.5pt" o:ole="">
             <v:imagedata r:id="rId379" o:title=""/>
           </v:shape>
-          <o:OLEObject Type="Embed" ProgID="Equation.DSMT4" ShapeID="_x0000_i1215" DrawAspect="Content" ObjectID="_1611676749" r:id="rId380"/>
+          <o:OLEObject Type="Embed" ProgID="Equation.DSMT4" ShapeID="_x0000_i1215" DrawAspect="Content" ObjectID="_1611677640" r:id="rId380"/>
         </w:object>
       </w:r>
       <w:r>
@@ -20622,7 +20622,7 @@
           <v:shape id="_x0000_i1216" type="#_x0000_t75" style="width:33pt;height:16.5pt" o:ole="">
             <v:imagedata r:id="rId381" o:title=""/>
           </v:shape>
-          <o:OLEObject Type="Embed" ProgID="Equation.DSMT4" ShapeID="_x0000_i1216" DrawAspect="Content" ObjectID="_1611676750" r:id="rId382"/>
+          <o:OLEObject Type="Embed" ProgID="Equation.DSMT4" ShapeID="_x0000_i1216" DrawAspect="Content" ObjectID="_1611677641" r:id="rId382"/>
         </w:object>
       </w:r>
       <w:r>
@@ -20647,7 +20647,7 @@
           <v:shape id="_x0000_i1217" type="#_x0000_t75" style="width:37.5pt;height:16.5pt" o:ole="">
             <v:imagedata r:id="rId383" o:title=""/>
           </v:shape>
-          <o:OLEObject Type="Embed" ProgID="Equation.DSMT4" ShapeID="_x0000_i1217" DrawAspect="Content" ObjectID="_1611676751" r:id="rId384"/>
+          <o:OLEObject Type="Embed" ProgID="Equation.DSMT4" ShapeID="_x0000_i1217" DrawAspect="Content" ObjectID="_1611677642" r:id="rId384"/>
         </w:object>
       </w:r>
       <w:r>
@@ -20706,7 +20706,7 @@
           <v:shape id="_x0000_i1218" type="#_x0000_t75" style="width:145.5pt;height:31.5pt" o:ole="">
             <v:imagedata r:id="rId385" o:title=""/>
           </v:shape>
-          <o:OLEObject Type="Embed" ProgID="Equation.DSMT4" ShapeID="_x0000_i1218" DrawAspect="Content" ObjectID="_1611676752" r:id="rId386"/>
+          <o:OLEObject Type="Embed" ProgID="Equation.DSMT4" ShapeID="_x0000_i1218" DrawAspect="Content" ObjectID="_1611677643" r:id="rId386"/>
         </w:object>
       </w:r>
     </w:p>
@@ -20734,7 +20734,7 @@
           <v:shape id="_x0000_i1219" type="#_x0000_t75" style="width:217.5pt;height:19.5pt" o:ole="">
             <v:imagedata r:id="rId387" o:title=""/>
           </v:shape>
-          <o:OLEObject Type="Embed" ProgID="Equation.DSMT4" ShapeID="_x0000_i1219" DrawAspect="Content" ObjectID="_1611676753" r:id="rId388"/>
+          <o:OLEObject Type="Embed" ProgID="Equation.DSMT4" ShapeID="_x0000_i1219" DrawAspect="Content" ObjectID="_1611677644" r:id="rId388"/>
         </w:object>
       </w:r>
       <w:r>
@@ -20769,7 +20769,7 @@
           <v:shape id="_x0000_i1220" type="#_x0000_t75" style="width:1in;height:34.5pt" o:ole="">
             <v:imagedata r:id="rId389" o:title=""/>
           </v:shape>
-          <o:OLEObject Type="Embed" ProgID="Equation.DSMT4" ShapeID="_x0000_i1220" DrawAspect="Content" ObjectID="_1611676754" r:id="rId390"/>
+          <o:OLEObject Type="Embed" ProgID="Equation.DSMT4" ShapeID="_x0000_i1220" DrawAspect="Content" ObjectID="_1611677645" r:id="rId390"/>
         </w:object>
       </w:r>
     </w:p>
@@ -20854,7 +20854,7 @@
           <v:shape id="_x0000_i1221" type="#_x0000_t75" style="width:311.25pt;height:43.5pt" o:ole="">
             <v:imagedata r:id="rId391" o:title=""/>
           </v:shape>
-          <o:OLEObject Type="Embed" ProgID="Equation.DSMT4" ShapeID="_x0000_i1221" DrawAspect="Content" ObjectID="_1611676755" r:id="rId392"/>
+          <o:OLEObject Type="Embed" ProgID="Equation.DSMT4" ShapeID="_x0000_i1221" DrawAspect="Content" ObjectID="_1611677646" r:id="rId392"/>
         </w:object>
       </w:r>
       <w:r>
@@ -20893,7 +20893,7 @@
           <v:shape id="_x0000_i1222" type="#_x0000_t75" style="width:91.5pt;height:18pt" o:ole="">
             <v:imagedata r:id="rId393" o:title=""/>
           </v:shape>
-          <o:OLEObject Type="Embed" ProgID="Equation.DSMT4" ShapeID="_x0000_i1222" DrawAspect="Content" ObjectID="_1611676756" r:id="rId394"/>
+          <o:OLEObject Type="Embed" ProgID="Equation.DSMT4" ShapeID="_x0000_i1222" DrawAspect="Content" ObjectID="_1611677647" r:id="rId394"/>
         </w:object>
       </w:r>
       <w:r>
@@ -21505,7 +21505,7 @@
           <v:shape id="_x0000_i1223" type="#_x0000_t75" style="width:42pt;height:21pt" o:ole="">
             <v:imagedata r:id="rId44" o:title=""/>
           </v:shape>
-          <o:OLEObject Type="Embed" ProgID="Equation.DSMT4" ShapeID="_x0000_i1223" DrawAspect="Content" ObjectID="_1611676757" r:id="rId395"/>
+          <o:OLEObject Type="Embed" ProgID="Equation.DSMT4" ShapeID="_x0000_i1223" DrawAspect="Content" ObjectID="_1611677648" r:id="rId395"/>
         </w:object>
       </w:r>
       <w:r>
@@ -21553,7 +21553,7 @@
           <v:shape id="_x0000_i1224" type="#_x0000_t75" style="width:57pt;height:21pt" o:ole="">
             <v:imagedata r:id="rId42" o:title=""/>
           </v:shape>
-          <o:OLEObject Type="Embed" ProgID="Equation.DSMT4" ShapeID="_x0000_i1224" DrawAspect="Content" ObjectID="_1611676758" r:id="rId396"/>
+          <o:OLEObject Type="Embed" ProgID="Equation.DSMT4" ShapeID="_x0000_i1224" DrawAspect="Content" ObjectID="_1611677649" r:id="rId396"/>
         </w:object>
       </w:r>
       <w:r>
@@ -21599,7 +21599,7 @@
           <v:shape id="_x0000_i1225" type="#_x0000_t75" style="width:319.5pt;height:46.5pt" o:ole="">
             <v:imagedata r:id="rId397" o:title=""/>
           </v:shape>
-          <o:OLEObject Type="Embed" ProgID="Equation.DSMT4" ShapeID="_x0000_i1225" DrawAspect="Content" ObjectID="_1611676759" r:id="rId398"/>
+          <o:OLEObject Type="Embed" ProgID="Equation.DSMT4" ShapeID="_x0000_i1225" DrawAspect="Content" ObjectID="_1611677650" r:id="rId398"/>
         </w:object>
       </w:r>
     </w:p>
@@ -21627,7 +21627,7 @@
           <v:shape id="_x0000_i1226" type="#_x0000_t75" style="width:244.5pt;height:46.5pt" o:ole="">
             <v:imagedata r:id="rId50" o:title=""/>
           </v:shape>
-          <o:OLEObject Type="Embed" ProgID="Equation.DSMT4" ShapeID="_x0000_i1226" DrawAspect="Content" ObjectID="_1611676760" r:id="rId399"/>
+          <o:OLEObject Type="Embed" ProgID="Equation.DSMT4" ShapeID="_x0000_i1226" DrawAspect="Content" ObjectID="_1611677651" r:id="rId399"/>
         </w:object>
       </w:r>
     </w:p>
@@ -21655,7 +21655,7 @@
           <v:shape id="_x0000_i1227" type="#_x0000_t75" style="width:226.5pt;height:46.5pt" o:ole="">
             <v:imagedata r:id="rId400" o:title=""/>
           </v:shape>
-          <o:OLEObject Type="Embed" ProgID="Equation.DSMT4" ShapeID="_x0000_i1227" DrawAspect="Content" ObjectID="_1611676761" r:id="rId401"/>
+          <o:OLEObject Type="Embed" ProgID="Equation.DSMT4" ShapeID="_x0000_i1227" DrawAspect="Content" ObjectID="_1611677652" r:id="rId401"/>
         </w:object>
       </w:r>
     </w:p>
@@ -21683,7 +21683,7 @@
           <v:shape id="_x0000_i1228" type="#_x0000_t75" style="width:153pt;height:46.5pt" o:ole="">
             <v:imagedata r:id="rId402" o:title=""/>
           </v:shape>
-          <o:OLEObject Type="Embed" ProgID="Equation.DSMT4" ShapeID="_x0000_i1228" DrawAspect="Content" ObjectID="_1611676762" r:id="rId403"/>
+          <o:OLEObject Type="Embed" ProgID="Equation.DSMT4" ShapeID="_x0000_i1228" DrawAspect="Content" ObjectID="_1611677653" r:id="rId403"/>
         </w:object>
       </w:r>
     </w:p>
@@ -21711,8 +21711,44 @@
           <v:shape id="_x0000_i1229" type="#_x0000_t75" style="width:43.5pt;height:31.5pt" o:ole="">
             <v:imagedata r:id="rId54" o:title=""/>
           </v:shape>
-          <o:OLEObject Type="Embed" ProgID="Equation.DSMT4" ShapeID="_x0000_i1229" DrawAspect="Content" ObjectID="_1611676763" r:id="rId404"/>
+          <o:OLEObject Type="Embed" ProgID="Equation.DSMT4" ShapeID="_x0000_i1229" DrawAspect="Content" ObjectID="_1611677654" r:id="rId404"/>
         </w:object>
+      </w:r>
+    </w:p>
+    <w:commentRangeStart w:id="29"/>
+    <w:p>
+      <w:pPr>
+        <w:spacing w:line="240" w:lineRule="auto"/>
+        <w:ind w:left="360"/>
+        <w:jc w:val="center"/>
+        <w:outlineLvl w:val="0"/>
+        <w:rPr>
+          <w:rFonts w:ascii="Times New Roman" w:hAnsi="Times New Roman"/>
+          <w:sz w:val="28"/>
+          <w:szCs w:val="28"/>
+        </w:rPr>
+      </w:pPr>
+      <w:r>
+        <w:rPr>
+          <w:rFonts w:ascii="Times New Roman" w:eastAsia="Calibri" w:hAnsi="Times New Roman" w:cs="Times New Roman"/>
+          <w:position w:val="-12"/>
+          <w:sz w:val="28"/>
+          <w:szCs w:val="28"/>
+          <w:lang w:val="ru-RU" w:eastAsia="ru-RU"/>
+        </w:rPr>
+        <w:object w:dxaOrig="1596" w:dyaOrig="384" w14:anchorId="43C9338F">
+          <v:shape id="_x0000_i1230" type="#_x0000_t75" style="width:79.5pt;height:19.5pt" o:ole="">
+            <v:imagedata r:id="rId60" o:title=""/>
+          </v:shape>
+          <o:OLEObject Type="Embed" ProgID="Equation.DSMT4" ShapeID="_x0000_i1230" DrawAspect="Content" ObjectID="_1611677655" r:id="rId405"/>
+        </w:object>
+      </w:r>
+      <w:commentRangeEnd w:id="29"/>
+      <w:r>
+        <w:rPr>
+          <w:rStyle w:val="CommentReference"/>
+        </w:rPr>
+        <w:commentReference w:id="29"/>
       </w:r>
     </w:p>
     <w:p>
@@ -21730,16 +21766,16 @@
       <w:r>
         <w:rPr>
           <w:rFonts w:ascii="Times New Roman" w:eastAsia="Calibri" w:hAnsi="Times New Roman" w:cs="Times New Roman"/>
-          <w:position w:val="-12"/>
+          <w:position w:val="-10"/>
           <w:sz w:val="28"/>
           <w:szCs w:val="28"/>
           <w:lang w:val="ru-RU" w:eastAsia="ru-RU"/>
         </w:rPr>
-        <w:object w:dxaOrig="1596" w:dyaOrig="384" w14:anchorId="43C9338F">
-          <v:shape id="_x0000_i1230" type="#_x0000_t75" style="width:79.5pt;height:19.5pt" o:ole="">
-            <v:imagedata r:id="rId60" o:title=""/>
+        <w:object w:dxaOrig="720" w:dyaOrig="360" w14:anchorId="18CBC93F">
+          <v:shape id="_x0000_i1231" type="#_x0000_t75" style="width:36pt;height:18pt" o:ole="">
+            <v:imagedata r:id="rId64" o:title=""/>
           </v:shape>
-          <o:OLEObject Type="Embed" ProgID="Equation.DSMT4" ShapeID="_x0000_i1230" DrawAspect="Content" ObjectID="_1611676764" r:id="rId405"/>
+          <o:OLEObject Type="Embed" ProgID="Equation.DSMT4" ShapeID="_x0000_i1231" DrawAspect="Content" ObjectID="_1611677656" r:id="rId406"/>
         </w:object>
       </w:r>
     </w:p>
@@ -21758,17 +21794,38 @@
       <w:r>
         <w:rPr>
           <w:rFonts w:ascii="Times New Roman" w:eastAsia="Calibri" w:hAnsi="Times New Roman" w:cs="Times New Roman"/>
-          <w:position w:val="-10"/>
+          <w:position w:val="-32"/>
           <w:sz w:val="28"/>
           <w:szCs w:val="28"/>
           <w:lang w:val="ru-RU" w:eastAsia="ru-RU"/>
         </w:rPr>
-        <w:object w:dxaOrig="720" w:dyaOrig="360" w14:anchorId="18CBC93F">
-          <v:shape id="_x0000_i1231" type="#_x0000_t75" style="width:36pt;height:18pt" o:ole="">
-            <v:imagedata r:id="rId64" o:title=""/>
+        <w:object w:dxaOrig="1656" w:dyaOrig="744" w14:anchorId="5CF436A0">
+          <v:shape id="_x0000_i1232" type="#_x0000_t75" style="width:82.5pt;height:37.5pt" o:ole="">
+            <v:imagedata r:id="rId66" o:title=""/>
           </v:shape>
-          <o:OLEObject Type="Embed" ProgID="Equation.DSMT4" ShapeID="_x0000_i1231" DrawAspect="Content" ObjectID="_1611676765" r:id="rId406"/>
+          <o:OLEObject Type="Embed" ProgID="Equation.DSMT4" ShapeID="_x0000_i1232" DrawAspect="Content" ObjectID="_1611677657" r:id="rId407"/>
         </w:object>
+      </w:r>
+    </w:p>
+    <w:p>
+      <w:pPr>
+        <w:spacing w:line="240" w:lineRule="auto"/>
+        <w:ind w:left="360"/>
+        <w:jc w:val="both"/>
+        <w:outlineLvl w:val="0"/>
+        <w:rPr>
+          <w:rFonts w:ascii="Times New Roman" w:hAnsi="Times New Roman"/>
+          <w:sz w:val="28"/>
+          <w:szCs w:val="28"/>
+        </w:rPr>
+      </w:pPr>
+      <w:r>
+        <w:rPr>
+          <w:rFonts w:ascii="Times New Roman" w:hAnsi="Times New Roman"/>
+          <w:sz w:val="28"/>
+          <w:szCs w:val="28"/>
+        </w:rPr>
+        <w:t>Or</w:t>
       </w:r>
     </w:p>
     <w:p>
@@ -21786,38 +21843,17 @@
       <w:r>
         <w:rPr>
           <w:rFonts w:ascii="Times New Roman" w:eastAsia="Calibri" w:hAnsi="Times New Roman" w:cs="Times New Roman"/>
-          <w:position w:val="-32"/>
+          <w:position w:val="-40"/>
           <w:sz w:val="28"/>
           <w:szCs w:val="28"/>
           <w:lang w:val="ru-RU" w:eastAsia="ru-RU"/>
         </w:rPr>
-        <w:object w:dxaOrig="1656" w:dyaOrig="744" w14:anchorId="5CF436A0">
-          <v:shape id="_x0000_i1232" type="#_x0000_t75" style="width:82.5pt;height:37.5pt" o:ole="">
-            <v:imagedata r:id="rId66" o:title=""/>
+        <w:object w:dxaOrig="9384" w:dyaOrig="936" w14:anchorId="1FE06F92">
+          <v:shape id="_x0000_i1233" type="#_x0000_t75" style="width:469.5pt;height:46.5pt" o:ole="">
+            <v:imagedata r:id="rId408" o:title=""/>
           </v:shape>
-          <o:OLEObject Type="Embed" ProgID="Equation.DSMT4" ShapeID="_x0000_i1232" DrawAspect="Content" ObjectID="_1611676766" r:id="rId407"/>
+          <o:OLEObject Type="Embed" ProgID="Equation.DSMT4" ShapeID="_x0000_i1233" DrawAspect="Content" ObjectID="_1611677658" r:id="rId409"/>
         </w:object>
-      </w:r>
-    </w:p>
-    <w:p>
-      <w:pPr>
-        <w:spacing w:line="240" w:lineRule="auto"/>
-        <w:ind w:left="360"/>
-        <w:jc w:val="both"/>
-        <w:outlineLvl w:val="0"/>
-        <w:rPr>
-          <w:rFonts w:ascii="Times New Roman" w:hAnsi="Times New Roman"/>
-          <w:sz w:val="28"/>
-          <w:szCs w:val="28"/>
-        </w:rPr>
-      </w:pPr>
-      <w:r>
-        <w:rPr>
-          <w:rFonts w:ascii="Times New Roman" w:hAnsi="Times New Roman"/>
-          <w:sz w:val="28"/>
-          <w:szCs w:val="28"/>
-        </w:rPr>
-        <w:t>Or</w:t>
       </w:r>
     </w:p>
     <w:p>
@@ -21840,39 +21876,11 @@
           <w:szCs w:val="28"/>
           <w:lang w:val="ru-RU" w:eastAsia="ru-RU"/>
         </w:rPr>
-        <w:object w:dxaOrig="9384" w:dyaOrig="936" w14:anchorId="1FE06F92">
-          <v:shape id="_x0000_i1233" type="#_x0000_t75" style="width:469.5pt;height:46.5pt" o:ole="">
-            <v:imagedata r:id="rId408" o:title=""/>
-          </v:shape>
-          <o:OLEObject Type="Embed" ProgID="Equation.DSMT4" ShapeID="_x0000_i1233" DrawAspect="Content" ObjectID="_1611676767" r:id="rId409"/>
-        </w:object>
-      </w:r>
-    </w:p>
-    <w:p>
-      <w:pPr>
-        <w:spacing w:line="240" w:lineRule="auto"/>
-        <w:ind w:left="360"/>
-        <w:jc w:val="center"/>
-        <w:outlineLvl w:val="0"/>
-        <w:rPr>
-          <w:rFonts w:ascii="Times New Roman" w:hAnsi="Times New Roman"/>
-          <w:sz w:val="28"/>
-          <w:szCs w:val="28"/>
-        </w:rPr>
-      </w:pPr>
-      <w:r>
-        <w:rPr>
-          <w:rFonts w:ascii="Times New Roman" w:eastAsia="Calibri" w:hAnsi="Times New Roman" w:cs="Times New Roman"/>
-          <w:position w:val="-40"/>
-          <w:sz w:val="28"/>
-          <w:szCs w:val="28"/>
-          <w:lang w:val="ru-RU" w:eastAsia="ru-RU"/>
-        </w:rPr>
         <w:object w:dxaOrig="5256" w:dyaOrig="924" w14:anchorId="0024E68C">
           <v:shape id="_x0000_i1234" type="#_x0000_t75" style="width:262.5pt;height:46.5pt" o:ole="">
             <v:imagedata r:id="rId410" o:title=""/>
           </v:shape>
-          <o:OLEObject Type="Embed" ProgID="Equation.DSMT4" ShapeID="_x0000_i1234" DrawAspect="Content" ObjectID="_1611676768" r:id="rId411"/>
+          <o:OLEObject Type="Embed" ProgID="Equation.DSMT4" ShapeID="_x0000_i1234" DrawAspect="Content" ObjectID="_1611677659" r:id="rId411"/>
         </w:object>
       </w:r>
     </w:p>
@@ -22047,6 +22055,7 @@
         <w:t xml:space="preserve"> </w:t>
       </w:r>
     </w:p>
+    <w:commentRangeStart w:id="30"/>
     <w:p>
       <w:pPr>
         <w:spacing w:line="240" w:lineRule="auto"/>
@@ -22074,8 +22083,15 @@
           <v:shape id="_x0000_i1235" type="#_x0000_t75" style="width:205.5pt;height:18pt" o:ole="">
             <v:imagedata r:id="rId196" o:title=""/>
           </v:shape>
-          <o:OLEObject Type="Embed" ProgID="Equation.DSMT4" ShapeID="_x0000_i1235" DrawAspect="Content" ObjectID="_1611676769" r:id="rId412"/>
+          <o:OLEObject Type="Embed" ProgID="Equation.DSMT4" ShapeID="_x0000_i1235" DrawAspect="Content" ObjectID="_1611677660" r:id="rId412"/>
         </w:object>
+      </w:r>
+      <w:commentRangeEnd w:id="30"/>
+      <w:r>
+        <w:rPr>
+          <w:rStyle w:val="CommentReference"/>
+        </w:rPr>
+        <w:commentReference w:id="30"/>
       </w:r>
       <w:r>
         <w:rPr>
@@ -22132,7 +22148,7 @@
           <v:shape id="_x0000_i1236" type="#_x0000_t75" style="width:31.5pt;height:18pt" o:ole="">
             <v:imagedata r:id="rId198" o:title=""/>
           </v:shape>
-          <o:OLEObject Type="Embed" ProgID="Equation.DSMT4" ShapeID="_x0000_i1236" DrawAspect="Content" ObjectID="_1611676770" r:id="rId413"/>
+          <o:OLEObject Type="Embed" ProgID="Equation.DSMT4" ShapeID="_x0000_i1236" DrawAspect="Content" ObjectID="_1611677661" r:id="rId413"/>
         </w:object>
       </w:r>
       <w:r>
@@ -22234,15 +22250,28 @@
         </w:rPr>
         <w:t xml:space="preserve"> </w:t>
       </w:r>
-      <w:r>
-        <w:rPr>
-          <w:rFonts w:ascii="Times New Roman" w:hAnsi="Times New Roman"/>
-          <w:color w:val="000000"/>
-          <w:sz w:val="28"/>
-          <w:lang w:val="en-US"/>
-        </w:rPr>
-        <w:t>harmonic</w:t>
-      </w:r>
+      <w:del w:id="31" w:author="Thibault Derrien" w:date="2019-02-14T19:13:00Z">
+        <w:r>
+          <w:rPr>
+            <w:rFonts w:ascii="Times New Roman" w:hAnsi="Times New Roman"/>
+            <w:color w:val="000000"/>
+            <w:sz w:val="28"/>
+            <w:lang w:val="en-US"/>
+          </w:rPr>
+          <w:delText>harmonic</w:delText>
+        </w:r>
+      </w:del>
+      <w:ins w:id="32" w:author="Thibault Derrien" w:date="2019-02-14T19:13:00Z">
+        <w:r>
+          <w:rPr>
+            <w:rFonts w:ascii="Times New Roman" w:hAnsi="Times New Roman"/>
+            <w:color w:val="000000"/>
+            <w:sz w:val="28"/>
+            <w:lang w:val="en-US"/>
+          </w:rPr>
+          <w:t>pulse</w:t>
+        </w:r>
+      </w:ins>
       <w:r>
         <w:rPr>
           <w:rFonts w:ascii="Times New Roman" w:hAnsi="Times New Roman"/>
@@ -22373,7 +22402,7 @@
           <v:shape id="_x0000_i1237" type="#_x0000_t75" style="width:25.5pt;height:18pt" o:ole="">
             <v:imagedata r:id="rId200" o:title=""/>
           </v:shape>
-          <o:OLEObject Type="Embed" ProgID="Equation.DSMT4" ShapeID="_x0000_i1237" DrawAspect="Content" ObjectID="_1611676771" r:id="rId414"/>
+          <o:OLEObject Type="Embed" ProgID="Equation.DSMT4" ShapeID="_x0000_i1237" DrawAspect="Content" ObjectID="_1611677662" r:id="rId414"/>
         </w:object>
       </w:r>
       <w:r>
@@ -22392,7 +22421,38 @@
           <w:sz w:val="28"/>
           <w:lang w:val="en-US"/>
         </w:rPr>
-        <w:t>Some of following calculations can be performed for time-depended amplitudes.</w:t>
+        <w:t>Some of following calculations can be performed for time-depende</w:t>
+      </w:r>
+      <w:ins w:id="33" w:author="Thibault Derrien" w:date="2019-02-14T19:13:00Z">
+        <w:r>
+          <w:rPr>
+            <w:rFonts w:ascii="Times New Roman" w:hAnsi="Times New Roman"/>
+            <w:color w:val="000000"/>
+            <w:sz w:val="28"/>
+            <w:lang w:val="en-US"/>
+          </w:rPr>
+          <w:t>nt</w:t>
+        </w:r>
+      </w:ins>
+      <w:del w:id="34" w:author="Thibault Derrien" w:date="2019-02-14T19:13:00Z">
+        <w:r>
+          <w:rPr>
+            <w:rFonts w:ascii="Times New Roman" w:hAnsi="Times New Roman"/>
+            <w:color w:val="000000"/>
+            <w:sz w:val="28"/>
+            <w:lang w:val="en-US"/>
+          </w:rPr>
+          <w:delText>d</w:delText>
+        </w:r>
+      </w:del>
+      <w:r>
+        <w:rPr>
+          <w:rFonts w:ascii="Times New Roman" w:hAnsi="Times New Roman"/>
+          <w:color w:val="000000"/>
+          <w:sz w:val="28"/>
+          <w:lang w:val="en-US"/>
+        </w:rPr>
+        <w:t xml:space="preserve"> amplitudes.</w:t>
       </w:r>
       <w:r>
         <w:rPr>
@@ -22488,7 +22548,7 @@
           <v:shape id="_x0000_i1238" type="#_x0000_t75" style="width:31.5pt;height:18pt" o:ole="">
             <v:imagedata r:id="rId198" o:title=""/>
           </v:shape>
-          <o:OLEObject Type="Embed" ProgID="Equation.DSMT4" ShapeID="_x0000_i1238" DrawAspect="Content" ObjectID="_1611676772" r:id="rId415"/>
+          <o:OLEObject Type="Embed" ProgID="Equation.DSMT4" ShapeID="_x0000_i1238" DrawAspect="Content" ObjectID="_1611677663" r:id="rId415"/>
         </w:object>
       </w:r>
       <w:r>
@@ -22549,7 +22609,7 @@
           <v:shape id="_x0000_i1239" type="#_x0000_t75" style="width:13.5pt;height:18pt" o:ole="">
             <v:imagedata r:id="rId203" o:title=""/>
           </v:shape>
-          <o:OLEObject Type="Embed" ProgID="Equation.DSMT4" ShapeID="_x0000_i1239" DrawAspect="Content" ObjectID="_1611676773" r:id="rId416"/>
+          <o:OLEObject Type="Embed" ProgID="Equation.DSMT4" ShapeID="_x0000_i1239" DrawAspect="Content" ObjectID="_1611677664" r:id="rId416"/>
         </w:object>
       </w:r>
       <w:r>
@@ -22583,7 +22643,7 @@
           <v:shape id="_x0000_i1240" type="#_x0000_t75" style="width:30pt;height:19.5pt" o:ole="">
             <v:imagedata r:id="rId205" o:title=""/>
           </v:shape>
-          <o:OLEObject Type="Embed" ProgID="Equation.DSMT4" ShapeID="_x0000_i1240" DrawAspect="Content" ObjectID="_1611676774" r:id="rId417"/>
+          <o:OLEObject Type="Embed" ProgID="Equation.DSMT4" ShapeID="_x0000_i1240" DrawAspect="Content" ObjectID="_1611677665" r:id="rId417"/>
         </w:object>
       </w:r>
       <w:r>
@@ -22671,7 +22731,7 @@
           <v:shape id="_x0000_i1241" type="#_x0000_t75" style="width:24pt;height:18pt" o:ole="">
             <v:imagedata r:id="rId207" o:title=""/>
           </v:shape>
-          <o:OLEObject Type="Embed" ProgID="Equation.DSMT4" ShapeID="_x0000_i1241" DrawAspect="Content" ObjectID="_1611676775" r:id="rId418"/>
+          <o:OLEObject Type="Embed" ProgID="Equation.DSMT4" ShapeID="_x0000_i1241" DrawAspect="Content" ObjectID="_1611677666" r:id="rId418"/>
         </w:object>
       </w:r>
       <w:r>
@@ -22705,7 +22765,7 @@
           <v:shape id="_x0000_i1242" type="#_x0000_t75" style="width:34.5pt;height:18pt" o:ole="">
             <v:imagedata r:id="rId209" o:title=""/>
           </v:shape>
-          <o:OLEObject Type="Embed" ProgID="Equation.DSMT4" ShapeID="_x0000_i1242" DrawAspect="Content" ObjectID="_1611676776" r:id="rId419"/>
+          <o:OLEObject Type="Embed" ProgID="Equation.DSMT4" ShapeID="_x0000_i1242" DrawAspect="Content" ObjectID="_1611677667" r:id="rId419"/>
         </w:object>
       </w:r>
       <w:r>
@@ -22904,6 +22964,7 @@
         </w:rPr>
         <w:t xml:space="preserve">will be measured in terms of </w:t>
       </w:r>
+      <w:commentRangeStart w:id="35"/>
       <w:r>
         <w:rPr>
           <w:rFonts w:ascii="Times New Roman" w:eastAsia="Calibri" w:hAnsi="Times New Roman" w:cs="Times New Roman"/>
@@ -22917,8 +22978,15 @@
           <v:shape id="_x0000_i1243" type="#_x0000_t75" style="width:1in;height:19.5pt" o:ole="">
             <v:imagedata r:id="rId16" o:title=""/>
           </v:shape>
-          <o:OLEObject Type="Embed" ProgID="Equation.DSMT4" ShapeID="_x0000_i1243" DrawAspect="Content" ObjectID="_1611676777" r:id="rId420"/>
+          <o:OLEObject Type="Embed" ProgID="Equation.DSMT4" ShapeID="_x0000_i1243" DrawAspect="Content" ObjectID="_1611677668" r:id="rId420"/>
         </w:object>
+      </w:r>
+      <w:commentRangeEnd w:id="35"/>
+      <w:r>
+        <w:rPr>
+          <w:rStyle w:val="CommentReference"/>
+        </w:rPr>
+        <w:commentReference w:id="35"/>
       </w:r>
       <w:r>
         <w:rPr>
@@ -22943,7 +23011,7 @@
           <v:shape id="_x0000_i1244" type="#_x0000_t75" style="width:34.5pt;height:19.5pt" o:ole="">
             <v:imagedata r:id="rId212" o:title=""/>
           </v:shape>
-          <o:OLEObject Type="Embed" ProgID="Equation.DSMT4" ShapeID="_x0000_i1244" DrawAspect="Content" ObjectID="_1611676778" r:id="rId421"/>
+          <o:OLEObject Type="Embed" ProgID="Equation.DSMT4" ShapeID="_x0000_i1244" DrawAspect="Content" ObjectID="_1611677669" r:id="rId421"/>
         </w:object>
       </w:r>
       <w:r>
@@ -22969,7 +23037,7 @@
           <v:shape id="_x0000_i1245" type="#_x0000_t75" style="width:60pt;height:33pt" o:ole="">
             <v:imagedata r:id="rId214" o:title=""/>
           </v:shape>
-          <o:OLEObject Type="Embed" ProgID="Equation.DSMT4" ShapeID="_x0000_i1245" DrawAspect="Content" ObjectID="_1611676779" r:id="rId422"/>
+          <o:OLEObject Type="Embed" ProgID="Equation.DSMT4" ShapeID="_x0000_i1245" DrawAspect="Content" ObjectID="_1611677670" r:id="rId422"/>
         </w:object>
       </w:r>
       <w:r>
@@ -22995,7 +23063,7 @@
           <v:shape id="_x0000_i1246" type="#_x0000_t75" style="width:34.5pt;height:19.5pt" o:ole="">
             <v:imagedata r:id="rId216" o:title=""/>
           </v:shape>
-          <o:OLEObject Type="Embed" ProgID="Equation.DSMT4" ShapeID="_x0000_i1246" DrawAspect="Content" ObjectID="_1611676780" r:id="rId423"/>
+          <o:OLEObject Type="Embed" ProgID="Equation.DSMT4" ShapeID="_x0000_i1246" DrawAspect="Content" ObjectID="_1611677671" r:id="rId423"/>
         </w:object>
       </w:r>
       <w:r>
@@ -23021,7 +23089,7 @@
           <v:shape id="_x0000_i1247" type="#_x0000_t75" style="width:121.5pt;height:19.5pt" o:ole="">
             <v:imagedata r:id="rId218" o:title=""/>
           </v:shape>
-          <o:OLEObject Type="Embed" ProgID="Equation.DSMT4" ShapeID="_x0000_i1247" DrawAspect="Content" ObjectID="_1611676781" r:id="rId424"/>
+          <o:OLEObject Type="Embed" ProgID="Equation.DSMT4" ShapeID="_x0000_i1247" DrawAspect="Content" ObjectID="_1611677672" r:id="rId424"/>
         </w:object>
       </w:r>
       <w:r>
@@ -23117,7 +23185,7 @@
           <v:shape id="_x0000_i1248" type="#_x0000_t75" style="width:75pt;height:19.5pt" o:ole="">
             <v:imagedata r:id="rId220" o:title=""/>
           </v:shape>
-          <o:OLEObject Type="Embed" ProgID="Equation.DSMT4" ShapeID="_x0000_i1248" DrawAspect="Content" ObjectID="_1611676782" r:id="rId425"/>
+          <o:OLEObject Type="Embed" ProgID="Equation.DSMT4" ShapeID="_x0000_i1248" DrawAspect="Content" ObjectID="_1611677673" r:id="rId425"/>
         </w:object>
       </w:r>
       <w:r>
@@ -23233,7 +23301,7 @@
           <v:shape id="_x0000_i1249" type="#_x0000_t75" style="width:12pt;height:13.5pt" o:ole="">
             <v:imagedata r:id="rId222" o:title=""/>
           </v:shape>
-          <o:OLEObject Type="Embed" ProgID="Equation.DSMT4" ShapeID="_x0000_i1249" DrawAspect="Content" ObjectID="_1611676783" r:id="rId426"/>
+          <o:OLEObject Type="Embed" ProgID="Equation.DSMT4" ShapeID="_x0000_i1249" DrawAspect="Content" ObjectID="_1611677674" r:id="rId426"/>
         </w:object>
       </w:r>
       <w:r>
@@ -23283,7 +23351,7 @@
           <v:shape id="_x0000_i1250" type="#_x0000_t75" style="width:145.5pt;height:31.5pt" o:ole="">
             <v:imagedata r:id="rId385" o:title=""/>
           </v:shape>
-          <o:OLEObject Type="Embed" ProgID="Equation.DSMT4" ShapeID="_x0000_i1250" DrawAspect="Content" ObjectID="_1611676784" r:id="rId427"/>
+          <o:OLEObject Type="Embed" ProgID="Equation.DSMT4" ShapeID="_x0000_i1250" DrawAspect="Content" ObjectID="_1611677675" r:id="rId427"/>
         </w:object>
       </w:r>
       <w:r>
@@ -23322,7 +23390,7 @@
           <v:shape id="_x0000_i1251" type="#_x0000_t75" style="width:274.5pt;height:19.5pt" o:ole="">
             <v:imagedata r:id="rId428" o:title=""/>
           </v:shape>
-          <o:OLEObject Type="Embed" ProgID="Equation.DSMT4" ShapeID="_x0000_i1251" DrawAspect="Content" ObjectID="_1611676785" r:id="rId429"/>
+          <o:OLEObject Type="Embed" ProgID="Equation.DSMT4" ShapeID="_x0000_i1251" DrawAspect="Content" ObjectID="_1611677676" r:id="rId429"/>
         </w:object>
       </w:r>
       <w:r>
@@ -23389,7 +23457,7 @@
           <v:shape id="_x0000_i1252" type="#_x0000_t75" style="width:55.5pt;height:19.5pt" o:ole="">
             <v:imagedata r:id="rId430" o:title=""/>
           </v:shape>
-          <o:OLEObject Type="Embed" ProgID="Equation.DSMT4" ShapeID="_x0000_i1252" DrawAspect="Content" ObjectID="_1611676786" r:id="rId431"/>
+          <o:OLEObject Type="Embed" ProgID="Equation.DSMT4" ShapeID="_x0000_i1252" DrawAspect="Content" ObjectID="_1611677677" r:id="rId431"/>
         </w:object>
       </w:r>
       <w:r>
@@ -23459,7 +23527,7 @@
           <v:shape id="_x0000_i1253" type="#_x0000_t75" style="width:13.5pt;height:18pt" o:ole="">
             <v:imagedata r:id="rId432" o:title=""/>
           </v:shape>
-          <o:OLEObject Type="Embed" ProgID="Equation.DSMT4" ShapeID="_x0000_i1253" DrawAspect="Content" ObjectID="_1611676787" r:id="rId433"/>
+          <o:OLEObject Type="Embed" ProgID="Equation.DSMT4" ShapeID="_x0000_i1253" DrawAspect="Content" ObjectID="_1611677678" r:id="rId433"/>
         </w:object>
       </w:r>
       <w:r>
@@ -23655,7 +23723,7 @@
           <v:shape id="_x0000_i1254" type="#_x0000_t75" style="width:13.5pt;height:18pt" o:ole="">
             <v:imagedata r:id="rId434" o:title=""/>
           </v:shape>
-          <o:OLEObject Type="Embed" ProgID="Equation.DSMT4" ShapeID="_x0000_i1254" DrawAspect="Content" ObjectID="_1611676788" r:id="rId435"/>
+          <o:OLEObject Type="Embed" ProgID="Equation.DSMT4" ShapeID="_x0000_i1254" DrawAspect="Content" ObjectID="_1611677679" r:id="rId435"/>
         </w:object>
       </w:r>
       <w:r>
@@ -23752,7 +23820,7 @@
           <v:shape id="_x0000_i1255" type="#_x0000_t75" style="width:51pt;height:19.5pt" o:ole="">
             <v:imagedata r:id="rId436" o:title=""/>
           </v:shape>
-          <o:OLEObject Type="Embed" ProgID="Equation.DSMT4" ShapeID="_x0000_i1255" DrawAspect="Content" ObjectID="_1611676789" r:id="rId437"/>
+          <o:OLEObject Type="Embed" ProgID="Equation.DSMT4" ShapeID="_x0000_i1255" DrawAspect="Content" ObjectID="_1611677680" r:id="rId437"/>
         </w:object>
       </w:r>
       <w:r>
@@ -23858,7 +23926,7 @@
           <v:shape id="_x0000_i1256" type="#_x0000_t75" style="width:15pt;height:18pt" o:ole="">
             <v:imagedata r:id="rId438" o:title=""/>
           </v:shape>
-          <o:OLEObject Type="Embed" ProgID="Equation.DSMT4" ShapeID="_x0000_i1256" DrawAspect="Content" ObjectID="_1611676790" r:id="rId439"/>
+          <o:OLEObject Type="Embed" ProgID="Equation.DSMT4" ShapeID="_x0000_i1256" DrawAspect="Content" ObjectID="_1611677681" r:id="rId439"/>
         </w:object>
       </w:r>
       <w:r>
@@ -23955,7 +24023,7 @@
           <v:shape id="_x0000_i1257" type="#_x0000_t75" style="width:106.5pt;height:22.5pt" o:ole="">
             <v:imagedata r:id="rId440" o:title=""/>
           </v:shape>
-          <o:OLEObject Type="Embed" ProgID="Equation.DSMT4" ShapeID="_x0000_i1257" DrawAspect="Content" ObjectID="_1611676791" r:id="rId441"/>
+          <o:OLEObject Type="Embed" ProgID="Equation.DSMT4" ShapeID="_x0000_i1257" DrawAspect="Content" ObjectID="_1611677682" r:id="rId441"/>
         </w:object>
       </w:r>
       <w:r>
@@ -24025,7 +24093,7 @@
           <v:shape id="_x0000_i1258" type="#_x0000_t75" style="width:73.5pt;height:22.5pt" o:ole="">
             <v:imagedata r:id="rId442" o:title=""/>
           </v:shape>
-          <o:OLEObject Type="Embed" ProgID="Equation.DSMT4" ShapeID="_x0000_i1258" DrawAspect="Content" ObjectID="_1611676792" r:id="rId443"/>
+          <o:OLEObject Type="Embed" ProgID="Equation.DSMT4" ShapeID="_x0000_i1258" DrawAspect="Content" ObjectID="_1611677683" r:id="rId443"/>
         </w:object>
       </w:r>
       <w:r>
@@ -24080,7 +24148,7 @@
           <v:shape id="_x0000_i1259" type="#_x0000_t75" style="width:217.5pt;height:19.5pt" o:ole="">
             <v:imagedata r:id="rId387" o:title=""/>
           </v:shape>
-          <o:OLEObject Type="Embed" ProgID="Equation.DSMT4" ShapeID="_x0000_i1259" DrawAspect="Content" ObjectID="_1611676793" r:id="rId444"/>
+          <o:OLEObject Type="Embed" ProgID="Equation.DSMT4" ShapeID="_x0000_i1259" DrawAspect="Content" ObjectID="_1611677684" r:id="rId444"/>
         </w:object>
       </w:r>
       <w:r>
@@ -24116,7 +24184,7 @@
           <v:shape id="_x0000_i1260" type="#_x0000_t75" style="width:1in;height:34.5pt" o:ole="">
             <v:imagedata r:id="rId389" o:title=""/>
           </v:shape>
-          <o:OLEObject Type="Embed" ProgID="Equation.DSMT4" ShapeID="_x0000_i1260" DrawAspect="Content" ObjectID="_1611676794" r:id="rId445"/>
+          <o:OLEObject Type="Embed" ProgID="Equation.DSMT4" ShapeID="_x0000_i1260" DrawAspect="Content" ObjectID="_1611677685" r:id="rId445"/>
         </w:object>
       </w:r>
     </w:p>
@@ -24216,7 +24284,7 @@
           <v:shape id="_x0000_i1261" type="#_x0000_t75" style="width:10.5pt;height:13.5pt" o:ole="">
             <v:imagedata r:id="rId446" o:title=""/>
           </v:shape>
-          <o:OLEObject Type="Embed" ProgID="Equation.DSMT4" ShapeID="_x0000_i1261" DrawAspect="Content" ObjectID="_1611676795" r:id="rId447"/>
+          <o:OLEObject Type="Embed" ProgID="Equation.DSMT4" ShapeID="_x0000_i1261" DrawAspect="Content" ObjectID="_1611677686" r:id="rId447"/>
         </w:object>
       </w:r>
       <w:r>
@@ -24261,7 +24329,7 @@
           <v:shape id="_x0000_i1262" type="#_x0000_t75" style="width:311.25pt;height:43.5pt" o:ole="">
             <v:imagedata r:id="rId391" o:title=""/>
           </v:shape>
-          <o:OLEObject Type="Embed" ProgID="Equation.DSMT4" ShapeID="_x0000_i1262" DrawAspect="Content" ObjectID="_1611676796" r:id="rId448"/>
+          <o:OLEObject Type="Embed" ProgID="Equation.DSMT4" ShapeID="_x0000_i1262" DrawAspect="Content" ObjectID="_1611677687" r:id="rId448"/>
         </w:object>
       </w:r>
       <w:r>
@@ -24296,7 +24364,7 @@
           <v:shape id="_x0000_i1263" type="#_x0000_t75" style="width:91.5pt;height:18pt" o:ole="">
             <v:imagedata r:id="rId393" o:title=""/>
           </v:shape>
-          <o:OLEObject Type="Embed" ProgID="Equation.DSMT4" ShapeID="_x0000_i1263" DrawAspect="Content" ObjectID="_1611676797" r:id="rId449"/>
+          <o:OLEObject Type="Embed" ProgID="Equation.DSMT4" ShapeID="_x0000_i1263" DrawAspect="Content" ObjectID="_1611677688" r:id="rId449"/>
         </w:object>
       </w:r>
       <w:r>
@@ -24331,7 +24399,7 @@
           <v:shape id="_x0000_i1264" type="#_x0000_t75" style="width:280.5pt;height:37.5pt" o:ole="">
             <v:imagedata r:id="rId450" o:title=""/>
           </v:shape>
-          <o:OLEObject Type="Embed" ProgID="Equation.DSMT4" ShapeID="_x0000_i1264" DrawAspect="Content" ObjectID="_1611676798" r:id="rId451"/>
+          <o:OLEObject Type="Embed" ProgID="Equation.DSMT4" ShapeID="_x0000_i1264" DrawAspect="Content" ObjectID="_1611677689" r:id="rId451"/>
         </w:object>
       </w:r>
     </w:p>
@@ -24376,7 +24444,7 @@
           <v:shape id="_x0000_i1265" type="#_x0000_t75" style="width:55.5pt;height:22.5pt" o:ole="">
             <v:imagedata r:id="rId452" o:title=""/>
           </v:shape>
-          <o:OLEObject Type="Embed" ProgID="Equation.DSMT4" ShapeID="_x0000_i1265" DrawAspect="Content" ObjectID="_1611676799" r:id="rId453"/>
+          <o:OLEObject Type="Embed" ProgID="Equation.DSMT4" ShapeID="_x0000_i1265" DrawAspect="Content" ObjectID="_1611677690" r:id="rId453"/>
         </w:object>
       </w:r>
       <w:r>
@@ -24410,7 +24478,7 @@
           <v:shape id="_x0000_i1266" type="#_x0000_t75" style="width:25.5pt;height:19.5pt" o:ole="">
             <v:imagedata r:id="rId454" o:title=""/>
           </v:shape>
-          <o:OLEObject Type="Embed" ProgID="Equation.DSMT4" ShapeID="_x0000_i1266" DrawAspect="Content" ObjectID="_1611676800" r:id="rId455"/>
+          <o:OLEObject Type="Embed" ProgID="Equation.DSMT4" ShapeID="_x0000_i1266" DrawAspect="Content" ObjectID="_1611677691" r:id="rId455"/>
         </w:object>
       </w:r>
       <w:r>
@@ -24435,7 +24503,7 @@
           <v:shape id="_x0000_i1267" type="#_x0000_t75" style="width:37.5pt;height:16.5pt" o:ole="">
             <v:imagedata r:id="rId456" o:title=""/>
           </v:shape>
-          <o:OLEObject Type="Embed" ProgID="Equation.DSMT4" ShapeID="_x0000_i1267" DrawAspect="Content" ObjectID="_1611676801" r:id="rId457"/>
+          <o:OLEObject Type="Embed" ProgID="Equation.DSMT4" ShapeID="_x0000_i1267" DrawAspect="Content" ObjectID="_1611677692" r:id="rId457"/>
         </w:object>
       </w:r>
       <w:r>
@@ -24469,7 +24537,7 @@
           <v:shape id="_x0000_i1268" type="#_x0000_t75" style="width:10.5pt;height:13.5pt" o:ole="">
             <v:imagedata r:id="rId458" o:title=""/>
           </v:shape>
-          <o:OLEObject Type="Embed" ProgID="Equation.DSMT4" ShapeID="_x0000_i1268" DrawAspect="Content" ObjectID="_1611676802" r:id="rId459"/>
+          <o:OLEObject Type="Embed" ProgID="Equation.DSMT4" ShapeID="_x0000_i1268" DrawAspect="Content" ObjectID="_1611677693" r:id="rId459"/>
         </w:object>
       </w:r>
       <w:r>
@@ -24503,7 +24571,7 @@
           <v:shape id="_x0000_i1269" type="#_x0000_t75" style="width:10.5pt;height:16.5pt" o:ole="">
             <v:imagedata r:id="rId460" o:title=""/>
           </v:shape>
-          <o:OLEObject Type="Embed" ProgID="Equation.DSMT4" ShapeID="_x0000_i1269" DrawAspect="Content" ObjectID="_1611676803" r:id="rId461"/>
+          <o:OLEObject Type="Embed" ProgID="Equation.DSMT4" ShapeID="_x0000_i1269" DrawAspect="Content" ObjectID="_1611677694" r:id="rId461"/>
         </w:object>
       </w:r>
       <w:r>
@@ -24548,7 +24616,7 @@
           <v:shape id="_x0000_i1270" type="#_x0000_t75" style="width:265.5pt;height:49.5pt" o:ole="">
             <v:imagedata r:id="rId462" o:title=""/>
           </v:shape>
-          <o:OLEObject Type="Embed" ProgID="Equation.DSMT4" ShapeID="_x0000_i1270" DrawAspect="Content" ObjectID="_1611676804" r:id="rId463"/>
+          <o:OLEObject Type="Embed" ProgID="Equation.DSMT4" ShapeID="_x0000_i1270" DrawAspect="Content" ObjectID="_1611677695" r:id="rId463"/>
         </w:object>
       </w:r>
     </w:p>
@@ -24575,7 +24643,7 @@
           <v:shape id="_x0000_i1271" type="#_x0000_t75" style="width:268.5pt;height:49.5pt" o:ole="">
             <v:imagedata r:id="rId464" o:title=""/>
           </v:shape>
-          <o:OLEObject Type="Embed" ProgID="Equation.DSMT4" ShapeID="_x0000_i1271" DrawAspect="Content" ObjectID="_1611676805" r:id="rId465"/>
+          <o:OLEObject Type="Embed" ProgID="Equation.DSMT4" ShapeID="_x0000_i1271" DrawAspect="Content" ObjectID="_1611677696" r:id="rId465"/>
         </w:object>
       </w:r>
     </w:p>
@@ -24621,7 +24689,7 @@
           <v:shape id="_x0000_i1272" type="#_x0000_t75" style="width:383.25pt;height:37.5pt" o:ole="">
             <v:imagedata r:id="rId466" o:title=""/>
           </v:shape>
-          <o:OLEObject Type="Embed" ProgID="Equation.DSMT4" ShapeID="_x0000_i1272" DrawAspect="Content" ObjectID="_1611676806" r:id="rId467"/>
+          <o:OLEObject Type="Embed" ProgID="Equation.DSMT4" ShapeID="_x0000_i1272" DrawAspect="Content" ObjectID="_1611677697" r:id="rId467"/>
         </w:object>
       </w:r>
     </w:p>
@@ -24649,7 +24717,7 @@
           <v:shape id="_x0000_i1273" type="#_x0000_t75" style="width:152.25pt;height:61.5pt" o:ole="">
             <v:imagedata r:id="rId313" o:title=""/>
           </v:shape>
-          <o:OLEObject Type="Embed" ProgID="Equation.DSMT4" ShapeID="_x0000_i1273" DrawAspect="Content" ObjectID="_1611676807" r:id="rId468"/>
+          <o:OLEObject Type="Embed" ProgID="Equation.DSMT4" ShapeID="_x0000_i1273" DrawAspect="Content" ObjectID="_1611677698" r:id="rId468"/>
         </w:object>
       </w:r>
       <w:r>
@@ -24707,7 +24775,7 @@
           <v:shape id="_x0000_i1274" type="#_x0000_t75" style="width:181.5pt;height:18pt" o:ole="">
             <v:imagedata r:id="rId469" o:title=""/>
           </v:shape>
-          <o:OLEObject Type="Embed" ProgID="Equation.DSMT4" ShapeID="_x0000_i1274" DrawAspect="Content" ObjectID="_1611676808" r:id="rId470"/>
+          <o:OLEObject Type="Embed" ProgID="Equation.DSMT4" ShapeID="_x0000_i1274" DrawAspect="Content" ObjectID="_1611677699" r:id="rId470"/>
         </w:object>
       </w:r>
       <w:r>
@@ -24782,7 +24850,7 @@
           <v:shape id="_x0000_i1275" type="#_x0000_t75" style="width:354.75pt;height:37.5pt" o:ole="">
             <v:imagedata r:id="rId471" o:title=""/>
           </v:shape>
-          <o:OLEObject Type="Embed" ProgID="Equation.DSMT4" ShapeID="_x0000_i1275" DrawAspect="Content" ObjectID="_1611676809" r:id="rId472"/>
+          <o:OLEObject Type="Embed" ProgID="Equation.DSMT4" ShapeID="_x0000_i1275" DrawAspect="Content" ObjectID="_1611677700" r:id="rId472"/>
         </w:object>
       </w:r>
     </w:p>
@@ -24809,7 +24877,7 @@
           <v:shape id="_x0000_i1276" type="#_x0000_t75" style="width:152.25pt;height:61.5pt" o:ole="">
             <v:imagedata r:id="rId473" o:title=""/>
           </v:shape>
-          <o:OLEObject Type="Embed" ProgID="Equation.DSMT4" ShapeID="_x0000_i1276" DrawAspect="Content" ObjectID="_1611676810" r:id="rId474"/>
+          <o:OLEObject Type="Embed" ProgID="Equation.DSMT4" ShapeID="_x0000_i1276" DrawAspect="Content" ObjectID="_1611677701" r:id="rId474"/>
         </w:object>
       </w:r>
     </w:p>
@@ -24836,7 +24904,7 @@
           <v:shape id="_x0000_i1277" type="#_x0000_t75" style="width:9pt;height:13.5pt" o:ole="">
             <v:imagedata r:id="rId475" o:title=""/>
           </v:shape>
-          <o:OLEObject Type="Embed" ProgID="Equation.DSMT4" ShapeID="_x0000_i1277" DrawAspect="Content" ObjectID="_1611676811" r:id="rId476"/>
+          <o:OLEObject Type="Embed" ProgID="Equation.DSMT4" ShapeID="_x0000_i1277" DrawAspect="Content" ObjectID="_1611677702" r:id="rId476"/>
         </w:object>
       </w:r>
       <w:r>
@@ -24852,7 +24920,7 @@
           <v:shape id="_x0000_i1278" type="#_x0000_t75" style="width:406.5pt;height:37.5pt" o:ole="">
             <v:imagedata r:id="rId477" o:title=""/>
           </v:shape>
-          <o:OLEObject Type="Embed" ProgID="Equation.DSMT4" ShapeID="_x0000_i1278" DrawAspect="Content" ObjectID="_1611676812" r:id="rId478"/>
+          <o:OLEObject Type="Embed" ProgID="Equation.DSMT4" ShapeID="_x0000_i1278" DrawAspect="Content" ObjectID="_1611677703" r:id="rId478"/>
         </w:object>
       </w:r>
     </w:p>
@@ -24879,7 +24947,7 @@
           <v:shape id="_x0000_i1279" type="#_x0000_t75" style="width:291pt;height:37.5pt" o:ole="">
             <v:imagedata r:id="rId479" o:title=""/>
           </v:shape>
-          <o:OLEObject Type="Embed" ProgID="Equation.DSMT4" ShapeID="_x0000_i1279" DrawAspect="Content" ObjectID="_1611676813" r:id="rId480"/>
+          <o:OLEObject Type="Embed" ProgID="Equation.DSMT4" ShapeID="_x0000_i1279" DrawAspect="Content" ObjectID="_1611677704" r:id="rId480"/>
         </w:object>
       </w:r>
     </w:p>
@@ -24906,7 +24974,7 @@
           <v:shape id="_x0000_i1280" type="#_x0000_t75" style="width:373.5pt;height:37.5pt" o:ole="">
             <v:imagedata r:id="rId481" o:title=""/>
           </v:shape>
-          <o:OLEObject Type="Embed" ProgID="Equation.DSMT4" ShapeID="_x0000_i1280" DrawAspect="Content" ObjectID="_1611676814" r:id="rId482"/>
+          <o:OLEObject Type="Embed" ProgID="Equation.DSMT4" ShapeID="_x0000_i1280" DrawAspect="Content" ObjectID="_1611677705" r:id="rId482"/>
         </w:object>
       </w:r>
       <w:r>
@@ -24941,7 +25009,7 @@
           <v:shape id="_x0000_i1281" type="#_x0000_t75" style="width:177pt;height:19.5pt" o:ole="">
             <v:imagedata r:id="rId483" o:title=""/>
           </v:shape>
-          <o:OLEObject Type="Embed" ProgID="Equation.DSMT4" ShapeID="_x0000_i1281" DrawAspect="Content" ObjectID="_1611676815" r:id="rId484"/>
+          <o:OLEObject Type="Embed" ProgID="Equation.DSMT4" ShapeID="_x0000_i1281" DrawAspect="Content" ObjectID="_1611677706" r:id="rId484"/>
         </w:object>
       </w:r>
     </w:p>
@@ -24968,7 +25036,7 @@
           <v:shape id="_x0000_i1282" type="#_x0000_t75" style="width:259.5pt;height:34.5pt" o:ole="">
             <v:imagedata r:id="rId485" o:title=""/>
           </v:shape>
-          <o:OLEObject Type="Embed" ProgID="Equation.DSMT4" ShapeID="_x0000_i1282" DrawAspect="Content" ObjectID="_1611676816" r:id="rId486"/>
+          <o:OLEObject Type="Embed" ProgID="Equation.DSMT4" ShapeID="_x0000_i1282" DrawAspect="Content" ObjectID="_1611677707" r:id="rId486"/>
         </w:object>
       </w:r>
     </w:p>
@@ -24996,7 +25064,7 @@
           <v:shape id="_x0000_i1283" type="#_x0000_t75" style="width:451.5pt;height:37.5pt" o:ole="">
             <v:imagedata r:id="rId487" o:title=""/>
           </v:shape>
-          <o:OLEObject Type="Embed" ProgID="Equation.DSMT4" ShapeID="_x0000_i1283" DrawAspect="Content" ObjectID="_1611676817" r:id="rId488"/>
+          <o:OLEObject Type="Embed" ProgID="Equation.DSMT4" ShapeID="_x0000_i1283" DrawAspect="Content" ObjectID="_1611677708" r:id="rId488"/>
         </w:object>
       </w:r>
       <w:r>
@@ -25232,7 +25300,7 @@
           <v:shape id="_x0000_i1284" type="#_x0000_t75" style="width:327pt;height:42pt" o:ole="">
             <v:imagedata r:id="rId489" o:title=""/>
           </v:shape>
-          <o:OLEObject Type="Embed" ProgID="Equation.DSMT4" ShapeID="_x0000_i1284" DrawAspect="Content" ObjectID="_1611676818" r:id="rId490"/>
+          <o:OLEObject Type="Embed" ProgID="Equation.DSMT4" ShapeID="_x0000_i1284" DrawAspect="Content" ObjectID="_1611677709" r:id="rId490"/>
         </w:object>
       </w:r>
       <w:r>
@@ -25297,7 +25365,7 @@
           <v:shape id="_x0000_i1285" type="#_x0000_t75" style="width:2in;height:37.5pt" o:ole="">
             <v:imagedata r:id="rId491" o:title=""/>
           </v:shape>
-          <o:OLEObject Type="Embed" ProgID="Equation.DSMT4" ShapeID="_x0000_i1285" DrawAspect="Content" ObjectID="_1611676819" r:id="rId492"/>
+          <o:OLEObject Type="Embed" ProgID="Equation.DSMT4" ShapeID="_x0000_i1285" DrawAspect="Content" ObjectID="_1611677710" r:id="rId492"/>
         </w:object>
       </w:r>
     </w:p>
@@ -25355,7 +25423,7 @@
           <v:shape id="_x0000_i1286" type="#_x0000_t75" style="width:33pt;height:18pt" o:ole="">
             <v:imagedata r:id="rId493" o:title=""/>
           </v:shape>
-          <o:OLEObject Type="Embed" ProgID="Equation.DSMT4" ShapeID="_x0000_i1286" DrawAspect="Content" ObjectID="_1611676820" r:id="rId494"/>
+          <o:OLEObject Type="Embed" ProgID="Equation.DSMT4" ShapeID="_x0000_i1286" DrawAspect="Content" ObjectID="_1611677711" r:id="rId494"/>
         </w:object>
       </w:r>
       <w:r>
@@ -25427,7 +25495,7 @@
           <v:shape id="_x0000_i1287" type="#_x0000_t75" style="width:33pt;height:18pt" o:ole="">
             <v:imagedata r:id="rId493" o:title=""/>
           </v:shape>
-          <o:OLEObject Type="Embed" ProgID="Equation.DSMT4" ShapeID="_x0000_i1287" DrawAspect="Content" ObjectID="_1611676821" r:id="rId495"/>
+          <o:OLEObject Type="Embed" ProgID="Equation.DSMT4" ShapeID="_x0000_i1287" DrawAspect="Content" ObjectID="_1611677712" r:id="rId495"/>
         </w:object>
       </w:r>
       <w:r>
@@ -25459,7 +25527,7 @@
           <v:shape id="_x0000_i1288" type="#_x0000_t75" style="width:21pt;height:18pt" o:ole="">
             <v:imagedata r:id="rId496" o:title=""/>
           </v:shape>
-          <o:OLEObject Type="Embed" ProgID="Equation.DSMT4" ShapeID="_x0000_i1288" DrawAspect="Content" ObjectID="_1611676822" r:id="rId497"/>
+          <o:OLEObject Type="Embed" ProgID="Equation.DSMT4" ShapeID="_x0000_i1288" DrawAspect="Content" ObjectID="_1611677713" r:id="rId497"/>
         </w:object>
       </w:r>
       <w:r>
@@ -25500,7 +25568,7 @@
           <v:shape id="_x0000_i1289" type="#_x0000_t75" style="width:19.5pt;height:16.5pt" o:ole="">
             <v:imagedata r:id="rId498" o:title=""/>
           </v:shape>
-          <o:OLEObject Type="Embed" ProgID="Equation.DSMT4" ShapeID="_x0000_i1289" DrawAspect="Content" ObjectID="_1611676823" r:id="rId499"/>
+          <o:OLEObject Type="Embed" ProgID="Equation.DSMT4" ShapeID="_x0000_i1289" DrawAspect="Content" ObjectID="_1611677714" r:id="rId499"/>
         </w:object>
       </w:r>
       <w:r>
@@ -25541,7 +25609,7 @@
           <v:shape id="_x0000_i1290" type="#_x0000_t75" style="width:21pt;height:16.5pt" o:ole="">
             <v:imagedata r:id="rId500" o:title=""/>
           </v:shape>
-          <o:OLEObject Type="Embed" ProgID="Equation.DSMT4" ShapeID="_x0000_i1290" DrawAspect="Content" ObjectID="_1611676824" r:id="rId501"/>
+          <o:OLEObject Type="Embed" ProgID="Equation.DSMT4" ShapeID="_x0000_i1290" DrawAspect="Content" ObjectID="_1611677715" r:id="rId501"/>
         </w:object>
       </w:r>
       <w:r>
@@ -25585,7 +25653,7 @@
           <v:shape id="_x0000_i1291" type="#_x0000_t75" style="width:118.5pt;height:30pt" o:ole="">
             <v:imagedata r:id="rId502" o:title=""/>
           </v:shape>
-          <o:OLEObject Type="Embed" ProgID="Equation.DSMT4" ShapeID="_x0000_i1291" DrawAspect="Content" ObjectID="_1611676825" r:id="rId503"/>
+          <o:OLEObject Type="Embed" ProgID="Equation.DSMT4" ShapeID="_x0000_i1291" DrawAspect="Content" ObjectID="_1611677716" r:id="rId503"/>
         </w:object>
       </w:r>
       <w:r>
@@ -25683,7 +25751,7 @@
           <v:shape id="_x0000_i1292" type="#_x0000_t75" style="width:12pt;height:16.5pt" o:ole="">
             <v:imagedata r:id="rId504" o:title=""/>
           </v:shape>
-          <o:OLEObject Type="Embed" ProgID="Equation.DSMT4" ShapeID="_x0000_i1292" DrawAspect="Content" ObjectID="_1611676826" r:id="rId505"/>
+          <o:OLEObject Type="Embed" ProgID="Equation.DSMT4" ShapeID="_x0000_i1292" DrawAspect="Content" ObjectID="_1611677717" r:id="rId505"/>
         </w:object>
       </w:r>
       <w:r>
@@ -25715,7 +25783,7 @@
           <v:shape id="_x0000_i1293" type="#_x0000_t75" style="width:10.5pt;height:13.5pt" o:ole="">
             <v:imagedata r:id="rId506" o:title=""/>
           </v:shape>
-          <o:OLEObject Type="Embed" ProgID="Equation.DSMT4" ShapeID="_x0000_i1293" DrawAspect="Content" ObjectID="_1611676827" r:id="rId507"/>
+          <o:OLEObject Type="Embed" ProgID="Equation.DSMT4" ShapeID="_x0000_i1293" DrawAspect="Content" ObjectID="_1611677718" r:id="rId507"/>
         </w:object>
       </w:r>
       <w:r>
@@ -25747,7 +25815,7 @@
           <v:shape id="_x0000_i1294" type="#_x0000_t75" style="width:18pt;height:18pt" o:ole="">
             <v:imagedata r:id="rId508" o:title=""/>
           </v:shape>
-          <o:OLEObject Type="Embed" ProgID="Equation.DSMT4" ShapeID="_x0000_i1294" DrawAspect="Content" ObjectID="_1611676828" r:id="rId509"/>
+          <o:OLEObject Type="Embed" ProgID="Equation.DSMT4" ShapeID="_x0000_i1294" DrawAspect="Content" ObjectID="_1611677719" r:id="rId509"/>
         </w:object>
       </w:r>
       <w:r>
@@ -25788,7 +25856,7 @@
           <v:shape id="_x0000_i1295" type="#_x0000_t75" style="width:40.5pt;height:18pt" o:ole="">
             <v:imagedata r:id="rId510" o:title=""/>
           </v:shape>
-          <o:OLEObject Type="Embed" ProgID="Equation.DSMT4" ShapeID="_x0000_i1295" DrawAspect="Content" ObjectID="_1611676829" r:id="rId511"/>
+          <o:OLEObject Type="Embed" ProgID="Equation.DSMT4" ShapeID="_x0000_i1295" DrawAspect="Content" ObjectID="_1611677720" r:id="rId511"/>
         </w:object>
       </w:r>
       <w:r>
@@ -25892,7 +25960,7 @@
           <v:shape id="_x0000_i1296" type="#_x0000_t75" style="width:18pt;height:18pt" o:ole="">
             <v:imagedata r:id="rId512" o:title=""/>
           </v:shape>
-          <o:OLEObject Type="Embed" ProgID="Equation.DSMT4" ShapeID="_x0000_i1296" DrawAspect="Content" ObjectID="_1611676830" r:id="rId513"/>
+          <o:OLEObject Type="Embed" ProgID="Equation.DSMT4" ShapeID="_x0000_i1296" DrawAspect="Content" ObjectID="_1611677721" r:id="rId513"/>
         </w:object>
       </w:r>
       <w:r>
@@ -25933,7 +26001,7 @@
           <v:shape id="_x0000_i1297" type="#_x0000_t75" style="width:19.5pt;height:18pt" o:ole="">
             <v:imagedata r:id="rId514" o:title=""/>
           </v:shape>
-          <o:OLEObject Type="Embed" ProgID="Equation.DSMT4" ShapeID="_x0000_i1297" DrawAspect="Content" ObjectID="_1611676831" r:id="rId515"/>
+          <o:OLEObject Type="Embed" ProgID="Equation.DSMT4" ShapeID="_x0000_i1297" DrawAspect="Content" ObjectID="_1611677722" r:id="rId515"/>
         </w:object>
       </w:r>
       <w:r>
@@ -25974,7 +26042,7 @@
           <v:shape id="_x0000_i1298" type="#_x0000_t75" style="width:19.5pt;height:18pt" o:ole="">
             <v:imagedata r:id="rId516" o:title=""/>
           </v:shape>
-          <o:OLEObject Type="Embed" ProgID="Equation.DSMT4" ShapeID="_x0000_i1298" DrawAspect="Content" ObjectID="_1611676832" r:id="rId517"/>
+          <o:OLEObject Type="Embed" ProgID="Equation.DSMT4" ShapeID="_x0000_i1298" DrawAspect="Content" ObjectID="_1611677723" r:id="rId517"/>
         </w:object>
       </w:r>
       <w:r>
@@ -26015,7 +26083,7 @@
           <v:shape id="_x0000_i1299" type="#_x0000_t75" style="width:22.5pt;height:18pt" o:ole="">
             <v:imagedata r:id="rId518" o:title=""/>
           </v:shape>
-          <o:OLEObject Type="Embed" ProgID="Equation.DSMT4" ShapeID="_x0000_i1299" DrawAspect="Content" ObjectID="_1611676833" r:id="rId519"/>
+          <o:OLEObject Type="Embed" ProgID="Equation.DSMT4" ShapeID="_x0000_i1299" DrawAspect="Content" ObjectID="_1611677724" r:id="rId519"/>
         </w:object>
       </w:r>
       <w:r>
@@ -26047,7 +26115,7 @@
           <v:shape id="_x0000_i1300" type="#_x0000_t75" style="width:22.5pt;height:19.5pt" o:ole="">
             <v:imagedata r:id="rId520" o:title=""/>
           </v:shape>
-          <o:OLEObject Type="Embed" ProgID="Equation.DSMT4" ShapeID="_x0000_i1300" DrawAspect="Content" ObjectID="_1611676834" r:id="rId521"/>
+          <o:OLEObject Type="Embed" ProgID="Equation.DSMT4" ShapeID="_x0000_i1300" DrawAspect="Content" ObjectID="_1611677725" r:id="rId521"/>
         </w:object>
       </w:r>
       <w:r>
@@ -26091,7 +26159,7 @@
           <v:shape id="_x0000_i1301" type="#_x0000_t75" style="width:231pt;height:19.5pt" o:ole="">
             <v:imagedata r:id="rId522" o:title=""/>
           </v:shape>
-          <o:OLEObject Type="Embed" ProgID="Equation.DSMT4" ShapeID="_x0000_i1301" DrawAspect="Content" ObjectID="_1611676835" r:id="rId523"/>
+          <o:OLEObject Type="Embed" ProgID="Equation.DSMT4" ShapeID="_x0000_i1301" DrawAspect="Content" ObjectID="_1611677726" r:id="rId523"/>
         </w:object>
       </w:r>
       <w:r>
@@ -26135,7 +26203,7 @@
           <v:shape id="_x0000_i1302" type="#_x0000_t75" style="width:39pt;height:16.5pt" o:ole="">
             <v:imagedata r:id="rId524" o:title=""/>
           </v:shape>
-          <o:OLEObject Type="Embed" ProgID="Equation.DSMT4" ShapeID="_x0000_i1302" DrawAspect="Content" ObjectID="_1611676836" r:id="rId525"/>
+          <o:OLEObject Type="Embed" ProgID="Equation.DSMT4" ShapeID="_x0000_i1302" DrawAspect="Content" ObjectID="_1611677727" r:id="rId525"/>
         </w:object>
       </w:r>
       <w:r>
@@ -26167,7 +26235,7 @@
           <v:shape id="_x0000_i1303" type="#_x0000_t75" style="width:18pt;height:13.5pt" o:ole="">
             <v:imagedata r:id="rId526" o:title=""/>
           </v:shape>
-          <o:OLEObject Type="Embed" ProgID="Equation.DSMT4" ShapeID="_x0000_i1303" DrawAspect="Content" ObjectID="_1611676837" r:id="rId527"/>
+          <o:OLEObject Type="Embed" ProgID="Equation.DSMT4" ShapeID="_x0000_i1303" DrawAspect="Content" ObjectID="_1611677728" r:id="rId527"/>
         </w:object>
       </w:r>
       <w:r>
@@ -26217,7 +26285,7 @@
           <v:shape id="_x0000_i1304" type="#_x0000_t75" style="width:108.75pt;height:28.5pt" o:ole="">
             <v:imagedata r:id="rId528" o:title=""/>
           </v:shape>
-          <o:OLEObject Type="Embed" ProgID="Equation.DSMT4" ShapeID="_x0000_i1304" DrawAspect="Content" ObjectID="_1611676838" r:id="rId529"/>
+          <o:OLEObject Type="Embed" ProgID="Equation.DSMT4" ShapeID="_x0000_i1304" DrawAspect="Content" ObjectID="_1611677729" r:id="rId529"/>
         </w:object>
       </w:r>
       <w:r>
@@ -26249,7 +26317,7 @@
           <v:shape id="_x0000_i1305" type="#_x0000_t75" style="width:52.5pt;height:19.5pt" o:ole="">
             <v:imagedata r:id="rId530" o:title=""/>
           </v:shape>
-          <o:OLEObject Type="Embed" ProgID="Equation.DSMT4" ShapeID="_x0000_i1305" DrawAspect="Content" ObjectID="_1611676839" r:id="rId531"/>
+          <o:OLEObject Type="Embed" ProgID="Equation.DSMT4" ShapeID="_x0000_i1305" DrawAspect="Content" ObjectID="_1611677730" r:id="rId531"/>
         </w:object>
       </w:r>
       <w:r>
@@ -26284,7 +26352,7 @@
           <v:shape id="_x0000_i1306" type="#_x0000_t75" style="width:265.5pt;height:37.5pt" o:ole="">
             <v:imagedata r:id="rId532" o:title=""/>
           </v:shape>
-          <o:OLEObject Type="Embed" ProgID="Equation.DSMT4" ShapeID="_x0000_i1306" DrawAspect="Content" ObjectID="_1611676840" r:id="rId533"/>
+          <o:OLEObject Type="Embed" ProgID="Equation.DSMT4" ShapeID="_x0000_i1306" DrawAspect="Content" ObjectID="_1611677731" r:id="rId533"/>
         </w:object>
       </w:r>
       <w:r>
@@ -26337,7 +26405,7 @@
           <v:shape id="_x0000_i1307" type="#_x0000_t75" style="width:2in;height:37.5pt" o:ole="">
             <v:imagedata r:id="rId534" o:title=""/>
           </v:shape>
-          <o:OLEObject Type="Embed" ProgID="Equation.DSMT4" ShapeID="_x0000_i1307" DrawAspect="Content" ObjectID="_1611676841" r:id="rId535"/>
+          <o:OLEObject Type="Embed" ProgID="Equation.DSMT4" ShapeID="_x0000_i1307" DrawAspect="Content" ObjectID="_1611677732" r:id="rId535"/>
         </w:object>
       </w:r>
     </w:p>
@@ -26362,7 +26430,7 @@
           <v:shape id="_x0000_i1308" type="#_x0000_t75" style="width:341.25pt;height:39.75pt" o:ole="">
             <v:imagedata r:id="rId536" o:title=""/>
           </v:shape>
-          <o:OLEObject Type="Embed" ProgID="Equation.DSMT4" ShapeID="_x0000_i1308" DrawAspect="Content" ObjectID="_1611676842" r:id="rId537"/>
+          <o:OLEObject Type="Embed" ProgID="Equation.DSMT4" ShapeID="_x0000_i1308" DrawAspect="Content" ObjectID="_1611677733" r:id="rId537"/>
         </w:object>
       </w:r>
     </w:p>
@@ -26388,7 +26456,7 @@
           <v:shape id="_x0000_i1309" type="#_x0000_t75" style="width:351pt;height:39.75pt" o:ole="">
             <v:imagedata r:id="rId538" o:title=""/>
           </v:shape>
-          <o:OLEObject Type="Embed" ProgID="Equation.DSMT4" ShapeID="_x0000_i1309" DrawAspect="Content" ObjectID="_1611676843" r:id="rId539"/>
+          <o:OLEObject Type="Embed" ProgID="Equation.DSMT4" ShapeID="_x0000_i1309" DrawAspect="Content" ObjectID="_1611677734" r:id="rId539"/>
         </w:object>
       </w:r>
       <w:r>
@@ -26450,7 +26518,7 @@
           <v:shape id="_x0000_i1310" type="#_x0000_t75" style="width:111pt;height:24pt" o:ole="">
             <v:imagedata r:id="rId540" o:title=""/>
           </v:shape>
-          <o:OLEObject Type="Embed" ProgID="Equation.DSMT4" ShapeID="_x0000_i1310" DrawAspect="Content" ObjectID="_1611676844" r:id="rId541"/>
+          <o:OLEObject Type="Embed" ProgID="Equation.DSMT4" ShapeID="_x0000_i1310" DrawAspect="Content" ObjectID="_1611677735" r:id="rId541"/>
         </w:object>
       </w:r>
       <w:r>
@@ -26563,7 +26631,7 @@
           <v:shape id="_x0000_i1311" type="#_x0000_t75" style="width:10.5pt;height:13.5pt" o:ole="">
             <v:imagedata r:id="rId542" o:title=""/>
           </v:shape>
-          <o:OLEObject Type="Embed" ProgID="Equation.DSMT4" ShapeID="_x0000_i1311" DrawAspect="Content" ObjectID="_1611676845" r:id="rId543"/>
+          <o:OLEObject Type="Embed" ProgID="Equation.DSMT4" ShapeID="_x0000_i1311" DrawAspect="Content" ObjectID="_1611677736" r:id="rId543"/>
         </w:object>
       </w:r>
       <w:r>
@@ -26631,7 +26699,7 @@
           <v:shape id="_x0000_i1312" type="#_x0000_t75" style="width:31.5pt;height:13.5pt" o:ole="">
             <v:imagedata r:id="rId544" o:title=""/>
           </v:shape>
-          <o:OLEObject Type="Embed" ProgID="Equation.DSMT4" ShapeID="_x0000_i1312" DrawAspect="Content" ObjectID="_1611676846" r:id="rId545"/>
+          <o:OLEObject Type="Embed" ProgID="Equation.DSMT4" ShapeID="_x0000_i1312" DrawAspect="Content" ObjectID="_1611677737" r:id="rId545"/>
         </w:object>
       </w:r>
       <w:r>
@@ -26654,7 +26722,7 @@
           <v:shape id="_x0000_i1313" type="#_x0000_t75" style="width:37.5pt;height:13.5pt" o:ole="">
             <v:imagedata r:id="rId546" o:title=""/>
           </v:shape>
-          <o:OLEObject Type="Embed" ProgID="Equation.DSMT4" ShapeID="_x0000_i1313" DrawAspect="Content" ObjectID="_1611676847" r:id="rId547"/>
+          <o:OLEObject Type="Embed" ProgID="Equation.DSMT4" ShapeID="_x0000_i1313" DrawAspect="Content" ObjectID="_1611677738" r:id="rId547"/>
         </w:object>
       </w:r>
       <w:r>
@@ -26716,7 +26784,7 @@
           <v:shape id="_x0000_i1314" type="#_x0000_t75" style="width:280.5pt;height:28.5pt" o:ole="">
             <v:imagedata r:id="rId548" o:title=""/>
           </v:shape>
-          <o:OLEObject Type="Embed" ProgID="Equation.DSMT4" ShapeID="_x0000_i1314" DrawAspect="Content" ObjectID="_1611676848" r:id="rId549"/>
+          <o:OLEObject Type="Embed" ProgID="Equation.DSMT4" ShapeID="_x0000_i1314" DrawAspect="Content" ObjectID="_1611677739" r:id="rId549"/>
         </w:object>
       </w:r>
       <w:r>
@@ -26869,7 +26937,7 @@
           <v:shape id="_x0000_i1315" type="#_x0000_t75" style="width:13.5pt;height:18pt" o:ole="">
             <v:imagedata r:id="rId550" o:title=""/>
           </v:shape>
-          <o:OLEObject Type="Embed" ProgID="Equation.DSMT4" ShapeID="_x0000_i1315" DrawAspect="Content" ObjectID="_1611676849" r:id="rId551"/>
+          <o:OLEObject Type="Embed" ProgID="Equation.DSMT4" ShapeID="_x0000_i1315" DrawAspect="Content" ObjectID="_1611677740" r:id="rId551"/>
         </w:object>
       </w:r>
       <w:r>
@@ -26962,7 +27030,7 @@
           <v:shape id="_x0000_i1316" type="#_x0000_t75" style="width:73.5pt;height:18pt" o:ole="">
             <v:imagedata r:id="rId552" o:title=""/>
           </v:shape>
-          <o:OLEObject Type="Embed" ProgID="Equation.DSMT4" ShapeID="_x0000_i1316" DrawAspect="Content" ObjectID="_1611676850" r:id="rId553"/>
+          <o:OLEObject Type="Embed" ProgID="Equation.DSMT4" ShapeID="_x0000_i1316" DrawAspect="Content" ObjectID="_1611677741" r:id="rId553"/>
         </w:object>
       </w:r>
       <w:r>
@@ -27007,7 +27075,7 @@
           <v:shape id="_x0000_i1317" type="#_x0000_t75" style="width:21pt;height:19.5pt" o:ole="">
             <v:imagedata r:id="rId554" o:title=""/>
           </v:shape>
-          <o:OLEObject Type="Embed" ProgID="Equation.DSMT4" ShapeID="_x0000_i1317" DrawAspect="Content" ObjectID="_1611676851" r:id="rId555"/>
+          <o:OLEObject Type="Embed" ProgID="Equation.DSMT4" ShapeID="_x0000_i1317" DrawAspect="Content" ObjectID="_1611677742" r:id="rId555"/>
         </w:object>
       </w:r>
       <w:r>
@@ -27044,7 +27112,7 @@
           <v:shape id="_x0000_i1318" type="#_x0000_t75" style="width:28.5pt;height:16.5pt" o:ole="">
             <v:imagedata r:id="rId556" o:title=""/>
           </v:shape>
-          <o:OLEObject Type="Embed" ProgID="Equation.DSMT4" ShapeID="_x0000_i1318" DrawAspect="Content" ObjectID="_1611676852" r:id="rId557"/>
+          <o:OLEObject Type="Embed" ProgID="Equation.DSMT4" ShapeID="_x0000_i1318" DrawAspect="Content" ObjectID="_1611677743" r:id="rId557"/>
         </w:object>
       </w:r>
       <w:r>
@@ -27081,7 +27149,7 @@
           <v:shape id="_x0000_i1319" type="#_x0000_t75" style="width:30pt;height:19.5pt" o:ole="">
             <v:imagedata r:id="rId558" o:title=""/>
           </v:shape>
-          <o:OLEObject Type="Embed" ProgID="Equation.DSMT4" ShapeID="_x0000_i1319" DrawAspect="Content" ObjectID="_1611676853" r:id="rId559"/>
+          <o:OLEObject Type="Embed" ProgID="Equation.DSMT4" ShapeID="_x0000_i1319" DrawAspect="Content" ObjectID="_1611677744" r:id="rId559"/>
         </w:object>
       </w:r>
       <w:r>
@@ -27188,7 +27256,7 @@
           <v:shape id="_x0000_i1320" type="#_x0000_t75" style="width:40.5pt;height:18pt" o:ole="">
             <v:imagedata r:id="rId560" o:title=""/>
           </v:shape>
-          <o:OLEObject Type="Embed" ProgID="Equation.DSMT4" ShapeID="_x0000_i1320" DrawAspect="Content" ObjectID="_1611676854" r:id="rId561"/>
+          <o:OLEObject Type="Embed" ProgID="Equation.DSMT4" ShapeID="_x0000_i1320" DrawAspect="Content" ObjectID="_1611677745" r:id="rId561"/>
         </w:object>
       </w:r>
       <w:r>
@@ -27247,7 +27315,7 @@
           <v:shape id="_x0000_i1321" type="#_x0000_t75" style="width:12pt;height:18pt" o:ole="">
             <v:imagedata r:id="rId562" o:title=""/>
           </v:shape>
-          <o:OLEObject Type="Embed" ProgID="Equation.DSMT4" ShapeID="_x0000_i1321" DrawAspect="Content" ObjectID="_1611676855" r:id="rId563"/>
+          <o:OLEObject Type="Embed" ProgID="Equation.DSMT4" ShapeID="_x0000_i1321" DrawAspect="Content" ObjectID="_1611677746" r:id="rId563"/>
         </w:object>
       </w:r>
       <w:r>
@@ -27279,7 +27347,7 @@
           <v:shape id="_x0000_i1322" type="#_x0000_t75" style="width:154.5pt;height:17.25pt" o:ole="">
             <v:imagedata r:id="rId564" o:title=""/>
           </v:shape>
-          <o:OLEObject Type="Embed" ProgID="Equation.DSMT4" ShapeID="_x0000_i1322" DrawAspect="Content" ObjectID="_1611676856" r:id="rId565"/>
+          <o:OLEObject Type="Embed" ProgID="Equation.DSMT4" ShapeID="_x0000_i1322" DrawAspect="Content" ObjectID="_1611677747" r:id="rId565"/>
         </w:object>
       </w:r>
       <w:r>
@@ -27341,7 +27409,7 @@
           <v:shape id="_x0000_i1323" type="#_x0000_t75" style="width:102pt;height:34.5pt" o:ole="">
             <v:imagedata r:id="rId566" o:title=""/>
           </v:shape>
-          <o:OLEObject Type="Embed" ProgID="Equation.DSMT4" ShapeID="_x0000_i1323" DrawAspect="Content" ObjectID="_1611676857" r:id="rId567"/>
+          <o:OLEObject Type="Embed" ProgID="Equation.DSMT4" ShapeID="_x0000_i1323" DrawAspect="Content" ObjectID="_1611677748" r:id="rId567"/>
         </w:object>
       </w:r>
       <w:r>
@@ -27376,7 +27444,7 @@
           <v:shape id="_x0000_i1324" type="#_x0000_t75" style="width:280.5pt;height:22.5pt" o:ole="">
             <v:imagedata r:id="rId568" o:title=""/>
           </v:shape>
-          <o:OLEObject Type="Embed" ProgID="Equation.DSMT4" ShapeID="_x0000_i1324" DrawAspect="Content" ObjectID="_1611676858" r:id="rId569"/>
+          <o:OLEObject Type="Embed" ProgID="Equation.DSMT4" ShapeID="_x0000_i1324" DrawAspect="Content" ObjectID="_1611677749" r:id="rId569"/>
         </w:object>
       </w:r>
       <w:r>
@@ -27411,7 +27479,7 @@
           <v:shape id="_x0000_i1325" type="#_x0000_t75" style="width:434.25pt;height:40.5pt" o:ole="">
             <v:imagedata r:id="rId570" o:title=""/>
           </v:shape>
-          <o:OLEObject Type="Embed" ProgID="Equation.DSMT4" ShapeID="_x0000_i1325" DrawAspect="Content" ObjectID="_1611676859" r:id="rId571"/>
+          <o:OLEObject Type="Embed" ProgID="Equation.DSMT4" ShapeID="_x0000_i1325" DrawAspect="Content" ObjectID="_1611677750" r:id="rId571"/>
         </w:object>
       </w:r>
       <w:r>
@@ -27455,7 +27523,7 @@
           <v:shape id="_x0000_i1326" type="#_x0000_t75" style="width:24pt;height:18pt" o:ole="">
             <v:imagedata r:id="rId572" o:title=""/>
           </v:shape>
-          <o:OLEObject Type="Embed" ProgID="Equation.DSMT4" ShapeID="_x0000_i1326" DrawAspect="Content" ObjectID="_1611676860" r:id="rId573"/>
+          <o:OLEObject Type="Embed" ProgID="Equation.DSMT4" ShapeID="_x0000_i1326" DrawAspect="Content" ObjectID="_1611677751" r:id="rId573"/>
         </w:object>
       </w:r>
       <w:r>
@@ -27915,7 +27983,7 @@
           <v:shape id="_x0000_i1327" type="#_x0000_t75" style="width:13.5pt;height:18pt" o:ole="">
             <v:imagedata r:id="rId574" o:title=""/>
           </v:shape>
-          <o:OLEObject Type="Embed" ProgID="Equation.DSMT4" ShapeID="_x0000_i1327" DrawAspect="Content" ObjectID="_1611676861" r:id="rId575"/>
+          <o:OLEObject Type="Embed" ProgID="Equation.DSMT4" ShapeID="_x0000_i1327" DrawAspect="Content" ObjectID="_1611677752" r:id="rId575"/>
         </w:object>
       </w:r>
       <w:r>
@@ -28074,7 +28142,7 @@
           <v:shape id="_x0000_i1328" type="#_x0000_t75" style="width:15pt;height:18pt" o:ole="">
             <v:imagedata r:id="rId576" o:title=""/>
           </v:shape>
-          <o:OLEObject Type="Embed" ProgID="Equation.DSMT4" ShapeID="_x0000_i1328" DrawAspect="Content" ObjectID="_1611676862" r:id="rId577"/>
+          <o:OLEObject Type="Embed" ProgID="Equation.DSMT4" ShapeID="_x0000_i1328" DrawAspect="Content" ObjectID="_1611677753" r:id="rId577"/>
         </w:object>
       </w:r>
       <w:r>
@@ -28169,7 +28237,7 @@
           <v:shape id="_x0000_i1329" type="#_x0000_t75" style="width:28.5pt;height:19.5pt" o:ole="">
             <v:imagedata r:id="rId578" o:title=""/>
           </v:shape>
-          <o:OLEObject Type="Embed" ProgID="Equation.DSMT4" ShapeID="_x0000_i1329" DrawAspect="Content" ObjectID="_1611676863" r:id="rId579"/>
+          <o:OLEObject Type="Embed" ProgID="Equation.DSMT4" ShapeID="_x0000_i1329" DrawAspect="Content" ObjectID="_1611677754" r:id="rId579"/>
         </w:object>
       </w:r>
       <w:r>
@@ -28219,7 +28287,7 @@
           <v:shape id="_x0000_i1330" type="#_x0000_t75" style="width:28.5pt;height:19.5pt" o:ole="">
             <v:imagedata r:id="rId580" o:title=""/>
           </v:shape>
-          <o:OLEObject Type="Embed" ProgID="Equation.DSMT4" ShapeID="_x0000_i1330" DrawAspect="Content" ObjectID="_1611676864" r:id="rId581"/>
+          <o:OLEObject Type="Embed" ProgID="Equation.DSMT4" ShapeID="_x0000_i1330" DrawAspect="Content" ObjectID="_1611677755" r:id="rId581"/>
         </w:object>
       </w:r>
       <w:r>
@@ -28269,7 +28337,7 @@
           <v:shape id="_x0000_i1331" type="#_x0000_t75" style="width:13.5pt;height:18pt" o:ole="">
             <v:imagedata r:id="rId582" o:title=""/>
           </v:shape>
-          <o:OLEObject Type="Embed" ProgID="Equation.DSMT4" ShapeID="_x0000_i1331" DrawAspect="Content" ObjectID="_1611676865" r:id="rId583"/>
+          <o:OLEObject Type="Embed" ProgID="Equation.DSMT4" ShapeID="_x0000_i1331" DrawAspect="Content" ObjectID="_1611677756" r:id="rId583"/>
         </w:object>
       </w:r>
       <w:r>
@@ -28301,7 +28369,7 @@
           <v:shape id="_x0000_i1332" type="#_x0000_t75" style="width:22.5pt;height:19.5pt" o:ole="">
             <v:imagedata r:id="rId584" o:title=""/>
           </v:shape>
-          <o:OLEObject Type="Embed" ProgID="Equation.DSMT4" ShapeID="_x0000_i1332" DrawAspect="Content" ObjectID="_1611676866" r:id="rId585"/>
+          <o:OLEObject Type="Embed" ProgID="Equation.DSMT4" ShapeID="_x0000_i1332" DrawAspect="Content" ObjectID="_1611677757" r:id="rId585"/>
         </w:object>
       </w:r>
       <w:r>
@@ -28333,7 +28401,7 @@
           <v:shape id="_x0000_i1333" type="#_x0000_t75" style="width:22.5pt;height:13.5pt" o:ole="">
             <v:imagedata r:id="rId586" o:title=""/>
           </v:shape>
-          <o:OLEObject Type="Embed" ProgID="Equation.DSMT4" ShapeID="_x0000_i1333" DrawAspect="Content" ObjectID="_1611676867" r:id="rId587"/>
+          <o:OLEObject Type="Embed" ProgID="Equation.DSMT4" ShapeID="_x0000_i1333" DrawAspect="Content" ObjectID="_1611677758" r:id="rId587"/>
         </w:object>
       </w:r>
       <w:r>
@@ -28374,7 +28442,7 @@
           <v:shape id="_x0000_i1334" type="#_x0000_t75" style="width:25.5pt;height:14.25pt" o:ole="">
             <v:imagedata r:id="rId586" o:title=""/>
           </v:shape>
-          <o:OLEObject Type="Embed" ProgID="Equation.DSMT4" ShapeID="_x0000_i1334" DrawAspect="Content" ObjectID="_1611676868" r:id="rId588"/>
+          <o:OLEObject Type="Embed" ProgID="Equation.DSMT4" ShapeID="_x0000_i1334" DrawAspect="Content" ObjectID="_1611677759" r:id="rId588"/>
         </w:object>
       </w:r>
       <w:r>
@@ -28442,7 +28510,7 @@
           <v:shape id="_x0000_i1335" type="#_x0000_t75" style="width:138pt;height:19.5pt" o:ole="">
             <v:imagedata r:id="rId589" o:title=""/>
           </v:shape>
-          <o:OLEObject Type="Embed" ProgID="Equation.DSMT4" ShapeID="_x0000_i1335" DrawAspect="Content" ObjectID="_1611676869" r:id="rId590"/>
+          <o:OLEObject Type="Embed" ProgID="Equation.DSMT4" ShapeID="_x0000_i1335" DrawAspect="Content" ObjectID="_1611677760" r:id="rId590"/>
         </w:object>
       </w:r>
       <w:r>
@@ -28474,7 +28542,7 @@
           <v:shape id="_x0000_i1336" type="#_x0000_t75" style="width:42pt;height:19.5pt" o:ole="">
             <v:imagedata r:id="rId591" o:title=""/>
           </v:shape>
-          <o:OLEObject Type="Embed" ProgID="Equation.DSMT4" ShapeID="_x0000_i1336" DrawAspect="Content" ObjectID="_1611676870" r:id="rId592"/>
+          <o:OLEObject Type="Embed" ProgID="Equation.DSMT4" ShapeID="_x0000_i1336" DrawAspect="Content" ObjectID="_1611677761" r:id="rId592"/>
         </w:object>
       </w:r>
       <w:r>
@@ -28587,7 +28655,7 @@
           <v:shape id="_x0000_i1337" type="#_x0000_t75" style="width:19.5pt;height:18pt" o:ole="">
             <v:imagedata r:id="rId593" o:title=""/>
           </v:shape>
-          <o:OLEObject Type="Embed" ProgID="Equation.DSMT4" ShapeID="_x0000_i1337" DrawAspect="Content" ObjectID="_1611676871" r:id="rId594"/>
+          <o:OLEObject Type="Embed" ProgID="Equation.DSMT4" ShapeID="_x0000_i1337" DrawAspect="Content" ObjectID="_1611677762" r:id="rId594"/>
         </w:object>
       </w:r>
       <w:r>
@@ -28829,7 +28897,7 @@
           <v:shape id="_x0000_i1338" type="#_x0000_t75" style="width:33.75pt;height:18pt" o:ole="">
             <v:imagedata r:id="rId493" o:title=""/>
           </v:shape>
-          <o:OLEObject Type="Embed" ProgID="Equation.DSMT4" ShapeID="_x0000_i1338" DrawAspect="Content" ObjectID="_1611676872" r:id="rId596"/>
+          <o:OLEObject Type="Embed" ProgID="Equation.DSMT4" ShapeID="_x0000_i1338" DrawAspect="Content" ObjectID="_1611677763" r:id="rId596"/>
         </w:object>
       </w:r>
       <w:r>
@@ -28929,7 +28997,7 @@
           <v:shape id="_x0000_i1339" type="#_x0000_t75" style="width:13.5pt;height:18pt" o:ole="">
             <v:imagedata r:id="rId597" o:title=""/>
           </v:shape>
-          <o:OLEObject Type="Embed" ProgID="Equation.DSMT4" ShapeID="_x0000_i1339" DrawAspect="Content" ObjectID="_1611676873" r:id="rId598"/>
+          <o:OLEObject Type="Embed" ProgID="Equation.DSMT4" ShapeID="_x0000_i1339" DrawAspect="Content" ObjectID="_1611677764" r:id="rId598"/>
         </w:object>
       </w:r>
       <w:r>
@@ -28971,7 +29039,7 @@
           <v:shape id="_x0000_i1340" type="#_x0000_t75" style="width:15pt;height:18pt" o:ole="">
             <v:imagedata r:id="rId599" o:title=""/>
           </v:shape>
-          <o:OLEObject Type="Embed" ProgID="Equation.DSMT4" ShapeID="_x0000_i1340" DrawAspect="Content" ObjectID="_1611676874" r:id="rId600"/>
+          <o:OLEObject Type="Embed" ProgID="Equation.DSMT4" ShapeID="_x0000_i1340" DrawAspect="Content" ObjectID="_1611677765" r:id="rId600"/>
         </w:object>
       </w:r>
       <w:r>
@@ -29021,7 +29089,7 @@
           <v:shape id="_x0000_i1341" type="#_x0000_t75" style="width:12pt;height:10.5pt" o:ole="">
             <v:imagedata r:id="rId601" o:title=""/>
           </v:shape>
-          <o:OLEObject Type="Embed" ProgID="Equation.DSMT4" ShapeID="_x0000_i1341" DrawAspect="Content" ObjectID="_1611676875" r:id="rId602"/>
+          <o:OLEObject Type="Embed" ProgID="Equation.DSMT4" ShapeID="_x0000_i1341" DrawAspect="Content" ObjectID="_1611677766" r:id="rId602"/>
         </w:object>
       </w:r>
       <w:r>
@@ -29080,7 +29148,7 @@
           <v:shape id="_x0000_i1342" type="#_x0000_t75" style="width:16.5pt;height:18pt" o:ole="">
             <v:imagedata r:id="rId603" o:title=""/>
           </v:shape>
-          <o:OLEObject Type="Embed" ProgID="Equation.DSMT4" ShapeID="_x0000_i1342" DrawAspect="Content" ObjectID="_1611676876" r:id="rId604"/>
+          <o:OLEObject Type="Embed" ProgID="Equation.DSMT4" ShapeID="_x0000_i1342" DrawAspect="Content" ObjectID="_1611677767" r:id="rId604"/>
         </w:object>
       </w:r>
       <w:r>
@@ -29112,7 +29180,7 @@
           <v:shape id="_x0000_i1343" type="#_x0000_t75" style="width:21pt;height:18pt" o:ole="">
             <v:imagedata r:id="rId605" o:title=""/>
           </v:shape>
-          <o:OLEObject Type="Embed" ProgID="Equation.DSMT4" ShapeID="_x0000_i1343" DrawAspect="Content" ObjectID="_1611676877" r:id="rId606"/>
+          <o:OLEObject Type="Embed" ProgID="Equation.DSMT4" ShapeID="_x0000_i1343" DrawAspect="Content" ObjectID="_1611677768" r:id="rId606"/>
         </w:object>
       </w:r>
       <w:r>
@@ -29171,7 +29239,7 @@
           <v:shape id="_x0000_i1344" type="#_x0000_t75" style="width:49.5pt;height:18pt" o:ole="">
             <v:imagedata r:id="rId607" o:title=""/>
           </v:shape>
-          <o:OLEObject Type="Embed" ProgID="Equation.DSMT4" ShapeID="_x0000_i1344" DrawAspect="Content" ObjectID="_1611676878" r:id="rId608"/>
+          <o:OLEObject Type="Embed" ProgID="Equation.DSMT4" ShapeID="_x0000_i1344" DrawAspect="Content" ObjectID="_1611677769" r:id="rId608"/>
         </w:object>
       </w:r>
       <w:r>
@@ -29194,7 +29262,7 @@
           <v:shape id="_x0000_i1345" type="#_x0000_t75" style="width:54pt;height:18pt" o:ole="">
             <v:imagedata r:id="rId609" o:title=""/>
           </v:shape>
-          <o:OLEObject Type="Embed" ProgID="Equation.DSMT4" ShapeID="_x0000_i1345" DrawAspect="Content" ObjectID="_1611676879" r:id="rId610"/>
+          <o:OLEObject Type="Embed" ProgID="Equation.DSMT4" ShapeID="_x0000_i1345" DrawAspect="Content" ObjectID="_1611677770" r:id="rId610"/>
         </w:object>
       </w:r>
       <w:r>
@@ -29226,7 +29294,7 @@
           <v:shape id="_x0000_i1346" type="#_x0000_t75" style="width:43.5pt;height:18pt" o:ole="">
             <v:imagedata r:id="rId611" o:title=""/>
           </v:shape>
-          <o:OLEObject Type="Embed" ProgID="Equation.DSMT4" ShapeID="_x0000_i1346" DrawAspect="Content" ObjectID="_1611676880" r:id="rId612"/>
+          <o:OLEObject Type="Embed" ProgID="Equation.DSMT4" ShapeID="_x0000_i1346" DrawAspect="Content" ObjectID="_1611677771" r:id="rId612"/>
         </w:object>
       </w:r>
       <w:r>
@@ -29285,7 +29353,7 @@
           <v:shape id="_x0000_i1347" type="#_x0000_t75" style="width:22.5pt;height:19.5pt" o:ole="">
             <v:imagedata r:id="rId613" o:title=""/>
           </v:shape>
-          <o:OLEObject Type="Embed" ProgID="Equation.DSMT4" ShapeID="_x0000_i1347" DrawAspect="Content" ObjectID="_1611676881" r:id="rId614"/>
+          <o:OLEObject Type="Embed" ProgID="Equation.DSMT4" ShapeID="_x0000_i1347" DrawAspect="Content" ObjectID="_1611677772" r:id="rId614"/>
         </w:object>
       </w:r>
       <w:r>
@@ -29308,7 +29376,7 @@
           <v:shape id="_x0000_i1348" type="#_x0000_t75" style="width:12pt;height:10.5pt" o:ole="">
             <v:imagedata r:id="rId615" o:title=""/>
           </v:shape>
-          <o:OLEObject Type="Embed" ProgID="Equation.DSMT4" ShapeID="_x0000_i1348" DrawAspect="Content" ObjectID="_1611676882" r:id="rId616"/>
+          <o:OLEObject Type="Embed" ProgID="Equation.DSMT4" ShapeID="_x0000_i1348" DrawAspect="Content" ObjectID="_1611677773" r:id="rId616"/>
         </w:object>
       </w:r>
       <w:r>
@@ -29592,7 +29660,7 @@
           <v:shape id="_x0000_i1349" type="#_x0000_t75" style="width:51pt;height:18pt" o:ole="">
             <v:imagedata r:id="rId617" o:title=""/>
           </v:shape>
-          <o:OLEObject Type="Embed" ProgID="Equation.DSMT4" ShapeID="_x0000_i1349" DrawAspect="Content" ObjectID="_1611676883" r:id="rId618"/>
+          <o:OLEObject Type="Embed" ProgID="Equation.DSMT4" ShapeID="_x0000_i1349" DrawAspect="Content" ObjectID="_1611677774" r:id="rId618"/>
         </w:object>
       </w:r>
       <w:r>
@@ -29696,7 +29764,7 @@
           <v:shape id="_x0000_i1350" type="#_x0000_t75" style="width:51pt;height:18pt" o:ole="">
             <v:imagedata r:id="rId617" o:title=""/>
           </v:shape>
-          <o:OLEObject Type="Embed" ProgID="Equation.DSMT4" ShapeID="_x0000_i1350" DrawAspect="Content" ObjectID="_1611676884" r:id="rId619"/>
+          <o:OLEObject Type="Embed" ProgID="Equation.DSMT4" ShapeID="_x0000_i1350" DrawAspect="Content" ObjectID="_1611677775" r:id="rId619"/>
         </w:object>
       </w:r>
       <w:r>
@@ -29719,7 +29787,7 @@
           <v:shape id="_x0000_i1351" type="#_x0000_t75" style="width:100.5pt;height:42pt" o:ole="">
             <v:imagedata r:id="rId620" o:title=""/>
           </v:shape>
-          <o:OLEObject Type="Embed" ProgID="Equation.DSMT4" ShapeID="_x0000_i1351" DrawAspect="Content" ObjectID="_1611676885" r:id="rId621"/>
+          <o:OLEObject Type="Embed" ProgID="Equation.DSMT4" ShapeID="_x0000_i1351" DrawAspect="Content" ObjectID="_1611677776" r:id="rId621"/>
         </w:object>
       </w:r>
       <w:r>
@@ -29940,7 +30008,7 @@
           <v:shape id="_x0000_i1352" type="#_x0000_t75" style="width:40.5pt;height:18pt" o:ole="">
             <v:imagedata r:id="rId622" o:title=""/>
           </v:shape>
-          <o:OLEObject Type="Embed" ProgID="Equation.DSMT4" ShapeID="_x0000_i1352" DrawAspect="Content" ObjectID="_1611676886" r:id="rId623"/>
+          <o:OLEObject Type="Embed" ProgID="Equation.DSMT4" ShapeID="_x0000_i1352" DrawAspect="Content" ObjectID="_1611677777" r:id="rId623"/>
         </w:object>
       </w:r>
       <w:r>
@@ -30161,7 +30229,7 @@
           <v:shape id="_x0000_i1353" type="#_x0000_t75" style="width:51pt;height:18pt" o:ole="">
             <v:imagedata r:id="rId617" o:title=""/>
           </v:shape>
-          <o:OLEObject Type="Embed" ProgID="Equation.DSMT4" ShapeID="_x0000_i1353" DrawAspect="Content" ObjectID="_1611676887" r:id="rId624"/>
+          <o:OLEObject Type="Embed" ProgID="Equation.DSMT4" ShapeID="_x0000_i1353" DrawAspect="Content" ObjectID="_1611677778" r:id="rId624"/>
         </w:object>
       </w:r>
       <w:r>
@@ -30310,7 +30378,7 @@
           <v:shape id="_x0000_i1354" type="#_x0000_t75" style="width:31.5pt;height:16.5pt" o:ole="">
             <v:imagedata r:id="rId625" o:title=""/>
           </v:shape>
-          <o:OLEObject Type="Embed" ProgID="Equation.DSMT4" ShapeID="_x0000_i1354" DrawAspect="Content" ObjectID="_1611676888" r:id="rId626"/>
+          <o:OLEObject Type="Embed" ProgID="Equation.DSMT4" ShapeID="_x0000_i1354" DrawAspect="Content" ObjectID="_1611677779" r:id="rId626"/>
         </w:object>
       </w:r>
       <w:r>
@@ -30352,7 +30420,7 @@
           <v:shape id="_x0000_i1355" type="#_x0000_t75" style="width:31.5pt;height:16.5pt" o:ole="">
             <v:imagedata r:id="rId627" o:title=""/>
           </v:shape>
-          <o:OLEObject Type="Embed" ProgID="Equation.DSMT4" ShapeID="_x0000_i1355" DrawAspect="Content" ObjectID="_1611676889" r:id="rId628"/>
+          <o:OLEObject Type="Embed" ProgID="Equation.DSMT4" ShapeID="_x0000_i1355" DrawAspect="Content" ObjectID="_1611677780" r:id="rId628"/>
         </w:object>
       </w:r>
       <w:r>
@@ -30465,7 +30533,7 @@
           <v:shape id="_x0000_i1356" type="#_x0000_t75" style="width:112.5pt;height:18pt" o:ole="">
             <v:imagedata r:id="rId629" o:title=""/>
           </v:shape>
-          <o:OLEObject Type="Embed" ProgID="Equation.DSMT4" ShapeID="_x0000_i1356" DrawAspect="Content" ObjectID="_1611676890" r:id="rId630"/>
+          <o:OLEObject Type="Embed" ProgID="Equation.DSMT4" ShapeID="_x0000_i1356" DrawAspect="Content" ObjectID="_1611677781" r:id="rId630"/>
         </w:object>
       </w:r>
       <w:r>
@@ -30497,7 +30565,7 @@
           <v:shape id="_x0000_i1357" type="#_x0000_t75" style="width:112.5pt;height:18pt" o:ole="">
             <v:imagedata r:id="rId631" o:title=""/>
           </v:shape>
-          <o:OLEObject Type="Embed" ProgID="Equation.DSMT4" ShapeID="_x0000_i1357" DrawAspect="Content" ObjectID="_1611676891" r:id="rId632"/>
+          <o:OLEObject Type="Embed" ProgID="Equation.DSMT4" ShapeID="_x0000_i1357" DrawAspect="Content" ObjectID="_1611677782" r:id="rId632"/>
         </w:object>
       </w:r>
       <w:r>
@@ -30538,7 +30606,7 @@
           <v:shape id="_x0000_i1358" type="#_x0000_t75" style="width:21pt;height:18pt" o:ole="">
             <v:imagedata r:id="rId633" o:title=""/>
           </v:shape>
-          <o:OLEObject Type="Embed" ProgID="Equation.DSMT4" ShapeID="_x0000_i1358" DrawAspect="Content" ObjectID="_1611676892" r:id="rId634"/>
+          <o:OLEObject Type="Embed" ProgID="Equation.DSMT4" ShapeID="_x0000_i1358" DrawAspect="Content" ObjectID="_1611677783" r:id="rId634"/>
         </w:object>
       </w:r>
       <w:r>
@@ -30724,7 +30792,7 @@
           <v:shape id="_x0000_i1359" type="#_x0000_t75" style="width:31.5pt;height:16.5pt" o:ole="">
             <v:imagedata r:id="rId625" o:title=""/>
           </v:shape>
-          <o:OLEObject Type="Embed" ProgID="Equation.DSMT4" ShapeID="_x0000_i1359" DrawAspect="Content" ObjectID="_1611676893" r:id="rId635"/>
+          <o:OLEObject Type="Embed" ProgID="Equation.DSMT4" ShapeID="_x0000_i1359" DrawAspect="Content" ObjectID="_1611677784" r:id="rId635"/>
         </w:object>
       </w:r>
       <w:r>
@@ -30757,7 +30825,7 @@
           <v:shape id="_x0000_i1360" type="#_x0000_t75" style="width:33pt;height:18pt" o:ole="">
             <v:imagedata r:id="rId493" o:title=""/>
           </v:shape>
-          <o:OLEObject Type="Embed" ProgID="Equation.DSMT4" ShapeID="_x0000_i1360" DrawAspect="Content" ObjectID="_1611676894" r:id="rId636"/>
+          <o:OLEObject Type="Embed" ProgID="Equation.DSMT4" ShapeID="_x0000_i1360" DrawAspect="Content" ObjectID="_1611677785" r:id="rId636"/>
         </w:object>
       </w:r>
       <w:r>
@@ -30790,7 +30858,7 @@
           <v:shape id="_x0000_i1361" type="#_x0000_t75" style="width:40.5pt;height:18pt" o:ole="">
             <v:imagedata r:id="rId622" o:title=""/>
           </v:shape>
-          <o:OLEObject Type="Embed" ProgID="Equation.DSMT4" ShapeID="_x0000_i1361" DrawAspect="Content" ObjectID="_1611676895" r:id="rId637"/>
+          <o:OLEObject Type="Embed" ProgID="Equation.DSMT4" ShapeID="_x0000_i1361" DrawAspect="Content" ObjectID="_1611677786" r:id="rId637"/>
         </w:object>
       </w:r>
       <w:r>
@@ -30861,7 +30929,7 @@
           <v:shape id="_x0000_i1362" type="#_x0000_t75" style="width:63pt;height:18pt" o:ole="">
             <v:imagedata r:id="rId638" o:title=""/>
           </v:shape>
-          <o:OLEObject Type="Embed" ProgID="Equation.DSMT4" ShapeID="_x0000_i1362" DrawAspect="Content" ObjectID="_1611676896" r:id="rId639"/>
+          <o:OLEObject Type="Embed" ProgID="Equation.DSMT4" ShapeID="_x0000_i1362" DrawAspect="Content" ObjectID="_1611677787" r:id="rId639"/>
         </w:object>
       </w:r>
       <w:r>
@@ -30946,7 +31014,7 @@
           <v:shape id="_x0000_i1363" type="#_x0000_t75" style="width:19.5pt;height:18pt" o:ole="">
             <v:imagedata r:id="rId640" o:title=""/>
           </v:shape>
-          <o:OLEObject Type="Embed" ProgID="Equation.DSMT4" ShapeID="_x0000_i1363" DrawAspect="Content" ObjectID="_1611676897" r:id="rId641"/>
+          <o:OLEObject Type="Embed" ProgID="Equation.DSMT4" ShapeID="_x0000_i1363" DrawAspect="Content" ObjectID="_1611677788" r:id="rId641"/>
         </w:object>
       </w:r>
       <w:r>
@@ -31127,7 +31195,7 @@
           <v:shape id="_x0000_i1364" type="#_x0000_t75" style="width:13.5pt;height:18pt" o:ole="">
             <v:imagedata r:id="rId550" o:title=""/>
           </v:shape>
-          <o:OLEObject Type="Embed" ProgID="Equation.DSMT4" ShapeID="_x0000_i1364" DrawAspect="Content" ObjectID="_1611676898" r:id="rId642"/>
+          <o:OLEObject Type="Embed" ProgID="Equation.DSMT4" ShapeID="_x0000_i1364" DrawAspect="Content" ObjectID="_1611677789" r:id="rId642"/>
         </w:object>
       </w:r>
       <w:r>
@@ -31525,7 +31593,7 @@
           <v:shape id="_x0000_i1365" type="#_x0000_t75" style="width:16.5pt;height:18pt" o:ole="">
             <v:imagedata r:id="rId603" o:title=""/>
           </v:shape>
-          <o:OLEObject Type="Embed" ProgID="Equation.DSMT4" ShapeID="_x0000_i1365" DrawAspect="Content" ObjectID="_1611676899" r:id="rId643"/>
+          <o:OLEObject Type="Embed" ProgID="Equation.DSMT4" ShapeID="_x0000_i1365" DrawAspect="Content" ObjectID="_1611677790" r:id="rId643"/>
         </w:object>
       </w:r>
       <w:r>
@@ -31566,7 +31634,7 @@
           <v:shape id="_x0000_i1366" type="#_x0000_t75" style="width:21pt;height:18pt" o:ole="">
             <v:imagedata r:id="rId605" o:title=""/>
           </v:shape>
-          <o:OLEObject Type="Embed" ProgID="Equation.DSMT4" ShapeID="_x0000_i1366" DrawAspect="Content" ObjectID="_1611676900" r:id="rId644"/>
+          <o:OLEObject Type="Embed" ProgID="Equation.DSMT4" ShapeID="_x0000_i1366" DrawAspect="Content" ObjectID="_1611677791" r:id="rId644"/>
         </w:object>
       </w:r>
       <w:r>
@@ -31633,7 +31701,7 @@
           <v:shape id="_x0000_i1367" type="#_x0000_t75" style="width:39pt;height:19.5pt" o:ole="">
             <v:imagedata r:id="rId645" o:title=""/>
           </v:shape>
-          <o:OLEObject Type="Embed" ProgID="Equation.DSMT4" ShapeID="_x0000_i1367" DrawAspect="Content" ObjectID="_1611676901" r:id="rId646"/>
+          <o:OLEObject Type="Embed" ProgID="Equation.DSMT4" ShapeID="_x0000_i1367" DrawAspect="Content" ObjectID="_1611677792" r:id="rId646"/>
         </w:object>
       </w:r>
       <w:r>
@@ -31670,7 +31738,7 @@
           <v:shape id="_x0000_i1368" type="#_x0000_t75" style="width:12pt;height:18pt" o:ole="">
             <v:imagedata r:id="rId647" o:title=""/>
           </v:shape>
-          <o:OLEObject Type="Embed" ProgID="Equation.DSMT4" ShapeID="_x0000_i1368" DrawAspect="Content" ObjectID="_1611676902" r:id="rId648"/>
+          <o:OLEObject Type="Embed" ProgID="Equation.DSMT4" ShapeID="_x0000_i1368" DrawAspect="Content" ObjectID="_1611677793" r:id="rId648"/>
         </w:object>
       </w:r>
       <w:r>
@@ -31707,7 +31775,7 @@
           <v:shape id="_x0000_i1369" type="#_x0000_t75" style="width:13.5pt;height:18pt" o:ole="">
             <v:imagedata r:id="rId649" o:title=""/>
           </v:shape>
-          <o:OLEObject Type="Embed" ProgID="Equation.DSMT4" ShapeID="_x0000_i1369" DrawAspect="Content" ObjectID="_1611676903" r:id="rId650"/>
+          <o:OLEObject Type="Embed" ProgID="Equation.DSMT4" ShapeID="_x0000_i1369" DrawAspect="Content" ObjectID="_1611677794" r:id="rId650"/>
         </w:object>
       </w:r>
       <w:r>
@@ -31744,7 +31812,7 @@
           <v:shape id="_x0000_i1370" type="#_x0000_t75" style="width:70.5pt;height:19.5pt" o:ole="">
             <v:imagedata r:id="rId651" o:title=""/>
           </v:shape>
-          <o:OLEObject Type="Embed" ProgID="Equation.DSMT4" ShapeID="_x0000_i1370" DrawAspect="Content" ObjectID="_1611676904" r:id="rId652"/>
+          <o:OLEObject Type="Embed" ProgID="Equation.DSMT4" ShapeID="_x0000_i1370" DrawAspect="Content" ObjectID="_1611677795" r:id="rId652"/>
         </w:object>
       </w:r>
       <w:r>
@@ -31926,7 +31994,7 @@
           <v:shape id="_x0000_i1371" type="#_x0000_t75" style="width:33pt;height:18pt" o:ole="">
             <v:imagedata r:id="rId653" o:title=""/>
           </v:shape>
-          <o:OLEObject Type="Embed" ProgID="Equation.DSMT4" ShapeID="_x0000_i1371" DrawAspect="Content" ObjectID="_1611676905" r:id="rId654"/>
+          <o:OLEObject Type="Embed" ProgID="Equation.DSMT4" ShapeID="_x0000_i1371" DrawAspect="Content" ObjectID="_1611677796" r:id="rId654"/>
         </w:object>
       </w:r>
       <w:r>
@@ -31958,7 +32026,7 @@
           <v:shape id="_x0000_i1372" type="#_x0000_t75" style="width:48pt;height:18pt" o:ole="">
             <v:imagedata r:id="rId655" o:title=""/>
           </v:shape>
-          <o:OLEObject Type="Embed" ProgID="Equation.DSMT4" ShapeID="_x0000_i1372" DrawAspect="Content" ObjectID="_1611676906" r:id="rId656"/>
+          <o:OLEObject Type="Embed" ProgID="Equation.DSMT4" ShapeID="_x0000_i1372" DrawAspect="Content" ObjectID="_1611677797" r:id="rId656"/>
         </w:object>
       </w:r>
       <w:r>
@@ -32066,7 +32134,7 @@
           <v:shape id="_x0000_i1373" type="#_x0000_t75" style="width:12pt;height:18pt" o:ole="">
             <v:imagedata r:id="rId647" o:title=""/>
           </v:shape>
-          <o:OLEObject Type="Embed" ProgID="Equation.DSMT4" ShapeID="_x0000_i1373" DrawAspect="Content" ObjectID="_1611676907" r:id="rId657"/>
+          <o:OLEObject Type="Embed" ProgID="Equation.DSMT4" ShapeID="_x0000_i1373" DrawAspect="Content" ObjectID="_1611677798" r:id="rId657"/>
         </w:object>
       </w:r>
       <w:r>
@@ -32103,7 +32171,7 @@
           <v:shape id="_x0000_i1374" type="#_x0000_t75" style="width:13.5pt;height:18pt" o:ole="">
             <v:imagedata r:id="rId649" o:title=""/>
           </v:shape>
-          <o:OLEObject Type="Embed" ProgID="Equation.DSMT4" ShapeID="_x0000_i1374" DrawAspect="Content" ObjectID="_1611676908" r:id="rId658"/>
+          <o:OLEObject Type="Embed" ProgID="Equation.DSMT4" ShapeID="_x0000_i1374" DrawAspect="Content" ObjectID="_1611677799" r:id="rId658"/>
         </w:object>
       </w:r>
       <w:r>
@@ -32148,7 +32216,7 @@
           <v:shape id="_x0000_i1375" type="#_x0000_t75" style="width:13.5pt;height:18pt" o:ole="">
             <v:imagedata r:id="rId659" o:title=""/>
           </v:shape>
-          <o:OLEObject Type="Embed" ProgID="Equation.DSMT4" ShapeID="_x0000_i1375" DrawAspect="Content" ObjectID="_1611676909" r:id="rId660"/>
+          <o:OLEObject Type="Embed" ProgID="Equation.DSMT4" ShapeID="_x0000_i1375" DrawAspect="Content" ObjectID="_1611677800" r:id="rId660"/>
         </w:object>
       </w:r>
       <w:r>
@@ -32202,7 +32270,7 @@
           <v:shape id="_x0000_i1376" type="#_x0000_t75" style="width:33pt;height:18pt" o:ole="">
             <v:imagedata r:id="rId661" o:title=""/>
           </v:shape>
-          <o:OLEObject Type="Embed" ProgID="Equation.DSMT4" ShapeID="_x0000_i1376" DrawAspect="Content" ObjectID="_1611676910" r:id="rId662"/>
+          <o:OLEObject Type="Embed" ProgID="Equation.DSMT4" ShapeID="_x0000_i1376" DrawAspect="Content" ObjectID="_1611677801" r:id="rId662"/>
         </w:object>
       </w:r>
       <w:r>
@@ -32295,7 +32363,7 @@
                 <v:shape id="_x0000_i1377" type="#_x0000_t75" style="width:19.5pt;height:18pt" o:ole="">
                   <v:imagedata r:id="rId663" o:title=""/>
                 </v:shape>
-                <o:OLEObject Type="Embed" ProgID="Equation.DSMT4" ShapeID="_x0000_i1377" DrawAspect="Content" ObjectID="_1611676911" r:id="rId664"/>
+                <o:OLEObject Type="Embed" ProgID="Equation.DSMT4" ShapeID="_x0000_i1377" DrawAspect="Content" ObjectID="_1611677802" r:id="rId664"/>
               </w:object>
             </w:r>
           </w:p>
@@ -32351,7 +32419,7 @@
                 <v:shape id="_x0000_i1378" type="#_x0000_t75" style="width:34.5pt;height:18pt" o:ole="">
                   <v:imagedata r:id="rId665" o:title=""/>
                 </v:shape>
-                <o:OLEObject Type="Embed" ProgID="Equation.DSMT4" ShapeID="_x0000_i1378" DrawAspect="Content" ObjectID="_1611676912" r:id="rId666"/>
+                <o:OLEObject Type="Embed" ProgID="Equation.DSMT4" ShapeID="_x0000_i1378" DrawAspect="Content" ObjectID="_1611677803" r:id="rId666"/>
               </w:object>
             </w:r>
           </w:p>
@@ -32415,7 +32483,7 @@
                 <v:shape id="_x0000_i1379" type="#_x0000_t75" style="width:25.5pt;height:16.5pt" o:ole="">
                   <v:imagedata r:id="rId667" o:title=""/>
                 </v:shape>
-                <o:OLEObject Type="Embed" ProgID="Equation.DSMT4" ShapeID="_x0000_i1379" DrawAspect="Content" ObjectID="_1611676913" r:id="rId668"/>
+                <o:OLEObject Type="Embed" ProgID="Equation.DSMT4" ShapeID="_x0000_i1379" DrawAspect="Content" ObjectID="_1611677804" r:id="rId668"/>
               </w:object>
             </w:r>
           </w:p>
@@ -32499,7 +32567,7 @@
                 <v:shape id="_x0000_i1380" type="#_x0000_t75" style="width:25.5pt;height:16.5pt" o:ole="">
                   <v:imagedata r:id="rId667" o:title=""/>
                 </v:shape>
-                <o:OLEObject Type="Embed" ProgID="Equation.DSMT4" ShapeID="_x0000_i1380" DrawAspect="Content" ObjectID="_1611676914" r:id="rId669"/>
+                <o:OLEObject Type="Embed" ProgID="Equation.DSMT4" ShapeID="_x0000_i1380" DrawAspect="Content" ObjectID="_1611677805" r:id="rId669"/>
               </w:object>
             </w:r>
           </w:p>
@@ -32592,7 +32660,7 @@
                 <v:shape id="_x0000_i1381" type="#_x0000_t75" style="width:25.5pt;height:16.5pt" o:ole="">
                   <v:imagedata r:id="rId667" o:title=""/>
                 </v:shape>
-                <o:OLEObject Type="Embed" ProgID="Equation.DSMT4" ShapeID="_x0000_i1381" DrawAspect="Content" ObjectID="_1611676915" r:id="rId670"/>
+                <o:OLEObject Type="Embed" ProgID="Equation.DSMT4" ShapeID="_x0000_i1381" DrawAspect="Content" ObjectID="_1611677806" r:id="rId670"/>
               </w:object>
             </w:r>
           </w:p>
@@ -32677,7 +32745,7 @@
                 <v:shape id="_x0000_i1382" type="#_x0000_t75" style="width:25.5pt;height:16.5pt" o:ole="">
                   <v:imagedata r:id="rId667" o:title=""/>
                 </v:shape>
-                <o:OLEObject Type="Embed" ProgID="Equation.DSMT4" ShapeID="_x0000_i1382" DrawAspect="Content" ObjectID="_1611676916" r:id="rId671"/>
+                <o:OLEObject Type="Embed" ProgID="Equation.DSMT4" ShapeID="_x0000_i1382" DrawAspect="Content" ObjectID="_1611677807" r:id="rId671"/>
               </w:object>
             </w:r>
           </w:p>
@@ -32733,7 +32801,7 @@
                 <v:shape id="_x0000_i1383" type="#_x0000_t75" style="width:31.5pt;height:18pt" o:ole="">
                   <v:imagedata r:id="rId672" o:title=""/>
                 </v:shape>
-                <o:OLEObject Type="Embed" ProgID="Equation.DSMT4" ShapeID="_x0000_i1383" DrawAspect="Content" ObjectID="_1611676917" r:id="rId673"/>
+                <o:OLEObject Type="Embed" ProgID="Equation.DSMT4" ShapeID="_x0000_i1383" DrawAspect="Content" ObjectID="_1611677808" r:id="rId673"/>
               </w:object>
             </w:r>
           </w:p>
@@ -32807,7 +32875,7 @@
                 <v:shape id="_x0000_i1384" type="#_x0000_t75" style="width:25.5pt;height:16.5pt" o:ole="">
                   <v:imagedata r:id="rId667" o:title=""/>
                 </v:shape>
-                <o:OLEObject Type="Embed" ProgID="Equation.DSMT4" ShapeID="_x0000_i1384" DrawAspect="Content" ObjectID="_1611676918" r:id="rId674"/>
+                <o:OLEObject Type="Embed" ProgID="Equation.DSMT4" ShapeID="_x0000_i1384" DrawAspect="Content" ObjectID="_1611677809" r:id="rId674"/>
               </w:object>
             </w:r>
           </w:p>
@@ -32893,7 +32961,7 @@
                 <v:shape id="_x0000_i1385" type="#_x0000_t75" style="width:25.5pt;height:16.5pt" o:ole="">
                   <v:imagedata r:id="rId667" o:title=""/>
                 </v:shape>
-                <o:OLEObject Type="Embed" ProgID="Equation.DSMT4" ShapeID="_x0000_i1385" DrawAspect="Content" ObjectID="_1611676919" r:id="rId675"/>
+                <o:OLEObject Type="Embed" ProgID="Equation.DSMT4" ShapeID="_x0000_i1385" DrawAspect="Content" ObjectID="_1611677810" r:id="rId675"/>
               </w:object>
             </w:r>
           </w:p>
@@ -32978,7 +33046,7 @@
                 <v:shape id="_x0000_i1386" type="#_x0000_t75" style="width:25.5pt;height:16.5pt" o:ole="">
                   <v:imagedata r:id="rId667" o:title=""/>
                 </v:shape>
-                <o:OLEObject Type="Embed" ProgID="Equation.DSMT4" ShapeID="_x0000_i1386" DrawAspect="Content" ObjectID="_1611676920" r:id="rId676"/>
+                <o:OLEObject Type="Embed" ProgID="Equation.DSMT4" ShapeID="_x0000_i1386" DrawAspect="Content" ObjectID="_1611677811" r:id="rId676"/>
               </w:object>
             </w:r>
           </w:p>
@@ -33066,7 +33134,7 @@
                 <v:shape id="_x0000_i1387" type="#_x0000_t75" style="width:25.5pt;height:16.5pt" o:ole="">
                   <v:imagedata r:id="rId667" o:title=""/>
                 </v:shape>
-                <o:OLEObject Type="Embed" ProgID="Equation.DSMT4" ShapeID="_x0000_i1387" DrawAspect="Content" ObjectID="_1611676921" r:id="rId677"/>
+                <o:OLEObject Type="Embed" ProgID="Equation.DSMT4" ShapeID="_x0000_i1387" DrawAspect="Content" ObjectID="_1611677812" r:id="rId677"/>
               </w:object>
             </w:r>
           </w:p>
@@ -33124,7 +33192,7 @@
           <v:shape id="_x0000_i1388" type="#_x0000_t75" style="width:37.5pt;height:18pt" o:ole="">
             <v:imagedata r:id="rId678" o:title=""/>
           </v:shape>
-          <o:OLEObject Type="Embed" ProgID="Equation.DSMT4" ShapeID="_x0000_i1388" DrawAspect="Content" ObjectID="_1611676922" r:id="rId679"/>
+          <o:OLEObject Type="Embed" ProgID="Equation.DSMT4" ShapeID="_x0000_i1388" DrawAspect="Content" ObjectID="_1611677813" r:id="rId679"/>
         </w:object>
       </w:r>
       <w:r>
@@ -33146,7 +33214,7 @@
           <v:shape id="_x0000_i1389" type="#_x0000_t75" style="width:34.5pt;height:18pt" o:ole="">
             <v:imagedata r:id="rId665" o:title=""/>
           </v:shape>
-          <o:OLEObject Type="Embed" ProgID="Equation.DSMT4" ShapeID="_x0000_i1389" DrawAspect="Content" ObjectID="_1611676923" r:id="rId680"/>
+          <o:OLEObject Type="Embed" ProgID="Equation.DSMT4" ShapeID="_x0000_i1389" DrawAspect="Content" ObjectID="_1611677814" r:id="rId680"/>
         </w:object>
       </w:r>
       <w:r>
@@ -33175,7 +33243,7 @@
           <v:shape id="_x0000_i1390" type="#_x0000_t75" style="width:33pt;height:18pt" o:ole="">
             <v:imagedata r:id="rId681" o:title=""/>
           </v:shape>
-          <o:OLEObject Type="Embed" ProgID="Equation.DSMT4" ShapeID="_x0000_i1390" DrawAspect="Content" ObjectID="_1611676924" r:id="rId682"/>
+          <o:OLEObject Type="Embed" ProgID="Equation.DSMT4" ShapeID="_x0000_i1390" DrawAspect="Content" ObjectID="_1611677815" r:id="rId682"/>
         </w:object>
       </w:r>
       <w:r>
@@ -33204,7 +33272,7 @@
           <v:shape id="_x0000_i1391" type="#_x0000_t75" style="width:31.5pt;height:18pt" o:ole="">
             <v:imagedata r:id="rId683" o:title=""/>
           </v:shape>
-          <o:OLEObject Type="Embed" ProgID="Equation.DSMT4" ShapeID="_x0000_i1391" DrawAspect="Content" ObjectID="_1611676925" r:id="rId684"/>
+          <o:OLEObject Type="Embed" ProgID="Equation.DSMT4" ShapeID="_x0000_i1391" DrawAspect="Content" ObjectID="_1611677816" r:id="rId684"/>
         </w:object>
       </w:r>
       <w:r>
@@ -33282,7 +33350,7 @@
           <v:shape id="_x0000_i1392" type="#_x0000_t75" style="width:34.5pt;height:18pt" o:ole="">
             <v:imagedata r:id="rId665" o:title=""/>
           </v:shape>
-          <o:OLEObject Type="Embed" ProgID="Equation.DSMT4" ShapeID="_x0000_i1392" DrawAspect="Content" ObjectID="_1611676926" r:id="rId685"/>
+          <o:OLEObject Type="Embed" ProgID="Equation.DSMT4" ShapeID="_x0000_i1392" DrawAspect="Content" ObjectID="_1611677817" r:id="rId685"/>
         </w:object>
       </w:r>
       <w:r>
@@ -33304,7 +33372,7 @@
           <v:shape id="_x0000_i1393" type="#_x0000_t75" style="width:37.5pt;height:18pt" o:ole="">
             <v:imagedata r:id="rId678" o:title=""/>
           </v:shape>
-          <o:OLEObject Type="Embed" ProgID="Equation.DSMT4" ShapeID="_x0000_i1393" DrawAspect="Content" ObjectID="_1611676927" r:id="rId686"/>
+          <o:OLEObject Type="Embed" ProgID="Equation.DSMT4" ShapeID="_x0000_i1393" DrawAspect="Content" ObjectID="_1611677818" r:id="rId686"/>
         </w:object>
       </w:r>
       <w:r>
@@ -33341,7 +33409,7 @@
           <v:shape id="_x0000_i1394" type="#_x0000_t75" style="width:48pt;height:18pt" o:ole="">
             <v:imagedata r:id="rId687" o:title=""/>
           </v:shape>
-          <o:OLEObject Type="Embed" ProgID="Equation.DSMT4" ShapeID="_x0000_i1394" DrawAspect="Content" ObjectID="_1611676928" r:id="rId688"/>
+          <o:OLEObject Type="Embed" ProgID="Equation.DSMT4" ShapeID="_x0000_i1394" DrawAspect="Content" ObjectID="_1611677819" r:id="rId688"/>
         </w:object>
       </w:r>
       <w:r>
@@ -33418,7 +33486,7 @@
           <v:shape id="_x0000_i1395" type="#_x0000_t75" style="width:36pt;height:19.5pt" o:ole="">
             <v:imagedata r:id="rId689" o:title=""/>
           </v:shape>
-          <o:OLEObject Type="Embed" ProgID="Equation.DSMT4" ShapeID="_x0000_i1395" DrawAspect="Content" ObjectID="_1611676929" r:id="rId690"/>
+          <o:OLEObject Type="Embed" ProgID="Equation.DSMT4" ShapeID="_x0000_i1395" DrawAspect="Content" ObjectID="_1611677820" r:id="rId690"/>
         </w:object>
       </w:r>
       <w:r>
@@ -33680,7 +33748,7 @@
           <v:shape id="_x0000_i1396" type="#_x0000_t75" style="width:19.5pt;height:13.5pt" o:ole="">
             <v:imagedata r:id="rId691" o:title=""/>
           </v:shape>
-          <o:OLEObject Type="Embed" ProgID="Equation.DSMT4" ShapeID="_x0000_i1396" DrawAspect="Content" ObjectID="_1611676930" r:id="rId692"/>
+          <o:OLEObject Type="Embed" ProgID="Equation.DSMT4" ShapeID="_x0000_i1396" DrawAspect="Content" ObjectID="_1611677821" r:id="rId692"/>
         </w:object>
       </w:r>
       <w:r>
@@ -33701,7 +33769,7 @@
           <v:shape id="_x0000_i1397" type="#_x0000_t75" style="width:39pt;height:19.5pt" o:ole="">
             <v:imagedata r:id="rId645" o:title=""/>
           </v:shape>
-          <o:OLEObject Type="Embed" ProgID="Equation.DSMT4" ShapeID="_x0000_i1397" DrawAspect="Content" ObjectID="_1611676931" r:id="rId693"/>
+          <o:OLEObject Type="Embed" ProgID="Equation.DSMT4" ShapeID="_x0000_i1397" DrawAspect="Content" ObjectID="_1611677822" r:id="rId693"/>
         </w:object>
       </w:r>
       <w:r>
@@ -33738,7 +33806,7 @@
           <v:shape id="_x0000_i1398" type="#_x0000_t75" style="width:70.5pt;height:19.5pt" o:ole="">
             <v:imagedata r:id="rId694" o:title=""/>
           </v:shape>
-          <o:OLEObject Type="Embed" ProgID="Equation.DSMT4" ShapeID="_x0000_i1398" DrawAspect="Content" ObjectID="_1611676932" r:id="rId695"/>
+          <o:OLEObject Type="Embed" ProgID="Equation.DSMT4" ShapeID="_x0000_i1398" DrawAspect="Content" ObjectID="_1611677823" r:id="rId695"/>
         </w:object>
       </w:r>
       <w:r>
@@ -33791,7 +33859,7 @@
           <v:shape id="_x0000_i1399" type="#_x0000_t75" style="width:19.5pt;height:18pt" o:ole="">
             <v:imagedata r:id="rId696" o:title=""/>
           </v:shape>
-          <o:OLEObject Type="Embed" ProgID="Equation.DSMT4" ShapeID="_x0000_i1399" DrawAspect="Content" ObjectID="_1611676933" r:id="rId697"/>
+          <o:OLEObject Type="Embed" ProgID="Equation.DSMT4" ShapeID="_x0000_i1399" DrawAspect="Content" ObjectID="_1611677824" r:id="rId697"/>
         </w:object>
       </w:r>
       <w:r>
@@ -33860,7 +33928,7 @@
           <v:shape id="_x0000_i1400" type="#_x0000_t75" style="width:19.5pt;height:18pt" o:ole="">
             <v:imagedata r:id="rId696" o:title=""/>
           </v:shape>
-          <o:OLEObject Type="Embed" ProgID="Equation.DSMT4" ShapeID="_x0000_i1400" DrawAspect="Content" ObjectID="_1611676934" r:id="rId698"/>
+          <o:OLEObject Type="Embed" ProgID="Equation.DSMT4" ShapeID="_x0000_i1400" DrawAspect="Content" ObjectID="_1611677825" r:id="rId698"/>
         </w:object>
       </w:r>
       <w:r>
@@ -34448,7 +34516,7 @@
           <v:shape id="_x0000_i1401" type="#_x0000_t75" style="width:33pt;height:18pt" o:ole="">
             <v:imagedata r:id="rId699" o:title=""/>
           </v:shape>
-          <o:OLEObject Type="Embed" ProgID="Equation.DSMT4" ShapeID="_x0000_i1401" DrawAspect="Content" ObjectID="_1611676935" r:id="rId700"/>
+          <o:OLEObject Type="Embed" ProgID="Equation.DSMT4" ShapeID="_x0000_i1401" DrawAspect="Content" ObjectID="_1611677826" r:id="rId700"/>
         </w:object>
       </w:r>
       <w:r>
@@ -34516,7 +34584,7 @@
           <v:shape id="_x0000_i1402" type="#_x0000_t75" style="width:84pt;height:28.5pt" o:ole="">
             <v:imagedata r:id="rId701" o:title=""/>
           </v:shape>
-          <o:OLEObject Type="Embed" ProgID="Equation.DSMT4" ShapeID="_x0000_i1402" DrawAspect="Content" ObjectID="_1611676936" r:id="rId702"/>
+          <o:OLEObject Type="Embed" ProgID="Equation.DSMT4" ShapeID="_x0000_i1402" DrawAspect="Content" ObjectID="_1611677827" r:id="rId702"/>
         </w:object>
       </w:r>
       <w:r>
@@ -34539,7 +34607,7 @@
           <v:shape id="_x0000_i1403" type="#_x0000_t75" style="width:88.5pt;height:28.5pt" o:ole="">
             <v:imagedata r:id="rId703" o:title=""/>
           </v:shape>
-          <o:OLEObject Type="Embed" ProgID="Equation.DSMT4" ShapeID="_x0000_i1403" DrawAspect="Content" ObjectID="_1611676937" r:id="rId704"/>
+          <o:OLEObject Type="Embed" ProgID="Equation.DSMT4" ShapeID="_x0000_i1403" DrawAspect="Content" ObjectID="_1611677828" r:id="rId704"/>
         </w:object>
       </w:r>
       <w:r>
@@ -34706,7 +34774,7 @@
           <v:shape id="_x0000_i1404" type="#_x0000_t75" style="width:19.5pt;height:19.5pt" o:ole="">
             <v:imagedata r:id="rId705" o:title=""/>
           </v:shape>
-          <o:OLEObject Type="Embed" ProgID="Equation.DSMT4" ShapeID="_x0000_i1404" DrawAspect="Content" ObjectID="_1611676938" r:id="rId706"/>
+          <o:OLEObject Type="Embed" ProgID="Equation.DSMT4" ShapeID="_x0000_i1404" DrawAspect="Content" ObjectID="_1611677829" r:id="rId706"/>
         </w:object>
       </w:r>
       <w:r>
@@ -34729,7 +34797,7 @@
           <v:shape id="_x0000_i1405" type="#_x0000_t75" style="width:58.5pt;height:13.5pt" o:ole="">
             <v:imagedata r:id="rId707" o:title=""/>
           </v:shape>
-          <o:OLEObject Type="Embed" ProgID="Equation.DSMT4" ShapeID="_x0000_i1405" DrawAspect="Content" ObjectID="_1611676939" r:id="rId708"/>
+          <o:OLEObject Type="Embed" ProgID="Equation.DSMT4" ShapeID="_x0000_i1405" DrawAspect="Content" ObjectID="_1611677830" r:id="rId708"/>
         </w:object>
       </w:r>
       <w:r>
@@ -34761,7 +34829,7 @@
           <v:shape id="_x0000_i1406" type="#_x0000_t75" style="width:33pt;height:18pt" o:ole="">
             <v:imagedata r:id="rId699" o:title=""/>
           </v:shape>
-          <o:OLEObject Type="Embed" ProgID="Equation.DSMT4" ShapeID="_x0000_i1406" DrawAspect="Content" ObjectID="_1611676940" r:id="rId709"/>
+          <o:OLEObject Type="Embed" ProgID="Equation.DSMT4" ShapeID="_x0000_i1406" DrawAspect="Content" ObjectID="_1611677831" r:id="rId709"/>
         </w:object>
       </w:r>
       <w:r>
@@ -34892,7 +34960,7 @@
           <v:shape id="_x0000_i1407" type="#_x0000_t75" style="width:123pt;height:28.5pt" o:ole="">
             <v:imagedata r:id="rId710" o:title=""/>
           </v:shape>
-          <o:OLEObject Type="Embed" ProgID="Equation.DSMT4" ShapeID="_x0000_i1407" DrawAspect="Content" ObjectID="_1611676941" r:id="rId711"/>
+          <o:OLEObject Type="Embed" ProgID="Equation.DSMT4" ShapeID="_x0000_i1407" DrawAspect="Content" ObjectID="_1611677832" r:id="rId711"/>
         </w:object>
       </w:r>
       <w:r>
@@ -35557,7 +35625,7 @@
           <v:shape id="_x0000_i1408" type="#_x0000_t75" style="width:9pt;height:13.5pt" o:ole="">
             <v:imagedata r:id="rId712" o:title=""/>
           </v:shape>
-          <o:OLEObject Type="Embed" ProgID="Equation.DSMT4" ShapeID="_x0000_i1408" DrawAspect="Content" ObjectID="_1611676942" r:id="rId713"/>
+          <o:OLEObject Type="Embed" ProgID="Equation.DSMT4" ShapeID="_x0000_i1408" DrawAspect="Content" ObjectID="_1611677833" r:id="rId713"/>
         </w:object>
       </w:r>
       <w:r>
@@ -35571,7 +35639,7 @@
           <v:shape id="_x0000_i1409" type="#_x0000_t75" style="width:124.5pt;height:28.5pt" o:ole="">
             <v:imagedata r:id="rId714" o:title=""/>
           </v:shape>
-          <o:OLEObject Type="Embed" ProgID="Equation.DSMT4" ShapeID="_x0000_i1409" DrawAspect="Content" ObjectID="_1611676943" r:id="rId715"/>
+          <o:OLEObject Type="Embed" ProgID="Equation.DSMT4" ShapeID="_x0000_i1409" DrawAspect="Content" ObjectID="_1611677834" r:id="rId715"/>
         </w:object>
       </w:r>
       <w:r>
@@ -35594,7 +35662,7 @@
           <v:shape id="_x0000_i1410" type="#_x0000_t75" style="width:12pt;height:10.5pt" o:ole="">
             <v:imagedata r:id="rId716" o:title=""/>
           </v:shape>
-          <o:OLEObject Type="Embed" ProgID="Equation.DSMT4" ShapeID="_x0000_i1410" DrawAspect="Content" ObjectID="_1611676944" r:id="rId717"/>
+          <o:OLEObject Type="Embed" ProgID="Equation.DSMT4" ShapeID="_x0000_i1410" DrawAspect="Content" ObjectID="_1611677835" r:id="rId717"/>
         </w:object>
       </w:r>
       <w:r>
@@ -35995,7 +36063,7 @@
           <v:shape id="_x0000_i1411" type="#_x0000_t75" style="width:16.5pt;height:18pt" o:ole="">
             <v:imagedata r:id="rId718" o:title=""/>
           </v:shape>
-          <o:OLEObject Type="Embed" ProgID="Equation.DSMT4" ShapeID="_x0000_i1411" DrawAspect="Content" ObjectID="_1611676945" r:id="rId719"/>
+          <o:OLEObject Type="Embed" ProgID="Equation.DSMT4" ShapeID="_x0000_i1411" DrawAspect="Content" ObjectID="_1611677836" r:id="rId719"/>
         </w:object>
       </w:r>
       <w:r>
@@ -36063,7 +36131,7 @@
           <v:shape id="_x0000_i1412" type="#_x0000_t75" style="width:19.5pt;height:19.5pt" o:ole="">
             <v:imagedata r:id="rId720" o:title=""/>
           </v:shape>
-          <o:OLEObject Type="Embed" ProgID="Equation.DSMT4" ShapeID="_x0000_i1412" DrawAspect="Content" ObjectID="_1611676946" r:id="rId721"/>
+          <o:OLEObject Type="Embed" ProgID="Equation.DSMT4" ShapeID="_x0000_i1412" DrawAspect="Content" ObjectID="_1611677837" r:id="rId721"/>
         </w:object>
       </w:r>
       <w:r>
@@ -36186,7 +36254,7 @@
           <v:shape id="_x0000_i1413" type="#_x0000_t75" style="width:250.5pt;height:34.5pt" o:ole="">
             <v:imagedata r:id="rId722" o:title=""/>
           </v:shape>
-          <o:OLEObject Type="Embed" ProgID="Equation.DSMT4" ShapeID="_x0000_i1413" DrawAspect="Content" ObjectID="_1611676947" r:id="rId723"/>
+          <o:OLEObject Type="Embed" ProgID="Equation.DSMT4" ShapeID="_x0000_i1413" DrawAspect="Content" ObjectID="_1611677838" r:id="rId723"/>
         </w:object>
       </w:r>
       <w:r>
@@ -36234,7 +36302,7 @@
           <v:shape id="_x0000_i1414" type="#_x0000_t75" style="width:18pt;height:18pt" o:ole="">
             <v:imagedata r:id="rId724" o:title=""/>
           </v:shape>
-          <o:OLEObject Type="Embed" ProgID="Equation.DSMT4" ShapeID="_x0000_i1414" DrawAspect="Content" ObjectID="_1611676948" r:id="rId725"/>
+          <o:OLEObject Type="Embed" ProgID="Equation.DSMT4" ShapeID="_x0000_i1414" DrawAspect="Content" ObjectID="_1611677839" r:id="rId725"/>
         </w:object>
       </w:r>
       <w:r>
@@ -36255,7 +36323,7 @@
           <v:shape id="_x0000_i1415" type="#_x0000_t75" style="width:16.5pt;height:18pt" o:ole="">
             <v:imagedata r:id="rId726" o:title=""/>
           </v:shape>
-          <o:OLEObject Type="Embed" ProgID="Equation.DSMT4" ShapeID="_x0000_i1415" DrawAspect="Content" ObjectID="_1611676949" r:id="rId727"/>
+          <o:OLEObject Type="Embed" ProgID="Equation.DSMT4" ShapeID="_x0000_i1415" DrawAspect="Content" ObjectID="_1611677840" r:id="rId727"/>
         </w:object>
       </w:r>
       <w:r>
@@ -36276,7 +36344,7 @@
           <v:shape id="_x0000_i1416" type="#_x0000_t75" style="width:16.5pt;height:18pt" o:ole="">
             <v:imagedata r:id="rId728" o:title=""/>
           </v:shape>
-          <o:OLEObject Type="Embed" ProgID="Equation.DSMT4" ShapeID="_x0000_i1416" DrawAspect="Content" ObjectID="_1611676950" r:id="rId729"/>
+          <o:OLEObject Type="Embed" ProgID="Equation.DSMT4" ShapeID="_x0000_i1416" DrawAspect="Content" ObjectID="_1611677841" r:id="rId729"/>
         </w:object>
       </w:r>
       <w:r>
@@ -36322,7 +36390,7 @@
           <v:shape id="_x0000_i1417" type="#_x0000_t75" style="width:12pt;height:13.5pt" o:ole="">
             <v:imagedata r:id="rId730" o:title=""/>
           </v:shape>
-          <o:OLEObject Type="Embed" ProgID="Equation.DSMT4" ShapeID="_x0000_i1417" DrawAspect="Content" ObjectID="_1611676951" r:id="rId731"/>
+          <o:OLEObject Type="Embed" ProgID="Equation.DSMT4" ShapeID="_x0000_i1417" DrawAspect="Content" ObjectID="_1611677842" r:id="rId731"/>
         </w:object>
       </w:r>
       <w:r>
@@ -36354,7 +36422,7 @@
           <v:shape id="_x0000_i1418" type="#_x0000_t75" style="width:9pt;height:10.5pt" o:ole="">
             <v:imagedata r:id="rId732" o:title=""/>
           </v:shape>
-          <o:OLEObject Type="Embed" ProgID="Equation.DSMT4" ShapeID="_x0000_i1418" DrawAspect="Content" ObjectID="_1611676952" r:id="rId733"/>
+          <o:OLEObject Type="Embed" ProgID="Equation.DSMT4" ShapeID="_x0000_i1418" DrawAspect="Content" ObjectID="_1611677843" r:id="rId733"/>
         </w:object>
       </w:r>
       <w:r>
@@ -36386,7 +36454,7 @@
           <v:shape id="_x0000_i1419" type="#_x0000_t75" style="width:16.5pt;height:18pt" o:ole="">
             <v:imagedata r:id="rId734" o:title=""/>
           </v:shape>
-          <o:OLEObject Type="Embed" ProgID="Equation.DSMT4" ShapeID="_x0000_i1419" DrawAspect="Content" ObjectID="_1611676953" r:id="rId735"/>
+          <o:OLEObject Type="Embed" ProgID="Equation.DSMT4" ShapeID="_x0000_i1419" DrawAspect="Content" ObjectID="_1611677844" r:id="rId735"/>
         </w:object>
       </w:r>
       <w:r>
@@ -36418,7 +36486,7 @@
           <v:shape id="_x0000_i1420" type="#_x0000_t75" style="width:12pt;height:10.5pt" o:ole="">
             <v:imagedata r:id="rId736" o:title=""/>
           </v:shape>
-          <o:OLEObject Type="Embed" ProgID="Equation.DSMT4" ShapeID="_x0000_i1420" DrawAspect="Content" ObjectID="_1611676954" r:id="rId737"/>
+          <o:OLEObject Type="Embed" ProgID="Equation.DSMT4" ShapeID="_x0000_i1420" DrawAspect="Content" ObjectID="_1611677845" r:id="rId737"/>
         </w:object>
       </w:r>
       <w:r>
@@ -36552,7 +36620,7 @@
           <v:shape id="_x0000_i1421" type="#_x0000_t75" style="width:181.5pt;height:34.5pt" o:ole="">
             <v:imagedata r:id="rId738" o:title=""/>
           </v:shape>
-          <o:OLEObject Type="Embed" ProgID="Equation.DSMT4" ShapeID="_x0000_i1421" DrawAspect="Content" ObjectID="_1611676955" r:id="rId739"/>
+          <o:OLEObject Type="Embed" ProgID="Equation.DSMT4" ShapeID="_x0000_i1421" DrawAspect="Content" ObjectID="_1611677846" r:id="rId739"/>
         </w:object>
       </w:r>
       <w:r>
@@ -36587,7 +36655,7 @@
           <v:shape id="_x0000_i1422" type="#_x0000_t75" style="width:87pt;height:18pt" o:ole="">
             <v:imagedata r:id="rId740" o:title=""/>
           </v:shape>
-          <o:OLEObject Type="Embed" ProgID="Equation.DSMT4" ShapeID="_x0000_i1422" DrawAspect="Content" ObjectID="_1611676956" r:id="rId741"/>
+          <o:OLEObject Type="Embed" ProgID="Equation.DSMT4" ShapeID="_x0000_i1422" DrawAspect="Content" ObjectID="_1611677847" r:id="rId741"/>
         </w:object>
       </w:r>
       <w:r>
@@ -36641,7 +36709,7 @@
           <v:shape id="_x0000_i1423" type="#_x0000_t75" style="width:15pt;height:18pt" o:ole="">
             <v:imagedata r:id="rId742" o:title=""/>
           </v:shape>
-          <o:OLEObject Type="Embed" ProgID="Equation.DSMT4" ShapeID="_x0000_i1423" DrawAspect="Content" ObjectID="_1611676957" r:id="rId743"/>
+          <o:OLEObject Type="Embed" ProgID="Equation.DSMT4" ShapeID="_x0000_i1423" DrawAspect="Content" ObjectID="_1611677848" r:id="rId743"/>
         </w:object>
       </w:r>
       <w:r>
@@ -36673,7 +36741,7 @@
           <v:shape id="_x0000_i1424" type="#_x0000_t75" style="width:12pt;height:18pt" o:ole="">
             <v:imagedata r:id="rId744" o:title=""/>
           </v:shape>
-          <o:OLEObject Type="Embed" ProgID="Equation.DSMT4" ShapeID="_x0000_i1424" DrawAspect="Content" ObjectID="_1611676958" r:id="rId745"/>
+          <o:OLEObject Type="Embed" ProgID="Equation.DSMT4" ShapeID="_x0000_i1424" DrawAspect="Content" ObjectID="_1611677849" r:id="rId745"/>
         </w:object>
       </w:r>
       <w:r>
@@ -36741,7 +36809,7 @@
           <v:shape id="_x0000_i1425" type="#_x0000_t75" style="width:16.5pt;height:18pt" o:ole="">
             <v:imagedata r:id="rId746" o:title=""/>
           </v:shape>
-          <o:OLEObject Type="Embed" ProgID="Equation.DSMT4" ShapeID="_x0000_i1425" DrawAspect="Content" ObjectID="_1611676959" r:id="rId747"/>
+          <o:OLEObject Type="Embed" ProgID="Equation.DSMT4" ShapeID="_x0000_i1425" DrawAspect="Content" ObjectID="_1611677850" r:id="rId747"/>
         </w:object>
       </w:r>
       <w:r>
@@ -36944,7 +37012,7 @@
           <v:shape id="_x0000_i1426" type="#_x0000_t75" style="width:34.5pt;height:16.5pt" o:ole="">
             <v:imagedata r:id="rId748" o:title=""/>
           </v:shape>
-          <o:OLEObject Type="Embed" ProgID="Equation.DSMT4" ShapeID="_x0000_i1426" DrawAspect="Content" ObjectID="_1611676960" r:id="rId749"/>
+          <o:OLEObject Type="Embed" ProgID="Equation.DSMT4" ShapeID="_x0000_i1426" DrawAspect="Content" ObjectID="_1611677851" r:id="rId749"/>
         </w:object>
       </w:r>
       <w:r>
@@ -37199,7 +37267,7 @@
           <v:shape id="_x0000_i1427" type="#_x0000_t75" style="width:115.5pt;height:34.5pt" o:ole="">
             <v:imagedata r:id="rId750" o:title=""/>
           </v:shape>
-          <o:OLEObject Type="Embed" ProgID="Equation.DSMT4" ShapeID="_x0000_i1427" DrawAspect="Content" ObjectID="_1611676961" r:id="rId751"/>
+          <o:OLEObject Type="Embed" ProgID="Equation.DSMT4" ShapeID="_x0000_i1427" DrawAspect="Content" ObjectID="_1611677852" r:id="rId751"/>
         </w:object>
       </w:r>
       <w:r>
@@ -37604,7 +37672,7 @@
           <v:shape id="_x0000_i1428" type="#_x0000_t75" style="width:16.5pt;height:18pt" o:ole="">
             <v:imagedata r:id="rId734" o:title=""/>
           </v:shape>
-          <o:OLEObject Type="Embed" ProgID="Equation.DSMT4" ShapeID="_x0000_i1428" DrawAspect="Content" ObjectID="_1611676962" r:id="rId752"/>
+          <o:OLEObject Type="Embed" ProgID="Equation.DSMT4" ShapeID="_x0000_i1428" DrawAspect="Content" ObjectID="_1611677853" r:id="rId752"/>
         </w:object>
       </w:r>
       <w:r>
@@ -37762,7 +37830,7 @@
           <v:shape id="_x0000_i1429" type="#_x0000_t75" style="width:16.5pt;height:18pt" o:ole="">
             <v:imagedata r:id="rId734" o:title=""/>
           </v:shape>
-          <o:OLEObject Type="Embed" ProgID="Equation.DSMT4" ShapeID="_x0000_i1429" DrawAspect="Content" ObjectID="_1611676963" r:id="rId753"/>
+          <o:OLEObject Type="Embed" ProgID="Equation.DSMT4" ShapeID="_x0000_i1429" DrawAspect="Content" ObjectID="_1611677854" r:id="rId753"/>
         </w:object>
       </w:r>
       <w:r>
@@ -37794,7 +37862,7 @@
           <v:shape id="_x0000_i1430" type="#_x0000_t75" style="width:16.5pt;height:18pt" o:ole="">
             <v:imagedata r:id="rId754" o:title=""/>
           </v:shape>
-          <o:OLEObject Type="Embed" ProgID="Equation.DSMT4" ShapeID="_x0000_i1430" DrawAspect="Content" ObjectID="_1611676964" r:id="rId755"/>
+          <o:OLEObject Type="Embed" ProgID="Equation.DSMT4" ShapeID="_x0000_i1430" DrawAspect="Content" ObjectID="_1611677855" r:id="rId755"/>
         </w:object>
       </w:r>
       <w:r>
@@ -38196,7 +38264,7 @@
           <v:shape id="_x0000_i1431" type="#_x0000_t75" style="width:37.5pt;height:36pt" o:ole="">
             <v:imagedata r:id="rId756" o:title=""/>
           </v:shape>
-          <o:OLEObject Type="Embed" ProgID="Equation.DSMT4" ShapeID="_x0000_i1431" DrawAspect="Content" ObjectID="_1611676965" r:id="rId757"/>
+          <o:OLEObject Type="Embed" ProgID="Equation.DSMT4" ShapeID="_x0000_i1431" DrawAspect="Content" ObjectID="_1611677856" r:id="rId757"/>
         </w:object>
       </w:r>
       <w:r>
@@ -38231,7 +38299,7 @@
           <v:shape id="_x0000_i1432" type="#_x0000_t75" style="width:28.5pt;height:19.5pt" o:ole="">
             <v:imagedata r:id="rId758" o:title=""/>
           </v:shape>
-          <o:OLEObject Type="Embed" ProgID="Equation.DSMT4" ShapeID="_x0000_i1432" DrawAspect="Content" ObjectID="_1611676966" r:id="rId759"/>
+          <o:OLEObject Type="Embed" ProgID="Equation.DSMT4" ShapeID="_x0000_i1432" DrawAspect="Content" ObjectID="_1611677857" r:id="rId759"/>
         </w:object>
       </w:r>
       <w:r>
@@ -38416,7 +38484,7 @@
           <v:shape id="_x0000_i1433" type="#_x0000_t75" style="width:16.5pt;height:18pt" o:ole="">
             <v:imagedata r:id="rId760" o:title=""/>
           </v:shape>
-          <o:OLEObject Type="Embed" ProgID="Equation.DSMT4" ShapeID="_x0000_i1433" DrawAspect="Content" ObjectID="_1611676967" r:id="rId761"/>
+          <o:OLEObject Type="Embed" ProgID="Equation.DSMT4" ShapeID="_x0000_i1433" DrawAspect="Content" ObjectID="_1611677858" r:id="rId761"/>
         </w:object>
       </w:r>
       <w:r>
@@ -38541,7 +38609,7 @@
           <v:shape id="_x0000_i1434" type="#_x0000_t75" style="width:96pt;height:19.5pt" o:ole="">
             <v:imagedata r:id="rId762" o:title=""/>
           </v:shape>
-          <o:OLEObject Type="Embed" ProgID="Equation.DSMT4" ShapeID="_x0000_i1434" DrawAspect="Content" ObjectID="_1611676968" r:id="rId763"/>
+          <o:OLEObject Type="Embed" ProgID="Equation.DSMT4" ShapeID="_x0000_i1434" DrawAspect="Content" ObjectID="_1611677859" r:id="rId763"/>
         </w:object>
       </w:r>
       <w:r>
@@ -38856,7 +38924,7 @@
           <v:shape id="_x0000_i1435" type="#_x0000_t75" style="width:43.5pt;height:18pt" o:ole="">
             <v:imagedata r:id="rId764" o:title=""/>
           </v:shape>
-          <o:OLEObject Type="Embed" ProgID="Equation.DSMT4" ShapeID="_x0000_i1435" DrawAspect="Content" ObjectID="_1611676969" r:id="rId765"/>
+          <o:OLEObject Type="Embed" ProgID="Equation.DSMT4" ShapeID="_x0000_i1435" DrawAspect="Content" ObjectID="_1611677860" r:id="rId765"/>
         </w:object>
       </w:r>
       <w:r>
@@ -39065,7 +39133,7 @@
           <v:shape id="_x0000_i1436" type="#_x0000_t75" style="width:12pt;height:16.5pt" o:ole="">
             <v:imagedata r:id="rId766" o:title=""/>
           </v:shape>
-          <o:OLEObject Type="Embed" ProgID="Equation.DSMT4" ShapeID="_x0000_i1436" DrawAspect="Content" ObjectID="_1611676970" r:id="rId767"/>
+          <o:OLEObject Type="Embed" ProgID="Equation.DSMT4" ShapeID="_x0000_i1436" DrawAspect="Content" ObjectID="_1611677861" r:id="rId767"/>
         </w:object>
       </w:r>
       <w:r>
@@ -39390,7 +39458,7 @@
           <v:shape id="_x0000_i1437" type="#_x0000_t75" style="width:57pt;height:18pt" o:ole="">
             <v:imagedata r:id="rId768" o:title=""/>
           </v:shape>
-          <o:OLEObject Type="Embed" ProgID="Equation.DSMT4" ShapeID="_x0000_i1437" DrawAspect="Content" ObjectID="_1611676971" r:id="rId769"/>
+          <o:OLEObject Type="Embed" ProgID="Equation.DSMT4" ShapeID="_x0000_i1437" DrawAspect="Content" ObjectID="_1611677862" r:id="rId769"/>
         </w:object>
       </w:r>
       <w:r>
@@ -39425,7 +39493,7 @@
           <v:shape id="_x0000_i1438" type="#_x0000_t75" style="width:66pt;height:18pt" o:ole="">
             <v:imagedata r:id="rId770" o:title=""/>
           </v:shape>
-          <o:OLEObject Type="Embed" ProgID="Equation.DSMT4" ShapeID="_x0000_i1438" DrawAspect="Content" ObjectID="_1611676972" r:id="rId771"/>
+          <o:OLEObject Type="Embed" ProgID="Equation.DSMT4" ShapeID="_x0000_i1438" DrawAspect="Content" ObjectID="_1611677863" r:id="rId771"/>
         </w:object>
       </w:r>
       <w:r>
@@ -39890,7 +39958,7 @@
           <v:shape id="_x0000_i1439" type="#_x0000_t75" style="width:39pt;height:19.5pt" o:ole="">
             <v:imagedata r:id="rId772" o:title=""/>
           </v:shape>
-          <o:OLEObject Type="Embed" ProgID="Equation.DSMT4" ShapeID="_x0000_i1439" DrawAspect="Content" ObjectID="_1611676973" r:id="rId773"/>
+          <o:OLEObject Type="Embed" ProgID="Equation.DSMT4" ShapeID="_x0000_i1439" DrawAspect="Content" ObjectID="_1611677864" r:id="rId773"/>
         </w:object>
       </w:r>
       <w:r>
@@ -39955,7 +40023,7 @@
           <v:shape id="_x0000_i1440" type="#_x0000_t75" style="width:25.5pt;height:18pt" o:ole="">
             <v:imagedata r:id="rId774" o:title=""/>
           </v:shape>
-          <o:OLEObject Type="Embed" ProgID="Equation.DSMT4" ShapeID="_x0000_i1440" DrawAspect="Content" ObjectID="_1611676974" r:id="rId775"/>
+          <o:OLEObject Type="Embed" ProgID="Equation.DSMT4" ShapeID="_x0000_i1440" DrawAspect="Content" ObjectID="_1611677865" r:id="rId775"/>
         </w:object>
       </w:r>
       <w:r>
@@ -40239,7 +40307,7 @@
           <v:shape id="_x0000_i1441" type="#_x0000_t75" style="width:43.5pt;height:19.5pt" o:ole="">
             <v:imagedata r:id="rId777" o:title=""/>
           </v:shape>
-          <o:OLEObject Type="Embed" ProgID="Equation.DSMT4" ShapeID="_x0000_i1441" DrawAspect="Content" ObjectID="_1611676975" r:id="rId778"/>
+          <o:OLEObject Type="Embed" ProgID="Equation.DSMT4" ShapeID="_x0000_i1441" DrawAspect="Content" ObjectID="_1611677866" r:id="rId778"/>
         </w:object>
       </w:r>
       <w:r>
@@ -40762,7 +40830,7 @@
           <v:shape id="_x0000_i1442" type="#_x0000_t75" style="width:126pt;height:37.5pt" o:ole="">
             <v:imagedata r:id="rId779" o:title=""/>
           </v:shape>
-          <o:OLEObject Type="Embed" ProgID="Equation.DSMT4" ShapeID="_x0000_i1442" DrawAspect="Content" ObjectID="_1611676976" r:id="rId780"/>
+          <o:OLEObject Type="Embed" ProgID="Equation.DSMT4" ShapeID="_x0000_i1442" DrawAspect="Content" ObjectID="_1611677867" r:id="rId780"/>
         </w:object>
       </w:r>
     </w:p>
@@ -40824,7 +40892,7 @@
           <v:shape id="_x0000_i1443" type="#_x0000_t75" style="width:15pt;height:18pt" o:ole="">
             <v:imagedata r:id="rId781" o:title=""/>
           </v:shape>
-          <o:OLEObject Type="Embed" ProgID="Equation.DSMT4" ShapeID="_x0000_i1443" DrawAspect="Content" ObjectID="_1611676977" r:id="rId782"/>
+          <o:OLEObject Type="Embed" ProgID="Equation.DSMT4" ShapeID="_x0000_i1443" DrawAspect="Content" ObjectID="_1611677868" r:id="rId782"/>
         </w:object>
       </w:r>
       <w:r>
@@ -40865,7 +40933,7 @@
           <v:shape id="_x0000_i1444" type="#_x0000_t75" style="width:36pt;height:18pt" o:ole="">
             <v:imagedata r:id="rId783" o:title=""/>
           </v:shape>
-          <o:OLEObject Type="Embed" ProgID="Equation.DSMT4" ShapeID="_x0000_i1444" DrawAspect="Content" ObjectID="_1611676978" r:id="rId784"/>
+          <o:OLEObject Type="Embed" ProgID="Equation.DSMT4" ShapeID="_x0000_i1444" DrawAspect="Content" ObjectID="_1611677869" r:id="rId784"/>
         </w:object>
       </w:r>
       <w:r>
@@ -40888,7 +40956,7 @@
           <v:shape id="_x0000_i1445" type="#_x0000_t75" style="width:60pt;height:18pt" o:ole="">
             <v:imagedata r:id="rId785" o:title=""/>
           </v:shape>
-          <o:OLEObject Type="Embed" ProgID="Equation.DSMT4" ShapeID="_x0000_i1445" DrawAspect="Content" ObjectID="_1611676979" r:id="rId786"/>
+          <o:OLEObject Type="Embed" ProgID="Equation.DSMT4" ShapeID="_x0000_i1445" DrawAspect="Content" ObjectID="_1611677870" r:id="rId786"/>
         </w:object>
       </w:r>
       <w:r>
@@ -40911,7 +40979,7 @@
           <v:shape id="_x0000_i1446" type="#_x0000_t75" style="width:69pt;height:18pt" o:ole="">
             <v:imagedata r:id="rId787" o:title=""/>
           </v:shape>
-          <o:OLEObject Type="Embed" ProgID="Equation.DSMT4" ShapeID="_x0000_i1446" DrawAspect="Content" ObjectID="_1611676980" r:id="rId788"/>
+          <o:OLEObject Type="Embed" ProgID="Equation.DSMT4" ShapeID="_x0000_i1446" DrawAspect="Content" ObjectID="_1611677871" r:id="rId788"/>
         </w:object>
       </w:r>
       <w:r>
@@ -40952,7 +41020,7 @@
           <v:shape id="_x0000_i1447" type="#_x0000_t75" style="width:60pt;height:18pt" o:ole="">
             <v:imagedata r:id="rId789" o:title=""/>
           </v:shape>
-          <o:OLEObject Type="Embed" ProgID="Equation.DSMT4" ShapeID="_x0000_i1447" DrawAspect="Content" ObjectID="_1611676981" r:id="rId790"/>
+          <o:OLEObject Type="Embed" ProgID="Equation.DSMT4" ShapeID="_x0000_i1447" DrawAspect="Content" ObjectID="_1611677872" r:id="rId790"/>
         </w:object>
       </w:r>
       <w:r>
@@ -41024,7 +41092,7 @@
           <v:shape id="_x0000_i1448" type="#_x0000_t75" style="width:267pt;height:31.5pt" o:ole="">
             <v:imagedata r:id="rId791" o:title=""/>
           </v:shape>
-          <o:OLEObject Type="Embed" ProgID="Equation.DSMT4" ShapeID="_x0000_i1448" DrawAspect="Content" ObjectID="_1611676982" r:id="rId792"/>
+          <o:OLEObject Type="Embed" ProgID="Equation.DSMT4" ShapeID="_x0000_i1448" DrawAspect="Content" ObjectID="_1611677873" r:id="rId792"/>
         </w:object>
       </w:r>
     </w:p>
@@ -41070,7 +41138,7 @@
           <v:shape id="_x0000_i1449" type="#_x0000_t75" style="width:176.25pt;height:33.75pt" o:ole="">
             <v:imagedata r:id="rId793" o:title=""/>
           </v:shape>
-          <o:OLEObject Type="Embed" ProgID="Equation.DSMT4" ShapeID="_x0000_i1449" DrawAspect="Content" ObjectID="_1611676983" r:id="rId794"/>
+          <o:OLEObject Type="Embed" ProgID="Equation.DSMT4" ShapeID="_x0000_i1449" DrawAspect="Content" ObjectID="_1611677874" r:id="rId794"/>
         </w:object>
       </w:r>
     </w:p>
@@ -41114,7 +41182,7 @@
           <v:shape id="_x0000_i1450" type="#_x0000_t75" style="width:367.5pt;height:37.5pt" o:ole="">
             <v:imagedata r:id="rId795" o:title=""/>
           </v:shape>
-          <o:OLEObject Type="Embed" ProgID="Equation.DSMT4" ShapeID="_x0000_i1450" DrawAspect="Content" ObjectID="_1611676984" r:id="rId796"/>
+          <o:OLEObject Type="Embed" ProgID="Equation.DSMT4" ShapeID="_x0000_i1450" DrawAspect="Content" ObjectID="_1611677875" r:id="rId796"/>
         </w:object>
       </w:r>
     </w:p>
@@ -41158,7 +41226,7 @@
           <v:shape id="_x0000_i1451" type="#_x0000_t75" style="width:75pt;height:31.5pt" o:ole="">
             <v:imagedata r:id="rId797" o:title=""/>
           </v:shape>
-          <o:OLEObject Type="Embed" ProgID="Equation.DSMT4" ShapeID="_x0000_i1451" DrawAspect="Content" ObjectID="_1611676985" r:id="rId798"/>
+          <o:OLEObject Type="Embed" ProgID="Equation.DSMT4" ShapeID="_x0000_i1451" DrawAspect="Content" ObjectID="_1611677876" r:id="rId798"/>
         </w:object>
       </w:r>
       <w:r>
@@ -41247,7 +41315,7 @@
           <v:shape id="_x0000_i1452" type="#_x0000_t75" style="width:10.5pt;height:13.5pt" o:ole="">
             <v:imagedata r:id="rId799" o:title=""/>
           </v:shape>
-          <o:OLEObject Type="Embed" ProgID="Equation.DSMT4" ShapeID="_x0000_i1452" DrawAspect="Content" ObjectID="_1611676986" r:id="rId800"/>
+          <o:OLEObject Type="Embed" ProgID="Equation.DSMT4" ShapeID="_x0000_i1452" DrawAspect="Content" ObjectID="_1611677877" r:id="rId800"/>
         </w:object>
       </w:r>
       <w:r>
@@ -41279,7 +41347,7 @@
           <v:shape id="_x0000_i1453" type="#_x0000_t75" style="width:13.5pt;height:18pt" o:ole="">
             <v:imagedata r:id="rId801" o:title=""/>
           </v:shape>
-          <o:OLEObject Type="Embed" ProgID="Equation.DSMT4" ShapeID="_x0000_i1453" DrawAspect="Content" ObjectID="_1611676987" r:id="rId802"/>
+          <o:OLEObject Type="Embed" ProgID="Equation.DSMT4" ShapeID="_x0000_i1453" DrawAspect="Content" ObjectID="_1611677878" r:id="rId802"/>
         </w:object>
       </w:r>
       <w:r>
@@ -41374,7 +41442,7 @@
           <v:shape id="_x0000_i1454" type="#_x0000_t75" style="width:135.75pt;height:37.5pt" o:ole="">
             <v:imagedata r:id="rId803" o:title=""/>
           </v:shape>
-          <o:OLEObject Type="Embed" ProgID="Equation.DSMT4" ShapeID="_x0000_i1454" DrawAspect="Content" ObjectID="_1611676988" r:id="rId804"/>
+          <o:OLEObject Type="Embed" ProgID="Equation.DSMT4" ShapeID="_x0000_i1454" DrawAspect="Content" ObjectID="_1611677879" r:id="rId804"/>
         </w:object>
       </w:r>
       <w:r>
@@ -41397,7 +41465,7 @@
           <v:shape id="_x0000_i1455" type="#_x0000_t75" style="width:111.75pt;height:33.75pt" o:ole="">
             <v:imagedata r:id="rId805" o:title=""/>
           </v:shape>
-          <o:OLEObject Type="Embed" ProgID="Equation.DSMT4" ShapeID="_x0000_i1455" DrawAspect="Content" ObjectID="_1611676989" r:id="rId806"/>
+          <o:OLEObject Type="Embed" ProgID="Equation.DSMT4" ShapeID="_x0000_i1455" DrawAspect="Content" ObjectID="_1611677880" r:id="rId806"/>
         </w:object>
       </w:r>
       <w:r>
@@ -41609,7 +41677,7 @@
           <v:shape id="_x0000_i1456" type="#_x0000_t75" style="width:13.5pt;height:18pt" o:ole="">
             <v:imagedata r:id="rId801" o:title=""/>
           </v:shape>
-          <o:OLEObject Type="Embed" ProgID="Equation.DSMT4" ShapeID="_x0000_i1456" DrawAspect="Content" ObjectID="_1611676990" r:id="rId807"/>
+          <o:OLEObject Type="Embed" ProgID="Equation.DSMT4" ShapeID="_x0000_i1456" DrawAspect="Content" ObjectID="_1611677881" r:id="rId807"/>
         </w:object>
       </w:r>
       <w:r>
@@ -41830,7 +41898,7 @@
           <v:shape id="_x0000_i1457" type="#_x0000_t75" style="width:10.5pt;height:13.5pt" o:ole="">
             <v:imagedata r:id="rId808" o:title=""/>
           </v:shape>
-          <o:OLEObject Type="Embed" ProgID="Equation.DSMT4" ShapeID="_x0000_i1457" DrawAspect="Content" ObjectID="_1611676991" r:id="rId809"/>
+          <o:OLEObject Type="Embed" ProgID="Equation.DSMT4" ShapeID="_x0000_i1457" DrawAspect="Content" ObjectID="_1611677882" r:id="rId809"/>
         </w:object>
       </w:r>
       <w:r>
@@ -41979,7 +42047,7 @@
           <v:shape id="_x0000_i1458" type="#_x0000_t75" style="width:14.25pt;height:18pt" o:ole="">
             <v:imagedata r:id="rId810" o:title=""/>
           </v:shape>
-          <o:OLEObject Type="Embed" ProgID="Equation.DSMT4" ShapeID="_x0000_i1458" DrawAspect="Content" ObjectID="_1611676992" r:id="rId811"/>
+          <o:OLEObject Type="Embed" ProgID="Equation.DSMT4" ShapeID="_x0000_i1458" DrawAspect="Content" ObjectID="_1611677883" r:id="rId811"/>
         </w:object>
       </w:r>
       <w:r>
@@ -42056,7 +42124,7 @@
           <v:shape id="_x0000_i1459" type="#_x0000_t75" style="width:14.25pt;height:18pt" o:ole="">
             <v:imagedata r:id="rId810" o:title=""/>
           </v:shape>
-          <o:OLEObject Type="Embed" ProgID="Equation.DSMT4" ShapeID="_x0000_i1459" DrawAspect="Content" ObjectID="_1611676993" r:id="rId812"/>
+          <o:OLEObject Type="Embed" ProgID="Equation.DSMT4" ShapeID="_x0000_i1459" DrawAspect="Content" ObjectID="_1611677884" r:id="rId812"/>
         </w:object>
       </w:r>
       <w:r>
@@ -42070,7 +42138,7 @@
           <v:shape id="_x0000_i1460" type="#_x0000_t75" style="width:24pt;height:14.25pt" o:ole="">
             <v:imagedata r:id="rId813" o:title=""/>
           </v:shape>
-          <o:OLEObject Type="Embed" ProgID="Equation.DSMT4" ShapeID="_x0000_i1460" DrawAspect="Content" ObjectID="_1611676994" r:id="rId814"/>
+          <o:OLEObject Type="Embed" ProgID="Equation.DSMT4" ShapeID="_x0000_i1460" DrawAspect="Content" ObjectID="_1611677885" r:id="rId814"/>
         </w:object>
       </w:r>
       <w:r>
@@ -42138,7 +42206,7 @@
           <v:shape id="_x0000_i1461" type="#_x0000_t75" style="width:19.5pt;height:18pt" o:ole="">
             <v:imagedata r:id="rId815" o:title=""/>
           </v:shape>
-          <o:OLEObject Type="Embed" ProgID="Equation.DSMT4" ShapeID="_x0000_i1461" DrawAspect="Content" ObjectID="_1611676995" r:id="rId816"/>
+          <o:OLEObject Type="Embed" ProgID="Equation.DSMT4" ShapeID="_x0000_i1461" DrawAspect="Content" ObjectID="_1611677886" r:id="rId816"/>
         </w:object>
       </w:r>
       <w:r>
@@ -42175,7 +42243,7 @@
           <v:shape id="_x0000_i1462" type="#_x0000_t75" style="width:27pt;height:15.75pt" o:ole="">
             <v:imagedata r:id="rId817" o:title=""/>
           </v:shape>
-          <o:OLEObject Type="Embed" ProgID="Equation.DSMT4" ShapeID="_x0000_i1462" DrawAspect="Content" ObjectID="_1611676996" r:id="rId818"/>
+          <o:OLEObject Type="Embed" ProgID="Equation.DSMT4" ShapeID="_x0000_i1462" DrawAspect="Content" ObjectID="_1611677887" r:id="rId818"/>
         </w:object>
       </w:r>
       <w:r>
@@ -42220,7 +42288,7 @@
           <v:shape id="_x0000_i1463" type="#_x0000_t75" style="width:32.25pt;height:19.5pt" o:ole="">
             <v:imagedata r:id="rId819" o:title=""/>
           </v:shape>
-          <o:OLEObject Type="Embed" ProgID="Equation.DSMT4" ShapeID="_x0000_i1463" DrawAspect="Content" ObjectID="_1611676997" r:id="rId820"/>
+          <o:OLEObject Type="Embed" ProgID="Equation.DSMT4" ShapeID="_x0000_i1463" DrawAspect="Content" ObjectID="_1611677888" r:id="rId820"/>
         </w:object>
       </w:r>
       <w:r>
@@ -42257,7 +42325,7 @@
           <v:shape id="_x0000_i1464" type="#_x0000_t75" style="width:32.25pt;height:18pt" o:ole="">
             <v:imagedata r:id="rId821" o:title=""/>
           </v:shape>
-          <o:OLEObject Type="Embed" ProgID="Equation.DSMT4" ShapeID="_x0000_i1464" DrawAspect="Content" ObjectID="_1611676998" r:id="rId822"/>
+          <o:OLEObject Type="Embed" ProgID="Equation.DSMT4" ShapeID="_x0000_i1464" DrawAspect="Content" ObjectID="_1611677889" r:id="rId822"/>
         </w:object>
       </w:r>
       <w:r>
@@ -42442,7 +42510,7 @@
           <v:shape id="_x0000_i1465" type="#_x0000_t75" style="width:147.75pt;height:40.5pt" o:ole="">
             <v:imagedata r:id="rId823" o:title=""/>
           </v:shape>
-          <o:OLEObject Type="Embed" ProgID="Equation.DSMT4" ShapeID="_x0000_i1465" DrawAspect="Content" ObjectID="_1611676999" r:id="rId824"/>
+          <o:OLEObject Type="Embed" ProgID="Equation.DSMT4" ShapeID="_x0000_i1465" DrawAspect="Content" ObjectID="_1611677890" r:id="rId824"/>
         </w:object>
       </w:r>
       <w:r>
@@ -42474,7 +42542,7 @@
           <v:shape id="_x0000_i1466" type="#_x0000_t75" style="width:94.5pt;height:27.75pt" o:ole="">
             <v:imagedata r:id="rId825" o:title=""/>
           </v:shape>
-          <o:OLEObject Type="Embed" ProgID="Equation.DSMT4" ShapeID="_x0000_i1466" DrawAspect="Content" ObjectID="_1611677000" r:id="rId826"/>
+          <o:OLEObject Type="Embed" ProgID="Equation.DSMT4" ShapeID="_x0000_i1466" DrawAspect="Content" ObjectID="_1611677891" r:id="rId826"/>
         </w:object>
       </w:r>
       <w:r>
@@ -42515,7 +42583,7 @@
           <v:shape id="_x0000_i1467" type="#_x0000_t75" style="width:345.75pt;height:40.5pt" o:ole="">
             <v:imagedata r:id="rId827" o:title=""/>
           </v:shape>
-          <o:OLEObject Type="Embed" ProgID="Equation.DSMT4" ShapeID="_x0000_i1467" DrawAspect="Content" ObjectID="_1611677001" r:id="rId828"/>
+          <o:OLEObject Type="Embed" ProgID="Equation.DSMT4" ShapeID="_x0000_i1467" DrawAspect="Content" ObjectID="_1611677892" r:id="rId828"/>
         </w:object>
       </w:r>
       <w:r>
@@ -42556,7 +42624,7 @@
           <v:shape id="_x0000_i1468" type="#_x0000_t75" style="width:145.5pt;height:27.75pt" o:ole="">
             <v:imagedata r:id="rId829" o:title=""/>
           </v:shape>
-          <o:OLEObject Type="Embed" ProgID="Equation.DSMT4" ShapeID="_x0000_i1468" DrawAspect="Content" ObjectID="_1611677002" r:id="rId830"/>
+          <o:OLEObject Type="Embed" ProgID="Equation.DSMT4" ShapeID="_x0000_i1468" DrawAspect="Content" ObjectID="_1611677893" r:id="rId830"/>
         </w:object>
       </w:r>
       <w:r>
@@ -42687,7 +42755,7 @@
           <v:shape id="_x0000_i1469" type="#_x0000_t75" style="width:9.75pt;height:13.5pt" o:ole="">
             <v:imagedata r:id="rId831" o:title=""/>
           </v:shape>
-          <o:OLEObject Type="Embed" ProgID="Equation.DSMT4" ShapeID="_x0000_i1469" DrawAspect="Content" ObjectID="_1611677003" r:id="rId832"/>
+          <o:OLEObject Type="Embed" ProgID="Equation.DSMT4" ShapeID="_x0000_i1469" DrawAspect="Content" ObjectID="_1611677894" r:id="rId832"/>
         </w:object>
       </w:r>
       <w:r>
@@ -42728,7 +42796,7 @@
           <v:shape id="_x0000_i1470" type="#_x0000_t75" style="width:15pt;height:18pt" o:ole="">
             <v:imagedata r:id="rId833" o:title=""/>
           </v:shape>
-          <o:OLEObject Type="Embed" ProgID="Equation.DSMT4" ShapeID="_x0000_i1470" DrawAspect="Content" ObjectID="_1611677004" r:id="rId834"/>
+          <o:OLEObject Type="Embed" ProgID="Equation.DSMT4" ShapeID="_x0000_i1470" DrawAspect="Content" ObjectID="_1611677895" r:id="rId834"/>
         </w:object>
       </w:r>
       <w:r>
@@ -42769,7 +42837,7 @@
           <v:shape id="_x0000_i1471" type="#_x0000_t75" style="width:32.25pt;height:18pt" o:ole="">
             <v:imagedata r:id="rId835" o:title=""/>
           </v:shape>
-          <o:OLEObject Type="Embed" ProgID="Equation.DSMT4" ShapeID="_x0000_i1471" DrawAspect="Content" ObjectID="_1611677005" r:id="rId836"/>
+          <o:OLEObject Type="Embed" ProgID="Equation.DSMT4" ShapeID="_x0000_i1471" DrawAspect="Content" ObjectID="_1611677896" r:id="rId836"/>
         </w:object>
       </w:r>
       <w:r>
@@ -43044,7 +43112,7 @@
           <v:shape id="_x0000_i1472" type="#_x0000_t75" style="width:15.75pt;height:20.25pt" o:ole="">
             <v:imagedata r:id="rId833" o:title=""/>
           </v:shape>
-          <o:OLEObject Type="Embed" ProgID="Equation.DSMT4" ShapeID="_x0000_i1472" DrawAspect="Content" ObjectID="_1611677006" r:id="rId837"/>
+          <o:OLEObject Type="Embed" ProgID="Equation.DSMT4" ShapeID="_x0000_i1472" DrawAspect="Content" ObjectID="_1611677897" r:id="rId837"/>
         </w:object>
       </w:r>
       <w:r>
@@ -43094,7 +43162,7 @@
           <v:shape id="_x0000_i1473" type="#_x0000_t75" style="width:16.5pt;height:15.75pt" o:ole="">
             <v:imagedata r:id="rId838" o:title=""/>
           </v:shape>
-          <o:OLEObject Type="Embed" ProgID="Equation.DSMT4" ShapeID="_x0000_i1473" DrawAspect="Content" ObjectID="_1611677007" r:id="rId839"/>
+          <o:OLEObject Type="Embed" ProgID="Equation.DSMT4" ShapeID="_x0000_i1473" DrawAspect="Content" ObjectID="_1611677898" r:id="rId839"/>
         </w:object>
       </w:r>
       <w:r>
@@ -43144,7 +43212,7 @@
           <v:shape id="_x0000_i1474" type="#_x0000_t75" style="width:9.75pt;height:14.25pt" o:ole="">
             <v:imagedata r:id="rId840" o:title=""/>
           </v:shape>
-          <o:OLEObject Type="Embed" ProgID="Equation.DSMT4" ShapeID="_x0000_i1474" DrawAspect="Content" ObjectID="_1611677008" r:id="rId841"/>
+          <o:OLEObject Type="Embed" ProgID="Equation.DSMT4" ShapeID="_x0000_i1474" DrawAspect="Content" ObjectID="_1611677899" r:id="rId841"/>
         </w:object>
       </w:r>
       <w:r>
@@ -43276,7 +43344,7 @@
           <v:shape id="_x0000_i1475" type="#_x0000_t75" style="width:32.25pt;height:19.5pt" o:ole="">
             <v:imagedata r:id="rId819" o:title=""/>
           </v:shape>
-          <o:OLEObject Type="Embed" ProgID="Equation.DSMT4" ShapeID="_x0000_i1475" DrawAspect="Content" ObjectID="_1611677009" r:id="rId842"/>
+          <o:OLEObject Type="Embed" ProgID="Equation.DSMT4" ShapeID="_x0000_i1475" DrawAspect="Content" ObjectID="_1611677900" r:id="rId842"/>
         </w:object>
       </w:r>
       <w:r>
@@ -43313,7 +43381,7 @@
           <v:shape id="_x0000_i1476" type="#_x0000_t75" style="width:13.5pt;height:18pt" o:ole="">
             <v:imagedata r:id="rId843" o:title=""/>
           </v:shape>
-          <o:OLEObject Type="Embed" ProgID="Equation.DSMT4" ShapeID="_x0000_i1476" DrawAspect="Content" ObjectID="_1611677010" r:id="rId844"/>
+          <o:OLEObject Type="Embed" ProgID="Equation.DSMT4" ShapeID="_x0000_i1476" DrawAspect="Content" ObjectID="_1611677901" r:id="rId844"/>
         </w:object>
       </w:r>
       <w:r>
@@ -43630,7 +43698,7 @@
           <v:shape id="_x0000_i1477" type="#_x0000_t75" style="width:10.5pt;height:13.5pt" o:ole="">
             <v:imagedata r:id="rId845" o:title=""/>
           </v:shape>
-          <o:OLEObject Type="Embed" ProgID="Equation.DSMT4" ShapeID="_x0000_i1477" DrawAspect="Content" ObjectID="_1611677011" r:id="rId846"/>
+          <o:OLEObject Type="Embed" ProgID="Equation.DSMT4" ShapeID="_x0000_i1477" DrawAspect="Content" ObjectID="_1611677902" r:id="rId846"/>
         </w:object>
       </w:r>
       <w:r>
@@ -43659,7 +43727,7 @@
           <v:shape id="_x0000_i1478" type="#_x0000_t75" style="width:13.5pt;height:18pt" o:ole="">
             <v:imagedata r:id="rId843" o:title=""/>
           </v:shape>
-          <o:OLEObject Type="Embed" ProgID="Equation.DSMT4" ShapeID="_x0000_i1478" DrawAspect="Content" ObjectID="_1611677012" r:id="rId847"/>
+          <o:OLEObject Type="Embed" ProgID="Equation.DSMT4" ShapeID="_x0000_i1478" DrawAspect="Content" ObjectID="_1611677903" r:id="rId847"/>
         </w:object>
       </w:r>
       <w:r>
@@ -44022,7 +44090,7 @@
           <v:shape id="_x0000_i1479" type="#_x0000_t75" style="width:294.75pt;height:24pt" o:ole="">
             <v:imagedata r:id="rId848" o:title=""/>
           </v:shape>
-          <o:OLEObject Type="Embed" ProgID="Equation.DSMT4" ShapeID="_x0000_i1479" DrawAspect="Content" ObjectID="_1611677013" r:id="rId849"/>
+          <o:OLEObject Type="Embed" ProgID="Equation.DSMT4" ShapeID="_x0000_i1479" DrawAspect="Content" ObjectID="_1611677904" r:id="rId849"/>
         </w:object>
       </w:r>
       <w:r>
@@ -44109,7 +44177,7 @@
           <v:shape id="_x0000_i1480" type="#_x0000_t75" style="width:115.5pt;height:19.5pt" o:ole="">
             <v:imagedata r:id="rId850" o:title=""/>
           </v:shape>
-          <o:OLEObject Type="Embed" ProgID="Equation.DSMT4" ShapeID="_x0000_i1480" DrawAspect="Content" ObjectID="_1611677014" r:id="rId851"/>
+          <o:OLEObject Type="Embed" ProgID="Equation.DSMT4" ShapeID="_x0000_i1480" DrawAspect="Content" ObjectID="_1611677905" r:id="rId851"/>
         </w:object>
       </w:r>
       <w:r>
@@ -44130,7 +44198,7 @@
           <v:shape id="_x0000_i1481" type="#_x0000_t75" style="width:16.5pt;height:18pt" o:ole="">
             <v:imagedata r:id="rId852" o:title=""/>
           </v:shape>
-          <o:OLEObject Type="Embed" ProgID="Equation.DSMT4" ShapeID="_x0000_i1481" DrawAspect="Content" ObjectID="_1611677015" r:id="rId853"/>
+          <o:OLEObject Type="Embed" ProgID="Equation.DSMT4" ShapeID="_x0000_i1481" DrawAspect="Content" ObjectID="_1611677906" r:id="rId853"/>
         </w:object>
       </w:r>
       <w:r>
@@ -44231,7 +44299,7 @@
           <v:shape id="_x0000_i1482" type="#_x0000_t75" style="width:103.5pt;height:18pt" o:ole="">
             <v:imagedata r:id="rId854" o:title=""/>
           </v:shape>
-          <o:OLEObject Type="Embed" ProgID="Equation.DSMT4" ShapeID="_x0000_i1482" DrawAspect="Content" ObjectID="_1611677016" r:id="rId855"/>
+          <o:OLEObject Type="Embed" ProgID="Equation.DSMT4" ShapeID="_x0000_i1482" DrawAspect="Content" ObjectID="_1611677907" r:id="rId855"/>
         </w:object>
       </w:r>
       <w:r>
@@ -44588,7 +44656,7 @@
           <v:shape id="_x0000_i1483" type="#_x0000_t75" style="width:34.5pt;height:19.5pt" o:ole="">
             <v:imagedata r:id="rId856" o:title=""/>
           </v:shape>
-          <o:OLEObject Type="Embed" ProgID="Equation.DSMT4" ShapeID="_x0000_i1483" DrawAspect="Content" ObjectID="_1611677017" r:id="rId857"/>
+          <o:OLEObject Type="Embed" ProgID="Equation.DSMT4" ShapeID="_x0000_i1483" DrawAspect="Content" ObjectID="_1611677908" r:id="rId857"/>
         </w:object>
       </w:r>
       <w:r>
@@ -44705,7 +44773,7 @@
           <v:shape id="_x0000_i1484" type="#_x0000_t75" style="width:13.5pt;height:19.5pt" o:ole="">
             <v:imagedata r:id="rId858" o:title=""/>
           </v:shape>
-          <o:OLEObject Type="Embed" ProgID="Equation.DSMT4" ShapeID="_x0000_i1484" DrawAspect="Content" ObjectID="_1611677018" r:id="rId859"/>
+          <o:OLEObject Type="Embed" ProgID="Equation.DSMT4" ShapeID="_x0000_i1484" DrawAspect="Content" ObjectID="_1611677909" r:id="rId859"/>
         </w:object>
       </w:r>
       <w:r>
@@ -44758,7 +44826,7 @@
           <v:shape id="_x0000_i1485" type="#_x0000_t75" style="width:103.5pt;height:16.5pt" o:ole="">
             <v:imagedata r:id="rId860" o:title=""/>
           </v:shape>
-          <o:OLEObject Type="Embed" ProgID="Equation.DSMT4" ShapeID="_x0000_i1485" DrawAspect="Content" ObjectID="_1611677019" r:id="rId861"/>
+          <o:OLEObject Type="Embed" ProgID="Equation.DSMT4" ShapeID="_x0000_i1485" DrawAspect="Content" ObjectID="_1611677910" r:id="rId861"/>
         </w:object>
       </w:r>
       <w:r>
@@ -45237,7 +45305,7 @@
           <v:shape id="_x0000_i1486" type="#_x0000_t75" style="width:60pt;height:18pt" o:ole="">
             <v:imagedata r:id="rId862" o:title=""/>
           </v:shape>
-          <o:OLEObject Type="Embed" ProgID="Equation.DSMT4" ShapeID="_x0000_i1486" DrawAspect="Content" ObjectID="_1611677020" r:id="rId863"/>
+          <o:OLEObject Type="Embed" ProgID="Equation.DSMT4" ShapeID="_x0000_i1486" DrawAspect="Content" ObjectID="_1611677911" r:id="rId863"/>
         </w:object>
       </w:r>
       <w:r>
@@ -45258,7 +45326,7 @@
           <v:shape id="_x0000_i1487" type="#_x0000_t75" style="width:25.5pt;height:18pt" o:ole="">
             <v:imagedata r:id="rId864" o:title=""/>
           </v:shape>
-          <o:OLEObject Type="Embed" ProgID="Equation.DSMT4" ShapeID="_x0000_i1487" DrawAspect="Content" ObjectID="_1611677021" r:id="rId865"/>
+          <o:OLEObject Type="Embed" ProgID="Equation.DSMT4" ShapeID="_x0000_i1487" DrawAspect="Content" ObjectID="_1611677912" r:id="rId865"/>
         </w:object>
       </w:r>
       <w:r>
@@ -45359,7 +45427,7 @@
           <v:shape id="_x0000_i1488" type="#_x0000_t75" style="width:64.5pt;height:18pt" o:ole="">
             <v:imagedata r:id="rId866" o:title=""/>
           </v:shape>
-          <o:OLEObject Type="Embed" ProgID="Equation.DSMT4" ShapeID="_x0000_i1488" DrawAspect="Content" ObjectID="_1611677022" r:id="rId867"/>
+          <o:OLEObject Type="Embed" ProgID="Equation.DSMT4" ShapeID="_x0000_i1488" DrawAspect="Content" ObjectID="_1611677913" r:id="rId867"/>
         </w:object>
       </w:r>
       <w:r>
@@ -45392,7 +45460,16 @@
           <w:sz w:val="28"/>
           <w:lang w:val="en-US"/>
         </w:rPr>
-        <w:t xml:space="preserve"> case of amorphous body in a low intensity limit. The</w:t>
+        <w:t xml:space="preserve"> case of amorphous body in a low intensity limit. </w:t>
+      </w:r>
+      <w:commentRangeStart w:id="36"/>
+      <w:r>
+        <w:rPr>
+          <w:rFonts w:ascii="Times New Roman" w:hAnsi="Times New Roman"/>
+          <w:sz w:val="28"/>
+          <w:lang w:val="en-US"/>
+        </w:rPr>
+        <w:t>The</w:t>
       </w:r>
       <w:r>
         <w:rPr>
@@ -45444,7 +45521,7 @@
           <v:shape id="_x0000_i1489" type="#_x0000_t75" style="width:24pt;height:18pt" o:ole="">
             <v:imagedata r:id="rId868" o:title=""/>
           </v:shape>
-          <o:OLEObject Type="Embed" ProgID="Equation.DSMT4" ShapeID="_x0000_i1489" DrawAspect="Content" ObjectID="_1611677023" r:id="rId869"/>
+          <o:OLEObject Type="Embed" ProgID="Equation.DSMT4" ShapeID="_x0000_i1489" DrawAspect="Content" ObjectID="_1611677914" r:id="rId869"/>
         </w:object>
       </w:r>
       <w:r>
@@ -45462,6 +45539,13 @@
           <w:lang w:val="en-US"/>
         </w:rPr>
         <w:t>.</w:t>
+      </w:r>
+      <w:commentRangeEnd w:id="36"/>
+      <w:r>
+        <w:rPr>
+          <w:rStyle w:val="CommentReference"/>
+        </w:rPr>
+        <w:commentReference w:id="36"/>
       </w:r>
     </w:p>
     <w:p>
@@ -45484,7 +45568,7 @@
           <v:shape id="_x0000_i1490" type="#_x0000_t75" style="width:34.5pt;height:19.5pt" o:ole="">
             <v:imagedata r:id="rId856" o:title=""/>
           </v:shape>
-          <o:OLEObject Type="Embed" ProgID="Equation.DSMT4" ShapeID="_x0000_i1490" DrawAspect="Content" ObjectID="_1611677024" r:id="rId870"/>
+          <o:OLEObject Type="Embed" ProgID="Equation.DSMT4" ShapeID="_x0000_i1490" DrawAspect="Content" ObjectID="_1611677915" r:id="rId870"/>
         </w:object>
       </w:r>
       <w:r>
@@ -45553,7 +45637,7 @@
           <v:shape id="_x0000_i1491" type="#_x0000_t75" style="width:55.5pt;height:22.5pt" o:ole="">
             <v:imagedata r:id="rId871" o:title=""/>
           </v:shape>
-          <o:OLEObject Type="Embed" ProgID="Equation.DSMT4" ShapeID="_x0000_i1491" DrawAspect="Content" ObjectID="_1611677025" r:id="rId872"/>
+          <o:OLEObject Type="Embed" ProgID="Equation.DSMT4" ShapeID="_x0000_i1491" DrawAspect="Content" ObjectID="_1611677916" r:id="rId872"/>
         </w:object>
       </w:r>
       <w:r>
@@ -46593,7 +46677,7 @@
           <v:shape id="_x0000_i1492" type="#_x0000_t75" style="width:90pt;height:16.5pt" o:ole="">
             <v:imagedata r:id="rId873" o:title=""/>
           </v:shape>
-          <o:OLEObject Type="Embed" ProgID="Equation.DSMT4" ShapeID="_x0000_i1492" DrawAspect="Content" ObjectID="_1611677026" r:id="rId874"/>
+          <o:OLEObject Type="Embed" ProgID="Equation.DSMT4" ShapeID="_x0000_i1492" DrawAspect="Content" ObjectID="_1611677917" r:id="rId874"/>
         </w:object>
       </w:r>
       <w:r>
@@ -47065,22 +47149,44 @@
         </w:rPr>
         <w:t xml:space="preserve"> </w:t>
       </w:r>
-      <w:r>
-        <w:rPr>
-          <w:rFonts w:ascii="Times New Roman" w:hAnsi="Times New Roman"/>
-          <w:sz w:val="28"/>
-          <w:lang w:val="en-US"/>
-        </w:rPr>
-        <w:t>polaron</w:t>
-      </w:r>
-      <w:r>
-        <w:rPr>
-          <w:rFonts w:ascii="Times New Roman" w:hAnsi="Times New Roman"/>
-          <w:sz w:val="28"/>
-          <w:lang w:val="en-US"/>
-        </w:rPr>
-        <w:t xml:space="preserve"> </w:t>
-      </w:r>
+      <w:del w:id="37" w:author="Thibault Derrien" w:date="2019-02-14T19:16:00Z">
+        <w:r>
+          <w:rPr>
+            <w:rFonts w:ascii="Times New Roman" w:hAnsi="Times New Roman"/>
+            <w:sz w:val="28"/>
+            <w:lang w:val="en-US"/>
+          </w:rPr>
+          <w:delText>polaron</w:delText>
+        </w:r>
+        <w:r>
+          <w:rPr>
+            <w:rFonts w:ascii="Times New Roman" w:hAnsi="Times New Roman"/>
+            <w:sz w:val="28"/>
+            <w:lang w:val="en-US"/>
+          </w:rPr>
+          <w:delText xml:space="preserve"> </w:delText>
+        </w:r>
+      </w:del>
+      <w:ins w:id="38" w:author="Thibault Derrien" w:date="2019-02-14T19:16:00Z">
+        <w:r>
+          <w:rPr>
+            <w:rFonts w:ascii="Times New Roman" w:hAnsi="Times New Roman"/>
+            <w:sz w:val="28"/>
+            <w:lang w:val="en-US"/>
+          </w:rPr>
+          <w:t>electron</w:t>
+        </w:r>
+        <w:bookmarkStart w:id="39" w:name="_GoBack"/>
+        <w:bookmarkEnd w:id="39"/>
+        <w:r>
+          <w:rPr>
+            <w:rFonts w:ascii="Times New Roman" w:hAnsi="Times New Roman"/>
+            <w:sz w:val="28"/>
+            <w:lang w:val="en-US"/>
+          </w:rPr>
+          <w:t xml:space="preserve"> </w:t>
+        </w:r>
+      </w:ins>
       <w:r>
         <w:rPr>
           <w:rFonts w:ascii="Times New Roman" w:hAnsi="Times New Roman"/>
@@ -47139,7 +47245,7 @@
           <v:shape id="_x0000_i1493" type="#_x0000_t75" style="width:19.5pt;height:18pt" o:ole="">
             <v:imagedata r:id="rId875" o:title=""/>
           </v:shape>
-          <o:OLEObject Type="Embed" ProgID="Equation.DSMT4" ShapeID="_x0000_i1493" DrawAspect="Content" ObjectID="_1611677027" r:id="rId876"/>
+          <o:OLEObject Type="Embed" ProgID="Equation.DSMT4" ShapeID="_x0000_i1493" DrawAspect="Content" ObjectID="_1611677918" r:id="rId876"/>
         </w:object>
       </w:r>
       <w:r>
@@ -47252,7 +47358,7 @@
           <v:shape id="_x0000_i1494" type="#_x0000_t75" style="width:19.5pt;height:18pt" o:ole="">
             <v:imagedata r:id="rId877" o:title=""/>
           </v:shape>
-          <o:OLEObject Type="Embed" ProgID="Equation.DSMT4" ShapeID="_x0000_i1494" DrawAspect="Content" ObjectID="_1611677028" r:id="rId878"/>
+          <o:OLEObject Type="Embed" ProgID="Equation.DSMT4" ShapeID="_x0000_i1494" DrawAspect="Content" ObjectID="_1611677919" r:id="rId878"/>
         </w:object>
       </w:r>
       <w:r>
@@ -47387,7 +47493,7 @@
           <v:shape id="_x0000_i1495" type="#_x0000_t75" style="width:138pt;height:19.5pt" o:ole="">
             <v:imagedata r:id="rId879" o:title=""/>
           </v:shape>
-          <o:OLEObject Type="Embed" ProgID="Equation.DSMT4" ShapeID="_x0000_i1495" DrawAspect="Content" ObjectID="_1611677029" r:id="rId880"/>
+          <o:OLEObject Type="Embed" ProgID="Equation.DSMT4" ShapeID="_x0000_i1495" DrawAspect="Content" ObjectID="_1611677920" r:id="rId880"/>
         </w:object>
       </w:r>
       <w:r>
@@ -47437,7 +47543,7 @@
           <v:shape id="_x0000_i1496" type="#_x0000_t75" style="width:42pt;height:19.5pt" o:ole="">
             <v:imagedata r:id="rId881" o:title=""/>
           </v:shape>
-          <o:OLEObject Type="Embed" ProgID="Equation.DSMT4" ShapeID="_x0000_i1496" DrawAspect="Content" ObjectID="_1611677030" r:id="rId882"/>
+          <o:OLEObject Type="Embed" ProgID="Equation.DSMT4" ShapeID="_x0000_i1496" DrawAspect="Content" ObjectID="_1611677921" r:id="rId882"/>
         </w:object>
       </w:r>
       <w:r>
@@ -47604,7 +47710,7 @@
           <v:shape id="_x0000_i1497" type="#_x0000_t75" style="width:19.5pt;height:18pt" o:ole="">
             <v:imagedata r:id="rId593" o:title=""/>
           </v:shape>
-          <o:OLEObject Type="Embed" ProgID="Equation.DSMT4" ShapeID="_x0000_i1497" DrawAspect="Content" ObjectID="_1611677031" r:id="rId883"/>
+          <o:OLEObject Type="Embed" ProgID="Equation.DSMT4" ShapeID="_x0000_i1497" DrawAspect="Content" ObjectID="_1611677922" r:id="rId883"/>
         </w:object>
       </w:r>
       <w:r>
@@ -47789,7 +47895,7 @@
           <v:shape id="_x0000_i1498" type="#_x0000_t75" style="width:19.5pt;height:19.5pt" o:ole="">
             <v:imagedata r:id="rId884" o:title=""/>
           </v:shape>
-          <o:OLEObject Type="Embed" ProgID="Equation.DSMT4" ShapeID="_x0000_i1498" DrawAspect="Content" ObjectID="_1611677032" r:id="rId885"/>
+          <o:OLEObject Type="Embed" ProgID="Equation.DSMT4" ShapeID="_x0000_i1498" DrawAspect="Content" ObjectID="_1611677923" r:id="rId885"/>
         </w:object>
       </w:r>
       <w:r>
@@ -47839,7 +47945,7 @@
           <v:shape id="_x0000_i1499" type="#_x0000_t75" style="width:34.5pt;height:18pt" o:ole="">
             <v:imagedata r:id="rId886" o:title=""/>
           </v:shape>
-          <o:OLEObject Type="Embed" ProgID="Equation.DSMT4" ShapeID="_x0000_i1499" DrawAspect="Content" ObjectID="_1611677033" r:id="rId887"/>
+          <o:OLEObject Type="Embed" ProgID="Equation.DSMT4" ShapeID="_x0000_i1499" DrawAspect="Content" ObjectID="_1611677924" r:id="rId887"/>
         </w:object>
       </w:r>
       <w:r>
@@ -47988,7 +48094,7 @@
           <v:shape id="_x0000_i1500" type="#_x0000_t75" style="width:1in;height:19.5pt" o:ole="">
             <v:imagedata r:id="rId888" o:title=""/>
           </v:shape>
-          <o:OLEObject Type="Embed" ProgID="Equation.DSMT4" ShapeID="_x0000_i1500" DrawAspect="Content" ObjectID="_1611677034" r:id="rId889"/>
+          <o:OLEObject Type="Embed" ProgID="Equation.DSMT4" ShapeID="_x0000_i1500" DrawAspect="Content" ObjectID="_1611677925" r:id="rId889"/>
         </w:object>
       </w:r>
       <w:r>
@@ -48065,7 +48171,7 @@
           <v:shape id="_x0000_i1501" type="#_x0000_t75" style="width:43.5pt;height:19.5pt" o:ole="">
             <v:imagedata r:id="rId890" o:title=""/>
           </v:shape>
-          <o:OLEObject Type="Embed" ProgID="Equation.DSMT4" ShapeID="_x0000_i1501" DrawAspect="Content" ObjectID="_1611677035" r:id="rId891"/>
+          <o:OLEObject Type="Embed" ProgID="Equation.DSMT4" ShapeID="_x0000_i1501" DrawAspect="Content" ObjectID="_1611677926" r:id="rId891"/>
         </w:object>
       </w:r>
       <w:r>
@@ -48214,7 +48320,7 @@
           <v:shape id="_x0000_i1502" type="#_x0000_t75" style="width:25.5pt;height:13.5pt" o:ole="">
             <v:imagedata r:id="rId892" o:title=""/>
           </v:shape>
-          <o:OLEObject Type="Embed" ProgID="Equation.DSMT4" ShapeID="_x0000_i1502" DrawAspect="Content" ObjectID="_1611677036" r:id="rId893"/>
+          <o:OLEObject Type="Embed" ProgID="Equation.DSMT4" ShapeID="_x0000_i1502" DrawAspect="Content" ObjectID="_1611677927" r:id="rId893"/>
         </w:object>
       </w:r>
       <w:r>
@@ -48255,7 +48361,7 @@
           <v:shape id="_x0000_i1503" type="#_x0000_t75" style="width:19.5pt;height:19.5pt" o:ole="">
             <v:imagedata r:id="rId894" o:title=""/>
           </v:shape>
-          <o:OLEObject Type="Embed" ProgID="Equation.DSMT4" ShapeID="_x0000_i1503" DrawAspect="Content" ObjectID="_1611677037" r:id="rId895"/>
+          <o:OLEObject Type="Embed" ProgID="Equation.DSMT4" ShapeID="_x0000_i1503" DrawAspect="Content" ObjectID="_1611677928" r:id="rId895"/>
         </w:object>
       </w:r>
       <w:r>
@@ -48534,7 +48640,7 @@
           <v:shape id="_x0000_i1504" type="#_x0000_t75" style="width:211.5pt;height:18pt" o:ole="">
             <v:imagedata r:id="rId896" o:title=""/>
           </v:shape>
-          <o:OLEObject Type="Embed" ProgID="Equation.DSMT4" ShapeID="_x0000_i1504" DrawAspect="Content" ObjectID="_1611677038" r:id="rId897"/>
+          <o:OLEObject Type="Embed" ProgID="Equation.DSMT4" ShapeID="_x0000_i1504" DrawAspect="Content" ObjectID="_1611677929" r:id="rId897"/>
         </w:object>
       </w:r>
       <w:r>
@@ -48611,7 +48717,7 @@
           <v:shape id="_x0000_i1505" type="#_x0000_t75" style="width:27pt;height:18pt" o:ole="">
             <v:imagedata r:id="rId898" o:title=""/>
           </v:shape>
-          <o:OLEObject Type="Embed" ProgID="Equation.DSMT4" ShapeID="_x0000_i1505" DrawAspect="Content" ObjectID="_1611677039" r:id="rId899"/>
+          <o:OLEObject Type="Embed" ProgID="Equation.DSMT4" ShapeID="_x0000_i1505" DrawAspect="Content" ObjectID="_1611677930" r:id="rId899"/>
         </w:object>
       </w:r>
       <w:r>
@@ -48643,7 +48749,7 @@
           <v:shape id="_x0000_i1506" type="#_x0000_t75" style="width:19.5pt;height:18pt" o:ole="">
             <v:imagedata r:id="rId900" o:title=""/>
           </v:shape>
-          <o:OLEObject Type="Embed" ProgID="Equation.DSMT4" ShapeID="_x0000_i1506" DrawAspect="Content" ObjectID="_1611677040" r:id="rId901"/>
+          <o:OLEObject Type="Embed" ProgID="Equation.DSMT4" ShapeID="_x0000_i1506" DrawAspect="Content" ObjectID="_1611677931" r:id="rId901"/>
         </w:object>
       </w:r>
       <w:r>
@@ -48675,7 +48781,7 @@
           <v:shape id="_x0000_i1507" type="#_x0000_t75" style="width:138pt;height:19.5pt" o:ole="">
             <v:imagedata r:id="rId902" o:title=""/>
           </v:shape>
-          <o:OLEObject Type="Embed" ProgID="Equation.DSMT4" ShapeID="_x0000_i1507" DrawAspect="Content" ObjectID="_1611677041" r:id="rId903"/>
+          <o:OLEObject Type="Embed" ProgID="Equation.DSMT4" ShapeID="_x0000_i1507" DrawAspect="Content" ObjectID="_1611677932" r:id="rId903"/>
         </w:object>
       </w:r>
       <w:r>
@@ -48698,7 +48804,7 @@
           <v:shape id="_x0000_i1508" type="#_x0000_t75" style="width:45pt;height:18pt" o:ole="">
             <v:imagedata r:id="rId904" o:title=""/>
           </v:shape>
-          <o:OLEObject Type="Embed" ProgID="Equation.DSMT4" ShapeID="_x0000_i1508" DrawAspect="Content" ObjectID="_1611677042" r:id="rId905"/>
+          <o:OLEObject Type="Embed" ProgID="Equation.DSMT4" ShapeID="_x0000_i1508" DrawAspect="Content" ObjectID="_1611677933" r:id="rId905"/>
         </w:object>
       </w:r>
       <w:r>
@@ -48821,7 +48927,7 @@
           <v:shape id="_x0000_i1509" type="#_x0000_t75" style="width:19.5pt;height:18pt" o:ole="">
             <v:imagedata r:id="rId907" o:title=""/>
           </v:shape>
-          <o:OLEObject Type="Embed" ProgID="Equation.DSMT4" ShapeID="_x0000_i1509" DrawAspect="Content" ObjectID="_1611677043" r:id="rId908"/>
+          <o:OLEObject Type="Embed" ProgID="Equation.DSMT4" ShapeID="_x0000_i1509" DrawAspect="Content" ObjectID="_1611677934" r:id="rId908"/>
         </w:object>
       </w:r>
       <w:r>
@@ -48898,7 +49004,7 @@
           <v:shape id="_x0000_i1510" type="#_x0000_t75" style="width:31.5pt;height:18pt" o:ole="">
             <v:imagedata r:id="rId909" o:title=""/>
           </v:shape>
-          <o:OLEObject Type="Embed" ProgID="Equation.DSMT4" ShapeID="_x0000_i1510" DrawAspect="Content" ObjectID="_1611677044" r:id="rId910"/>
+          <o:OLEObject Type="Embed" ProgID="Equation.DSMT4" ShapeID="_x0000_i1510" DrawAspect="Content" ObjectID="_1611677935" r:id="rId910"/>
         </w:object>
       </w:r>
     </w:p>
@@ -49144,7 +49250,7 @@
           <v:shape id="_x0000_i1511" type="#_x0000_t75" style="width:31.5pt;height:18pt" o:ole="">
             <v:imagedata r:id="rId909" o:title=""/>
           </v:shape>
-          <o:OLEObject Type="Embed" ProgID="Equation.DSMT4" ShapeID="_x0000_i1511" DrawAspect="Content" ObjectID="_1611677045" r:id="rId911"/>
+          <o:OLEObject Type="Embed" ProgID="Equation.DSMT4" ShapeID="_x0000_i1511" DrawAspect="Content" ObjectID="_1611677936" r:id="rId911"/>
         </w:object>
       </w:r>
       <w:r>
@@ -49185,7 +49291,7 @@
           <v:shape id="_x0000_i1512" type="#_x0000_t75" style="width:34.5pt;height:18pt" o:ole="">
             <v:imagedata r:id="rId665" o:title=""/>
           </v:shape>
-          <o:OLEObject Type="Embed" ProgID="Equation.DSMT4" ShapeID="_x0000_i1512" DrawAspect="Content" ObjectID="_1611677046" r:id="rId912"/>
+          <o:OLEObject Type="Embed" ProgID="Equation.DSMT4" ShapeID="_x0000_i1512" DrawAspect="Content" ObjectID="_1611677937" r:id="rId912"/>
         </w:object>
       </w:r>
       <w:r>
@@ -49406,7 +49512,7 @@
           <v:shape id="_x0000_i1513" type="#_x0000_t75" style="width:34.5pt;height:18pt" o:ole="">
             <v:imagedata r:id="rId665" o:title=""/>
           </v:shape>
-          <o:OLEObject Type="Embed" ProgID="Equation.DSMT4" ShapeID="_x0000_i1513" DrawAspect="Content" ObjectID="_1611677047" r:id="rId913"/>
+          <o:OLEObject Type="Embed" ProgID="Equation.DSMT4" ShapeID="_x0000_i1513" DrawAspect="Content" ObjectID="_1611677938" r:id="rId913"/>
         </w:object>
       </w:r>
       <w:r>
@@ -49447,7 +49553,7 @@
           <v:shape id="_x0000_i1514" type="#_x0000_t75" style="width:48pt;height:18pt" o:ole="">
             <v:imagedata r:id="rId914" o:title=""/>
           </v:shape>
-          <o:OLEObject Type="Embed" ProgID="Equation.DSMT4" ShapeID="_x0000_i1514" DrawAspect="Content" ObjectID="_1611677048" r:id="rId915"/>
+          <o:OLEObject Type="Embed" ProgID="Equation.DSMT4" ShapeID="_x0000_i1514" DrawAspect="Content" ObjectID="_1611677939" r:id="rId915"/>
         </w:object>
       </w:r>
       <w:r>
@@ -49708,7 +49814,7 @@
           <v:shape id="_x0000_i1515" type="#_x0000_t75" style="width:31.5pt;height:18pt" o:ole="">
             <v:imagedata r:id="rId909" o:title=""/>
           </v:shape>
-          <o:OLEObject Type="Embed" ProgID="Equation.DSMT4" ShapeID="_x0000_i1515" DrawAspect="Content" ObjectID="_1611677049" r:id="rId916"/>
+          <o:OLEObject Type="Embed" ProgID="Equation.DSMT4" ShapeID="_x0000_i1515" DrawAspect="Content" ObjectID="_1611677940" r:id="rId916"/>
         </w:object>
       </w:r>
       <w:r>
@@ -49749,7 +49855,7 @@
           <v:shape id="_x0000_i1516" type="#_x0000_t75" style="width:22.5pt;height:18pt" o:ole="">
             <v:imagedata r:id="rId917" o:title=""/>
           </v:shape>
-          <o:OLEObject Type="Embed" ProgID="Equation.DSMT4" ShapeID="_x0000_i1516" DrawAspect="Content" ObjectID="_1611677050" r:id="rId918"/>
+          <o:OLEObject Type="Embed" ProgID="Equation.DSMT4" ShapeID="_x0000_i1516" DrawAspect="Content" ObjectID="_1611677941" r:id="rId918"/>
         </w:object>
       </w:r>
       <w:r>
@@ -49790,7 +49896,7 @@
           <v:shape id="_x0000_i1517" type="#_x0000_t75" style="width:13.5pt;height:18pt" o:ole="">
             <v:imagedata r:id="rId919" o:title=""/>
           </v:shape>
-          <o:OLEObject Type="Embed" ProgID="Equation.DSMT4" ShapeID="_x0000_i1517" DrawAspect="Content" ObjectID="_1611677051" r:id="rId920"/>
+          <o:OLEObject Type="Embed" ProgID="Equation.DSMT4" ShapeID="_x0000_i1517" DrawAspect="Content" ObjectID="_1611677942" r:id="rId920"/>
         </w:object>
       </w:r>
       <w:r>
@@ -49849,7 +49955,7 @@
           <v:shape id="_x0000_i1518" type="#_x0000_t75" style="width:12pt;height:18pt" o:ole="">
             <v:imagedata r:id="rId921" o:title=""/>
           </v:shape>
-          <o:OLEObject Type="Embed" ProgID="Equation.DSMT4" ShapeID="_x0000_i1518" DrawAspect="Content" ObjectID="_1611677052" r:id="rId922"/>
+          <o:OLEObject Type="Embed" ProgID="Equation.DSMT4" ShapeID="_x0000_i1518" DrawAspect="Content" ObjectID="_1611677943" r:id="rId922"/>
         </w:object>
       </w:r>
       <w:r>
@@ -49872,7 +49978,7 @@
           <v:shape id="_x0000_i1519" type="#_x0000_t75" style="width:13.5pt;height:18pt" o:ole="">
             <v:imagedata r:id="rId923" o:title=""/>
           </v:shape>
-          <o:OLEObject Type="Embed" ProgID="Equation.DSMT4" ShapeID="_x0000_i1519" DrawAspect="Content" ObjectID="_1611677053" r:id="rId924"/>
+          <o:OLEObject Type="Embed" ProgID="Equation.DSMT4" ShapeID="_x0000_i1519" DrawAspect="Content" ObjectID="_1611677944" r:id="rId924"/>
         </w:object>
       </w:r>
       <w:r>
@@ -49913,7 +50019,7 @@
           <v:shape id="_x0000_i1520" type="#_x0000_t75" style="width:34.5pt;height:19.5pt" o:ole="">
             <v:imagedata r:id="rId925" o:title=""/>
           </v:shape>
-          <o:OLEObject Type="Embed" ProgID="Equation.DSMT4" ShapeID="_x0000_i1520" DrawAspect="Content" ObjectID="_1611677054" r:id="rId926"/>
+          <o:OLEObject Type="Embed" ProgID="Equation.DSMT4" ShapeID="_x0000_i1520" DrawAspect="Content" ObjectID="_1611677945" r:id="rId926"/>
         </w:object>
       </w:r>
       <w:r>
@@ -50044,7 +50150,7 @@
           <v:shape id="_x0000_i1521" type="#_x0000_t75" style="width:52.5pt;height:19.5pt" o:ole="">
             <v:imagedata r:id="rId927" o:title=""/>
           </v:shape>
-          <o:OLEObject Type="Embed" ProgID="Equation.DSMT4" ShapeID="_x0000_i1521" DrawAspect="Content" ObjectID="_1611677055" r:id="rId928"/>
+          <o:OLEObject Type="Embed" ProgID="Equation.DSMT4" ShapeID="_x0000_i1521" DrawAspect="Content" ObjectID="_1611677946" r:id="rId928"/>
         </w:object>
       </w:r>
       <w:r>
@@ -50736,7 +50842,7 @@
           <v:shape id="_x0000_i1522" type="#_x0000_t75" style="width:31.5pt;height:18pt" o:ole="">
             <v:imagedata r:id="rId929" o:title=""/>
           </v:shape>
-          <o:OLEObject Type="Embed" ProgID="Equation.DSMT4" ShapeID="_x0000_i1522" DrawAspect="Content" ObjectID="_1611677056" r:id="rId930"/>
+          <o:OLEObject Type="Embed" ProgID="Equation.DSMT4" ShapeID="_x0000_i1522" DrawAspect="Content" ObjectID="_1611677947" r:id="rId930"/>
         </w:object>
       </w:r>
       <w:r>
@@ -50777,7 +50883,7 @@
           <v:shape id="_x0000_i1523" type="#_x0000_t75" style="width:40.5pt;height:18pt" o:ole="">
             <v:imagedata r:id="rId931" o:title=""/>
           </v:shape>
-          <o:OLEObject Type="Embed" ProgID="Equation.DSMT4" ShapeID="_x0000_i1523" DrawAspect="Content" ObjectID="_1611677057" r:id="rId932"/>
+          <o:OLEObject Type="Embed" ProgID="Equation.DSMT4" ShapeID="_x0000_i1523" DrawAspect="Content" ObjectID="_1611677948" r:id="rId932"/>
         </w:object>
       </w:r>
       <w:r>
@@ -50845,7 +50951,7 @@
           <v:shape id="_x0000_i1524" type="#_x0000_t75" style="width:31.5pt;height:18pt" o:ole="">
             <v:imagedata r:id="rId933" o:title=""/>
           </v:shape>
-          <o:OLEObject Type="Embed" ProgID="Equation.DSMT4" ShapeID="_x0000_i1524" DrawAspect="Content" ObjectID="_1611677058" r:id="rId934"/>
+          <o:OLEObject Type="Embed" ProgID="Equation.DSMT4" ShapeID="_x0000_i1524" DrawAspect="Content" ObjectID="_1611677949" r:id="rId934"/>
         </w:object>
       </w:r>
       <w:r>
@@ -51008,7 +51114,7 @@
           <v:shape id="_x0000_i1525" type="#_x0000_t75" style="width:21pt;height:18pt" o:ole="">
             <v:imagedata r:id="rId936" o:title=""/>
           </v:shape>
-          <o:OLEObject Type="Embed" ProgID="Equation.DSMT4" ShapeID="_x0000_i1525" DrawAspect="Content" ObjectID="_1611677059" r:id="rId937"/>
+          <o:OLEObject Type="Embed" ProgID="Equation.DSMT4" ShapeID="_x0000_i1525" DrawAspect="Content" ObjectID="_1611677950" r:id="rId937"/>
         </w:object>
       </w:r>
       <w:r>
@@ -54826,7 +54932,7 @@
           <v:shape id="_x0000_i1526" type="#_x0000_t75" style="width:19.5pt;height:18pt" o:ole="">
             <v:imagedata r:id="rId907" o:title=""/>
           </v:shape>
-          <o:OLEObject Type="Embed" ProgID="Equation.DSMT4" ShapeID="_x0000_i1526" DrawAspect="Content" ObjectID="_1611677060" r:id="rId938"/>
+          <o:OLEObject Type="Embed" ProgID="Equation.DSMT4" ShapeID="_x0000_i1526" DrawAspect="Content" ObjectID="_1611677951" r:id="rId938"/>
         </w:object>
       </w:r>
       <w:r>
@@ -58773,7 +58879,7 @@
       </w:r>
     </w:p>
   </w:comment>
-  <w:comment w:id="27" w:author="Thibault Derrien" w:date="2019-02-14T18:50:00Z" w:initials="TD">
+  <w:comment w:id="26" w:author="Thibault Derrien" w:date="2019-02-14T18:50:00Z" w:initials="TD">
     <w:p>
       <w:pPr>
         <w:pStyle w:val="CommentText"/>
@@ -58789,7 +58895,7 @@
       </w:r>
     </w:p>
   </w:comment>
-  <w:comment w:id="26" w:author="Thibault Derrien" w:date="2019-02-14T18:49:00Z" w:initials="TD">
+  <w:comment w:id="27" w:author="Thibault Derrien" w:date="2019-02-14T18:49:00Z" w:initials="TD">
     <w:p>
       <w:pPr>
         <w:pStyle w:val="CommentText"/>
@@ -58822,8 +58928,70 @@
       <w:r>
         <w:t>cm^-3, maybe</w:t>
       </w:r>
-      <w:bookmarkStart w:id="29" w:name="_GoBack"/>
-      <w:bookmarkEnd w:id="29"/>
+    </w:p>
+  </w:comment>
+  <w:comment w:id="29" w:author="Thibault Derrien" w:date="2019-02-14T19:12:00Z" w:initials="TD">
+    <w:p>
+      <w:pPr>
+        <w:pStyle w:val="CommentText"/>
+      </w:pPr>
+      <w:r>
+        <w:rPr>
+          <w:rStyle w:val="CommentReference"/>
+        </w:rPr>
+        <w:annotationRef/>
+      </w:r>
+      <w:r>
+        <w:t xml:space="preserve">Is it related to a parabolic band structure? </w:t>
+      </w:r>
+    </w:p>
+  </w:comment>
+  <w:comment w:id="30" w:author="Thibault Derrien" w:date="2019-02-14T19:12:00Z" w:initials="TD">
+    <w:p>
+      <w:pPr>
+        <w:pStyle w:val="CommentText"/>
+      </w:pPr>
+      <w:r>
+        <w:rPr>
+          <w:rStyle w:val="CommentReference"/>
+        </w:rPr>
+        <w:annotationRef/>
+      </w:r>
+      <w:r>
+        <w:t>Same comment as before: E(t) = E1 e1 cos( ... ) + E2 e2 cos ( ... )</w:t>
+      </w:r>
+    </w:p>
+  </w:comment>
+  <w:comment w:id="35" w:author="Thibault Derrien" w:date="2019-02-14T19:14:00Z" w:initials="TD">
+    <w:p>
+      <w:pPr>
+        <w:pStyle w:val="CommentText"/>
+      </w:pPr>
+      <w:r>
+        <w:rPr>
+          <w:rStyle w:val="CommentReference"/>
+        </w:rPr>
+        <w:annotationRef/>
+      </w:r>
+      <w:r>
+        <w:t xml:space="preserve">Same question: what is alpha? Which unit does it has? Maybe this text is repeated? </w:t>
+      </w:r>
+    </w:p>
+  </w:comment>
+  <w:comment w:id="36" w:author="Thibault Derrien" w:date="2019-02-14T19:15:00Z" w:initials="TD">
+    <w:p>
+      <w:pPr>
+        <w:pStyle w:val="CommentText"/>
+      </w:pPr>
+      <w:r>
+        <w:rPr>
+          <w:rStyle w:val="CommentReference"/>
+        </w:rPr>
+        <w:annotationRef/>
+      </w:r>
+      <w:r>
+        <w:t xml:space="preserve">Okay, we can find this coefficient using my TDDFT simulations. </w:t>
+      </w:r>
     </w:p>
   </w:comment>
 </w:comments>
@@ -58854,6 +59022,10 @@
   <w15:commentEx w15:paraId="666CE0CB" w15:done="0"/>
   <w15:commentEx w15:paraId="79F8C307" w15:done="0"/>
   <w15:commentEx w15:paraId="575EEA56" w15:done="0"/>
+  <w15:commentEx w15:paraId="46231CA7" w15:done="0"/>
+  <w15:commentEx w15:paraId="264F325D" w15:done="0"/>
+  <w15:commentEx w15:paraId="3E043971" w15:done="0"/>
+  <w15:commentEx w15:paraId="53F7D5B8" w15:done="0"/>
 </w15:commentsEx>
 </file>
 

</xml_diff>

<commit_message>
Updated comments for VP Zhukov.
</commit_message>
<xml_diff>
--- a/Keldysh/Zhukov/mart-2018-Translation for Thibault.docx
+++ b/Keldysh/Zhukov/mart-2018-Translation for Thibault.docx
@@ -446,7 +446,7 @@
           <v:shape id="_x0000_i1025" type="#_x0000_t75" style="width:31.5pt;height:19.5pt" o:ole="">
             <v:imagedata r:id="rId8" o:title=""/>
           </v:shape>
-          <o:OLEObject Type="Embed" ProgID="Equation.DSMT4" ShapeID="_x0000_i1025" DrawAspect="Content" ObjectID="_1611677450" r:id="rId9"/>
+          <o:OLEObject Type="Embed" ProgID="Equation.DSMT4" ShapeID="_x0000_i1025" DrawAspect="Content" ObjectID="_1611678551" r:id="rId9"/>
         </w:object>
       </w:r>
       <w:r>
@@ -511,7 +511,7 @@
           <v:shape id="_x0000_i1026" type="#_x0000_t75" style="width:88.5pt;height:19.5pt" o:ole="">
             <v:imagedata r:id="rId10" o:title=""/>
           </v:shape>
-          <o:OLEObject Type="Embed" ProgID="Equation.DSMT4" ShapeID="_x0000_i1026" DrawAspect="Content" ObjectID="_1611677451" r:id="rId11"/>
+          <o:OLEObject Type="Embed" ProgID="Equation.DSMT4" ShapeID="_x0000_i1026" DrawAspect="Content" ObjectID="_1611678552" r:id="rId11"/>
         </w:object>
       </w:r>
       <w:r>
@@ -534,7 +534,7 @@
           <v:shape id="_x0000_i1027" type="#_x0000_t75" style="width:40.5pt;height:16.5pt" o:ole="">
             <v:imagedata r:id="rId12" o:title=""/>
           </v:shape>
-          <o:OLEObject Type="Embed" ProgID="Equation.DSMT4" ShapeID="_x0000_i1027" DrawAspect="Content" ObjectID="_1611677452" r:id="rId13"/>
+          <o:OLEObject Type="Embed" ProgID="Equation.DSMT4" ShapeID="_x0000_i1027" DrawAspect="Content" ObjectID="_1611678553" r:id="rId13"/>
         </w:object>
       </w:r>
       <w:r>
@@ -646,7 +646,7 @@
           <v:shape id="_x0000_i1028" type="#_x0000_t75" style="width:109.5pt;height:19.5pt" o:ole="">
             <v:imagedata r:id="rId14" o:title=""/>
           </v:shape>
-          <o:OLEObject Type="Embed" ProgID="Equation.DSMT4" ShapeID="_x0000_i1028" DrawAspect="Content" ObjectID="_1611677453" r:id="rId15"/>
+          <o:OLEObject Type="Embed" ProgID="Equation.DSMT4" ShapeID="_x0000_i1028" DrawAspect="Content" ObjectID="_1611678554" r:id="rId15"/>
         </w:object>
       </w:r>
       <w:r>
@@ -669,7 +669,7 @@
           <v:shape id="_x0000_i1029" type="#_x0000_t75" style="width:1in;height:19.5pt" o:ole="">
             <v:imagedata r:id="rId16" o:title=""/>
           </v:shape>
-          <o:OLEObject Type="Embed" ProgID="Equation.DSMT4" ShapeID="_x0000_i1029" DrawAspect="Content" ObjectID="_1611677454" r:id="rId17"/>
+          <o:OLEObject Type="Embed" ProgID="Equation.DSMT4" ShapeID="_x0000_i1029" DrawAspect="Content" ObjectID="_1611678555" r:id="rId17"/>
         </w:object>
       </w:r>
       <w:r>
@@ -692,7 +692,7 @@
           <v:shape id="_x0000_i1030" type="#_x0000_t75" style="width:87pt;height:19.5pt" o:ole="">
             <v:imagedata r:id="rId18" o:title=""/>
           </v:shape>
-          <o:OLEObject Type="Embed" ProgID="Equation.DSMT4" ShapeID="_x0000_i1030" DrawAspect="Content" ObjectID="_1611677455" r:id="rId19"/>
+          <o:OLEObject Type="Embed" ProgID="Equation.DSMT4" ShapeID="_x0000_i1030" DrawAspect="Content" ObjectID="_1611678556" r:id="rId19"/>
         </w:object>
       </w:r>
       <w:r>
@@ -876,7 +876,7 @@
           <v:shape id="_x0000_i1031" type="#_x0000_t75" style="width:39pt;height:16.5pt" o:ole="">
             <v:imagedata r:id="rId20" o:title=""/>
           </v:shape>
-          <o:OLEObject Type="Embed" ProgID="Equation.DSMT4" ShapeID="_x0000_i1031" DrawAspect="Content" ObjectID="_1611677456" r:id="rId21"/>
+          <o:OLEObject Type="Embed" ProgID="Equation.DSMT4" ShapeID="_x0000_i1031" DrawAspect="Content" ObjectID="_1611678557" r:id="rId21"/>
         </w:object>
       </w:r>
       <w:r>
@@ -1112,7 +1112,7 @@
           <v:shape id="_x0000_i1032" type="#_x0000_t75" style="width:15pt;height:18pt" o:ole="">
             <v:imagedata r:id="rId22" o:title=""/>
           </v:shape>
-          <o:OLEObject Type="Embed" ProgID="Equation.DSMT4" ShapeID="_x0000_i1032" DrawAspect="Content" ObjectID="_1611677457" r:id="rId23"/>
+          <o:OLEObject Type="Embed" ProgID="Equation.DSMT4" ShapeID="_x0000_i1032" DrawAspect="Content" ObjectID="_1611678558" r:id="rId23"/>
         </w:object>
       </w:r>
       <w:r>
@@ -1192,7 +1192,7 @@
           <v:shape id="_x0000_i1033" type="#_x0000_t75" style="width:32.25pt;height:19.5pt" o:ole="">
             <v:imagedata r:id="rId24" o:title=""/>
           </v:shape>
-          <o:OLEObject Type="Embed" ProgID="Equation.DSMT4" ShapeID="_x0000_i1033" DrawAspect="Content" ObjectID="_1611677458" r:id="rId25"/>
+          <o:OLEObject Type="Embed" ProgID="Equation.DSMT4" ShapeID="_x0000_i1033" DrawAspect="Content" ObjectID="_1611678559" r:id="rId25"/>
         </w:object>
       </w:r>
       <w:r>
@@ -1242,7 +1242,7 @@
           <v:shape id="_x0000_i1034" type="#_x0000_t75" style="width:15pt;height:18pt" o:ole="">
             <v:imagedata r:id="rId26" o:title=""/>
           </v:shape>
-          <o:OLEObject Type="Embed" ProgID="Equation.DSMT4" ShapeID="_x0000_i1034" DrawAspect="Content" ObjectID="_1611677459" r:id="rId27"/>
+          <o:OLEObject Type="Embed" ProgID="Equation.DSMT4" ShapeID="_x0000_i1034" DrawAspect="Content" ObjectID="_1611678560" r:id="rId27"/>
         </w:object>
       </w:r>
       <w:r>
@@ -1372,7 +1372,7 @@
           <v:shape id="_x0000_i1035" type="#_x0000_t75" style="width:33.75pt;height:20.25pt" o:ole="">
             <v:imagedata r:id="rId28" o:title=""/>
           </v:shape>
-          <o:OLEObject Type="Embed" ProgID="Equation.DSMT4" ShapeID="_x0000_i1035" DrawAspect="Content" ObjectID="_1611677460" r:id="rId29"/>
+          <o:OLEObject Type="Embed" ProgID="Equation.DSMT4" ShapeID="_x0000_i1035" DrawAspect="Content" ObjectID="_1611678561" r:id="rId29"/>
         </w:object>
       </w:r>
       <w:r>
@@ -1404,7 +1404,7 @@
           <v:shape id="_x0000_i1036" type="#_x0000_t75" style="width:16.5pt;height:18pt" o:ole="">
             <v:imagedata r:id="rId30" o:title=""/>
           </v:shape>
-          <o:OLEObject Type="Embed" ProgID="Equation.DSMT4" ShapeID="_x0000_i1036" DrawAspect="Content" ObjectID="_1611677461" r:id="rId31"/>
+          <o:OLEObject Type="Embed" ProgID="Equation.DSMT4" ShapeID="_x0000_i1036" DrawAspect="Content" ObjectID="_1611678562" r:id="rId31"/>
         </w:object>
       </w:r>
       <w:r>
@@ -1560,7 +1560,7 @@
           <v:shape id="_x0000_i1037" type="#_x0000_t75" style="width:55.5pt;height:19.5pt" o:ole="">
             <v:imagedata r:id="rId32" o:title=""/>
           </v:shape>
-          <o:OLEObject Type="Embed" ProgID="Equation.DSMT4" ShapeID="_x0000_i1037" DrawAspect="Content" ObjectID="_1611677462" r:id="rId33"/>
+          <o:OLEObject Type="Embed" ProgID="Equation.DSMT4" ShapeID="_x0000_i1037" DrawAspect="Content" ObjectID="_1611678563" r:id="rId33"/>
         </w:object>
       </w:r>
       <w:r>
@@ -1709,7 +1709,7 @@
           <v:shape id="_x0000_i1038" type="#_x0000_t75" style="width:17.25pt;height:18pt" o:ole="">
             <v:imagedata r:id="rId34" o:title=""/>
           </v:shape>
-          <o:OLEObject Type="Embed" ProgID="Equation.DSMT4" ShapeID="_x0000_i1038" DrawAspect="Content" ObjectID="_1611677463" r:id="rId35"/>
+          <o:OLEObject Type="Embed" ProgID="Equation.DSMT4" ShapeID="_x0000_i1038" DrawAspect="Content" ObjectID="_1611678564" r:id="rId35"/>
         </w:object>
       </w:r>
       <w:r>
@@ -1867,7 +1867,7 @@
           <v:shape id="_x0000_i1039" type="#_x0000_t75" style="width:15pt;height:16.5pt" o:ole="">
             <v:imagedata r:id="rId36" o:title=""/>
           </v:shape>
-          <o:OLEObject Type="Embed" ProgID="Equation.DSMT4" ShapeID="_x0000_i1039" DrawAspect="Content" ObjectID="_1611677464" r:id="rId37"/>
+          <o:OLEObject Type="Embed" ProgID="Equation.DSMT4" ShapeID="_x0000_i1039" DrawAspect="Content" ObjectID="_1611678565" r:id="rId37"/>
         </w:object>
       </w:r>
       <w:r>
@@ -1940,7 +1940,7 @@
           <v:shape id="_x0000_i1040" type="#_x0000_t75" style="width:15pt;height:18pt" o:ole="">
             <v:imagedata r:id="rId38" o:title=""/>
           </v:shape>
-          <o:OLEObject Type="Embed" ProgID="Equation.DSMT4" ShapeID="_x0000_i1040" DrawAspect="Content" ObjectID="_1611677465" r:id="rId39"/>
+          <o:OLEObject Type="Embed" ProgID="Equation.DSMT4" ShapeID="_x0000_i1040" DrawAspect="Content" ObjectID="_1611678566" r:id="rId39"/>
         </w:object>
       </w:r>
       <w:r>
@@ -1966,7 +1966,7 @@
           <v:shape id="_x0000_i1041" type="#_x0000_t75" style="width:16.5pt;height:18pt" o:ole="">
             <v:imagedata r:id="rId40" o:title=""/>
           </v:shape>
-          <o:OLEObject Type="Embed" ProgID="Equation.DSMT4" ShapeID="_x0000_i1041" DrawAspect="Content" ObjectID="_1611677466" r:id="rId41"/>
+          <o:OLEObject Type="Embed" ProgID="Equation.DSMT4" ShapeID="_x0000_i1041" DrawAspect="Content" ObjectID="_1611678567" r:id="rId41"/>
         </w:object>
       </w:r>
       <w:r>
@@ -2188,7 +2188,7 @@
           <v:shape id="_x0000_i1042" type="#_x0000_t75" style="width:57pt;height:21pt" o:ole="">
             <v:imagedata r:id="rId42" o:title=""/>
           </v:shape>
-          <o:OLEObject Type="Embed" ProgID="Equation.DSMT4" ShapeID="_x0000_i1042" DrawAspect="Content" ObjectID="_1611677467" r:id="rId43"/>
+          <o:OLEObject Type="Embed" ProgID="Equation.DSMT4" ShapeID="_x0000_i1042" DrawAspect="Content" ObjectID="_1611678568" r:id="rId43"/>
         </w:object>
       </w:r>
       <w:r>
@@ -2231,7 +2231,7 @@
           <v:shape id="_x0000_i1043" type="#_x0000_t75" style="width:42pt;height:21pt" o:ole="">
             <v:imagedata r:id="rId44" o:title=""/>
           </v:shape>
-          <o:OLEObject Type="Embed" ProgID="Equation.DSMT4" ShapeID="_x0000_i1043" DrawAspect="Content" ObjectID="_1611677468" r:id="rId45"/>
+          <o:OLEObject Type="Embed" ProgID="Equation.DSMT4" ShapeID="_x0000_i1043" DrawAspect="Content" ObjectID="_1611678569" r:id="rId45"/>
         </w:object>
       </w:r>
       <w:r>
@@ -2292,7 +2292,7 @@
           <v:shape id="_x0000_i1044" type="#_x0000_t75" style="width:16.5pt;height:18pt" o:ole="">
             <v:imagedata r:id="rId46" o:title=""/>
           </v:shape>
-          <o:OLEObject Type="Embed" ProgID="Equation.DSMT4" ShapeID="_x0000_i1044" DrawAspect="Content" ObjectID="_1611677469" r:id="rId47"/>
+          <o:OLEObject Type="Embed" ProgID="Equation.DSMT4" ShapeID="_x0000_i1044" DrawAspect="Content" ObjectID="_1611678570" r:id="rId47"/>
         </w:object>
       </w:r>
       <w:r>
@@ -2339,7 +2339,7 @@
           <v:shape id="_x0000_i1045" type="#_x0000_t75" style="width:327pt;height:46.5pt" o:ole="">
             <v:imagedata r:id="rId48" o:title=""/>
           </v:shape>
-          <o:OLEObject Type="Embed" ProgID="Equation.DSMT4" ShapeID="_x0000_i1045" DrawAspect="Content" ObjectID="_1611677470" r:id="rId49"/>
+          <o:OLEObject Type="Embed" ProgID="Equation.DSMT4" ShapeID="_x0000_i1045" DrawAspect="Content" ObjectID="_1611678571" r:id="rId49"/>
         </w:object>
       </w:r>
     </w:p>
@@ -2368,7 +2368,7 @@
           <v:shape id="_x0000_i1046" type="#_x0000_t75" style="width:244.5pt;height:46.5pt" o:ole="">
             <v:imagedata r:id="rId50" o:title=""/>
           </v:shape>
-          <o:OLEObject Type="Embed" ProgID="Equation.DSMT4" ShapeID="_x0000_i1046" DrawAspect="Content" ObjectID="_1611677471" r:id="rId51"/>
+          <o:OLEObject Type="Embed" ProgID="Equation.DSMT4" ShapeID="_x0000_i1046" DrawAspect="Content" ObjectID="_1611678572" r:id="rId51"/>
         </w:object>
       </w:r>
     </w:p>
@@ -2397,7 +2397,7 @@
           <v:shape id="_x0000_i1047" type="#_x0000_t75" style="width:232.5pt;height:46.5pt" o:ole="">
             <v:imagedata r:id="rId52" o:title=""/>
           </v:shape>
-          <o:OLEObject Type="Embed" ProgID="Equation.DSMT4" ShapeID="_x0000_i1047" DrawAspect="Content" ObjectID="_1611677472" r:id="rId53"/>
+          <o:OLEObject Type="Embed" ProgID="Equation.DSMT4" ShapeID="_x0000_i1047" DrawAspect="Content" ObjectID="_1611678573" r:id="rId53"/>
         </w:object>
       </w:r>
       <w:r>
@@ -2435,7 +2435,7 @@
           <v:shape id="_x0000_i1048" type="#_x0000_t75" style="width:43.5pt;height:31.5pt" o:ole="">
             <v:imagedata r:id="rId54" o:title=""/>
           </v:shape>
-          <o:OLEObject Type="Embed" ProgID="Equation.DSMT4" ShapeID="_x0000_i1048" DrawAspect="Content" ObjectID="_1611677473" r:id="rId55"/>
+          <o:OLEObject Type="Embed" ProgID="Equation.DSMT4" ShapeID="_x0000_i1048" DrawAspect="Content" ObjectID="_1611678574" r:id="rId55"/>
         </w:object>
       </w:r>
     </w:p>
@@ -2464,7 +2464,7 @@
           <v:shape id="_x0000_i1049" type="#_x0000_t75" style="width:48pt;height:18pt" o:ole="">
             <v:imagedata r:id="rId56" o:title=""/>
           </v:shape>
-          <o:OLEObject Type="Embed" ProgID="Equation.DSMT4" ShapeID="_x0000_i1049" DrawAspect="Content" ObjectID="_1611677474" r:id="rId57"/>
+          <o:OLEObject Type="Embed" ProgID="Equation.DSMT4" ShapeID="_x0000_i1049" DrawAspect="Content" ObjectID="_1611678575" r:id="rId57"/>
         </w:object>
       </w:r>
       <w:r>
@@ -2489,7 +2489,7 @@
           <v:shape id="_x0000_i1050" type="#_x0000_t75" style="width:97.5pt;height:19.5pt" o:ole="">
             <v:imagedata r:id="rId58" o:title=""/>
           </v:shape>
-          <o:OLEObject Type="Embed" ProgID="Equation.DSMT4" ShapeID="_x0000_i1050" DrawAspect="Content" ObjectID="_1611677475" r:id="rId59"/>
+          <o:OLEObject Type="Embed" ProgID="Equation.DSMT4" ShapeID="_x0000_i1050" DrawAspect="Content" ObjectID="_1611678576" r:id="rId59"/>
         </w:object>
       </w:r>
       <w:r>
@@ -2528,7 +2528,7 @@
           <v:shape id="_x0000_i1051" type="#_x0000_t75" style="width:79.5pt;height:19.5pt" o:ole="">
             <v:imagedata r:id="rId60" o:title=""/>
           </v:shape>
-          <o:OLEObject Type="Embed" ProgID="Equation.DSMT4" ShapeID="_x0000_i1051" DrawAspect="Content" ObjectID="_1611677476" r:id="rId61"/>
+          <o:OLEObject Type="Embed" ProgID="Equation.DSMT4" ShapeID="_x0000_i1051" DrawAspect="Content" ObjectID="_1611678577" r:id="rId61"/>
         </w:object>
       </w:r>
     </w:p>
@@ -2557,7 +2557,7 @@
           <v:shape id="_x0000_i1052" type="#_x0000_t75" style="width:157.5pt;height:46.5pt" o:ole="">
             <v:imagedata r:id="rId62" o:title=""/>
           </v:shape>
-          <o:OLEObject Type="Embed" ProgID="Equation.DSMT4" ShapeID="_x0000_i1052" DrawAspect="Content" ObjectID="_1611677477" r:id="rId63"/>
+          <o:OLEObject Type="Embed" ProgID="Equation.DSMT4" ShapeID="_x0000_i1052" DrawAspect="Content" ObjectID="_1611678578" r:id="rId63"/>
         </w:object>
       </w:r>
     </w:p>
@@ -2586,7 +2586,7 @@
           <v:shape id="_x0000_i1053" type="#_x0000_t75" style="width:36pt;height:18pt" o:ole="">
             <v:imagedata r:id="rId64" o:title=""/>
           </v:shape>
-          <o:OLEObject Type="Embed" ProgID="Equation.DSMT4" ShapeID="_x0000_i1053" DrawAspect="Content" ObjectID="_1611677478" r:id="rId65"/>
+          <o:OLEObject Type="Embed" ProgID="Equation.DSMT4" ShapeID="_x0000_i1053" DrawAspect="Content" ObjectID="_1611678579" r:id="rId65"/>
         </w:object>
       </w:r>
     </w:p>
@@ -2615,7 +2615,7 @@
           <v:shape id="_x0000_i1054" type="#_x0000_t75" style="width:82.5pt;height:37.5pt" o:ole="">
             <v:imagedata r:id="rId66" o:title=""/>
           </v:shape>
-          <o:OLEObject Type="Embed" ProgID="Equation.DSMT4" ShapeID="_x0000_i1054" DrawAspect="Content" ObjectID="_1611677479" r:id="rId67"/>
+          <o:OLEObject Type="Embed" ProgID="Equation.DSMT4" ShapeID="_x0000_i1054" DrawAspect="Content" ObjectID="_1611678580" r:id="rId67"/>
         </w:object>
       </w:r>
       <w:r>
@@ -2648,7 +2648,7 @@
           <v:shape id="_x0000_i1055" type="#_x0000_t75" style="width:34.5pt;height:10.5pt" o:ole="">
             <v:imagedata r:id="rId68" o:title=""/>
           </v:shape>
-          <o:OLEObject Type="Embed" ProgID="Equation.DSMT4" ShapeID="_x0000_i1055" DrawAspect="Content" ObjectID="_1611677480" r:id="rId69"/>
+          <o:OLEObject Type="Embed" ProgID="Equation.DSMT4" ShapeID="_x0000_i1055" DrawAspect="Content" ObjectID="_1611678581" r:id="rId69"/>
         </w:object>
       </w:r>
       <w:r>
@@ -2672,7 +2672,7 @@
           <v:shape id="_x0000_i1056" type="#_x0000_t75" style="width:52.5pt;height:18pt" o:ole="">
             <v:imagedata r:id="rId70" o:title=""/>
           </v:shape>
-          <o:OLEObject Type="Embed" ProgID="Equation.DSMT4" ShapeID="_x0000_i1056" DrawAspect="Content" ObjectID="_1611677481" r:id="rId71"/>
+          <o:OLEObject Type="Embed" ProgID="Equation.DSMT4" ShapeID="_x0000_i1056" DrawAspect="Content" ObjectID="_1611678582" r:id="rId71"/>
         </w:object>
       </w:r>
       <w:r>
@@ -2733,7 +2733,7 @@
           <v:shape id="_x0000_i1057" type="#_x0000_t75" style="width:472.5pt;height:46.5pt" o:ole="">
             <v:imagedata r:id="rId72" o:title=""/>
           </v:shape>
-          <o:OLEObject Type="Embed" ProgID="Equation.DSMT4" ShapeID="_x0000_i1057" DrawAspect="Content" ObjectID="_1611677482" r:id="rId73"/>
+          <o:OLEObject Type="Embed" ProgID="Equation.DSMT4" ShapeID="_x0000_i1057" DrawAspect="Content" ObjectID="_1611678583" r:id="rId73"/>
         </w:object>
       </w:r>
     </w:p>
@@ -2762,7 +2762,7 @@
           <v:shape id="_x0000_i1058" type="#_x0000_t75" style="width:267pt;height:46.5pt" o:ole="">
             <v:imagedata r:id="rId74" o:title=""/>
           </v:shape>
-          <o:OLEObject Type="Embed" ProgID="Equation.DSMT4" ShapeID="_x0000_i1058" DrawAspect="Content" ObjectID="_1611677483" r:id="rId75"/>
+          <o:OLEObject Type="Embed" ProgID="Equation.DSMT4" ShapeID="_x0000_i1058" DrawAspect="Content" ObjectID="_1611678584" r:id="rId75"/>
         </w:object>
       </w:r>
       <w:r>
@@ -2964,7 +2964,7 @@
           <v:shape id="_x0000_i1059" type="#_x0000_t75" style="width:15pt;height:18pt" o:ole="">
             <v:imagedata r:id="rId76" o:title=""/>
           </v:shape>
-          <o:OLEObject Type="Embed" ProgID="Equation.DSMT4" ShapeID="_x0000_i1059" DrawAspect="Content" ObjectID="_1611677484" r:id="rId77"/>
+          <o:OLEObject Type="Embed" ProgID="Equation.DSMT4" ShapeID="_x0000_i1059" DrawAspect="Content" ObjectID="_1611678585" r:id="rId77"/>
         </w:object>
       </w:r>
       <w:r>
@@ -3079,7 +3079,7 @@
           <v:shape id="_x0000_i1060" type="#_x0000_t75" style="width:15pt;height:18pt" o:ole="">
             <v:imagedata r:id="rId78" o:title=""/>
           </v:shape>
-          <o:OLEObject Type="Embed" ProgID="Equation.DSMT4" ShapeID="_x0000_i1060" DrawAspect="Content" ObjectID="_1611677485" r:id="rId79"/>
+          <o:OLEObject Type="Embed" ProgID="Equation.DSMT4" ShapeID="_x0000_i1060" DrawAspect="Content" ObjectID="_1611678586" r:id="rId79"/>
         </w:object>
       </w:r>
       <w:r>
@@ -3123,7 +3123,7 @@
           <v:shape id="_x0000_i1061" type="#_x0000_t75" style="width:169.5pt;height:31.5pt" o:ole="">
             <v:imagedata r:id="rId80" o:title=""/>
           </v:shape>
-          <o:OLEObject Type="Embed" ProgID="Equation.DSMT4" ShapeID="_x0000_i1061" DrawAspect="Content" ObjectID="_1611677486" r:id="rId81"/>
+          <o:OLEObject Type="Embed" ProgID="Equation.DSMT4" ShapeID="_x0000_i1061" DrawAspect="Content" ObjectID="_1611678587" r:id="rId81"/>
         </w:object>
       </w:r>
       <w:r>
@@ -3163,7 +3163,7 @@
           <v:shape id="_x0000_i1062" type="#_x0000_t75" style="width:15pt;height:18pt" o:ole="">
             <v:imagedata r:id="rId78" o:title=""/>
           </v:shape>
-          <o:OLEObject Type="Embed" ProgID="Equation.DSMT4" ShapeID="_x0000_i1062" DrawAspect="Content" ObjectID="_1611677487" r:id="rId84"/>
+          <o:OLEObject Type="Embed" ProgID="Equation.DSMT4" ShapeID="_x0000_i1062" DrawAspect="Content" ObjectID="_1611678588" r:id="rId84"/>
         </w:object>
       </w:r>
       <w:r>
@@ -3197,7 +3197,7 @@
           <v:shape id="_x0000_i1063" type="#_x0000_t75" style="width:16.5pt;height:18pt" o:ole="">
             <v:imagedata r:id="rId85" o:title=""/>
           </v:shape>
-          <o:OLEObject Type="Embed" ProgID="Equation.DSMT4" ShapeID="_x0000_i1063" DrawAspect="Content" ObjectID="_1611677488" r:id="rId86"/>
+          <o:OLEObject Type="Embed" ProgID="Equation.DSMT4" ShapeID="_x0000_i1063" DrawAspect="Content" ObjectID="_1611678589" r:id="rId86"/>
         </w:object>
       </w:r>
       <w:r>
@@ -3381,7 +3381,7 @@
           <v:shape id="_x0000_i1064" type="#_x0000_t75" style="width:123pt;height:19.5pt" o:ole="">
             <v:imagedata r:id="rId87" o:title=""/>
           </v:shape>
-          <o:OLEObject Type="Embed" ProgID="Equation.DSMT4" ShapeID="_x0000_i1064" DrawAspect="Content" ObjectID="_1611677489" r:id="rId88"/>
+          <o:OLEObject Type="Embed" ProgID="Equation.DSMT4" ShapeID="_x0000_i1064" DrawAspect="Content" ObjectID="_1611678590" r:id="rId88"/>
         </w:object>
       </w:r>
       <w:r>
@@ -3450,7 +3450,7 @@
           <v:shape id="_x0000_i1065" type="#_x0000_t75" style="width:265.5pt;height:33pt" o:ole="">
             <v:imagedata r:id="rId89" o:title=""/>
           </v:shape>
-          <o:OLEObject Type="Embed" ProgID="Equation.DSMT4" ShapeID="_x0000_i1065" DrawAspect="Content" ObjectID="_1611677490" r:id="rId90"/>
+          <o:OLEObject Type="Embed" ProgID="Equation.DSMT4" ShapeID="_x0000_i1065" DrawAspect="Content" ObjectID="_1611678591" r:id="rId90"/>
         </w:object>
       </w:r>
       <w:r>
@@ -3611,7 +3611,7 @@
           <v:shape id="_x0000_i1066" type="#_x0000_t75" style="width:97.5pt;height:19.5pt" o:ole="">
             <v:imagedata r:id="rId58" o:title=""/>
           </v:shape>
-          <o:OLEObject Type="Embed" ProgID="Equation.DSMT4" ShapeID="_x0000_i1066" DrawAspect="Content" ObjectID="_1611677491" r:id="rId91"/>
+          <o:OLEObject Type="Embed" ProgID="Equation.DSMT4" ShapeID="_x0000_i1066" DrawAspect="Content" ObjectID="_1611678592" r:id="rId91"/>
         </w:object>
       </w:r>
       <w:r>
@@ -3756,7 +3756,7 @@
           <v:shape id="_x0000_i1067" type="#_x0000_t75" style="width:67.5pt;height:19.5pt" o:ole="">
             <v:imagedata r:id="rId93" o:title=""/>
           </v:shape>
-          <o:OLEObject Type="Embed" ProgID="Equation.DSMT4" ShapeID="_x0000_i1067" DrawAspect="Content" ObjectID="_1611677492" r:id="rId94"/>
+          <o:OLEObject Type="Embed" ProgID="Equation.DSMT4" ShapeID="_x0000_i1067" DrawAspect="Content" ObjectID="_1611678593" r:id="rId94"/>
         </w:object>
       </w:r>
       <w:r>
@@ -3780,7 +3780,7 @@
           <v:shape id="_x0000_i1068" type="#_x0000_t75" style="width:69pt;height:19.5pt" o:ole="">
             <v:imagedata r:id="rId95" o:title=""/>
           </v:shape>
-          <o:OLEObject Type="Embed" ProgID="Equation.DSMT4" ShapeID="_x0000_i1068" DrawAspect="Content" ObjectID="_1611677493" r:id="rId96"/>
+          <o:OLEObject Type="Embed" ProgID="Equation.DSMT4" ShapeID="_x0000_i1068" DrawAspect="Content" ObjectID="_1611678594" r:id="rId96"/>
         </w:object>
       </w:r>
       <w:r>
@@ -3822,7 +3822,7 @@
           <v:shape id="_x0000_i1069" type="#_x0000_t75" style="width:75pt;height:18pt" o:ole="">
             <v:imagedata r:id="rId97" o:title=""/>
           </v:shape>
-          <o:OLEObject Type="Embed" ProgID="Equation.DSMT4" ShapeID="_x0000_i1069" DrawAspect="Content" ObjectID="_1611677494" r:id="rId98"/>
+          <o:OLEObject Type="Embed" ProgID="Equation.DSMT4" ShapeID="_x0000_i1069" DrawAspect="Content" ObjectID="_1611678595" r:id="rId98"/>
         </w:object>
       </w:r>
     </w:p>
@@ -3964,7 +3964,7 @@
           <v:shape id="_x0000_i1070" type="#_x0000_t75" style="width:10.5pt;height:10.5pt" o:ole="">
             <v:imagedata r:id="rId99" o:title=""/>
           </v:shape>
-          <o:OLEObject Type="Embed" ProgID="Equation.DSMT4" ShapeID="_x0000_i1070" DrawAspect="Content" ObjectID="_1611677495" r:id="rId100"/>
+          <o:OLEObject Type="Embed" ProgID="Equation.DSMT4" ShapeID="_x0000_i1070" DrawAspect="Content" ObjectID="_1611678596" r:id="rId100"/>
         </w:object>
       </w:r>
       <w:r>
@@ -4035,7 +4035,7 @@
           <v:shape id="_x0000_i1071" type="#_x0000_t75" style="width:63pt;height:19.5pt" o:ole="">
             <v:imagedata r:id="rId101" o:title=""/>
           </v:shape>
-          <o:OLEObject Type="Embed" ProgID="Equation.DSMT4" ShapeID="_x0000_i1071" DrawAspect="Content" ObjectID="_1611677496" r:id="rId102"/>
+          <o:OLEObject Type="Embed" ProgID="Equation.DSMT4" ShapeID="_x0000_i1071" DrawAspect="Content" ObjectID="_1611678597" r:id="rId102"/>
         </w:object>
       </w:r>
       <w:r>
@@ -4060,7 +4060,7 @@
           <v:shape id="_x0000_i1072" type="#_x0000_t75" style="width:63pt;height:19.5pt" o:ole="">
             <v:imagedata r:id="rId103" o:title=""/>
           </v:shape>
-          <o:OLEObject Type="Embed" ProgID="Equation.DSMT4" ShapeID="_x0000_i1072" DrawAspect="Content" ObjectID="_1611677497" r:id="rId104"/>
+          <o:OLEObject Type="Embed" ProgID="Equation.DSMT4" ShapeID="_x0000_i1072" DrawAspect="Content" ObjectID="_1611678598" r:id="rId104"/>
         </w:object>
       </w:r>
       <w:commentRangeEnd w:id="3"/>
@@ -4293,7 +4293,7 @@
           <v:shape id="_x0000_i1073" type="#_x0000_t75" style="width:126pt;height:18pt" o:ole="">
             <v:imagedata r:id="rId105" o:title=""/>
           </v:shape>
-          <o:OLEObject Type="Embed" ProgID="Equation.DSMT4" ShapeID="_x0000_i1073" DrawAspect="Content" ObjectID="_1611677498" r:id="rId106"/>
+          <o:OLEObject Type="Embed" ProgID="Equation.DSMT4" ShapeID="_x0000_i1073" DrawAspect="Content" ObjectID="_1611678599" r:id="rId106"/>
         </w:object>
       </w:r>
       <w:r>
@@ -4789,7 +4789,7 @@
           <v:shape id="_x0000_i1074" type="#_x0000_t75" style="width:82.5pt;height:19.5pt" o:ole="">
             <v:imagedata r:id="rId108" o:title=""/>
           </v:shape>
-          <o:OLEObject Type="Embed" ProgID="Equation.DSMT4" ShapeID="_x0000_i1074" DrawAspect="Content" ObjectID="_1611677499" r:id="rId109"/>
+          <o:OLEObject Type="Embed" ProgID="Equation.DSMT4" ShapeID="_x0000_i1074" DrawAspect="Content" ObjectID="_1611678600" r:id="rId109"/>
         </w:object>
       </w:r>
       <w:r>
@@ -4815,7 +4815,7 @@
           <v:shape id="_x0000_i1075" type="#_x0000_t75" style="width:84pt;height:19.5pt" o:ole="">
             <v:imagedata r:id="rId110" o:title=""/>
           </v:shape>
-          <o:OLEObject Type="Embed" ProgID="Equation.DSMT4" ShapeID="_x0000_i1075" DrawAspect="Content" ObjectID="_1611677500" r:id="rId111"/>
+          <o:OLEObject Type="Embed" ProgID="Equation.DSMT4" ShapeID="_x0000_i1075" DrawAspect="Content" ObjectID="_1611678601" r:id="rId111"/>
         </w:object>
       </w:r>
       <w:r>
@@ -4866,7 +4866,7 @@
           <v:shape id="_x0000_i1076" type="#_x0000_t75" style="width:67.5pt;height:19.5pt" o:ole="">
             <v:imagedata r:id="rId93" o:title=""/>
           </v:shape>
-          <o:OLEObject Type="Embed" ProgID="Equation.DSMT4" ShapeID="_x0000_i1076" DrawAspect="Content" ObjectID="_1611677501" r:id="rId112"/>
+          <o:OLEObject Type="Embed" ProgID="Equation.DSMT4" ShapeID="_x0000_i1076" DrawAspect="Content" ObjectID="_1611678602" r:id="rId112"/>
         </w:object>
       </w:r>
       <w:r>
@@ -4926,7 +4926,7 @@
           <v:shape id="_x0000_i1077" type="#_x0000_t75" style="width:69pt;height:19.5pt" o:ole="">
             <v:imagedata r:id="rId113" o:title=""/>
           </v:shape>
-          <o:OLEObject Type="Embed" ProgID="Equation.DSMT4" ShapeID="_x0000_i1077" DrawAspect="Content" ObjectID="_1611677502" r:id="rId114"/>
+          <o:OLEObject Type="Embed" ProgID="Equation.DSMT4" ShapeID="_x0000_i1077" DrawAspect="Content" ObjectID="_1611678603" r:id="rId114"/>
         </w:object>
       </w:r>
       <w:r>
@@ -4977,7 +4977,7 @@
           <v:shape id="_x0000_i1078" type="#_x0000_t75" style="width:75pt;height:18pt" o:ole="">
             <v:imagedata r:id="rId97" o:title=""/>
           </v:shape>
-          <o:OLEObject Type="Embed" ProgID="Equation.DSMT4" ShapeID="_x0000_i1078" DrawAspect="Content" ObjectID="_1611677503" r:id="rId115"/>
+          <o:OLEObject Type="Embed" ProgID="Equation.DSMT4" ShapeID="_x0000_i1078" DrawAspect="Content" ObjectID="_1611678604" r:id="rId115"/>
         </w:object>
       </w:r>
       <w:r>
@@ -5110,7 +5110,7 @@
           <v:shape id="_x0000_i1079" type="#_x0000_t75" style="width:12pt;height:13.5pt" o:ole="">
             <v:imagedata r:id="rId117" o:title=""/>
           </v:shape>
-          <o:OLEObject Type="Embed" ProgID="Equation.DSMT4" ShapeID="_x0000_i1079" DrawAspect="Content" ObjectID="_1611677504" r:id="rId118"/>
+          <o:OLEObject Type="Embed" ProgID="Equation.DSMT4" ShapeID="_x0000_i1079" DrawAspect="Content" ObjectID="_1611678605" r:id="rId118"/>
         </w:object>
       </w:r>
       <w:r>
@@ -5326,7 +5326,7 @@
           <v:shape id="_x0000_i1080" type="#_x0000_t75" style="width:63pt;height:19.5pt" o:ole="">
             <v:imagedata r:id="rId119" o:title=""/>
           </v:shape>
-          <o:OLEObject Type="Embed" ProgID="Equation.DSMT4" ShapeID="_x0000_i1080" DrawAspect="Content" ObjectID="_1611677505" r:id="rId120"/>
+          <o:OLEObject Type="Embed" ProgID="Equation.DSMT4" ShapeID="_x0000_i1080" DrawAspect="Content" ObjectID="_1611678606" r:id="rId120"/>
         </w:object>
       </w:r>
       <w:r>
@@ -6347,7 +6347,7 @@
           <v:shape id="_x0000_i1081" type="#_x0000_t75" style="width:63pt;height:19.5pt" o:ole="">
             <v:imagedata r:id="rId119" o:title=""/>
           </v:shape>
-          <o:OLEObject Type="Embed" ProgID="Equation.DSMT4" ShapeID="_x0000_i1081" DrawAspect="Content" ObjectID="_1611677506" r:id="rId121"/>
+          <o:OLEObject Type="Embed" ProgID="Equation.DSMT4" ShapeID="_x0000_i1081" DrawAspect="Content" ObjectID="_1611678607" r:id="rId121"/>
         </w:object>
       </w:r>
       <w:r>
@@ -6763,7 +6763,7 @@
           <v:shape id="_x0000_i1082" type="#_x0000_t75" style="width:112.5pt;height:28.5pt" o:ole="">
             <v:imagedata r:id="rId122" o:title=""/>
           </v:shape>
-          <o:OLEObject Type="Embed" ProgID="Equation.DSMT4" ShapeID="_x0000_i1082" DrawAspect="Content" ObjectID="_1611677507" r:id="rId123"/>
+          <o:OLEObject Type="Embed" ProgID="Equation.DSMT4" ShapeID="_x0000_i1082" DrawAspect="Content" ObjectID="_1611678608" r:id="rId123"/>
         </w:object>
       </w:r>
       <w:commentRangeEnd w:id="9"/>
@@ -7173,7 +7173,7 @@
           <v:shape id="_x0000_i1083" type="#_x0000_t75" style="width:321pt;height:46.5pt" o:ole="">
             <v:imagedata r:id="rId124" o:title=""/>
           </v:shape>
-          <o:OLEObject Type="Embed" ProgID="Equation.DSMT4" ShapeID="_x0000_i1083" DrawAspect="Content" ObjectID="_1611677508" r:id="rId125"/>
+          <o:OLEObject Type="Embed" ProgID="Equation.DSMT4" ShapeID="_x0000_i1083" DrawAspect="Content" ObjectID="_1611678609" r:id="rId125"/>
         </w:object>
       </w:r>
     </w:p>
@@ -7201,7 +7201,7 @@
           <v:shape id="_x0000_i1084" type="#_x0000_t75" style="width:244.5pt;height:46.5pt" o:ole="">
             <v:imagedata r:id="rId50" o:title=""/>
           </v:shape>
-          <o:OLEObject Type="Embed" ProgID="Equation.DSMT4" ShapeID="_x0000_i1084" DrawAspect="Content" ObjectID="_1611677509" r:id="rId126"/>
+          <o:OLEObject Type="Embed" ProgID="Equation.DSMT4" ShapeID="_x0000_i1084" DrawAspect="Content" ObjectID="_1611678610" r:id="rId126"/>
         </w:object>
       </w:r>
     </w:p>
@@ -7230,7 +7230,7 @@
           <v:shape id="_x0000_i1085" type="#_x0000_t75" style="width:232.5pt;height:46.5pt" o:ole="">
             <v:imagedata r:id="rId127" o:title=""/>
           </v:shape>
-          <o:OLEObject Type="Embed" ProgID="Equation.DSMT4" ShapeID="_x0000_i1085" DrawAspect="Content" ObjectID="_1611677510" r:id="rId128"/>
+          <o:OLEObject Type="Embed" ProgID="Equation.DSMT4" ShapeID="_x0000_i1085" DrawAspect="Content" ObjectID="_1611678611" r:id="rId128"/>
         </w:object>
       </w:r>
       <w:r>
@@ -7358,7 +7358,7 @@
           <v:shape id="_x0000_i1086" type="#_x0000_t75" style="width:27pt;height:16.5pt" o:ole="">
             <v:imagedata r:id="rId129" o:title=""/>
           </v:shape>
-          <o:OLEObject Type="Embed" ProgID="Equation.DSMT4" ShapeID="_x0000_i1086" DrawAspect="Content" ObjectID="_1611677511" r:id="rId130"/>
+          <o:OLEObject Type="Embed" ProgID="Equation.DSMT4" ShapeID="_x0000_i1086" DrawAspect="Content" ObjectID="_1611678612" r:id="rId130"/>
         </w:object>
       </w:r>
       <w:r>
@@ -7454,7 +7454,7 @@
           <v:shape id="_x0000_i1087" type="#_x0000_t75" style="width:10.5pt;height:10.5pt" o:ole="">
             <v:imagedata r:id="rId131" o:title=""/>
           </v:shape>
-          <o:OLEObject Type="Embed" ProgID="Equation.DSMT4" ShapeID="_x0000_i1087" DrawAspect="Content" ObjectID="_1611677512" r:id="rId132"/>
+          <o:OLEObject Type="Embed" ProgID="Equation.DSMT4" ShapeID="_x0000_i1087" DrawAspect="Content" ObjectID="_1611678613" r:id="rId132"/>
         </w:object>
       </w:r>
       <w:r>
@@ -7591,7 +7591,7 @@
           <v:shape id="_x0000_i1088" type="#_x0000_t75" style="width:30pt;height:16.5pt" o:ole="">
             <v:imagedata r:id="rId133" o:title=""/>
           </v:shape>
-          <o:OLEObject Type="Embed" ProgID="Equation.DSMT4" ShapeID="_x0000_i1088" DrawAspect="Content" ObjectID="_1611677513" r:id="rId134"/>
+          <o:OLEObject Type="Embed" ProgID="Equation.DSMT4" ShapeID="_x0000_i1088" DrawAspect="Content" ObjectID="_1611678614" r:id="rId134"/>
         </w:object>
       </w:r>
       <w:r>
@@ -7693,7 +7693,7 @@
           <v:shape id="_x0000_i1089" type="#_x0000_t75" style="width:238.5pt;height:37.5pt" o:ole="">
             <v:imagedata r:id="rId135" o:title=""/>
           </v:shape>
-          <o:OLEObject Type="Embed" ProgID="Equation.DSMT4" ShapeID="_x0000_i1089" DrawAspect="Content" ObjectID="_1611677514" r:id="rId136"/>
+          <o:OLEObject Type="Embed" ProgID="Equation.DSMT4" ShapeID="_x0000_i1089" DrawAspect="Content" ObjectID="_1611678615" r:id="rId136"/>
         </w:object>
       </w:r>
       <w:r>
@@ -7729,7 +7729,7 @@
           <v:shape id="_x0000_i1090" type="#_x0000_t75" style="width:117pt;height:25.5pt" o:ole="">
             <v:imagedata r:id="rId137" o:title=""/>
           </v:shape>
-          <o:OLEObject Type="Embed" ProgID="Equation.DSMT4" ShapeID="_x0000_i1090" DrawAspect="Content" ObjectID="_1611677515" r:id="rId138"/>
+          <o:OLEObject Type="Embed" ProgID="Equation.DSMT4" ShapeID="_x0000_i1090" DrawAspect="Content" ObjectID="_1611678616" r:id="rId138"/>
         </w:object>
       </w:r>
     </w:p>
@@ -7846,7 +7846,7 @@
           <v:shape id="_x0000_i1091" type="#_x0000_t75" style="width:232.5pt;height:37.5pt" o:ole="">
             <v:imagedata r:id="rId139" o:title=""/>
           </v:shape>
-          <o:OLEObject Type="Embed" ProgID="Equation.DSMT4" ShapeID="_x0000_i1091" DrawAspect="Content" ObjectID="_1611677516" r:id="rId140"/>
+          <o:OLEObject Type="Embed" ProgID="Equation.DSMT4" ShapeID="_x0000_i1091" DrawAspect="Content" ObjectID="_1611678617" r:id="rId140"/>
         </w:object>
       </w:r>
       <w:r>
@@ -9298,7 +9298,7 @@
           <v:shape id="_x0000_i1092" type="#_x0000_t75" style="width:451.5pt;height:40.5pt" o:ole="">
             <v:imagedata r:id="rId141" o:title=""/>
           </v:shape>
-          <o:OLEObject Type="Embed" ProgID="Equation.DSMT4" ShapeID="_x0000_i1092" DrawAspect="Content" ObjectID="_1611677517" r:id="rId142"/>
+          <o:OLEObject Type="Embed" ProgID="Equation.DSMT4" ShapeID="_x0000_i1092" DrawAspect="Content" ObjectID="_1611678618" r:id="rId142"/>
         </w:object>
       </w:r>
       <w:r>
@@ -9336,7 +9336,7 @@
           <v:shape id="_x0000_i1093" type="#_x0000_t75" style="width:358.5pt;height:43.5pt" o:ole="">
             <v:imagedata r:id="rId143" o:title=""/>
           </v:shape>
-          <o:OLEObject Type="Embed" ProgID="Equation.DSMT4" ShapeID="_x0000_i1093" DrawAspect="Content" ObjectID="_1611677518" r:id="rId144"/>
+          <o:OLEObject Type="Embed" ProgID="Equation.DSMT4" ShapeID="_x0000_i1093" DrawAspect="Content" ObjectID="_1611678619" r:id="rId144"/>
         </w:object>
       </w:r>
       <w:r>
@@ -9374,7 +9374,7 @@
           <v:shape id="_x0000_i1094" type="#_x0000_t75" style="width:145.5pt;height:36pt" o:ole="">
             <v:imagedata r:id="rId145" o:title=""/>
           </v:shape>
-          <o:OLEObject Type="Embed" ProgID="Equation.DSMT4" ShapeID="_x0000_i1094" DrawAspect="Content" ObjectID="_1611677519" r:id="rId146"/>
+          <o:OLEObject Type="Embed" ProgID="Equation.DSMT4" ShapeID="_x0000_i1094" DrawAspect="Content" ObjectID="_1611678620" r:id="rId146"/>
         </w:object>
       </w:r>
       <w:r>
@@ -9416,7 +9416,7 @@
           <v:shape id="_x0000_i1095" type="#_x0000_t75" style="width:133.5pt;height:34.5pt" o:ole="">
             <v:imagedata r:id="rId147" o:title=""/>
           </v:shape>
-          <o:OLEObject Type="Embed" ProgID="Equation.DSMT4" ShapeID="_x0000_i1095" DrawAspect="Content" ObjectID="_1611677520" r:id="rId148"/>
+          <o:OLEObject Type="Embed" ProgID="Equation.DSMT4" ShapeID="_x0000_i1095" DrawAspect="Content" ObjectID="_1611678621" r:id="rId148"/>
         </w:object>
       </w:r>
     </w:p>
@@ -9467,7 +9467,7 @@
           <v:shape id="_x0000_i1096" type="#_x0000_t75" style="width:283.5pt;height:31.5pt" o:ole="">
             <v:imagedata r:id="rId149" o:title=""/>
           </v:shape>
-          <o:OLEObject Type="Embed" ProgID="Equation.DSMT4" ShapeID="_x0000_i1096" DrawAspect="Content" ObjectID="_1611677521" r:id="rId150"/>
+          <o:OLEObject Type="Embed" ProgID="Equation.DSMT4" ShapeID="_x0000_i1096" DrawAspect="Content" ObjectID="_1611678622" r:id="rId150"/>
         </w:object>
       </w:r>
     </w:p>
@@ -9514,7 +9514,7 @@
           <v:shape id="_x0000_i1097" type="#_x0000_t75" style="width:152.25pt;height:34.5pt" o:ole="">
             <v:imagedata r:id="rId151" o:title=""/>
           </v:shape>
-          <o:OLEObject Type="Embed" ProgID="Equation.DSMT4" ShapeID="_x0000_i1097" DrawAspect="Content" ObjectID="_1611677522" r:id="rId152"/>
+          <o:OLEObject Type="Embed" ProgID="Equation.DSMT4" ShapeID="_x0000_i1097" DrawAspect="Content" ObjectID="_1611678623" r:id="rId152"/>
         </w:object>
       </w:r>
     </w:p>
@@ -9543,7 +9543,7 @@
           <v:shape id="_x0000_i1098" type="#_x0000_t75" style="width:28.5pt;height:16.5pt" o:ole="">
             <v:imagedata r:id="rId153" o:title=""/>
           </v:shape>
-          <o:OLEObject Type="Embed" ProgID="Equation.DSMT4" ShapeID="_x0000_i1098" DrawAspect="Content" ObjectID="_1611677523" r:id="rId154"/>
+          <o:OLEObject Type="Embed" ProgID="Equation.DSMT4" ShapeID="_x0000_i1098" DrawAspect="Content" ObjectID="_1611678624" r:id="rId154"/>
         </w:object>
       </w:r>
       <w:r>
@@ -9603,7 +9603,7 @@
           <v:shape id="_x0000_i1099" type="#_x0000_t75" style="width:67.5pt;height:31.5pt" o:ole="">
             <v:imagedata r:id="rId155" o:title=""/>
           </v:shape>
-          <o:OLEObject Type="Embed" ProgID="Equation.DSMT4" ShapeID="_x0000_i1099" DrawAspect="Content" ObjectID="_1611677524" r:id="rId156"/>
+          <o:OLEObject Type="Embed" ProgID="Equation.DSMT4" ShapeID="_x0000_i1099" DrawAspect="Content" ObjectID="_1611678625" r:id="rId156"/>
         </w:object>
       </w:r>
       <w:r>
@@ -9627,7 +9627,7 @@
           <v:shape id="_x0000_i1100" type="#_x0000_t75" style="width:61.5pt;height:21pt" o:ole="">
             <v:imagedata r:id="rId157" o:title=""/>
           </v:shape>
-          <o:OLEObject Type="Embed" ProgID="Equation.DSMT4" ShapeID="_x0000_i1100" DrawAspect="Content" ObjectID="_1611677525" r:id="rId158"/>
+          <o:OLEObject Type="Embed" ProgID="Equation.DSMT4" ShapeID="_x0000_i1100" DrawAspect="Content" ObjectID="_1611678626" r:id="rId158"/>
         </w:object>
       </w:r>
       <w:r>
@@ -9696,7 +9696,7 @@
           <v:shape id="_x0000_i1101" type="#_x0000_t75" style="width:33pt;height:18pt" o:ole="">
             <v:imagedata r:id="rId159" o:title=""/>
           </v:shape>
-          <o:OLEObject Type="Embed" ProgID="Equation.DSMT4" ShapeID="_x0000_i1101" DrawAspect="Content" ObjectID="_1611677526" r:id="rId160"/>
+          <o:OLEObject Type="Embed" ProgID="Equation.DSMT4" ShapeID="_x0000_i1101" DrawAspect="Content" ObjectID="_1611678627" r:id="rId160"/>
         </w:object>
       </w:r>
       <w:r>
@@ -9720,7 +9720,7 @@
           <v:shape id="_x0000_i1102" type="#_x0000_t75" style="width:60pt;height:22.5pt" o:ole="">
             <v:imagedata r:id="rId161" o:title=""/>
           </v:shape>
-          <o:OLEObject Type="Embed" ProgID="Equation.DSMT4" ShapeID="_x0000_i1102" DrawAspect="Content" ObjectID="_1611677527" r:id="rId162"/>
+          <o:OLEObject Type="Embed" ProgID="Equation.DSMT4" ShapeID="_x0000_i1102" DrawAspect="Content" ObjectID="_1611678628" r:id="rId162"/>
         </w:object>
       </w:r>
       <w:r>
@@ -9799,7 +9799,7 @@
           <v:shape id="_x0000_i1103" type="#_x0000_t75" style="width:34.5pt;height:18pt" o:ole="">
             <v:imagedata r:id="rId163" o:title=""/>
           </v:shape>
-          <o:OLEObject Type="Embed" ProgID="Equation.DSMT4" ShapeID="_x0000_i1103" DrawAspect="Content" ObjectID="_1611677528" r:id="rId164"/>
+          <o:OLEObject Type="Embed" ProgID="Equation.DSMT4" ShapeID="_x0000_i1103" DrawAspect="Content" ObjectID="_1611678629" r:id="rId164"/>
         </w:object>
       </w:r>
       <w:r>
@@ -9859,7 +9859,7 @@
           <v:shape id="_x0000_i1104" type="#_x0000_t75" style="width:58.5pt;height:34.5pt" o:ole="">
             <v:imagedata r:id="rId165" o:title=""/>
           </v:shape>
-          <o:OLEObject Type="Embed" ProgID="Equation.DSMT4" ShapeID="_x0000_i1104" DrawAspect="Content" ObjectID="_1611677529" r:id="rId166"/>
+          <o:OLEObject Type="Embed" ProgID="Equation.DSMT4" ShapeID="_x0000_i1104" DrawAspect="Content" ObjectID="_1611678630" r:id="rId166"/>
         </w:object>
       </w:r>
       <w:r>
@@ -9988,7 +9988,7 @@
           <v:shape id="_x0000_i1105" type="#_x0000_t75" style="width:130.5pt;height:24pt" o:ole="">
             <v:imagedata r:id="rId167" o:title=""/>
           </v:shape>
-          <o:OLEObject Type="Embed" ProgID="Equation.DSMT4" ShapeID="_x0000_i1105" DrawAspect="Content" ObjectID="_1611677530" r:id="rId168"/>
+          <o:OLEObject Type="Embed" ProgID="Equation.DSMT4" ShapeID="_x0000_i1105" DrawAspect="Content" ObjectID="_1611678631" r:id="rId168"/>
         </w:object>
       </w:r>
       <w:r>
@@ -10193,7 +10193,7 @@
           <v:shape id="_x0000_i1106" type="#_x0000_t75" style="width:181.5pt;height:19.5pt" o:ole="">
             <v:imagedata r:id="rId169" o:title=""/>
           </v:shape>
-          <o:OLEObject Type="Embed" ProgID="Equation.DSMT4" ShapeID="_x0000_i1106" DrawAspect="Content" ObjectID="_1611677531" r:id="rId170"/>
+          <o:OLEObject Type="Embed" ProgID="Equation.DSMT4" ShapeID="_x0000_i1106" DrawAspect="Content" ObjectID="_1611678632" r:id="rId170"/>
         </w:object>
       </w:r>
       <w:r>
@@ -10543,7 +10543,7 @@
           <v:shape id="_x0000_i1107" type="#_x0000_t75" style="width:16.5pt;height:18pt" o:ole="">
             <v:imagedata r:id="rId171" o:title=""/>
           </v:shape>
-          <o:OLEObject Type="Embed" ProgID="Equation.DSMT4" ShapeID="_x0000_i1107" DrawAspect="Content" ObjectID="_1611677532" r:id="rId172"/>
+          <o:OLEObject Type="Embed" ProgID="Equation.DSMT4" ShapeID="_x0000_i1107" DrawAspect="Content" ObjectID="_1611678633" r:id="rId172"/>
         </w:object>
       </w:r>
       <w:r>
@@ -10568,7 +10568,7 @@
           <v:shape id="_x0000_i1108" type="#_x0000_t75" style="width:37.5pt;height:16.5pt" o:ole="">
             <v:imagedata r:id="rId173" o:title=""/>
           </v:shape>
-          <o:OLEObject Type="Embed" ProgID="Equation.DSMT4" ShapeID="_x0000_i1108" DrawAspect="Content" ObjectID="_1611677533" r:id="rId174"/>
+          <o:OLEObject Type="Embed" ProgID="Equation.DSMT4" ShapeID="_x0000_i1108" DrawAspect="Content" ObjectID="_1611678634" r:id="rId174"/>
         </w:object>
       </w:r>
       <w:commentRangeEnd w:id="16"/>
@@ -10707,7 +10707,7 @@
           <v:shape id="_x0000_i1109" type="#_x0000_t75" style="width:16.5pt;height:18pt" o:ole="">
             <v:imagedata r:id="rId175" o:title=""/>
           </v:shape>
-          <o:OLEObject Type="Embed" ProgID="Equation.DSMT4" ShapeID="_x0000_i1109" DrawAspect="Content" ObjectID="_1611677534" r:id="rId176"/>
+          <o:OLEObject Type="Embed" ProgID="Equation.DSMT4" ShapeID="_x0000_i1109" DrawAspect="Content" ObjectID="_1611678635" r:id="rId176"/>
         </w:object>
       </w:r>
       <w:r>
@@ -11018,7 +11018,7 @@
           <v:shape id="_x0000_i1110" type="#_x0000_t75" style="width:31.5pt;height:13.5pt" o:ole="">
             <v:imagedata r:id="rId177" o:title=""/>
           </v:shape>
-          <o:OLEObject Type="Embed" ProgID="Equation.DSMT4" ShapeID="_x0000_i1110" DrawAspect="Content" ObjectID="_1611677535" r:id="rId178"/>
+          <o:OLEObject Type="Embed" ProgID="Equation.DSMT4" ShapeID="_x0000_i1110" DrawAspect="Content" ObjectID="_1611678636" r:id="rId178"/>
         </w:object>
       </w:r>
       <w:r>
@@ -11042,7 +11042,7 @@
           <v:shape id="_x0000_i1111" type="#_x0000_t75" style="width:31.5pt;height:13.5pt" o:ole="">
             <v:imagedata r:id="rId179" o:title=""/>
           </v:shape>
-          <o:OLEObject Type="Embed" ProgID="Equation.DSMT4" ShapeID="_x0000_i1111" DrawAspect="Content" ObjectID="_1611677536" r:id="rId180"/>
+          <o:OLEObject Type="Embed" ProgID="Equation.DSMT4" ShapeID="_x0000_i1111" DrawAspect="Content" ObjectID="_1611678637" r:id="rId180"/>
         </w:object>
       </w:r>
       <w:r>
@@ -11551,7 +11551,7 @@
           <v:shape id="_x0000_i1112" type="#_x0000_t75" style="width:262.5pt;height:39pt" o:ole="">
             <v:imagedata r:id="rId181" o:title=""/>
           </v:shape>
-          <o:OLEObject Type="Embed" ProgID="Equation.DSMT4" ShapeID="_x0000_i1112" DrawAspect="Content" ObjectID="_1611677537" r:id="rId182"/>
+          <o:OLEObject Type="Embed" ProgID="Equation.DSMT4" ShapeID="_x0000_i1112" DrawAspect="Content" ObjectID="_1611678638" r:id="rId182"/>
         </w:object>
       </w:r>
       <w:r>
@@ -11842,7 +11842,7 @@
           <v:shape id="_x0000_i1113" type="#_x0000_t75" style="width:1in;height:19.5pt" o:ole="">
             <v:imagedata r:id="rId183" o:title=""/>
           </v:shape>
-          <o:OLEObject Type="Embed" ProgID="Equation.DSMT4" ShapeID="_x0000_i1113" DrawAspect="Content" ObjectID="_1611677538" r:id="rId184"/>
+          <o:OLEObject Type="Embed" ProgID="Equation.DSMT4" ShapeID="_x0000_i1113" DrawAspect="Content" ObjectID="_1611678639" r:id="rId184"/>
         </w:object>
       </w:r>
       <w:r>
@@ -12744,7 +12744,7 @@
           <v:shape id="_x0000_i1114" type="#_x0000_t75" style="width:25.5pt;height:18pt" o:ole="">
             <v:imagedata r:id="rId185" o:title=""/>
           </v:shape>
-          <o:OLEObject Type="Embed" ProgID="Equation.DSMT4" ShapeID="_x0000_i1114" DrawAspect="Content" ObjectID="_1611677539" r:id="rId186"/>
+          <o:OLEObject Type="Embed" ProgID="Equation.DSMT4" ShapeID="_x0000_i1114" DrawAspect="Content" ObjectID="_1611678640" r:id="rId186"/>
         </w:object>
       </w:r>
       <w:r>
@@ -13609,7 +13609,7 @@
           <v:shape id="_x0000_i1115" type="#_x0000_t75" style="width:10.5pt;height:13.5pt" o:ole="">
             <v:imagedata r:id="rId187" o:title=""/>
           </v:shape>
-          <o:OLEObject Type="Embed" ProgID="Equation.DSMT4" ShapeID="_x0000_i1115" DrawAspect="Content" ObjectID="_1611677540" r:id="rId188"/>
+          <o:OLEObject Type="Embed" ProgID="Equation.DSMT4" ShapeID="_x0000_i1115" DrawAspect="Content" ObjectID="_1611678641" r:id="rId188"/>
         </w:object>
       </w:r>
       <w:r>
@@ -13696,7 +13696,7 @@
           <v:shape id="_x0000_i1116" type="#_x0000_t75" style="width:25.5pt;height:13.5pt" o:ole="">
             <v:imagedata r:id="rId189" o:title=""/>
           </v:shape>
-          <o:OLEObject Type="Embed" ProgID="Equation.DSMT4" ShapeID="_x0000_i1116" DrawAspect="Content" ObjectID="_1611677541" r:id="rId190"/>
+          <o:OLEObject Type="Embed" ProgID="Equation.DSMT4" ShapeID="_x0000_i1116" DrawAspect="Content" ObjectID="_1611678642" r:id="rId190"/>
         </w:object>
       </w:r>
       <w:r>
@@ -14679,7 +14679,7 @@
           <v:shape id="_x0000_i1117" type="#_x0000_t75" style="width:49.5pt;height:18pt" o:ole="">
             <v:imagedata r:id="rId192" o:title=""/>
           </v:shape>
-          <o:OLEObject Type="Embed" ProgID="Equation.DSMT4" ShapeID="_x0000_i1117" DrawAspect="Content" ObjectID="_1611677542" r:id="rId193"/>
+          <o:OLEObject Type="Embed" ProgID="Equation.DSMT4" ShapeID="_x0000_i1117" DrawAspect="Content" ObjectID="_1611678643" r:id="rId193"/>
         </w:object>
       </w:r>
       <w:r>
@@ -14730,7 +14730,7 @@
           <v:shape id="_x0000_i1118" type="#_x0000_t75" style="width:42pt;height:18pt" o:ole="">
             <v:imagedata r:id="rId194" o:title=""/>
           </v:shape>
-          <o:OLEObject Type="Embed" ProgID="Equation.DSMT4" ShapeID="_x0000_i1118" DrawAspect="Content" ObjectID="_1611677543" r:id="rId195"/>
+          <o:OLEObject Type="Embed" ProgID="Equation.DSMT4" ShapeID="_x0000_i1118" DrawAspect="Content" ObjectID="_1611678644" r:id="rId195"/>
         </w:object>
       </w:r>
       <w:r>
@@ -15004,7 +15004,7 @@
           <v:shape id="_x0000_i1119" type="#_x0000_t75" style="width:205.5pt;height:18pt" o:ole="">
             <v:imagedata r:id="rId196" o:title=""/>
           </v:shape>
-          <o:OLEObject Type="Embed" ProgID="Equation.DSMT4" ShapeID="_x0000_i1119" DrawAspect="Content" ObjectID="_1611677544" r:id="rId197"/>
+          <o:OLEObject Type="Embed" ProgID="Equation.DSMT4" ShapeID="_x0000_i1119" DrawAspect="Content" ObjectID="_1611678645" r:id="rId197"/>
         </w:object>
       </w:r>
       <w:commentRangeEnd w:id="19"/>
@@ -15069,7 +15069,7 @@
           <v:shape id="_x0000_i1120" type="#_x0000_t75" style="width:31.5pt;height:18pt" o:ole="">
             <v:imagedata r:id="rId198" o:title=""/>
           </v:shape>
-          <o:OLEObject Type="Embed" ProgID="Equation.DSMT4" ShapeID="_x0000_i1120" DrawAspect="Content" ObjectID="_1611677545" r:id="rId199"/>
+          <o:OLEObject Type="Embed" ProgID="Equation.DSMT4" ShapeID="_x0000_i1120" DrawAspect="Content" ObjectID="_1611678646" r:id="rId199"/>
         </w:object>
       </w:r>
       <w:r>
@@ -15310,7 +15310,7 @@
           <v:shape id="_x0000_i1121" type="#_x0000_t75" style="width:25.5pt;height:18pt" o:ole="">
             <v:imagedata r:id="rId200" o:title=""/>
           </v:shape>
-          <o:OLEObject Type="Embed" ProgID="Equation.DSMT4" ShapeID="_x0000_i1121" DrawAspect="Content" ObjectID="_1611677546" r:id="rId201"/>
+          <o:OLEObject Type="Embed" ProgID="Equation.DSMT4" ShapeID="_x0000_i1121" DrawAspect="Content" ObjectID="_1611678647" r:id="rId201"/>
         </w:object>
       </w:r>
       <w:r>
@@ -15425,7 +15425,7 @@
           <v:shape id="_x0000_i1122" type="#_x0000_t75" style="width:31.5pt;height:18pt" o:ole="">
             <v:imagedata r:id="rId198" o:title=""/>
           </v:shape>
-          <o:OLEObject Type="Embed" ProgID="Equation.DSMT4" ShapeID="_x0000_i1122" DrawAspect="Content" ObjectID="_1611677547" r:id="rId202"/>
+          <o:OLEObject Type="Embed" ProgID="Equation.DSMT4" ShapeID="_x0000_i1122" DrawAspect="Content" ObjectID="_1611678648" r:id="rId202"/>
         </w:object>
       </w:r>
       <w:r>
@@ -15486,7 +15486,7 @@
           <v:shape id="_x0000_i1123" type="#_x0000_t75" style="width:13.5pt;height:18pt" o:ole="">
             <v:imagedata r:id="rId203" o:title=""/>
           </v:shape>
-          <o:OLEObject Type="Embed" ProgID="Equation.DSMT4" ShapeID="_x0000_i1123" DrawAspect="Content" ObjectID="_1611677548" r:id="rId204"/>
+          <o:OLEObject Type="Embed" ProgID="Equation.DSMT4" ShapeID="_x0000_i1123" DrawAspect="Content" ObjectID="_1611678649" r:id="rId204"/>
         </w:object>
       </w:r>
       <w:r>
@@ -15520,7 +15520,7 @@
           <v:shape id="_x0000_i1124" type="#_x0000_t75" style="width:30pt;height:19.5pt" o:ole="">
             <v:imagedata r:id="rId205" o:title=""/>
           </v:shape>
-          <o:OLEObject Type="Embed" ProgID="Equation.DSMT4" ShapeID="_x0000_i1124" DrawAspect="Content" ObjectID="_1611677549" r:id="rId206"/>
+          <o:OLEObject Type="Embed" ProgID="Equation.DSMT4" ShapeID="_x0000_i1124" DrawAspect="Content" ObjectID="_1611678650" r:id="rId206"/>
         </w:object>
       </w:r>
       <w:r>
@@ -15617,7 +15617,7 @@
           <v:shape id="_x0000_i1125" type="#_x0000_t75" style="width:24pt;height:18pt" o:ole="">
             <v:imagedata r:id="rId207" o:title=""/>
           </v:shape>
-          <o:OLEObject Type="Embed" ProgID="Equation.DSMT4" ShapeID="_x0000_i1125" DrawAspect="Content" ObjectID="_1611677550" r:id="rId208"/>
+          <o:OLEObject Type="Embed" ProgID="Equation.DSMT4" ShapeID="_x0000_i1125" DrawAspect="Content" ObjectID="_1611678651" r:id="rId208"/>
         </w:object>
       </w:r>
       <w:r>
@@ -15660,7 +15660,7 @@
           <v:shape id="_x0000_i1126" type="#_x0000_t75" style="width:34.5pt;height:18pt" o:ole="">
             <v:imagedata r:id="rId209" o:title=""/>
           </v:shape>
-          <o:OLEObject Type="Embed" ProgID="Equation.DSMT4" ShapeID="_x0000_i1126" DrawAspect="Content" ObjectID="_1611677551" r:id="rId210"/>
+          <o:OLEObject Type="Embed" ProgID="Equation.DSMT4" ShapeID="_x0000_i1126" DrawAspect="Content" ObjectID="_1611678652" r:id="rId210"/>
         </w:object>
       </w:r>
       <w:r>
@@ -15851,7 +15851,7 @@
           <v:shape id="_x0000_i1127" type="#_x0000_t75" style="width:1in;height:19.5pt" o:ole="">
             <v:imagedata r:id="rId16" o:title=""/>
           </v:shape>
-          <o:OLEObject Type="Embed" ProgID="Equation.DSMT4" ShapeID="_x0000_i1127" DrawAspect="Content" ObjectID="_1611677552" r:id="rId211"/>
+          <o:OLEObject Type="Embed" ProgID="Equation.DSMT4" ShapeID="_x0000_i1127" DrawAspect="Content" ObjectID="_1611678653" r:id="rId211"/>
         </w:object>
       </w:r>
       <w:commentRangeEnd w:id="20"/>
@@ -15914,7 +15914,7 @@
           <v:shape id="_x0000_i1128" type="#_x0000_t75" style="width:34.5pt;height:19.5pt" o:ole="">
             <v:imagedata r:id="rId212" o:title=""/>
           </v:shape>
-          <o:OLEObject Type="Embed" ProgID="Equation.DSMT4" ShapeID="_x0000_i1128" DrawAspect="Content" ObjectID="_1611677553" r:id="rId213"/>
+          <o:OLEObject Type="Embed" ProgID="Equation.DSMT4" ShapeID="_x0000_i1128" DrawAspect="Content" ObjectID="_1611678654" r:id="rId213"/>
         </w:object>
       </w:r>
       <w:r>
@@ -15950,7 +15950,7 @@
           <v:shape id="_x0000_i1129" type="#_x0000_t75" style="width:60pt;height:33pt" o:ole="">
             <v:imagedata r:id="rId214" o:title=""/>
           </v:shape>
-          <o:OLEObject Type="Embed" ProgID="Equation.DSMT4" ShapeID="_x0000_i1129" DrawAspect="Content" ObjectID="_1611677554" r:id="rId215"/>
+          <o:OLEObject Type="Embed" ProgID="Equation.DSMT4" ShapeID="_x0000_i1129" DrawAspect="Content" ObjectID="_1611678655" r:id="rId215"/>
         </w:object>
       </w:r>
       <w:r>
@@ -16056,7 +16056,7 @@
           <v:shape id="_x0000_i1130" type="#_x0000_t75" style="width:34.5pt;height:19.5pt" o:ole="">
             <v:imagedata r:id="rId216" o:title=""/>
           </v:shape>
-          <o:OLEObject Type="Embed" ProgID="Equation.DSMT4" ShapeID="_x0000_i1130" DrawAspect="Content" ObjectID="_1611677555" r:id="rId217"/>
+          <o:OLEObject Type="Embed" ProgID="Equation.DSMT4" ShapeID="_x0000_i1130" DrawAspect="Content" ObjectID="_1611678656" r:id="rId217"/>
         </w:object>
       </w:r>
       <w:r>
@@ -16102,7 +16102,7 @@
           <v:shape id="_x0000_i1131" type="#_x0000_t75" style="width:121.5pt;height:19.5pt" o:ole="">
             <v:imagedata r:id="rId218" o:title=""/>
           </v:shape>
-          <o:OLEObject Type="Embed" ProgID="Equation.DSMT4" ShapeID="_x0000_i1131" DrawAspect="Content" ObjectID="_1611677556" r:id="rId219"/>
+          <o:OLEObject Type="Embed" ProgID="Equation.DSMT4" ShapeID="_x0000_i1131" DrawAspect="Content" ObjectID="_1611678657" r:id="rId219"/>
         </w:object>
       </w:r>
       <w:r>
@@ -16178,7 +16178,7 @@
           <v:shape id="_x0000_i1132" type="#_x0000_t75" style="width:75pt;height:19.5pt" o:ole="">
             <v:imagedata r:id="rId220" o:title=""/>
           </v:shape>
-          <o:OLEObject Type="Embed" ProgID="Equation.DSMT4" ShapeID="_x0000_i1132" DrawAspect="Content" ObjectID="_1611677557" r:id="rId221"/>
+          <o:OLEObject Type="Embed" ProgID="Equation.DSMT4" ShapeID="_x0000_i1132" DrawAspect="Content" ObjectID="_1611678658" r:id="rId221"/>
         </w:object>
       </w:r>
       <w:r>
@@ -16314,7 +16314,7 @@
           <v:shape id="_x0000_i1133" type="#_x0000_t75" style="width:12pt;height:13.5pt" o:ole="">
             <v:imagedata r:id="rId222" o:title=""/>
           </v:shape>
-          <o:OLEObject Type="Embed" ProgID="Equation.DSMT4" ShapeID="_x0000_i1133" DrawAspect="Content" ObjectID="_1611677558" r:id="rId223"/>
+          <o:OLEObject Type="Embed" ProgID="Equation.DSMT4" ShapeID="_x0000_i1133" DrawAspect="Content" ObjectID="_1611678659" r:id="rId223"/>
         </w:object>
       </w:r>
       <w:r>
@@ -16391,7 +16391,7 @@
           <v:shape id="_x0000_i1134" type="#_x0000_t75" style="width:46.5pt;height:18pt" o:ole="">
             <v:imagedata r:id="rId224" o:title=""/>
           </v:shape>
-          <o:OLEObject Type="Embed" ProgID="Equation.DSMT4" ShapeID="_x0000_i1134" DrawAspect="Content" ObjectID="_1611677559" r:id="rId225"/>
+          <o:OLEObject Type="Embed" ProgID="Equation.DSMT4" ShapeID="_x0000_i1134" DrawAspect="Content" ObjectID="_1611678660" r:id="rId225"/>
         </w:object>
       </w:r>
       <w:r>
@@ -16415,7 +16415,7 @@
           <v:shape id="_x0000_i1135" type="#_x0000_t75" style="width:58.5pt;height:16.5pt" o:ole="">
             <v:imagedata r:id="rId226" o:title=""/>
           </v:shape>
-          <o:OLEObject Type="Embed" ProgID="Equation.DSMT4" ShapeID="_x0000_i1135" DrawAspect="Content" ObjectID="_1611677560" r:id="rId227"/>
+          <o:OLEObject Type="Embed" ProgID="Equation.DSMT4" ShapeID="_x0000_i1135" DrawAspect="Content" ObjectID="_1611678661" r:id="rId227"/>
         </w:object>
       </w:r>
     </w:p>
@@ -16443,7 +16443,7 @@
           <v:shape id="_x0000_i1136" type="#_x0000_t75" style="width:184.5pt;height:22.5pt" o:ole="">
             <v:imagedata r:id="rId228" o:title=""/>
           </v:shape>
-          <o:OLEObject Type="Embed" ProgID="Equation.DSMT4" ShapeID="_x0000_i1136" DrawAspect="Content" ObjectID="_1611677561" r:id="rId229"/>
+          <o:OLEObject Type="Embed" ProgID="Equation.DSMT4" ShapeID="_x0000_i1136" DrawAspect="Content" ObjectID="_1611678662" r:id="rId229"/>
         </w:object>
       </w:r>
     </w:p>
@@ -16470,7 +16470,7 @@
           <v:shape id="_x0000_i1137" type="#_x0000_t75" style="width:126pt;height:34.5pt" o:ole="">
             <v:imagedata r:id="rId230" o:title=""/>
           </v:shape>
-          <o:OLEObject Type="Embed" ProgID="Equation.DSMT4" ShapeID="_x0000_i1137" DrawAspect="Content" ObjectID="_1611677562" r:id="rId231"/>
+          <o:OLEObject Type="Embed" ProgID="Equation.DSMT4" ShapeID="_x0000_i1137" DrawAspect="Content" ObjectID="_1611678663" r:id="rId231"/>
         </w:object>
       </w:r>
       <w:r>
@@ -16493,7 +16493,7 @@
           <v:shape id="_x0000_i1138" type="#_x0000_t75" style="width:109.5pt;height:22.5pt" o:ole="">
             <v:imagedata r:id="rId232" o:title=""/>
           </v:shape>
-          <o:OLEObject Type="Embed" ProgID="Equation.DSMT4" ShapeID="_x0000_i1138" DrawAspect="Content" ObjectID="_1611677563" r:id="rId233"/>
+          <o:OLEObject Type="Embed" ProgID="Equation.DSMT4" ShapeID="_x0000_i1138" DrawAspect="Content" ObjectID="_1611678664" r:id="rId233"/>
         </w:object>
       </w:r>
     </w:p>
@@ -16520,7 +16520,7 @@
           <v:shape id="_x0000_i1139" type="#_x0000_t75" style="width:46.5pt;height:33pt" o:ole="">
             <v:imagedata r:id="rId234" o:title=""/>
           </v:shape>
-          <o:OLEObject Type="Embed" ProgID="Equation.DSMT4" ShapeID="_x0000_i1139" DrawAspect="Content" ObjectID="_1611677564" r:id="rId235"/>
+          <o:OLEObject Type="Embed" ProgID="Equation.DSMT4" ShapeID="_x0000_i1139" DrawAspect="Content" ObjectID="_1611678665" r:id="rId235"/>
         </w:object>
       </w:r>
     </w:p>
@@ -16547,7 +16547,7 @@
           <v:shape id="_x0000_i1140" type="#_x0000_t75" style="width:142.5pt;height:34.5pt" o:ole="">
             <v:imagedata r:id="rId236" o:title=""/>
           </v:shape>
-          <o:OLEObject Type="Embed" ProgID="Equation.DSMT4" ShapeID="_x0000_i1140" DrawAspect="Content" ObjectID="_1611677565" r:id="rId237"/>
+          <o:OLEObject Type="Embed" ProgID="Equation.DSMT4" ShapeID="_x0000_i1140" DrawAspect="Content" ObjectID="_1611678666" r:id="rId237"/>
         </w:object>
       </w:r>
     </w:p>
@@ -16575,7 +16575,7 @@
           <v:shape id="_x0000_i1141" type="#_x0000_t75" style="width:111pt;height:33pt" o:ole="">
             <v:imagedata r:id="rId238" o:title=""/>
           </v:shape>
-          <o:OLEObject Type="Embed" ProgID="Equation.DSMT4" ShapeID="_x0000_i1141" DrawAspect="Content" ObjectID="_1611677566" r:id="rId239"/>
+          <o:OLEObject Type="Embed" ProgID="Equation.DSMT4" ShapeID="_x0000_i1141" DrawAspect="Content" ObjectID="_1611678667" r:id="rId239"/>
         </w:object>
       </w:r>
       <w:r>
@@ -16599,7 +16599,7 @@
           <v:shape id="_x0000_i1142" type="#_x0000_t75" style="width:49.5pt;height:13.5pt" o:ole="">
             <v:imagedata r:id="rId240" o:title=""/>
           </v:shape>
-          <o:OLEObject Type="Embed" ProgID="Equation.DSMT4" ShapeID="_x0000_i1142" DrawAspect="Content" ObjectID="_1611677567" r:id="rId241"/>
+          <o:OLEObject Type="Embed" ProgID="Equation.DSMT4" ShapeID="_x0000_i1142" DrawAspect="Content" ObjectID="_1611678668" r:id="rId241"/>
         </w:object>
       </w:r>
       <w:r>
@@ -16624,7 +16624,7 @@
           <v:shape id="_x0000_i1143" type="#_x0000_t75" style="width:57pt;height:16.5pt" o:ole="">
             <v:imagedata r:id="rId242" o:title=""/>
           </v:shape>
-          <o:OLEObject Type="Embed" ProgID="Equation.DSMT4" ShapeID="_x0000_i1143" DrawAspect="Content" ObjectID="_1611677568" r:id="rId243"/>
+          <o:OLEObject Type="Embed" ProgID="Equation.DSMT4" ShapeID="_x0000_i1143" DrawAspect="Content" ObjectID="_1611678669" r:id="rId243"/>
         </w:object>
       </w:r>
       <w:commentRangeEnd w:id="21"/>
@@ -16655,7 +16655,7 @@
           <v:shape id="_x0000_i1144" type="#_x0000_t75" style="width:27pt;height:13.5pt" o:ole="">
             <v:imagedata r:id="rId244" o:title=""/>
           </v:shape>
-          <o:OLEObject Type="Embed" ProgID="Equation.DSMT4" ShapeID="_x0000_i1144" DrawAspect="Content" ObjectID="_1611677569" r:id="rId245"/>
+          <o:OLEObject Type="Embed" ProgID="Equation.DSMT4" ShapeID="_x0000_i1144" DrawAspect="Content" ObjectID="_1611678670" r:id="rId245"/>
         </w:object>
       </w:r>
     </w:p>
@@ -16696,7 +16696,7 @@
           <v:shape id="_x0000_i1145" type="#_x0000_t75" style="width:430.5pt;height:43.5pt" o:ole="">
             <v:imagedata r:id="rId246" o:title=""/>
           </v:shape>
-          <o:OLEObject Type="Embed" ProgID="Equation.DSMT4" ShapeID="_x0000_i1145" DrawAspect="Content" ObjectID="_1611677570" r:id="rId247"/>
+          <o:OLEObject Type="Embed" ProgID="Equation.DSMT4" ShapeID="_x0000_i1145" DrawAspect="Content" ObjectID="_1611678671" r:id="rId247"/>
         </w:object>
       </w:r>
     </w:p>
@@ -16737,7 +16737,7 @@
           <v:shape id="_x0000_i1146" type="#_x0000_t75" style="width:357pt;height:33pt" o:ole="">
             <v:imagedata r:id="rId248" o:title=""/>
           </v:shape>
-          <o:OLEObject Type="Embed" ProgID="Equation.DSMT4" ShapeID="_x0000_i1146" DrawAspect="Content" ObjectID="_1611677571" r:id="rId249"/>
+          <o:OLEObject Type="Embed" ProgID="Equation.DSMT4" ShapeID="_x0000_i1146" DrawAspect="Content" ObjectID="_1611678672" r:id="rId249"/>
         </w:object>
       </w:r>
     </w:p>
@@ -16773,7 +16773,7 @@
           <v:shape id="_x0000_i1147" type="#_x0000_t75" style="width:353.25pt;height:40.5pt" o:ole="">
             <v:imagedata r:id="rId250" o:title=""/>
           </v:shape>
-          <o:OLEObject Type="Embed" ProgID="Equation.DSMT4" ShapeID="_x0000_i1147" DrawAspect="Content" ObjectID="_1611677572" r:id="rId251"/>
+          <o:OLEObject Type="Embed" ProgID="Equation.DSMT4" ShapeID="_x0000_i1147" DrawAspect="Content" ObjectID="_1611678673" r:id="rId251"/>
         </w:object>
       </w:r>
     </w:p>
@@ -16801,7 +16801,7 @@
           <v:shape id="_x0000_i1148" type="#_x0000_t75" style="width:412.5pt;height:42pt" o:ole="">
             <v:imagedata r:id="rId252" o:title=""/>
           </v:shape>
-          <o:OLEObject Type="Embed" ProgID="Equation.DSMT4" ShapeID="_x0000_i1148" DrawAspect="Content" ObjectID="_1611677573" r:id="rId253"/>
+          <o:OLEObject Type="Embed" ProgID="Equation.DSMT4" ShapeID="_x0000_i1148" DrawAspect="Content" ObjectID="_1611678674" r:id="rId253"/>
         </w:object>
       </w:r>
       <w:r>
@@ -16837,7 +16837,7 @@
           <v:shape id="_x0000_i1149" type="#_x0000_t75" style="width:271.5pt;height:39pt" o:ole="">
             <v:imagedata r:id="rId254" o:title=""/>
           </v:shape>
-          <o:OLEObject Type="Embed" ProgID="Equation.DSMT4" ShapeID="_x0000_i1149" DrawAspect="Content" ObjectID="_1611677574" r:id="rId255"/>
+          <o:OLEObject Type="Embed" ProgID="Equation.DSMT4" ShapeID="_x0000_i1149" DrawAspect="Content" ObjectID="_1611678675" r:id="rId255"/>
         </w:object>
       </w:r>
       <w:r>
@@ -16890,7 +16890,7 @@
           <v:shape id="_x0000_i1150" type="#_x0000_t75" style="width:97.5pt;height:19.5pt" o:ole="">
             <v:imagedata r:id="rId58" o:title=""/>
           </v:shape>
-          <o:OLEObject Type="Embed" ProgID="Equation.DSMT4" ShapeID="_x0000_i1150" DrawAspect="Content" ObjectID="_1611677575" r:id="rId256"/>
+          <o:OLEObject Type="Embed" ProgID="Equation.DSMT4" ShapeID="_x0000_i1150" DrawAspect="Content" ObjectID="_1611678676" r:id="rId256"/>
         </w:object>
       </w:r>
       <w:r>
@@ -16924,7 +16924,7 @@
           <v:shape id="_x0000_i1151" type="#_x0000_t75" style="width:61.5pt;height:33pt" o:ole="">
             <v:imagedata r:id="rId257" o:title=""/>
           </v:shape>
-          <o:OLEObject Type="Embed" ProgID="Equation.DSMT4" ShapeID="_x0000_i1151" DrawAspect="Content" ObjectID="_1611677576" r:id="rId258"/>
+          <o:OLEObject Type="Embed" ProgID="Equation.DSMT4" ShapeID="_x0000_i1151" DrawAspect="Content" ObjectID="_1611678677" r:id="rId258"/>
         </w:object>
       </w:r>
       <w:r>
@@ -16974,7 +16974,7 @@
           <v:shape id="_x0000_i1152" type="#_x0000_t75" style="width:357pt;height:33pt" o:ole="">
             <v:imagedata r:id="rId259" o:title=""/>
           </v:shape>
-          <o:OLEObject Type="Embed" ProgID="Equation.DSMT4" ShapeID="_x0000_i1152" DrawAspect="Content" ObjectID="_1611677577" r:id="rId260"/>
+          <o:OLEObject Type="Embed" ProgID="Equation.DSMT4" ShapeID="_x0000_i1152" DrawAspect="Content" ObjectID="_1611678678" r:id="rId260"/>
         </w:object>
       </w:r>
     </w:p>
@@ -17002,7 +17002,7 @@
           <v:shape id="_x0000_i1153" type="#_x0000_t75" style="width:418.5pt;height:34.5pt" o:ole="">
             <v:imagedata r:id="rId261" o:title=""/>
           </v:shape>
-          <o:OLEObject Type="Embed" ProgID="Equation.DSMT4" ShapeID="_x0000_i1153" DrawAspect="Content" ObjectID="_1611677578" r:id="rId262"/>
+          <o:OLEObject Type="Embed" ProgID="Equation.DSMT4" ShapeID="_x0000_i1153" DrawAspect="Content" ObjectID="_1611678679" r:id="rId262"/>
         </w:object>
       </w:r>
     </w:p>
@@ -17046,7 +17046,7 @@
           <v:shape id="_x0000_i1154" type="#_x0000_t75" style="width:76.5pt;height:19.5pt" o:ole="">
             <v:imagedata r:id="rId263" o:title=""/>
           </v:shape>
-          <o:OLEObject Type="Embed" ProgID="Equation.DSMT4" ShapeID="_x0000_i1154" DrawAspect="Content" ObjectID="_1611677579" r:id="rId264"/>
+          <o:OLEObject Type="Embed" ProgID="Equation.DSMT4" ShapeID="_x0000_i1154" DrawAspect="Content" ObjectID="_1611678680" r:id="rId264"/>
         </w:object>
       </w:r>
       <w:r>
@@ -17070,7 +17070,7 @@
           <v:shape id="_x0000_i1155" type="#_x0000_t75" style="width:277.5pt;height:19.5pt" o:ole="">
             <v:imagedata r:id="rId265" o:title=""/>
           </v:shape>
-          <o:OLEObject Type="Embed" ProgID="Equation.DSMT4" ShapeID="_x0000_i1155" DrawAspect="Content" ObjectID="_1611677580" r:id="rId266"/>
+          <o:OLEObject Type="Embed" ProgID="Equation.DSMT4" ShapeID="_x0000_i1155" DrawAspect="Content" ObjectID="_1611678681" r:id="rId266"/>
         </w:object>
       </w:r>
     </w:p>
@@ -17098,7 +17098,7 @@
           <v:shape id="_x0000_i1156" type="#_x0000_t75" style="width:205.5pt;height:19.5pt" o:ole="">
             <v:imagedata r:id="rId267" o:title=""/>
           </v:shape>
-          <o:OLEObject Type="Embed" ProgID="Equation.DSMT4" ShapeID="_x0000_i1156" DrawAspect="Content" ObjectID="_1611677581" r:id="rId268"/>
+          <o:OLEObject Type="Embed" ProgID="Equation.DSMT4" ShapeID="_x0000_i1156" DrawAspect="Content" ObjectID="_1611678682" r:id="rId268"/>
         </w:object>
       </w:r>
     </w:p>
@@ -17145,7 +17145,7 @@
           <v:shape id="_x0000_i1157" type="#_x0000_t75" style="width:58.5pt;height:16.5pt" o:ole="">
             <v:imagedata r:id="rId269" o:title=""/>
           </v:shape>
-          <o:OLEObject Type="Embed" ProgID="Equation.DSMT4" ShapeID="_x0000_i1157" DrawAspect="Content" ObjectID="_1611677582" r:id="rId270"/>
+          <o:OLEObject Type="Embed" ProgID="Equation.DSMT4" ShapeID="_x0000_i1157" DrawAspect="Content" ObjectID="_1611678683" r:id="rId270"/>
         </w:object>
       </w:r>
       <w:r>
@@ -17170,7 +17170,7 @@
           <v:shape id="_x0000_i1158" type="#_x0000_t75" style="width:373.5pt;height:34.5pt" o:ole="">
             <v:imagedata r:id="rId271" o:title=""/>
           </v:shape>
-          <o:OLEObject Type="Embed" ProgID="Equation.DSMT4" ShapeID="_x0000_i1158" DrawAspect="Content" ObjectID="_1611677583" r:id="rId272"/>
+          <o:OLEObject Type="Embed" ProgID="Equation.DSMT4" ShapeID="_x0000_i1158" DrawAspect="Content" ObjectID="_1611678684" r:id="rId272"/>
         </w:object>
       </w:r>
       <w:r>
@@ -17216,7 +17216,7 @@
           <v:shape id="_x0000_i1159" type="#_x0000_t75" style="width:361.5pt;height:43.5pt" o:ole="">
             <v:imagedata r:id="rId273" o:title=""/>
           </v:shape>
-          <o:OLEObject Type="Embed" ProgID="Equation.DSMT4" ShapeID="_x0000_i1159" DrawAspect="Content" ObjectID="_1611677584" r:id="rId274"/>
+          <o:OLEObject Type="Embed" ProgID="Equation.DSMT4" ShapeID="_x0000_i1159" DrawAspect="Content" ObjectID="_1611678685" r:id="rId274"/>
         </w:object>
       </w:r>
     </w:p>
@@ -17345,7 +17345,7 @@
           <v:shape id="_x0000_i1160" type="#_x0000_t75" style="width:27pt;height:13.5pt" o:ole="">
             <v:imagedata r:id="rId275" o:title=""/>
           </v:shape>
-          <o:OLEObject Type="Embed" ProgID="Equation.DSMT4" ShapeID="_x0000_i1160" DrawAspect="Content" ObjectID="_1611677585" r:id="rId276"/>
+          <o:OLEObject Type="Embed" ProgID="Equation.DSMT4" ShapeID="_x0000_i1160" DrawAspect="Content" ObjectID="_1611678686" r:id="rId276"/>
         </w:object>
       </w:r>
       <w:r>
@@ -17388,7 +17388,7 @@
           <v:shape id="_x0000_i1161" type="#_x0000_t75" style="width:81pt;height:33pt" o:ole="">
             <v:imagedata r:id="rId277" o:title=""/>
           </v:shape>
-          <o:OLEObject Type="Embed" ProgID="Equation.DSMT4" ShapeID="_x0000_i1161" DrawAspect="Content" ObjectID="_1611677586" r:id="rId278"/>
+          <o:OLEObject Type="Embed" ProgID="Equation.DSMT4" ShapeID="_x0000_i1161" DrawAspect="Content" ObjectID="_1611678687" r:id="rId278"/>
         </w:object>
       </w:r>
     </w:p>
@@ -17478,7 +17478,7 @@
           <v:shape id="_x0000_i1162" type="#_x0000_t75" style="width:19.5pt;height:18pt" o:ole="">
             <v:imagedata r:id="rId279" o:title=""/>
           </v:shape>
-          <o:OLEObject Type="Embed" ProgID="Equation.DSMT4" ShapeID="_x0000_i1162" DrawAspect="Content" ObjectID="_1611677587" r:id="rId280"/>
+          <o:OLEObject Type="Embed" ProgID="Equation.DSMT4" ShapeID="_x0000_i1162" DrawAspect="Content" ObjectID="_1611678688" r:id="rId280"/>
         </w:object>
       </w:r>
     </w:p>
@@ -17504,7 +17504,7 @@
         </w:rPr>
         <w:t xml:space="preserve">1. </w:t>
       </w:r>
-      <w:commentRangeStart w:id="23"/>
+      <w:commentRangeStart w:id="24"/>
       <w:r>
         <w:rPr>
           <w:rFonts w:ascii="Times New Roman" w:eastAsia="Calibri" w:hAnsi="Times New Roman" w:cs="Times New Roman"/>
@@ -17517,15 +17517,15 @@
           <v:shape id="_x0000_i1163" type="#_x0000_t75" style="width:103.5pt;height:46.5pt" o:ole="">
             <v:imagedata r:id="rId281" o:title=""/>
           </v:shape>
-          <o:OLEObject Type="Embed" ProgID="Equation.DSMT4" ShapeID="_x0000_i1163" DrawAspect="Content" ObjectID="_1611677588" r:id="rId282"/>
+          <o:OLEObject Type="Embed" ProgID="Equation.DSMT4" ShapeID="_x0000_i1163" DrawAspect="Content" ObjectID="_1611678689" r:id="rId282"/>
         </w:object>
       </w:r>
-      <w:commentRangeEnd w:id="23"/>
+      <w:commentRangeEnd w:id="24"/>
       <w:r>
         <w:rPr>
           <w:rStyle w:val="CommentReference"/>
         </w:rPr>
-        <w:commentReference w:id="23"/>
+        <w:commentReference w:id="24"/>
       </w:r>
       <w:r>
         <w:rPr>
@@ -17585,7 +17585,7 @@
         <w:t>If</w:t>
       </w:r>
     </w:p>
-    <w:commentRangeStart w:id="24"/>
+    <w:commentRangeStart w:id="25"/>
     <w:p>
       <w:pPr>
         <w:spacing w:line="240" w:lineRule="auto"/>
@@ -17611,15 +17611,15 @@
           <v:shape id="_x0000_i1164" type="#_x0000_t75" style="width:129pt;height:19.5pt" o:ole="">
             <v:imagedata r:id="rId283" o:title=""/>
           </v:shape>
-          <o:OLEObject Type="Embed" ProgID="Equation.DSMT4" ShapeID="_x0000_i1164" DrawAspect="Content" ObjectID="_1611677589" r:id="rId284"/>
+          <o:OLEObject Type="Embed" ProgID="Equation.DSMT4" ShapeID="_x0000_i1164" DrawAspect="Content" ObjectID="_1611678690" r:id="rId284"/>
         </w:object>
       </w:r>
-      <w:commentRangeEnd w:id="24"/>
+      <w:commentRangeEnd w:id="25"/>
       <w:r>
         <w:rPr>
           <w:rStyle w:val="CommentReference"/>
         </w:rPr>
-        <w:commentReference w:id="24"/>
+        <w:commentReference w:id="25"/>
       </w:r>
       <w:r>
         <w:rPr>
@@ -17674,7 +17674,7 @@
           <v:shape id="_x0000_i1165" type="#_x0000_t75" style="width:34.5pt;height:18pt" o:ole="">
             <v:imagedata r:id="rId285" o:title=""/>
           </v:shape>
-          <o:OLEObject Type="Embed" ProgID="Equation.DSMT4" ShapeID="_x0000_i1165" DrawAspect="Content" ObjectID="_1611677590" r:id="rId286"/>
+          <o:OLEObject Type="Embed" ProgID="Equation.DSMT4" ShapeID="_x0000_i1165" DrawAspect="Content" ObjectID="_1611678691" r:id="rId286"/>
         </w:object>
       </w:r>
       <w:r>
@@ -17720,7 +17720,7 @@
         <w:lastRenderedPageBreak/>
         <w:t xml:space="preserve">2. </w:t>
       </w:r>
-      <w:commentRangeStart w:id="25"/>
+      <w:commentRangeStart w:id="26"/>
       <w:r>
         <w:rPr>
           <w:rFonts w:ascii="Times New Roman" w:eastAsia="Calibri" w:hAnsi="Times New Roman" w:cs="Times New Roman"/>
@@ -17733,15 +17733,15 @@
           <v:shape id="_x0000_i1166" type="#_x0000_t75" style="width:118.5pt;height:46.5pt" o:ole="">
             <v:imagedata r:id="rId287" o:title=""/>
           </v:shape>
-          <o:OLEObject Type="Embed" ProgID="Equation.DSMT4" ShapeID="_x0000_i1166" DrawAspect="Content" ObjectID="_1611677591" r:id="rId288"/>
+          <o:OLEObject Type="Embed" ProgID="Equation.DSMT4" ShapeID="_x0000_i1166" DrawAspect="Content" ObjectID="_1611678692" r:id="rId288"/>
         </w:object>
       </w:r>
-      <w:commentRangeEnd w:id="25"/>
+      <w:commentRangeEnd w:id="26"/>
       <w:r>
         <w:rPr>
           <w:rStyle w:val="CommentReference"/>
         </w:rPr>
-        <w:commentReference w:id="25"/>
+        <w:commentReference w:id="26"/>
       </w:r>
       <w:r>
         <w:rPr>
@@ -17766,7 +17766,7 @@
           <v:shape id="_x0000_i1167" type="#_x0000_t75" style="width:99pt;height:24pt" o:ole="">
             <v:imagedata r:id="rId289" o:title=""/>
           </v:shape>
-          <o:OLEObject Type="Embed" ProgID="Equation.DSMT4" ShapeID="_x0000_i1167" DrawAspect="Content" ObjectID="_1611677592" r:id="rId290"/>
+          <o:OLEObject Type="Embed" ProgID="Equation.DSMT4" ShapeID="_x0000_i1167" DrawAspect="Content" ObjectID="_1611678693" r:id="rId290"/>
         </w:object>
       </w:r>
       <w:r>
@@ -17891,7 +17891,7 @@
           <v:shape id="_x0000_i1168" type="#_x0000_t75" style="width:145.5pt;height:18pt" o:ole="">
             <v:imagedata r:id="rId291" o:title=""/>
           </v:shape>
-          <o:OLEObject Type="Embed" ProgID="Equation.DSMT4" ShapeID="_x0000_i1168" DrawAspect="Content" ObjectID="_1611677593" r:id="rId292"/>
+          <o:OLEObject Type="Embed" ProgID="Equation.DSMT4" ShapeID="_x0000_i1168" DrawAspect="Content" ObjectID="_1611678694" r:id="rId292"/>
         </w:object>
       </w:r>
       <w:r>
@@ -18015,7 +18015,7 @@
           <v:shape id="_x0000_i1169" type="#_x0000_t75" style="width:40.5pt;height:16.5pt" o:ole="">
             <v:imagedata r:id="rId293" o:title=""/>
           </v:shape>
-          <o:OLEObject Type="Embed" ProgID="Equation.DSMT4" ShapeID="_x0000_i1169" DrawAspect="Content" ObjectID="_1611677594" r:id="rId294"/>
+          <o:OLEObject Type="Embed" ProgID="Equation.DSMT4" ShapeID="_x0000_i1169" DrawAspect="Content" ObjectID="_1611678695" r:id="rId294"/>
         </w:object>
       </w:r>
       <w:r>
@@ -18102,7 +18102,7 @@
           <v:shape id="_x0000_i1170" type="#_x0000_t75" style="width:49.5pt;height:18pt" o:ole="">
             <v:imagedata r:id="rId295" o:title=""/>
           </v:shape>
-          <o:OLEObject Type="Embed" ProgID="Equation.DSMT4" ShapeID="_x0000_i1170" DrawAspect="Content" ObjectID="_1611677595" r:id="rId296"/>
+          <o:OLEObject Type="Embed" ProgID="Equation.DSMT4" ShapeID="_x0000_i1170" DrawAspect="Content" ObjectID="_1611678696" r:id="rId296"/>
         </w:object>
       </w:r>
       <w:r>
@@ -18231,12 +18231,12 @@
           <v:shape id="_x0000_i1171" type="#_x0000_t75" style="width:193.5pt;height:46.5pt" o:ole="">
             <v:imagedata r:id="rId297" o:title=""/>
           </v:shape>
-          <o:OLEObject Type="Embed" ProgID="Equation.DSMT4" ShapeID="_x0000_i1171" DrawAspect="Content" ObjectID="_1611677596" r:id="rId298"/>
+          <o:OLEObject Type="Embed" ProgID="Equation.DSMT4" ShapeID="_x0000_i1171" DrawAspect="Content" ObjectID="_1611678697" r:id="rId298"/>
         </w:object>
       </w:r>
     </w:p>
-    <w:commentRangeStart w:id="26"/>
     <w:commentRangeStart w:id="27"/>
+    <w:commentRangeStart w:id="28"/>
     <w:p>
       <w:pPr>
         <w:spacing w:line="240" w:lineRule="auto"/>
@@ -18264,22 +18264,22 @@
           <v:shape id="_x0000_i1172" type="#_x0000_t75" style="width:358.5pt;height:55.5pt" o:ole="">
             <v:imagedata r:id="rId299" o:title=""/>
           </v:shape>
-          <o:OLEObject Type="Embed" ProgID="Equation.DSMT4" ShapeID="_x0000_i1172" DrawAspect="Content" ObjectID="_1611677597" r:id="rId300"/>
+          <o:OLEObject Type="Embed" ProgID="Equation.DSMT4" ShapeID="_x0000_i1172" DrawAspect="Content" ObjectID="_1611678698" r:id="rId300"/>
         </w:object>
       </w:r>
-      <w:commentRangeEnd w:id="26"/>
       <w:commentRangeEnd w:id="27"/>
+      <w:commentRangeEnd w:id="28"/>
       <w:r>
         <w:rPr>
           <w:rStyle w:val="CommentReference"/>
         </w:rPr>
-        <w:commentReference w:id="26"/>
+        <w:commentReference w:id="27"/>
       </w:r>
       <w:r>
         <w:rPr>
           <w:rStyle w:val="CommentReference"/>
         </w:rPr>
-        <w:commentReference w:id="27"/>
+        <w:commentReference w:id="28"/>
       </w:r>
     </w:p>
     <w:p>
@@ -18307,7 +18307,7 @@
           <v:shape id="_x0000_i1173" type="#_x0000_t75" style="width:333pt;height:55.5pt" o:ole="">
             <v:imagedata r:id="rId301" o:title=""/>
           </v:shape>
-          <o:OLEObject Type="Embed" ProgID="Equation.DSMT4" ShapeID="_x0000_i1173" DrawAspect="Content" ObjectID="_1611677598" r:id="rId302"/>
+          <o:OLEObject Type="Embed" ProgID="Equation.DSMT4" ShapeID="_x0000_i1173" DrawAspect="Content" ObjectID="_1611678699" r:id="rId302"/>
         </w:object>
       </w:r>
     </w:p>
@@ -18364,7 +18364,7 @@
           <v:shape id="_x0000_i1174" type="#_x0000_t75" style="width:169.5pt;height:18pt" o:ole="">
             <v:imagedata r:id="rId303" o:title=""/>
           </v:shape>
-          <o:OLEObject Type="Embed" ProgID="Equation.DSMT4" ShapeID="_x0000_i1174" DrawAspect="Content" ObjectID="_1611677599" r:id="rId304"/>
+          <o:OLEObject Type="Embed" ProgID="Equation.DSMT4" ShapeID="_x0000_i1174" DrawAspect="Content" ObjectID="_1611678700" r:id="rId304"/>
         </w:object>
       </w:r>
       <w:r>
@@ -18438,7 +18438,7 @@
           <v:shape id="_x0000_i1175" type="#_x0000_t75" style="width:34.5pt;height:19.5pt" o:ole="">
             <v:imagedata r:id="rId212" o:title=""/>
           </v:shape>
-          <o:OLEObject Type="Embed" ProgID="Equation.DSMT4" ShapeID="_x0000_i1175" DrawAspect="Content" ObjectID="_1611677600" r:id="rId305"/>
+          <o:OLEObject Type="Embed" ProgID="Equation.DSMT4" ShapeID="_x0000_i1175" DrawAspect="Content" ObjectID="_1611678701" r:id="rId305"/>
         </w:object>
       </w:r>
       <w:r>
@@ -18484,7 +18484,7 @@
           <v:shape id="_x0000_i1176" type="#_x0000_t75" style="width:34.5pt;height:19.5pt" o:ole="">
             <v:imagedata r:id="rId216" o:title=""/>
           </v:shape>
-          <o:OLEObject Type="Embed" ProgID="Equation.DSMT4" ShapeID="_x0000_i1176" DrawAspect="Content" ObjectID="_1611677601" r:id="rId306"/>
+          <o:OLEObject Type="Embed" ProgID="Equation.DSMT4" ShapeID="_x0000_i1176" DrawAspect="Content" ObjectID="_1611678702" r:id="rId306"/>
         </w:object>
       </w:r>
       <w:r>
@@ -18533,7 +18533,7 @@
           <v:shape id="_x0000_i1177" type="#_x0000_t75" style="width:301.5pt;height:55.5pt" o:ole="">
             <v:imagedata r:id="rId307" o:title=""/>
           </v:shape>
-          <o:OLEObject Type="Embed" ProgID="Equation.DSMT4" ShapeID="_x0000_i1177" DrawAspect="Content" ObjectID="_1611677602" r:id="rId308"/>
+          <o:OLEObject Type="Embed" ProgID="Equation.DSMT4" ShapeID="_x0000_i1177" DrawAspect="Content" ObjectID="_1611678703" r:id="rId308"/>
         </w:object>
       </w:r>
     </w:p>
@@ -18581,7 +18581,7 @@
           <v:shape id="_x0000_i1178" type="#_x0000_t75" style="width:139.5pt;height:36pt" o:ole="">
             <v:imagedata r:id="rId309" o:title=""/>
           </v:shape>
-          <o:OLEObject Type="Embed" ProgID="Equation.DSMT4" ShapeID="_x0000_i1178" DrawAspect="Content" ObjectID="_1611677603" r:id="rId310"/>
+          <o:OLEObject Type="Embed" ProgID="Equation.DSMT4" ShapeID="_x0000_i1178" DrawAspect="Content" ObjectID="_1611678704" r:id="rId310"/>
         </w:object>
       </w:r>
     </w:p>
@@ -18608,7 +18608,7 @@
           <v:shape id="_x0000_i1179" type="#_x0000_t75" style="width:380.25pt;height:37.5pt" o:ole="">
             <v:imagedata r:id="rId311" o:title=""/>
           </v:shape>
-          <o:OLEObject Type="Embed" ProgID="Equation.DSMT4" ShapeID="_x0000_i1179" DrawAspect="Content" ObjectID="_1611677604" r:id="rId312"/>
+          <o:OLEObject Type="Embed" ProgID="Equation.DSMT4" ShapeID="_x0000_i1179" DrawAspect="Content" ObjectID="_1611678705" r:id="rId312"/>
         </w:object>
       </w:r>
     </w:p>
@@ -18637,7 +18637,7 @@
           <v:shape id="_x0000_i1180" type="#_x0000_t75" style="width:152.25pt;height:61.5pt" o:ole="">
             <v:imagedata r:id="rId313" o:title=""/>
           </v:shape>
-          <o:OLEObject Type="Embed" ProgID="Equation.DSMT4" ShapeID="_x0000_i1180" DrawAspect="Content" ObjectID="_1611677605" r:id="rId314"/>
+          <o:OLEObject Type="Embed" ProgID="Equation.DSMT4" ShapeID="_x0000_i1180" DrawAspect="Content" ObjectID="_1611678706" r:id="rId314"/>
         </w:object>
       </w:r>
     </w:p>
@@ -18666,7 +18666,7 @@
           <v:shape id="_x0000_i1181" type="#_x0000_t75" style="width:142.5pt;height:37.5pt" o:ole="">
             <v:imagedata r:id="rId315" o:title=""/>
           </v:shape>
-          <o:OLEObject Type="Embed" ProgID="Equation.DSMT4" ShapeID="_x0000_i1181" DrawAspect="Content" ObjectID="_1611677606" r:id="rId316"/>
+          <o:OLEObject Type="Embed" ProgID="Equation.DSMT4" ShapeID="_x0000_i1181" DrawAspect="Content" ObjectID="_1611678707" r:id="rId316"/>
         </w:object>
       </w:r>
     </w:p>
@@ -18696,7 +18696,7 @@
           <v:shape id="_x0000_i1182" type="#_x0000_t75" style="width:31.5pt;height:18pt" o:ole="">
             <v:imagedata r:id="rId317" o:title=""/>
           </v:shape>
-          <o:OLEObject Type="Embed" ProgID="Equation.DSMT4" ShapeID="_x0000_i1182" DrawAspect="Content" ObjectID="_1611677607" r:id="rId318"/>
+          <o:OLEObject Type="Embed" ProgID="Equation.DSMT4" ShapeID="_x0000_i1182" DrawAspect="Content" ObjectID="_1611678708" r:id="rId318"/>
         </w:object>
       </w:r>
       <w:r>
@@ -18748,7 +18748,7 @@
           <v:shape id="_x0000_i1183" type="#_x0000_t75" style="width:256.5pt;height:37.5pt" o:ole="">
             <v:imagedata r:id="rId319" o:title=""/>
           </v:shape>
-          <o:OLEObject Type="Embed" ProgID="Equation.DSMT4" ShapeID="_x0000_i1183" DrawAspect="Content" ObjectID="_1611677608" r:id="rId320"/>
+          <o:OLEObject Type="Embed" ProgID="Equation.DSMT4" ShapeID="_x0000_i1183" DrawAspect="Content" ObjectID="_1611678709" r:id="rId320"/>
         </w:object>
       </w:r>
       <w:r>
@@ -18786,7 +18786,7 @@
           <v:shape id="_x0000_i1184" type="#_x0000_t75" style="width:118.5pt;height:19.5pt" o:ole="">
             <v:imagedata r:id="rId321" o:title=""/>
           </v:shape>
-          <o:OLEObject Type="Embed" ProgID="Equation.DSMT4" ShapeID="_x0000_i1184" DrawAspect="Content" ObjectID="_1611677609" r:id="rId322"/>
+          <o:OLEObject Type="Embed" ProgID="Equation.DSMT4" ShapeID="_x0000_i1184" DrawAspect="Content" ObjectID="_1611678710" r:id="rId322"/>
         </w:object>
       </w:r>
     </w:p>
@@ -18815,7 +18815,7 @@
           <v:shape id="_x0000_i1185" type="#_x0000_t75" style="width:361.5pt;height:37.5pt" o:ole="">
             <v:imagedata r:id="rId323" o:title=""/>
           </v:shape>
-          <o:OLEObject Type="Embed" ProgID="Equation.DSMT4" ShapeID="_x0000_i1185" DrawAspect="Content" ObjectID="_1611677610" r:id="rId324"/>
+          <o:OLEObject Type="Embed" ProgID="Equation.DSMT4" ShapeID="_x0000_i1185" DrawAspect="Content" ObjectID="_1611678711" r:id="rId324"/>
         </w:object>
       </w:r>
     </w:p>
@@ -18860,7 +18860,7 @@
           <v:shape id="_x0000_i1186" type="#_x0000_t75" style="width:31.5pt;height:13.5pt" o:ole="">
             <v:imagedata r:id="rId325" o:title=""/>
           </v:shape>
-          <o:OLEObject Type="Embed" ProgID="Equation.DSMT4" ShapeID="_x0000_i1186" DrawAspect="Content" ObjectID="_1611677611" r:id="rId326"/>
+          <o:OLEObject Type="Embed" ProgID="Equation.DSMT4" ShapeID="_x0000_i1186" DrawAspect="Content" ObjectID="_1611678712" r:id="rId326"/>
         </w:object>
       </w:r>
       <w:r>
@@ -18892,7 +18892,7 @@
           <v:shape id="_x0000_i1187" type="#_x0000_t75" style="width:37.5pt;height:13.5pt" o:ole="">
             <v:imagedata r:id="rId327" o:title=""/>
           </v:shape>
-          <o:OLEObject Type="Embed" ProgID="Equation.DSMT4" ShapeID="_x0000_i1187" DrawAspect="Content" ObjectID="_1611677612" r:id="rId328"/>
+          <o:OLEObject Type="Embed" ProgID="Equation.DSMT4" ShapeID="_x0000_i1187" DrawAspect="Content" ObjectID="_1611678713" r:id="rId328"/>
         </w:object>
       </w:r>
       <w:r>
@@ -18937,7 +18937,7 @@
           <v:shape id="_x0000_i1188" type="#_x0000_t75" style="width:328.5pt;height:36pt" o:ole="">
             <v:imagedata r:id="rId329" o:title=""/>
           </v:shape>
-          <o:OLEObject Type="Embed" ProgID="Equation.DSMT4" ShapeID="_x0000_i1188" DrawAspect="Content" ObjectID="_1611677613" r:id="rId330"/>
+          <o:OLEObject Type="Embed" ProgID="Equation.DSMT4" ShapeID="_x0000_i1188" DrawAspect="Content" ObjectID="_1611678714" r:id="rId330"/>
         </w:object>
       </w:r>
     </w:p>
@@ -18966,7 +18966,7 @@
           <v:shape id="_x0000_i1189" type="#_x0000_t75" style="width:231.75pt;height:17.25pt" o:ole="">
             <v:imagedata r:id="rId331" o:title=""/>
           </v:shape>
-          <o:OLEObject Type="Embed" ProgID="Equation.DSMT4" ShapeID="_x0000_i1189" DrawAspect="Content" ObjectID="_1611677614" r:id="rId332"/>
+          <o:OLEObject Type="Embed" ProgID="Equation.DSMT4" ShapeID="_x0000_i1189" DrawAspect="Content" ObjectID="_1611678715" r:id="rId332"/>
         </w:object>
       </w:r>
     </w:p>
@@ -19014,7 +19014,7 @@
           <v:shape id="_x0000_i1190" type="#_x0000_t75" style="width:31.5pt;height:13.5pt" o:ole="">
             <v:imagedata r:id="rId333" o:title=""/>
           </v:shape>
-          <o:OLEObject Type="Embed" ProgID="Equation.DSMT4" ShapeID="_x0000_i1190" DrawAspect="Content" ObjectID="_1611677615" r:id="rId334"/>
+          <o:OLEObject Type="Embed" ProgID="Equation.DSMT4" ShapeID="_x0000_i1190" DrawAspect="Content" ObjectID="_1611678716" r:id="rId334"/>
         </w:object>
       </w:r>
       <w:r>
@@ -19048,7 +19048,7 @@
           <v:shape id="_x0000_i1191" type="#_x0000_t75" style="width:37.5pt;height:13.5pt" o:ole="">
             <v:imagedata r:id="rId335" o:title=""/>
           </v:shape>
-          <o:OLEObject Type="Embed" ProgID="Equation.DSMT4" ShapeID="_x0000_i1191" DrawAspect="Content" ObjectID="_1611677616" r:id="rId336"/>
+          <o:OLEObject Type="Embed" ProgID="Equation.DSMT4" ShapeID="_x0000_i1191" DrawAspect="Content" ObjectID="_1611678717" r:id="rId336"/>
         </w:object>
       </w:r>
       <w:r>
@@ -19091,7 +19091,7 @@
           <v:shape id="_x0000_i1192" type="#_x0000_t75" style="width:12pt;height:10.5pt" o:ole="">
             <v:imagedata r:id="rId337" o:title=""/>
           </v:shape>
-          <o:OLEObject Type="Embed" ProgID="Equation.DSMT4" ShapeID="_x0000_i1192" DrawAspect="Content" ObjectID="_1611677617" r:id="rId338"/>
+          <o:OLEObject Type="Embed" ProgID="Equation.DSMT4" ShapeID="_x0000_i1192" DrawAspect="Content" ObjectID="_1611678718" r:id="rId338"/>
         </w:object>
       </w:r>
       <w:r>
@@ -19138,7 +19138,7 @@
           <v:shape id="_x0000_i1193" type="#_x0000_t75" style="width:436.5pt;height:36pt" o:ole="">
             <v:imagedata r:id="rId339" o:title=""/>
           </v:shape>
-          <o:OLEObject Type="Embed" ProgID="Equation.DSMT4" ShapeID="_x0000_i1193" DrawAspect="Content" ObjectID="_1611677618" r:id="rId340"/>
+          <o:OLEObject Type="Embed" ProgID="Equation.DSMT4" ShapeID="_x0000_i1193" DrawAspect="Content" ObjectID="_1611678719" r:id="rId340"/>
         </w:object>
       </w:r>
     </w:p>
@@ -19222,7 +19222,7 @@
           <v:shape id="_x0000_i1194" type="#_x0000_t75" style="width:223.5pt;height:36pt" o:ole="">
             <v:imagedata r:id="rId341" o:title=""/>
           </v:shape>
-          <o:OLEObject Type="Embed" ProgID="Equation.DSMT4" ShapeID="_x0000_i1194" DrawAspect="Content" ObjectID="_1611677619" r:id="rId342"/>
+          <o:OLEObject Type="Embed" ProgID="Equation.DSMT4" ShapeID="_x0000_i1194" DrawAspect="Content" ObjectID="_1611678720" r:id="rId342"/>
         </w:object>
       </w:r>
       <w:r>
@@ -19427,7 +19427,7 @@
           <v:shape id="_x0000_i1195" type="#_x0000_t75" style="width:301.5pt;height:22.5pt" o:ole="">
             <v:imagedata r:id="rId343" o:title=""/>
           </v:shape>
-          <o:OLEObject Type="Embed" ProgID="Equation.DSMT4" ShapeID="_x0000_i1195" DrawAspect="Content" ObjectID="_1611677620" r:id="rId344"/>
+          <o:OLEObject Type="Embed" ProgID="Equation.DSMT4" ShapeID="_x0000_i1195" DrawAspect="Content" ObjectID="_1611678721" r:id="rId344"/>
         </w:object>
       </w:r>
       <w:r>
@@ -19587,7 +19587,7 @@
           <v:shape id="_x0000_i1196" type="#_x0000_t75" style="width:31.5pt;height:13.5pt" o:ole="">
             <v:imagedata r:id="rId333" o:title=""/>
           </v:shape>
-          <o:OLEObject Type="Embed" ProgID="Equation.DSMT4" ShapeID="_x0000_i1196" DrawAspect="Content" ObjectID="_1611677621" r:id="rId345"/>
+          <o:OLEObject Type="Embed" ProgID="Equation.DSMT4" ShapeID="_x0000_i1196" DrawAspect="Content" ObjectID="_1611678722" r:id="rId345"/>
         </w:object>
       </w:r>
       <w:r>
@@ -19621,7 +19621,7 @@
           <v:shape id="_x0000_i1197" type="#_x0000_t75" style="width:37.5pt;height:13.5pt" o:ole="">
             <v:imagedata r:id="rId335" o:title=""/>
           </v:shape>
-          <o:OLEObject Type="Embed" ProgID="Equation.DSMT4" ShapeID="_x0000_i1197" DrawAspect="Content" ObjectID="_1611677622" r:id="rId346"/>
+          <o:OLEObject Type="Embed" ProgID="Equation.DSMT4" ShapeID="_x0000_i1197" DrawAspect="Content" ObjectID="_1611678723" r:id="rId346"/>
         </w:object>
       </w:r>
       <w:r>
@@ -19664,7 +19664,7 @@
           <v:shape id="_x0000_i1198" type="#_x0000_t75" style="width:12pt;height:10.5pt" o:ole="">
             <v:imagedata r:id="rId337" o:title=""/>
           </v:shape>
-          <o:OLEObject Type="Embed" ProgID="Equation.DSMT4" ShapeID="_x0000_i1198" DrawAspect="Content" ObjectID="_1611677623" r:id="rId347"/>
+          <o:OLEObject Type="Embed" ProgID="Equation.DSMT4" ShapeID="_x0000_i1198" DrawAspect="Content" ObjectID="_1611678724" r:id="rId347"/>
         </w:object>
       </w:r>
       <w:r>
@@ -19734,7 +19734,7 @@
           <v:shape id="_x0000_i1199" type="#_x0000_t75" style="width:301.5pt;height:37.5pt" o:ole="">
             <v:imagedata r:id="rId348" o:title=""/>
           </v:shape>
-          <o:OLEObject Type="Embed" ProgID="Equation.DSMT4" ShapeID="_x0000_i1199" DrawAspect="Content" ObjectID="_1611677624" r:id="rId349"/>
+          <o:OLEObject Type="Embed" ProgID="Equation.DSMT4" ShapeID="_x0000_i1199" DrawAspect="Content" ObjectID="_1611678725" r:id="rId349"/>
         </w:object>
       </w:r>
     </w:p>
@@ -19763,7 +19763,7 @@
           <v:shape id="_x0000_i1200" type="#_x0000_t75" style="width:331.5pt;height:28.5pt" o:ole="">
             <v:imagedata r:id="rId350" o:title=""/>
           </v:shape>
-          <o:OLEObject Type="Embed" ProgID="Equation.DSMT4" ShapeID="_x0000_i1200" DrawAspect="Content" ObjectID="_1611677625" r:id="rId351"/>
+          <o:OLEObject Type="Embed" ProgID="Equation.DSMT4" ShapeID="_x0000_i1200" DrawAspect="Content" ObjectID="_1611678726" r:id="rId351"/>
         </w:object>
       </w:r>
       <w:r>
@@ -19787,7 +19787,7 @@
           <v:shape id="_x0000_i1201" type="#_x0000_t75" style="width:10.5pt;height:15pt" o:ole="">
             <v:imagedata r:id="rId352" o:title=""/>
           </v:shape>
-          <o:OLEObject Type="Embed" ProgID="Equation.DSMT4" ShapeID="_x0000_i1201" DrawAspect="Content" ObjectID="_1611677626" r:id="rId353"/>
+          <o:OLEObject Type="Embed" ProgID="Equation.DSMT4" ShapeID="_x0000_i1201" DrawAspect="Content" ObjectID="_1611678727" r:id="rId353"/>
         </w:object>
       </w:r>
       <w:r>
@@ -19822,7 +19822,7 @@
           <v:shape id="_x0000_i1202" type="#_x0000_t75" style="width:247.5pt;height:22.5pt" o:ole="">
             <v:imagedata r:id="rId354" o:title=""/>
           </v:shape>
-          <o:OLEObject Type="Embed" ProgID="Equation.DSMT4" ShapeID="_x0000_i1202" DrawAspect="Content" ObjectID="_1611677627" r:id="rId355"/>
+          <o:OLEObject Type="Embed" ProgID="Equation.DSMT4" ShapeID="_x0000_i1202" DrawAspect="Content" ObjectID="_1611678728" r:id="rId355"/>
         </w:object>
       </w:r>
       <w:r>
@@ -19857,7 +19857,7 @@
           <v:shape id="_x0000_i1203" type="#_x0000_t75" style="width:289.5pt;height:22.5pt" o:ole="">
             <v:imagedata r:id="rId356" o:title=""/>
           </v:shape>
-          <o:OLEObject Type="Embed" ProgID="Equation.DSMT4" ShapeID="_x0000_i1203" DrawAspect="Content" ObjectID="_1611677628" r:id="rId357"/>
+          <o:OLEObject Type="Embed" ProgID="Equation.DSMT4" ShapeID="_x0000_i1203" DrawAspect="Content" ObjectID="_1611678729" r:id="rId357"/>
         </w:object>
       </w:r>
       <w:r>
@@ -19892,7 +19892,7 @@
           <v:shape id="_x0000_i1204" type="#_x0000_t75" style="width:400.5pt;height:40.5pt" o:ole="">
             <v:imagedata r:id="rId358" o:title=""/>
           </v:shape>
-          <o:OLEObject Type="Embed" ProgID="Equation.DSMT4" ShapeID="_x0000_i1204" DrawAspect="Content" ObjectID="_1611677629" r:id="rId359"/>
+          <o:OLEObject Type="Embed" ProgID="Equation.DSMT4" ShapeID="_x0000_i1204" DrawAspect="Content" ObjectID="_1611678730" r:id="rId359"/>
         </w:object>
       </w:r>
     </w:p>
@@ -20001,7 +20001,7 @@
           <v:shape id="_x0000_i1205" type="#_x0000_t75" style="width:39pt;height:28.5pt" o:ole="">
             <v:imagedata r:id="rId360" o:title=""/>
           </v:shape>
-          <o:OLEObject Type="Embed" ProgID="Equation.DSMT4" ShapeID="_x0000_i1205" DrawAspect="Content" ObjectID="_1611677630" r:id="rId361"/>
+          <o:OLEObject Type="Embed" ProgID="Equation.DSMT4" ShapeID="_x0000_i1205" DrawAspect="Content" ObjectID="_1611678731" r:id="rId361"/>
         </w:object>
       </w:r>
       <w:r>
@@ -20141,7 +20141,7 @@
           <v:shape id="_x0000_i1206" type="#_x0000_t75" style="width:102pt;height:34.5pt" o:ole="">
             <v:imagedata r:id="rId362" o:title=""/>
           </v:shape>
-          <o:OLEObject Type="Embed" ProgID="Equation.DSMT4" ShapeID="_x0000_i1206" DrawAspect="Content" ObjectID="_1611677631" r:id="rId363"/>
+          <o:OLEObject Type="Embed" ProgID="Equation.DSMT4" ShapeID="_x0000_i1206" DrawAspect="Content" ObjectID="_1611678732" r:id="rId363"/>
         </w:object>
       </w:r>
       <w:r>
@@ -20196,7 +20196,7 @@
           <v:shape id="_x0000_i1207" type="#_x0000_t75" style="width:190.5pt;height:31.5pt" o:ole="">
             <v:imagedata r:id="rId364" o:title=""/>
           </v:shape>
-          <o:OLEObject Type="Embed" ProgID="Equation.DSMT4" ShapeID="_x0000_i1207" DrawAspect="Content" ObjectID="_1611677632" r:id="rId365"/>
+          <o:OLEObject Type="Embed" ProgID="Equation.DSMT4" ShapeID="_x0000_i1207" DrawAspect="Content" ObjectID="_1611678733" r:id="rId365"/>
         </w:object>
       </w:r>
       <w:r>
@@ -20234,7 +20234,7 @@
           <v:shape id="_x0000_i1208" type="#_x0000_t75" style="width:9pt;height:13.5pt" o:ole="">
             <v:imagedata r:id="rId366" o:title=""/>
           </v:shape>
-          <o:OLEObject Type="Embed" ProgID="Equation.DSMT4" ShapeID="_x0000_i1208" DrawAspect="Content" ObjectID="_1611677633" r:id="rId367"/>
+          <o:OLEObject Type="Embed" ProgID="Equation.DSMT4" ShapeID="_x0000_i1208" DrawAspect="Content" ObjectID="_1611678734" r:id="rId367"/>
         </w:object>
       </w:r>
       <w:r>
@@ -20250,7 +20250,7 @@
           <v:shape id="_x0000_i1209" type="#_x0000_t75" style="width:301.5pt;height:37.5pt" o:ole="">
             <v:imagedata r:id="rId348" o:title=""/>
           </v:shape>
-          <o:OLEObject Type="Embed" ProgID="Equation.DSMT4" ShapeID="_x0000_i1209" DrawAspect="Content" ObjectID="_1611677634" r:id="rId368"/>
+          <o:OLEObject Type="Embed" ProgID="Equation.DSMT4" ShapeID="_x0000_i1209" DrawAspect="Content" ObjectID="_1611678735" r:id="rId368"/>
         </w:object>
       </w:r>
       <w:r>
@@ -20266,7 +20266,7 @@
           <v:shape id="_x0000_i1210" type="#_x0000_t75" style="width:336.75pt;height:30pt" o:ole="">
             <v:imagedata r:id="rId369" o:title=""/>
           </v:shape>
-          <o:OLEObject Type="Embed" ProgID="Equation.DSMT4" ShapeID="_x0000_i1210" DrawAspect="Content" ObjectID="_1611677635" r:id="rId370"/>
+          <o:OLEObject Type="Embed" ProgID="Equation.DSMT4" ShapeID="_x0000_i1210" DrawAspect="Content" ObjectID="_1611678736" r:id="rId370"/>
         </w:object>
       </w:r>
     </w:p>
@@ -20304,7 +20304,7 @@
           <v:shape id="_x0000_i1211" type="#_x0000_t75" style="width:93pt;height:19.5pt" o:ole="">
             <v:imagedata r:id="rId371" o:title=""/>
           </v:shape>
-          <o:OLEObject Type="Embed" ProgID="Equation.DSMT4" ShapeID="_x0000_i1211" DrawAspect="Content" ObjectID="_1611677636" r:id="rId372"/>
+          <o:OLEObject Type="Embed" ProgID="Equation.DSMT4" ShapeID="_x0000_i1211" DrawAspect="Content" ObjectID="_1611678737" r:id="rId372"/>
         </w:object>
       </w:r>
       <w:r>
@@ -20334,7 +20334,7 @@
         </w:rPr>
         <w:t xml:space="preserve">keldformax.dat </w:t>
       </w:r>
-      <w:commentRangeStart w:id="28"/>
+      <w:commentRangeStart w:id="29"/>
       <w:r>
         <w:rPr>
           <w:rFonts w:ascii="Times New Roman" w:eastAsia="Calibri" w:hAnsi="Times New Roman" w:cs="Times New Roman"/>
@@ -20348,15 +20348,15 @@
           <v:shape id="_x0000_i1212" type="#_x0000_t75" style="width:168pt;height:19.5pt" o:ole="">
             <v:imagedata r:id="rId373" o:title=""/>
           </v:shape>
-          <o:OLEObject Type="Embed" ProgID="Equation.DSMT4" ShapeID="_x0000_i1212" DrawAspect="Content" ObjectID="_1611677637" r:id="rId374"/>
+          <o:OLEObject Type="Embed" ProgID="Equation.DSMT4" ShapeID="_x0000_i1212" DrawAspect="Content" ObjectID="_1611678738" r:id="rId374"/>
         </w:object>
       </w:r>
-      <w:commentRangeEnd w:id="28"/>
+      <w:commentRangeEnd w:id="29"/>
       <w:r>
         <w:rPr>
           <w:rStyle w:val="CommentReference"/>
         </w:rPr>
-        <w:commentReference w:id="28"/>
+        <w:commentReference w:id="29"/>
       </w:r>
       <w:r>
         <w:rPr>
@@ -20430,7 +20430,7 @@
           <v:shape id="_x0000_i1213" type="#_x0000_t75" style="width:57pt;height:16.5pt" o:ole="">
             <v:imagedata r:id="rId375" o:title=""/>
           </v:shape>
-          <o:OLEObject Type="Embed" ProgID="Equation.DSMT4" ShapeID="_x0000_i1213" DrawAspect="Content" ObjectID="_1611677638" r:id="rId376"/>
+          <o:OLEObject Type="Embed" ProgID="Equation.DSMT4" ShapeID="_x0000_i1213" DrawAspect="Content" ObjectID="_1611678739" r:id="rId376"/>
         </w:object>
       </w:r>
       <w:r>
@@ -20464,7 +20464,7 @@
           <v:shape id="_x0000_i1214" type="#_x0000_t75" style="width:81pt;height:16.5pt" o:ole="">
             <v:imagedata r:id="rId377" o:title=""/>
           </v:shape>
-          <o:OLEObject Type="Embed" ProgID="Equation.DSMT4" ShapeID="_x0000_i1214" DrawAspect="Content" ObjectID="_1611677639" r:id="rId378"/>
+          <o:OLEObject Type="Embed" ProgID="Equation.DSMT4" ShapeID="_x0000_i1214" DrawAspect="Content" ObjectID="_1611678740" r:id="rId378"/>
         </w:object>
       </w:r>
       <w:r>
@@ -20561,7 +20561,7 @@
           <v:shape id="_x0000_i1215" type="#_x0000_t75" style="width:42pt;height:16.5pt" o:ole="">
             <v:imagedata r:id="rId379" o:title=""/>
           </v:shape>
-          <o:OLEObject Type="Embed" ProgID="Equation.DSMT4" ShapeID="_x0000_i1215" DrawAspect="Content" ObjectID="_1611677640" r:id="rId380"/>
+          <o:OLEObject Type="Embed" ProgID="Equation.DSMT4" ShapeID="_x0000_i1215" DrawAspect="Content" ObjectID="_1611678741" r:id="rId380"/>
         </w:object>
       </w:r>
       <w:r>
@@ -20622,7 +20622,7 @@
           <v:shape id="_x0000_i1216" type="#_x0000_t75" style="width:33pt;height:16.5pt" o:ole="">
             <v:imagedata r:id="rId381" o:title=""/>
           </v:shape>
-          <o:OLEObject Type="Embed" ProgID="Equation.DSMT4" ShapeID="_x0000_i1216" DrawAspect="Content" ObjectID="_1611677641" r:id="rId382"/>
+          <o:OLEObject Type="Embed" ProgID="Equation.DSMT4" ShapeID="_x0000_i1216" DrawAspect="Content" ObjectID="_1611678742" r:id="rId382"/>
         </w:object>
       </w:r>
       <w:r>
@@ -20647,7 +20647,7 @@
           <v:shape id="_x0000_i1217" type="#_x0000_t75" style="width:37.5pt;height:16.5pt" o:ole="">
             <v:imagedata r:id="rId383" o:title=""/>
           </v:shape>
-          <o:OLEObject Type="Embed" ProgID="Equation.DSMT4" ShapeID="_x0000_i1217" DrawAspect="Content" ObjectID="_1611677642" r:id="rId384"/>
+          <o:OLEObject Type="Embed" ProgID="Equation.DSMT4" ShapeID="_x0000_i1217" DrawAspect="Content" ObjectID="_1611678743" r:id="rId384"/>
         </w:object>
       </w:r>
       <w:r>
@@ -20706,7 +20706,7 @@
           <v:shape id="_x0000_i1218" type="#_x0000_t75" style="width:145.5pt;height:31.5pt" o:ole="">
             <v:imagedata r:id="rId385" o:title=""/>
           </v:shape>
-          <o:OLEObject Type="Embed" ProgID="Equation.DSMT4" ShapeID="_x0000_i1218" DrawAspect="Content" ObjectID="_1611677643" r:id="rId386"/>
+          <o:OLEObject Type="Embed" ProgID="Equation.DSMT4" ShapeID="_x0000_i1218" DrawAspect="Content" ObjectID="_1611678744" r:id="rId386"/>
         </w:object>
       </w:r>
     </w:p>
@@ -20734,7 +20734,7 @@
           <v:shape id="_x0000_i1219" type="#_x0000_t75" style="width:217.5pt;height:19.5pt" o:ole="">
             <v:imagedata r:id="rId387" o:title=""/>
           </v:shape>
-          <o:OLEObject Type="Embed" ProgID="Equation.DSMT4" ShapeID="_x0000_i1219" DrawAspect="Content" ObjectID="_1611677644" r:id="rId388"/>
+          <o:OLEObject Type="Embed" ProgID="Equation.DSMT4" ShapeID="_x0000_i1219" DrawAspect="Content" ObjectID="_1611678745" r:id="rId388"/>
         </w:object>
       </w:r>
       <w:r>
@@ -20769,7 +20769,7 @@
           <v:shape id="_x0000_i1220" type="#_x0000_t75" style="width:1in;height:34.5pt" o:ole="">
             <v:imagedata r:id="rId389" o:title=""/>
           </v:shape>
-          <o:OLEObject Type="Embed" ProgID="Equation.DSMT4" ShapeID="_x0000_i1220" DrawAspect="Content" ObjectID="_1611677645" r:id="rId390"/>
+          <o:OLEObject Type="Embed" ProgID="Equation.DSMT4" ShapeID="_x0000_i1220" DrawAspect="Content" ObjectID="_1611678746" r:id="rId390"/>
         </w:object>
       </w:r>
     </w:p>
@@ -20854,7 +20854,7 @@
           <v:shape id="_x0000_i1221" type="#_x0000_t75" style="width:311.25pt;height:43.5pt" o:ole="">
             <v:imagedata r:id="rId391" o:title=""/>
           </v:shape>
-          <o:OLEObject Type="Embed" ProgID="Equation.DSMT4" ShapeID="_x0000_i1221" DrawAspect="Content" ObjectID="_1611677646" r:id="rId392"/>
+          <o:OLEObject Type="Embed" ProgID="Equation.DSMT4" ShapeID="_x0000_i1221" DrawAspect="Content" ObjectID="_1611678747" r:id="rId392"/>
         </w:object>
       </w:r>
       <w:r>
@@ -20893,7 +20893,7 @@
           <v:shape id="_x0000_i1222" type="#_x0000_t75" style="width:91.5pt;height:18pt" o:ole="">
             <v:imagedata r:id="rId393" o:title=""/>
           </v:shape>
-          <o:OLEObject Type="Embed" ProgID="Equation.DSMT4" ShapeID="_x0000_i1222" DrawAspect="Content" ObjectID="_1611677647" r:id="rId394"/>
+          <o:OLEObject Type="Embed" ProgID="Equation.DSMT4" ShapeID="_x0000_i1222" DrawAspect="Content" ObjectID="_1611678748" r:id="rId394"/>
         </w:object>
       </w:r>
       <w:r>
@@ -21505,7 +21505,7 @@
           <v:shape id="_x0000_i1223" type="#_x0000_t75" style="width:42pt;height:21pt" o:ole="">
             <v:imagedata r:id="rId44" o:title=""/>
           </v:shape>
-          <o:OLEObject Type="Embed" ProgID="Equation.DSMT4" ShapeID="_x0000_i1223" DrawAspect="Content" ObjectID="_1611677648" r:id="rId395"/>
+          <o:OLEObject Type="Embed" ProgID="Equation.DSMT4" ShapeID="_x0000_i1223" DrawAspect="Content" ObjectID="_1611678749" r:id="rId395"/>
         </w:object>
       </w:r>
       <w:r>
@@ -21553,7 +21553,7 @@
           <v:shape id="_x0000_i1224" type="#_x0000_t75" style="width:57pt;height:21pt" o:ole="">
             <v:imagedata r:id="rId42" o:title=""/>
           </v:shape>
-          <o:OLEObject Type="Embed" ProgID="Equation.DSMT4" ShapeID="_x0000_i1224" DrawAspect="Content" ObjectID="_1611677649" r:id="rId396"/>
+          <o:OLEObject Type="Embed" ProgID="Equation.DSMT4" ShapeID="_x0000_i1224" DrawAspect="Content" ObjectID="_1611678750" r:id="rId396"/>
         </w:object>
       </w:r>
       <w:r>
@@ -21599,7 +21599,7 @@
           <v:shape id="_x0000_i1225" type="#_x0000_t75" style="width:319.5pt;height:46.5pt" o:ole="">
             <v:imagedata r:id="rId397" o:title=""/>
           </v:shape>
-          <o:OLEObject Type="Embed" ProgID="Equation.DSMT4" ShapeID="_x0000_i1225" DrawAspect="Content" ObjectID="_1611677650" r:id="rId398"/>
+          <o:OLEObject Type="Embed" ProgID="Equation.DSMT4" ShapeID="_x0000_i1225" DrawAspect="Content" ObjectID="_1611678751" r:id="rId398"/>
         </w:object>
       </w:r>
     </w:p>
@@ -21627,7 +21627,7 @@
           <v:shape id="_x0000_i1226" type="#_x0000_t75" style="width:244.5pt;height:46.5pt" o:ole="">
             <v:imagedata r:id="rId50" o:title=""/>
           </v:shape>
-          <o:OLEObject Type="Embed" ProgID="Equation.DSMT4" ShapeID="_x0000_i1226" DrawAspect="Content" ObjectID="_1611677651" r:id="rId399"/>
+          <o:OLEObject Type="Embed" ProgID="Equation.DSMT4" ShapeID="_x0000_i1226" DrawAspect="Content" ObjectID="_1611678752" r:id="rId399"/>
         </w:object>
       </w:r>
     </w:p>
@@ -21655,7 +21655,7 @@
           <v:shape id="_x0000_i1227" type="#_x0000_t75" style="width:226.5pt;height:46.5pt" o:ole="">
             <v:imagedata r:id="rId400" o:title=""/>
           </v:shape>
-          <o:OLEObject Type="Embed" ProgID="Equation.DSMT4" ShapeID="_x0000_i1227" DrawAspect="Content" ObjectID="_1611677652" r:id="rId401"/>
+          <o:OLEObject Type="Embed" ProgID="Equation.DSMT4" ShapeID="_x0000_i1227" DrawAspect="Content" ObjectID="_1611678753" r:id="rId401"/>
         </w:object>
       </w:r>
     </w:p>
@@ -21683,7 +21683,7 @@
           <v:shape id="_x0000_i1228" type="#_x0000_t75" style="width:153pt;height:46.5pt" o:ole="">
             <v:imagedata r:id="rId402" o:title=""/>
           </v:shape>
-          <o:OLEObject Type="Embed" ProgID="Equation.DSMT4" ShapeID="_x0000_i1228" DrawAspect="Content" ObjectID="_1611677653" r:id="rId403"/>
+          <o:OLEObject Type="Embed" ProgID="Equation.DSMT4" ShapeID="_x0000_i1228" DrawAspect="Content" ObjectID="_1611678754" r:id="rId403"/>
         </w:object>
       </w:r>
     </w:p>
@@ -21711,11 +21711,11 @@
           <v:shape id="_x0000_i1229" type="#_x0000_t75" style="width:43.5pt;height:31.5pt" o:ole="">
             <v:imagedata r:id="rId54" o:title=""/>
           </v:shape>
-          <o:OLEObject Type="Embed" ProgID="Equation.DSMT4" ShapeID="_x0000_i1229" DrawAspect="Content" ObjectID="_1611677654" r:id="rId404"/>
+          <o:OLEObject Type="Embed" ProgID="Equation.DSMT4" ShapeID="_x0000_i1229" DrawAspect="Content" ObjectID="_1611678755" r:id="rId404"/>
         </w:object>
       </w:r>
     </w:p>
-    <w:commentRangeStart w:id="29"/>
+    <w:commentRangeStart w:id="30"/>
     <w:p>
       <w:pPr>
         <w:spacing w:line="240" w:lineRule="auto"/>
@@ -21740,15 +21740,15 @@
           <v:shape id="_x0000_i1230" type="#_x0000_t75" style="width:79.5pt;height:19.5pt" o:ole="">
             <v:imagedata r:id="rId60" o:title=""/>
           </v:shape>
-          <o:OLEObject Type="Embed" ProgID="Equation.DSMT4" ShapeID="_x0000_i1230" DrawAspect="Content" ObjectID="_1611677655" r:id="rId405"/>
+          <o:OLEObject Type="Embed" ProgID="Equation.DSMT4" ShapeID="_x0000_i1230" DrawAspect="Content" ObjectID="_1611678756" r:id="rId405"/>
         </w:object>
       </w:r>
-      <w:commentRangeEnd w:id="29"/>
+      <w:commentRangeEnd w:id="30"/>
       <w:r>
         <w:rPr>
           <w:rStyle w:val="CommentReference"/>
         </w:rPr>
-        <w:commentReference w:id="29"/>
+        <w:commentReference w:id="30"/>
       </w:r>
     </w:p>
     <w:p>
@@ -21775,7 +21775,7 @@
           <v:shape id="_x0000_i1231" type="#_x0000_t75" style="width:36pt;height:18pt" o:ole="">
             <v:imagedata r:id="rId64" o:title=""/>
           </v:shape>
-          <o:OLEObject Type="Embed" ProgID="Equation.DSMT4" ShapeID="_x0000_i1231" DrawAspect="Content" ObjectID="_1611677656" r:id="rId406"/>
+          <o:OLEObject Type="Embed" ProgID="Equation.DSMT4" ShapeID="_x0000_i1231" DrawAspect="Content" ObjectID="_1611678757" r:id="rId406"/>
         </w:object>
       </w:r>
     </w:p>
@@ -21803,7 +21803,7 @@
           <v:shape id="_x0000_i1232" type="#_x0000_t75" style="width:82.5pt;height:37.5pt" o:ole="">
             <v:imagedata r:id="rId66" o:title=""/>
           </v:shape>
-          <o:OLEObject Type="Embed" ProgID="Equation.DSMT4" ShapeID="_x0000_i1232" DrawAspect="Content" ObjectID="_1611677657" r:id="rId407"/>
+          <o:OLEObject Type="Embed" ProgID="Equation.DSMT4" ShapeID="_x0000_i1232" DrawAspect="Content" ObjectID="_1611678758" r:id="rId407"/>
         </w:object>
       </w:r>
     </w:p>
@@ -21852,7 +21852,7 @@
           <v:shape id="_x0000_i1233" type="#_x0000_t75" style="width:469.5pt;height:46.5pt" o:ole="">
             <v:imagedata r:id="rId408" o:title=""/>
           </v:shape>
-          <o:OLEObject Type="Embed" ProgID="Equation.DSMT4" ShapeID="_x0000_i1233" DrawAspect="Content" ObjectID="_1611677658" r:id="rId409"/>
+          <o:OLEObject Type="Embed" ProgID="Equation.DSMT4" ShapeID="_x0000_i1233" DrawAspect="Content" ObjectID="_1611678759" r:id="rId409"/>
         </w:object>
       </w:r>
     </w:p>
@@ -21880,7 +21880,7 @@
           <v:shape id="_x0000_i1234" type="#_x0000_t75" style="width:262.5pt;height:46.5pt" o:ole="">
             <v:imagedata r:id="rId410" o:title=""/>
           </v:shape>
-          <o:OLEObject Type="Embed" ProgID="Equation.DSMT4" ShapeID="_x0000_i1234" DrawAspect="Content" ObjectID="_1611677659" r:id="rId411"/>
+          <o:OLEObject Type="Embed" ProgID="Equation.DSMT4" ShapeID="_x0000_i1234" DrawAspect="Content" ObjectID="_1611678760" r:id="rId411"/>
         </w:object>
       </w:r>
     </w:p>
@@ -22055,7 +22055,7 @@
         <w:t xml:space="preserve"> </w:t>
       </w:r>
     </w:p>
-    <w:commentRangeStart w:id="30"/>
+    <w:commentRangeStart w:id="31"/>
     <w:p>
       <w:pPr>
         <w:spacing w:line="240" w:lineRule="auto"/>
@@ -22083,15 +22083,15 @@
           <v:shape id="_x0000_i1235" type="#_x0000_t75" style="width:205.5pt;height:18pt" o:ole="">
             <v:imagedata r:id="rId196" o:title=""/>
           </v:shape>
-          <o:OLEObject Type="Embed" ProgID="Equation.DSMT4" ShapeID="_x0000_i1235" DrawAspect="Content" ObjectID="_1611677660" r:id="rId412"/>
+          <o:OLEObject Type="Embed" ProgID="Equation.DSMT4" ShapeID="_x0000_i1235" DrawAspect="Content" ObjectID="_1611678761" r:id="rId412"/>
         </w:object>
       </w:r>
-      <w:commentRangeEnd w:id="30"/>
+      <w:commentRangeEnd w:id="31"/>
       <w:r>
         <w:rPr>
           <w:rStyle w:val="CommentReference"/>
         </w:rPr>
-        <w:commentReference w:id="30"/>
+        <w:commentReference w:id="31"/>
       </w:r>
       <w:r>
         <w:rPr>
@@ -22148,7 +22148,7 @@
           <v:shape id="_x0000_i1236" type="#_x0000_t75" style="width:31.5pt;height:18pt" o:ole="">
             <v:imagedata r:id="rId198" o:title=""/>
           </v:shape>
-          <o:OLEObject Type="Embed" ProgID="Equation.DSMT4" ShapeID="_x0000_i1236" DrawAspect="Content" ObjectID="_1611677661" r:id="rId413"/>
+          <o:OLEObject Type="Embed" ProgID="Equation.DSMT4" ShapeID="_x0000_i1236" DrawAspect="Content" ObjectID="_1611678762" r:id="rId413"/>
         </w:object>
       </w:r>
       <w:r>
@@ -22250,7 +22250,7 @@
         </w:rPr>
         <w:t xml:space="preserve"> </w:t>
       </w:r>
-      <w:del w:id="31" w:author="Thibault Derrien" w:date="2019-02-14T19:13:00Z">
+      <w:del w:id="32" w:author="Thibault Derrien" w:date="2019-02-14T19:13:00Z">
         <w:r>
           <w:rPr>
             <w:rFonts w:ascii="Times New Roman" w:hAnsi="Times New Roman"/>
@@ -22261,7 +22261,7 @@
           <w:delText>harmonic</w:delText>
         </w:r>
       </w:del>
-      <w:ins w:id="32" w:author="Thibault Derrien" w:date="2019-02-14T19:13:00Z">
+      <w:ins w:id="33" w:author="Thibault Derrien" w:date="2019-02-14T19:13:00Z">
         <w:r>
           <w:rPr>
             <w:rFonts w:ascii="Times New Roman" w:hAnsi="Times New Roman"/>
@@ -22402,7 +22402,7 @@
           <v:shape id="_x0000_i1237" type="#_x0000_t75" style="width:25.5pt;height:18pt" o:ole="">
             <v:imagedata r:id="rId200" o:title=""/>
           </v:shape>
-          <o:OLEObject Type="Embed" ProgID="Equation.DSMT4" ShapeID="_x0000_i1237" DrawAspect="Content" ObjectID="_1611677662" r:id="rId414"/>
+          <o:OLEObject Type="Embed" ProgID="Equation.DSMT4" ShapeID="_x0000_i1237" DrawAspect="Content" ObjectID="_1611678763" r:id="rId414"/>
         </w:object>
       </w:r>
       <w:r>
@@ -22423,7 +22423,7 @@
         </w:rPr>
         <w:t>Some of following calculations can be performed for time-depende</w:t>
       </w:r>
-      <w:ins w:id="33" w:author="Thibault Derrien" w:date="2019-02-14T19:13:00Z">
+      <w:ins w:id="34" w:author="Thibault Derrien" w:date="2019-02-14T19:13:00Z">
         <w:r>
           <w:rPr>
             <w:rFonts w:ascii="Times New Roman" w:hAnsi="Times New Roman"/>
@@ -22434,7 +22434,7 @@
           <w:t>nt</w:t>
         </w:r>
       </w:ins>
-      <w:del w:id="34" w:author="Thibault Derrien" w:date="2019-02-14T19:13:00Z">
+      <w:del w:id="35" w:author="Thibault Derrien" w:date="2019-02-14T19:13:00Z">
         <w:r>
           <w:rPr>
             <w:rFonts w:ascii="Times New Roman" w:hAnsi="Times New Roman"/>
@@ -22548,7 +22548,7 @@
           <v:shape id="_x0000_i1238" type="#_x0000_t75" style="width:31.5pt;height:18pt" o:ole="">
             <v:imagedata r:id="rId198" o:title=""/>
           </v:shape>
-          <o:OLEObject Type="Embed" ProgID="Equation.DSMT4" ShapeID="_x0000_i1238" DrawAspect="Content" ObjectID="_1611677663" r:id="rId415"/>
+          <o:OLEObject Type="Embed" ProgID="Equation.DSMT4" ShapeID="_x0000_i1238" DrawAspect="Content" ObjectID="_1611678764" r:id="rId415"/>
         </w:object>
       </w:r>
       <w:r>
@@ -22609,7 +22609,7 @@
           <v:shape id="_x0000_i1239" type="#_x0000_t75" style="width:13.5pt;height:18pt" o:ole="">
             <v:imagedata r:id="rId203" o:title=""/>
           </v:shape>
-          <o:OLEObject Type="Embed" ProgID="Equation.DSMT4" ShapeID="_x0000_i1239" DrawAspect="Content" ObjectID="_1611677664" r:id="rId416"/>
+          <o:OLEObject Type="Embed" ProgID="Equation.DSMT4" ShapeID="_x0000_i1239" DrawAspect="Content" ObjectID="_1611678765" r:id="rId416"/>
         </w:object>
       </w:r>
       <w:r>
@@ -22643,7 +22643,7 @@
           <v:shape id="_x0000_i1240" type="#_x0000_t75" style="width:30pt;height:19.5pt" o:ole="">
             <v:imagedata r:id="rId205" o:title=""/>
           </v:shape>
-          <o:OLEObject Type="Embed" ProgID="Equation.DSMT4" ShapeID="_x0000_i1240" DrawAspect="Content" ObjectID="_1611677665" r:id="rId417"/>
+          <o:OLEObject Type="Embed" ProgID="Equation.DSMT4" ShapeID="_x0000_i1240" DrawAspect="Content" ObjectID="_1611678766" r:id="rId417"/>
         </w:object>
       </w:r>
       <w:r>
@@ -22731,7 +22731,7 @@
           <v:shape id="_x0000_i1241" type="#_x0000_t75" style="width:24pt;height:18pt" o:ole="">
             <v:imagedata r:id="rId207" o:title=""/>
           </v:shape>
-          <o:OLEObject Type="Embed" ProgID="Equation.DSMT4" ShapeID="_x0000_i1241" DrawAspect="Content" ObjectID="_1611677666" r:id="rId418"/>
+          <o:OLEObject Type="Embed" ProgID="Equation.DSMT4" ShapeID="_x0000_i1241" DrawAspect="Content" ObjectID="_1611678767" r:id="rId418"/>
         </w:object>
       </w:r>
       <w:r>
@@ -22765,7 +22765,7 @@
           <v:shape id="_x0000_i1242" type="#_x0000_t75" style="width:34.5pt;height:18pt" o:ole="">
             <v:imagedata r:id="rId209" o:title=""/>
           </v:shape>
-          <o:OLEObject Type="Embed" ProgID="Equation.DSMT4" ShapeID="_x0000_i1242" DrawAspect="Content" ObjectID="_1611677667" r:id="rId419"/>
+          <o:OLEObject Type="Embed" ProgID="Equation.DSMT4" ShapeID="_x0000_i1242" DrawAspect="Content" ObjectID="_1611678768" r:id="rId419"/>
         </w:object>
       </w:r>
       <w:r>
@@ -22964,7 +22964,7 @@
         </w:rPr>
         <w:t xml:space="preserve">will be measured in terms of </w:t>
       </w:r>
-      <w:commentRangeStart w:id="35"/>
+      <w:commentRangeStart w:id="36"/>
       <w:r>
         <w:rPr>
           <w:rFonts w:ascii="Times New Roman" w:eastAsia="Calibri" w:hAnsi="Times New Roman" w:cs="Times New Roman"/>
@@ -22978,15 +22978,15 @@
           <v:shape id="_x0000_i1243" type="#_x0000_t75" style="width:1in;height:19.5pt" o:ole="">
             <v:imagedata r:id="rId16" o:title=""/>
           </v:shape>
-          <o:OLEObject Type="Embed" ProgID="Equation.DSMT4" ShapeID="_x0000_i1243" DrawAspect="Content" ObjectID="_1611677668" r:id="rId420"/>
+          <o:OLEObject Type="Embed" ProgID="Equation.DSMT4" ShapeID="_x0000_i1243" DrawAspect="Content" ObjectID="_1611678769" r:id="rId420"/>
         </w:object>
       </w:r>
-      <w:commentRangeEnd w:id="35"/>
+      <w:commentRangeEnd w:id="36"/>
       <w:r>
         <w:rPr>
           <w:rStyle w:val="CommentReference"/>
         </w:rPr>
-        <w:commentReference w:id="35"/>
+        <w:commentReference w:id="36"/>
       </w:r>
       <w:r>
         <w:rPr>
@@ -23011,7 +23011,7 @@
           <v:shape id="_x0000_i1244" type="#_x0000_t75" style="width:34.5pt;height:19.5pt" o:ole="">
             <v:imagedata r:id="rId212" o:title=""/>
           </v:shape>
-          <o:OLEObject Type="Embed" ProgID="Equation.DSMT4" ShapeID="_x0000_i1244" DrawAspect="Content" ObjectID="_1611677669" r:id="rId421"/>
+          <o:OLEObject Type="Embed" ProgID="Equation.DSMT4" ShapeID="_x0000_i1244" DrawAspect="Content" ObjectID="_1611678770" r:id="rId421"/>
         </w:object>
       </w:r>
       <w:r>
@@ -23037,7 +23037,7 @@
           <v:shape id="_x0000_i1245" type="#_x0000_t75" style="width:60pt;height:33pt" o:ole="">
             <v:imagedata r:id="rId214" o:title=""/>
           </v:shape>
-          <o:OLEObject Type="Embed" ProgID="Equation.DSMT4" ShapeID="_x0000_i1245" DrawAspect="Content" ObjectID="_1611677670" r:id="rId422"/>
+          <o:OLEObject Type="Embed" ProgID="Equation.DSMT4" ShapeID="_x0000_i1245" DrawAspect="Content" ObjectID="_1611678771" r:id="rId422"/>
         </w:object>
       </w:r>
       <w:r>
@@ -23063,7 +23063,7 @@
           <v:shape id="_x0000_i1246" type="#_x0000_t75" style="width:34.5pt;height:19.5pt" o:ole="">
             <v:imagedata r:id="rId216" o:title=""/>
           </v:shape>
-          <o:OLEObject Type="Embed" ProgID="Equation.DSMT4" ShapeID="_x0000_i1246" DrawAspect="Content" ObjectID="_1611677671" r:id="rId423"/>
+          <o:OLEObject Type="Embed" ProgID="Equation.DSMT4" ShapeID="_x0000_i1246" DrawAspect="Content" ObjectID="_1611678772" r:id="rId423"/>
         </w:object>
       </w:r>
       <w:r>
@@ -23089,7 +23089,7 @@
           <v:shape id="_x0000_i1247" type="#_x0000_t75" style="width:121.5pt;height:19.5pt" o:ole="">
             <v:imagedata r:id="rId218" o:title=""/>
           </v:shape>
-          <o:OLEObject Type="Embed" ProgID="Equation.DSMT4" ShapeID="_x0000_i1247" DrawAspect="Content" ObjectID="_1611677672" r:id="rId424"/>
+          <o:OLEObject Type="Embed" ProgID="Equation.DSMT4" ShapeID="_x0000_i1247" DrawAspect="Content" ObjectID="_1611678773" r:id="rId424"/>
         </w:object>
       </w:r>
       <w:r>
@@ -23185,7 +23185,7 @@
           <v:shape id="_x0000_i1248" type="#_x0000_t75" style="width:75pt;height:19.5pt" o:ole="">
             <v:imagedata r:id="rId220" o:title=""/>
           </v:shape>
-          <o:OLEObject Type="Embed" ProgID="Equation.DSMT4" ShapeID="_x0000_i1248" DrawAspect="Content" ObjectID="_1611677673" r:id="rId425"/>
+          <o:OLEObject Type="Embed" ProgID="Equation.DSMT4" ShapeID="_x0000_i1248" DrawAspect="Content" ObjectID="_1611678774" r:id="rId425"/>
         </w:object>
       </w:r>
       <w:r>
@@ -23301,7 +23301,7 @@
           <v:shape id="_x0000_i1249" type="#_x0000_t75" style="width:12pt;height:13.5pt" o:ole="">
             <v:imagedata r:id="rId222" o:title=""/>
           </v:shape>
-          <o:OLEObject Type="Embed" ProgID="Equation.DSMT4" ShapeID="_x0000_i1249" DrawAspect="Content" ObjectID="_1611677674" r:id="rId426"/>
+          <o:OLEObject Type="Embed" ProgID="Equation.DSMT4" ShapeID="_x0000_i1249" DrawAspect="Content" ObjectID="_1611678775" r:id="rId426"/>
         </w:object>
       </w:r>
       <w:r>
@@ -23351,7 +23351,7 @@
           <v:shape id="_x0000_i1250" type="#_x0000_t75" style="width:145.5pt;height:31.5pt" o:ole="">
             <v:imagedata r:id="rId385" o:title=""/>
           </v:shape>
-          <o:OLEObject Type="Embed" ProgID="Equation.DSMT4" ShapeID="_x0000_i1250" DrawAspect="Content" ObjectID="_1611677675" r:id="rId427"/>
+          <o:OLEObject Type="Embed" ProgID="Equation.DSMT4" ShapeID="_x0000_i1250" DrawAspect="Content" ObjectID="_1611678776" r:id="rId427"/>
         </w:object>
       </w:r>
       <w:r>
@@ -23390,7 +23390,7 @@
           <v:shape id="_x0000_i1251" type="#_x0000_t75" style="width:274.5pt;height:19.5pt" o:ole="">
             <v:imagedata r:id="rId428" o:title=""/>
           </v:shape>
-          <o:OLEObject Type="Embed" ProgID="Equation.DSMT4" ShapeID="_x0000_i1251" DrawAspect="Content" ObjectID="_1611677676" r:id="rId429"/>
+          <o:OLEObject Type="Embed" ProgID="Equation.DSMT4" ShapeID="_x0000_i1251" DrawAspect="Content" ObjectID="_1611678777" r:id="rId429"/>
         </w:object>
       </w:r>
       <w:r>
@@ -23457,7 +23457,7 @@
           <v:shape id="_x0000_i1252" type="#_x0000_t75" style="width:55.5pt;height:19.5pt" o:ole="">
             <v:imagedata r:id="rId430" o:title=""/>
           </v:shape>
-          <o:OLEObject Type="Embed" ProgID="Equation.DSMT4" ShapeID="_x0000_i1252" DrawAspect="Content" ObjectID="_1611677677" r:id="rId431"/>
+          <o:OLEObject Type="Embed" ProgID="Equation.DSMT4" ShapeID="_x0000_i1252" DrawAspect="Content" ObjectID="_1611678778" r:id="rId431"/>
         </w:object>
       </w:r>
       <w:r>
@@ -23527,7 +23527,7 @@
           <v:shape id="_x0000_i1253" type="#_x0000_t75" style="width:13.5pt;height:18pt" o:ole="">
             <v:imagedata r:id="rId432" o:title=""/>
           </v:shape>
-          <o:OLEObject Type="Embed" ProgID="Equation.DSMT4" ShapeID="_x0000_i1253" DrawAspect="Content" ObjectID="_1611677678" r:id="rId433"/>
+          <o:OLEObject Type="Embed" ProgID="Equation.DSMT4" ShapeID="_x0000_i1253" DrawAspect="Content" ObjectID="_1611678779" r:id="rId433"/>
         </w:object>
       </w:r>
       <w:r>
@@ -23723,7 +23723,7 @@
           <v:shape id="_x0000_i1254" type="#_x0000_t75" style="width:13.5pt;height:18pt" o:ole="">
             <v:imagedata r:id="rId434" o:title=""/>
           </v:shape>
-          <o:OLEObject Type="Embed" ProgID="Equation.DSMT4" ShapeID="_x0000_i1254" DrawAspect="Content" ObjectID="_1611677679" r:id="rId435"/>
+          <o:OLEObject Type="Embed" ProgID="Equation.DSMT4" ShapeID="_x0000_i1254" DrawAspect="Content" ObjectID="_1611678780" r:id="rId435"/>
         </w:object>
       </w:r>
       <w:r>
@@ -23820,7 +23820,7 @@
           <v:shape id="_x0000_i1255" type="#_x0000_t75" style="width:51pt;height:19.5pt" o:ole="">
             <v:imagedata r:id="rId436" o:title=""/>
           </v:shape>
-          <o:OLEObject Type="Embed" ProgID="Equation.DSMT4" ShapeID="_x0000_i1255" DrawAspect="Content" ObjectID="_1611677680" r:id="rId437"/>
+          <o:OLEObject Type="Embed" ProgID="Equation.DSMT4" ShapeID="_x0000_i1255" DrawAspect="Content" ObjectID="_1611678781" r:id="rId437"/>
         </w:object>
       </w:r>
       <w:r>
@@ -23926,7 +23926,7 @@
           <v:shape id="_x0000_i1256" type="#_x0000_t75" style="width:15pt;height:18pt" o:ole="">
             <v:imagedata r:id="rId438" o:title=""/>
           </v:shape>
-          <o:OLEObject Type="Embed" ProgID="Equation.DSMT4" ShapeID="_x0000_i1256" DrawAspect="Content" ObjectID="_1611677681" r:id="rId439"/>
+          <o:OLEObject Type="Embed" ProgID="Equation.DSMT4" ShapeID="_x0000_i1256" DrawAspect="Content" ObjectID="_1611678782" r:id="rId439"/>
         </w:object>
       </w:r>
       <w:r>
@@ -24023,7 +24023,7 @@
           <v:shape id="_x0000_i1257" type="#_x0000_t75" style="width:106.5pt;height:22.5pt" o:ole="">
             <v:imagedata r:id="rId440" o:title=""/>
           </v:shape>
-          <o:OLEObject Type="Embed" ProgID="Equation.DSMT4" ShapeID="_x0000_i1257" DrawAspect="Content" ObjectID="_1611677682" r:id="rId441"/>
+          <o:OLEObject Type="Embed" ProgID="Equation.DSMT4" ShapeID="_x0000_i1257" DrawAspect="Content" ObjectID="_1611678783" r:id="rId441"/>
         </w:object>
       </w:r>
       <w:r>
@@ -24093,7 +24093,7 @@
           <v:shape id="_x0000_i1258" type="#_x0000_t75" style="width:73.5pt;height:22.5pt" o:ole="">
             <v:imagedata r:id="rId442" o:title=""/>
           </v:shape>
-          <o:OLEObject Type="Embed" ProgID="Equation.DSMT4" ShapeID="_x0000_i1258" DrawAspect="Content" ObjectID="_1611677683" r:id="rId443"/>
+          <o:OLEObject Type="Embed" ProgID="Equation.DSMT4" ShapeID="_x0000_i1258" DrawAspect="Content" ObjectID="_1611678784" r:id="rId443"/>
         </w:object>
       </w:r>
       <w:r>
@@ -24148,7 +24148,7 @@
           <v:shape id="_x0000_i1259" type="#_x0000_t75" style="width:217.5pt;height:19.5pt" o:ole="">
             <v:imagedata r:id="rId387" o:title=""/>
           </v:shape>
-          <o:OLEObject Type="Embed" ProgID="Equation.DSMT4" ShapeID="_x0000_i1259" DrawAspect="Content" ObjectID="_1611677684" r:id="rId444"/>
+          <o:OLEObject Type="Embed" ProgID="Equation.DSMT4" ShapeID="_x0000_i1259" DrawAspect="Content" ObjectID="_1611678785" r:id="rId444"/>
         </w:object>
       </w:r>
       <w:r>
@@ -24184,7 +24184,7 @@
           <v:shape id="_x0000_i1260" type="#_x0000_t75" style="width:1in;height:34.5pt" o:ole="">
             <v:imagedata r:id="rId389" o:title=""/>
           </v:shape>
-          <o:OLEObject Type="Embed" ProgID="Equation.DSMT4" ShapeID="_x0000_i1260" DrawAspect="Content" ObjectID="_1611677685" r:id="rId445"/>
+          <o:OLEObject Type="Embed" ProgID="Equation.DSMT4" ShapeID="_x0000_i1260" DrawAspect="Content" ObjectID="_1611678786" r:id="rId445"/>
         </w:object>
       </w:r>
     </w:p>
@@ -24284,7 +24284,7 @@
           <v:shape id="_x0000_i1261" type="#_x0000_t75" style="width:10.5pt;height:13.5pt" o:ole="">
             <v:imagedata r:id="rId446" o:title=""/>
           </v:shape>
-          <o:OLEObject Type="Embed" ProgID="Equation.DSMT4" ShapeID="_x0000_i1261" DrawAspect="Content" ObjectID="_1611677686" r:id="rId447"/>
+          <o:OLEObject Type="Embed" ProgID="Equation.DSMT4" ShapeID="_x0000_i1261" DrawAspect="Content" ObjectID="_1611678787" r:id="rId447"/>
         </w:object>
       </w:r>
       <w:r>
@@ -24329,7 +24329,7 @@
           <v:shape id="_x0000_i1262" type="#_x0000_t75" style="width:311.25pt;height:43.5pt" o:ole="">
             <v:imagedata r:id="rId391" o:title=""/>
           </v:shape>
-          <o:OLEObject Type="Embed" ProgID="Equation.DSMT4" ShapeID="_x0000_i1262" DrawAspect="Content" ObjectID="_1611677687" r:id="rId448"/>
+          <o:OLEObject Type="Embed" ProgID="Equation.DSMT4" ShapeID="_x0000_i1262" DrawAspect="Content" ObjectID="_1611678788" r:id="rId448"/>
         </w:object>
       </w:r>
       <w:r>
@@ -24364,7 +24364,7 @@
           <v:shape id="_x0000_i1263" type="#_x0000_t75" style="width:91.5pt;height:18pt" o:ole="">
             <v:imagedata r:id="rId393" o:title=""/>
           </v:shape>
-          <o:OLEObject Type="Embed" ProgID="Equation.DSMT4" ShapeID="_x0000_i1263" DrawAspect="Content" ObjectID="_1611677688" r:id="rId449"/>
+          <o:OLEObject Type="Embed" ProgID="Equation.DSMT4" ShapeID="_x0000_i1263" DrawAspect="Content" ObjectID="_1611678789" r:id="rId449"/>
         </w:object>
       </w:r>
       <w:r>
@@ -24399,7 +24399,7 @@
           <v:shape id="_x0000_i1264" type="#_x0000_t75" style="width:280.5pt;height:37.5pt" o:ole="">
             <v:imagedata r:id="rId450" o:title=""/>
           </v:shape>
-          <o:OLEObject Type="Embed" ProgID="Equation.DSMT4" ShapeID="_x0000_i1264" DrawAspect="Content" ObjectID="_1611677689" r:id="rId451"/>
+          <o:OLEObject Type="Embed" ProgID="Equation.DSMT4" ShapeID="_x0000_i1264" DrawAspect="Content" ObjectID="_1611678790" r:id="rId451"/>
         </w:object>
       </w:r>
     </w:p>
@@ -24444,7 +24444,7 @@
           <v:shape id="_x0000_i1265" type="#_x0000_t75" style="width:55.5pt;height:22.5pt" o:ole="">
             <v:imagedata r:id="rId452" o:title=""/>
           </v:shape>
-          <o:OLEObject Type="Embed" ProgID="Equation.DSMT4" ShapeID="_x0000_i1265" DrawAspect="Content" ObjectID="_1611677690" r:id="rId453"/>
+          <o:OLEObject Type="Embed" ProgID="Equation.DSMT4" ShapeID="_x0000_i1265" DrawAspect="Content" ObjectID="_1611678791" r:id="rId453"/>
         </w:object>
       </w:r>
       <w:r>
@@ -24478,7 +24478,7 @@
           <v:shape id="_x0000_i1266" type="#_x0000_t75" style="width:25.5pt;height:19.5pt" o:ole="">
             <v:imagedata r:id="rId454" o:title=""/>
           </v:shape>
-          <o:OLEObject Type="Embed" ProgID="Equation.DSMT4" ShapeID="_x0000_i1266" DrawAspect="Content" ObjectID="_1611677691" r:id="rId455"/>
+          <o:OLEObject Type="Embed" ProgID="Equation.DSMT4" ShapeID="_x0000_i1266" DrawAspect="Content" ObjectID="_1611678792" r:id="rId455"/>
         </w:object>
       </w:r>
       <w:r>
@@ -24503,7 +24503,7 @@
           <v:shape id="_x0000_i1267" type="#_x0000_t75" style="width:37.5pt;height:16.5pt" o:ole="">
             <v:imagedata r:id="rId456" o:title=""/>
           </v:shape>
-          <o:OLEObject Type="Embed" ProgID="Equation.DSMT4" ShapeID="_x0000_i1267" DrawAspect="Content" ObjectID="_1611677692" r:id="rId457"/>
+          <o:OLEObject Type="Embed" ProgID="Equation.DSMT4" ShapeID="_x0000_i1267" DrawAspect="Content" ObjectID="_1611678793" r:id="rId457"/>
         </w:object>
       </w:r>
       <w:r>
@@ -24537,7 +24537,7 @@
           <v:shape id="_x0000_i1268" type="#_x0000_t75" style="width:10.5pt;height:13.5pt" o:ole="">
             <v:imagedata r:id="rId458" o:title=""/>
           </v:shape>
-          <o:OLEObject Type="Embed" ProgID="Equation.DSMT4" ShapeID="_x0000_i1268" DrawAspect="Content" ObjectID="_1611677693" r:id="rId459"/>
+          <o:OLEObject Type="Embed" ProgID="Equation.DSMT4" ShapeID="_x0000_i1268" DrawAspect="Content" ObjectID="_1611678794" r:id="rId459"/>
         </w:object>
       </w:r>
       <w:r>
@@ -24571,7 +24571,7 @@
           <v:shape id="_x0000_i1269" type="#_x0000_t75" style="width:10.5pt;height:16.5pt" o:ole="">
             <v:imagedata r:id="rId460" o:title=""/>
           </v:shape>
-          <o:OLEObject Type="Embed" ProgID="Equation.DSMT4" ShapeID="_x0000_i1269" DrawAspect="Content" ObjectID="_1611677694" r:id="rId461"/>
+          <o:OLEObject Type="Embed" ProgID="Equation.DSMT4" ShapeID="_x0000_i1269" DrawAspect="Content" ObjectID="_1611678795" r:id="rId461"/>
         </w:object>
       </w:r>
       <w:r>
@@ -24616,7 +24616,7 @@
           <v:shape id="_x0000_i1270" type="#_x0000_t75" style="width:265.5pt;height:49.5pt" o:ole="">
             <v:imagedata r:id="rId462" o:title=""/>
           </v:shape>
-          <o:OLEObject Type="Embed" ProgID="Equation.DSMT4" ShapeID="_x0000_i1270" DrawAspect="Content" ObjectID="_1611677695" r:id="rId463"/>
+          <o:OLEObject Type="Embed" ProgID="Equation.DSMT4" ShapeID="_x0000_i1270" DrawAspect="Content" ObjectID="_1611678796" r:id="rId463"/>
         </w:object>
       </w:r>
     </w:p>
@@ -24643,7 +24643,7 @@
           <v:shape id="_x0000_i1271" type="#_x0000_t75" style="width:268.5pt;height:49.5pt" o:ole="">
             <v:imagedata r:id="rId464" o:title=""/>
           </v:shape>
-          <o:OLEObject Type="Embed" ProgID="Equation.DSMT4" ShapeID="_x0000_i1271" DrawAspect="Content" ObjectID="_1611677696" r:id="rId465"/>
+          <o:OLEObject Type="Embed" ProgID="Equation.DSMT4" ShapeID="_x0000_i1271" DrawAspect="Content" ObjectID="_1611678797" r:id="rId465"/>
         </w:object>
       </w:r>
     </w:p>
@@ -24689,7 +24689,7 @@
           <v:shape id="_x0000_i1272" type="#_x0000_t75" style="width:383.25pt;height:37.5pt" o:ole="">
             <v:imagedata r:id="rId466" o:title=""/>
           </v:shape>
-          <o:OLEObject Type="Embed" ProgID="Equation.DSMT4" ShapeID="_x0000_i1272" DrawAspect="Content" ObjectID="_1611677697" r:id="rId467"/>
+          <o:OLEObject Type="Embed" ProgID="Equation.DSMT4" ShapeID="_x0000_i1272" DrawAspect="Content" ObjectID="_1611678798" r:id="rId467"/>
         </w:object>
       </w:r>
     </w:p>
@@ -24717,7 +24717,7 @@
           <v:shape id="_x0000_i1273" type="#_x0000_t75" style="width:152.25pt;height:61.5pt" o:ole="">
             <v:imagedata r:id="rId313" o:title=""/>
           </v:shape>
-          <o:OLEObject Type="Embed" ProgID="Equation.DSMT4" ShapeID="_x0000_i1273" DrawAspect="Content" ObjectID="_1611677698" r:id="rId468"/>
+          <o:OLEObject Type="Embed" ProgID="Equation.DSMT4" ShapeID="_x0000_i1273" DrawAspect="Content" ObjectID="_1611678799" r:id="rId468"/>
         </w:object>
       </w:r>
       <w:r>
@@ -24775,7 +24775,7 @@
           <v:shape id="_x0000_i1274" type="#_x0000_t75" style="width:181.5pt;height:18pt" o:ole="">
             <v:imagedata r:id="rId469" o:title=""/>
           </v:shape>
-          <o:OLEObject Type="Embed" ProgID="Equation.DSMT4" ShapeID="_x0000_i1274" DrawAspect="Content" ObjectID="_1611677699" r:id="rId470"/>
+          <o:OLEObject Type="Embed" ProgID="Equation.DSMT4" ShapeID="_x0000_i1274" DrawAspect="Content" ObjectID="_1611678800" r:id="rId470"/>
         </w:object>
       </w:r>
       <w:r>
@@ -24850,7 +24850,7 @@
           <v:shape id="_x0000_i1275" type="#_x0000_t75" style="width:354.75pt;height:37.5pt" o:ole="">
             <v:imagedata r:id="rId471" o:title=""/>
           </v:shape>
-          <o:OLEObject Type="Embed" ProgID="Equation.DSMT4" ShapeID="_x0000_i1275" DrawAspect="Content" ObjectID="_1611677700" r:id="rId472"/>
+          <o:OLEObject Type="Embed" ProgID="Equation.DSMT4" ShapeID="_x0000_i1275" DrawAspect="Content" ObjectID="_1611678801" r:id="rId472"/>
         </w:object>
       </w:r>
     </w:p>
@@ -24877,7 +24877,7 @@
           <v:shape id="_x0000_i1276" type="#_x0000_t75" style="width:152.25pt;height:61.5pt" o:ole="">
             <v:imagedata r:id="rId473" o:title=""/>
           </v:shape>
-          <o:OLEObject Type="Embed" ProgID="Equation.DSMT4" ShapeID="_x0000_i1276" DrawAspect="Content" ObjectID="_1611677701" r:id="rId474"/>
+          <o:OLEObject Type="Embed" ProgID="Equation.DSMT4" ShapeID="_x0000_i1276" DrawAspect="Content" ObjectID="_1611678802" r:id="rId474"/>
         </w:object>
       </w:r>
     </w:p>
@@ -24904,7 +24904,7 @@
           <v:shape id="_x0000_i1277" type="#_x0000_t75" style="width:9pt;height:13.5pt" o:ole="">
             <v:imagedata r:id="rId475" o:title=""/>
           </v:shape>
-          <o:OLEObject Type="Embed" ProgID="Equation.DSMT4" ShapeID="_x0000_i1277" DrawAspect="Content" ObjectID="_1611677702" r:id="rId476"/>
+          <o:OLEObject Type="Embed" ProgID="Equation.DSMT4" ShapeID="_x0000_i1277" DrawAspect="Content" ObjectID="_1611678803" r:id="rId476"/>
         </w:object>
       </w:r>
       <w:r>
@@ -24920,7 +24920,7 @@
           <v:shape id="_x0000_i1278" type="#_x0000_t75" style="width:406.5pt;height:37.5pt" o:ole="">
             <v:imagedata r:id="rId477" o:title=""/>
           </v:shape>
-          <o:OLEObject Type="Embed" ProgID="Equation.DSMT4" ShapeID="_x0000_i1278" DrawAspect="Content" ObjectID="_1611677703" r:id="rId478"/>
+          <o:OLEObject Type="Embed" ProgID="Equation.DSMT4" ShapeID="_x0000_i1278" DrawAspect="Content" ObjectID="_1611678804" r:id="rId478"/>
         </w:object>
       </w:r>
     </w:p>
@@ -24947,7 +24947,7 @@
           <v:shape id="_x0000_i1279" type="#_x0000_t75" style="width:291pt;height:37.5pt" o:ole="">
             <v:imagedata r:id="rId479" o:title=""/>
           </v:shape>
-          <o:OLEObject Type="Embed" ProgID="Equation.DSMT4" ShapeID="_x0000_i1279" DrawAspect="Content" ObjectID="_1611677704" r:id="rId480"/>
+          <o:OLEObject Type="Embed" ProgID="Equation.DSMT4" ShapeID="_x0000_i1279" DrawAspect="Content" ObjectID="_1611678805" r:id="rId480"/>
         </w:object>
       </w:r>
     </w:p>
@@ -24974,7 +24974,7 @@
           <v:shape id="_x0000_i1280" type="#_x0000_t75" style="width:373.5pt;height:37.5pt" o:ole="">
             <v:imagedata r:id="rId481" o:title=""/>
           </v:shape>
-          <o:OLEObject Type="Embed" ProgID="Equation.DSMT4" ShapeID="_x0000_i1280" DrawAspect="Content" ObjectID="_1611677705" r:id="rId482"/>
+          <o:OLEObject Type="Embed" ProgID="Equation.DSMT4" ShapeID="_x0000_i1280" DrawAspect="Content" ObjectID="_1611678806" r:id="rId482"/>
         </w:object>
       </w:r>
       <w:r>
@@ -25009,7 +25009,7 @@
           <v:shape id="_x0000_i1281" type="#_x0000_t75" style="width:177pt;height:19.5pt" o:ole="">
             <v:imagedata r:id="rId483" o:title=""/>
           </v:shape>
-          <o:OLEObject Type="Embed" ProgID="Equation.DSMT4" ShapeID="_x0000_i1281" DrawAspect="Content" ObjectID="_1611677706" r:id="rId484"/>
+          <o:OLEObject Type="Embed" ProgID="Equation.DSMT4" ShapeID="_x0000_i1281" DrawAspect="Content" ObjectID="_1611678807" r:id="rId484"/>
         </w:object>
       </w:r>
     </w:p>
@@ -25036,7 +25036,7 @@
           <v:shape id="_x0000_i1282" type="#_x0000_t75" style="width:259.5pt;height:34.5pt" o:ole="">
             <v:imagedata r:id="rId485" o:title=""/>
           </v:shape>
-          <o:OLEObject Type="Embed" ProgID="Equation.DSMT4" ShapeID="_x0000_i1282" DrawAspect="Content" ObjectID="_1611677707" r:id="rId486"/>
+          <o:OLEObject Type="Embed" ProgID="Equation.DSMT4" ShapeID="_x0000_i1282" DrawAspect="Content" ObjectID="_1611678808" r:id="rId486"/>
         </w:object>
       </w:r>
     </w:p>
@@ -25064,7 +25064,7 @@
           <v:shape id="_x0000_i1283" type="#_x0000_t75" style="width:451.5pt;height:37.5pt" o:ole="">
             <v:imagedata r:id="rId487" o:title=""/>
           </v:shape>
-          <o:OLEObject Type="Embed" ProgID="Equation.DSMT4" ShapeID="_x0000_i1283" DrawAspect="Content" ObjectID="_1611677708" r:id="rId488"/>
+          <o:OLEObject Type="Embed" ProgID="Equation.DSMT4" ShapeID="_x0000_i1283" DrawAspect="Content" ObjectID="_1611678809" r:id="rId488"/>
         </w:object>
       </w:r>
       <w:r>
@@ -25300,7 +25300,7 @@
           <v:shape id="_x0000_i1284" type="#_x0000_t75" style="width:327pt;height:42pt" o:ole="">
             <v:imagedata r:id="rId489" o:title=""/>
           </v:shape>
-          <o:OLEObject Type="Embed" ProgID="Equation.DSMT4" ShapeID="_x0000_i1284" DrawAspect="Content" ObjectID="_1611677709" r:id="rId490"/>
+          <o:OLEObject Type="Embed" ProgID="Equation.DSMT4" ShapeID="_x0000_i1284" DrawAspect="Content" ObjectID="_1611678810" r:id="rId490"/>
         </w:object>
       </w:r>
       <w:r>
@@ -25365,7 +25365,7 @@
           <v:shape id="_x0000_i1285" type="#_x0000_t75" style="width:2in;height:37.5pt" o:ole="">
             <v:imagedata r:id="rId491" o:title=""/>
           </v:shape>
-          <o:OLEObject Type="Embed" ProgID="Equation.DSMT4" ShapeID="_x0000_i1285" DrawAspect="Content" ObjectID="_1611677710" r:id="rId492"/>
+          <o:OLEObject Type="Embed" ProgID="Equation.DSMT4" ShapeID="_x0000_i1285" DrawAspect="Content" ObjectID="_1611678811" r:id="rId492"/>
         </w:object>
       </w:r>
     </w:p>
@@ -25423,7 +25423,7 @@
           <v:shape id="_x0000_i1286" type="#_x0000_t75" style="width:33pt;height:18pt" o:ole="">
             <v:imagedata r:id="rId493" o:title=""/>
           </v:shape>
-          <o:OLEObject Type="Embed" ProgID="Equation.DSMT4" ShapeID="_x0000_i1286" DrawAspect="Content" ObjectID="_1611677711" r:id="rId494"/>
+          <o:OLEObject Type="Embed" ProgID="Equation.DSMT4" ShapeID="_x0000_i1286" DrawAspect="Content" ObjectID="_1611678812" r:id="rId494"/>
         </w:object>
       </w:r>
       <w:r>
@@ -25495,7 +25495,7 @@
           <v:shape id="_x0000_i1287" type="#_x0000_t75" style="width:33pt;height:18pt" o:ole="">
             <v:imagedata r:id="rId493" o:title=""/>
           </v:shape>
-          <o:OLEObject Type="Embed" ProgID="Equation.DSMT4" ShapeID="_x0000_i1287" DrawAspect="Content" ObjectID="_1611677712" r:id="rId495"/>
+          <o:OLEObject Type="Embed" ProgID="Equation.DSMT4" ShapeID="_x0000_i1287" DrawAspect="Content" ObjectID="_1611678813" r:id="rId495"/>
         </w:object>
       </w:r>
       <w:r>
@@ -25527,7 +25527,7 @@
           <v:shape id="_x0000_i1288" type="#_x0000_t75" style="width:21pt;height:18pt" o:ole="">
             <v:imagedata r:id="rId496" o:title=""/>
           </v:shape>
-          <o:OLEObject Type="Embed" ProgID="Equation.DSMT4" ShapeID="_x0000_i1288" DrawAspect="Content" ObjectID="_1611677713" r:id="rId497"/>
+          <o:OLEObject Type="Embed" ProgID="Equation.DSMT4" ShapeID="_x0000_i1288" DrawAspect="Content" ObjectID="_1611678814" r:id="rId497"/>
         </w:object>
       </w:r>
       <w:r>
@@ -25568,7 +25568,7 @@
           <v:shape id="_x0000_i1289" type="#_x0000_t75" style="width:19.5pt;height:16.5pt" o:ole="">
             <v:imagedata r:id="rId498" o:title=""/>
           </v:shape>
-          <o:OLEObject Type="Embed" ProgID="Equation.DSMT4" ShapeID="_x0000_i1289" DrawAspect="Content" ObjectID="_1611677714" r:id="rId499"/>
+          <o:OLEObject Type="Embed" ProgID="Equation.DSMT4" ShapeID="_x0000_i1289" DrawAspect="Content" ObjectID="_1611678815" r:id="rId499"/>
         </w:object>
       </w:r>
       <w:r>
@@ -25609,7 +25609,7 @@
           <v:shape id="_x0000_i1290" type="#_x0000_t75" style="width:21pt;height:16.5pt" o:ole="">
             <v:imagedata r:id="rId500" o:title=""/>
           </v:shape>
-          <o:OLEObject Type="Embed" ProgID="Equation.DSMT4" ShapeID="_x0000_i1290" DrawAspect="Content" ObjectID="_1611677715" r:id="rId501"/>
+          <o:OLEObject Type="Embed" ProgID="Equation.DSMT4" ShapeID="_x0000_i1290" DrawAspect="Content" ObjectID="_1611678816" r:id="rId501"/>
         </w:object>
       </w:r>
       <w:r>
@@ -25653,7 +25653,7 @@
           <v:shape id="_x0000_i1291" type="#_x0000_t75" style="width:118.5pt;height:30pt" o:ole="">
             <v:imagedata r:id="rId502" o:title=""/>
           </v:shape>
-          <o:OLEObject Type="Embed" ProgID="Equation.DSMT4" ShapeID="_x0000_i1291" DrawAspect="Content" ObjectID="_1611677716" r:id="rId503"/>
+          <o:OLEObject Type="Embed" ProgID="Equation.DSMT4" ShapeID="_x0000_i1291" DrawAspect="Content" ObjectID="_1611678817" r:id="rId503"/>
         </w:object>
       </w:r>
       <w:r>
@@ -25751,7 +25751,7 @@
           <v:shape id="_x0000_i1292" type="#_x0000_t75" style="width:12pt;height:16.5pt" o:ole="">
             <v:imagedata r:id="rId504" o:title=""/>
           </v:shape>
-          <o:OLEObject Type="Embed" ProgID="Equation.DSMT4" ShapeID="_x0000_i1292" DrawAspect="Content" ObjectID="_1611677717" r:id="rId505"/>
+          <o:OLEObject Type="Embed" ProgID="Equation.DSMT4" ShapeID="_x0000_i1292" DrawAspect="Content" ObjectID="_1611678818" r:id="rId505"/>
         </w:object>
       </w:r>
       <w:r>
@@ -25783,7 +25783,7 @@
           <v:shape id="_x0000_i1293" type="#_x0000_t75" style="width:10.5pt;height:13.5pt" o:ole="">
             <v:imagedata r:id="rId506" o:title=""/>
           </v:shape>
-          <o:OLEObject Type="Embed" ProgID="Equation.DSMT4" ShapeID="_x0000_i1293" DrawAspect="Content" ObjectID="_1611677718" r:id="rId507"/>
+          <o:OLEObject Type="Embed" ProgID="Equation.DSMT4" ShapeID="_x0000_i1293" DrawAspect="Content" ObjectID="_1611678819" r:id="rId507"/>
         </w:object>
       </w:r>
       <w:r>
@@ -25815,7 +25815,7 @@
           <v:shape id="_x0000_i1294" type="#_x0000_t75" style="width:18pt;height:18pt" o:ole="">
             <v:imagedata r:id="rId508" o:title=""/>
           </v:shape>
-          <o:OLEObject Type="Embed" ProgID="Equation.DSMT4" ShapeID="_x0000_i1294" DrawAspect="Content" ObjectID="_1611677719" r:id="rId509"/>
+          <o:OLEObject Type="Embed" ProgID="Equation.DSMT4" ShapeID="_x0000_i1294" DrawAspect="Content" ObjectID="_1611678820" r:id="rId509"/>
         </w:object>
       </w:r>
       <w:r>
@@ -25856,7 +25856,7 @@
           <v:shape id="_x0000_i1295" type="#_x0000_t75" style="width:40.5pt;height:18pt" o:ole="">
             <v:imagedata r:id="rId510" o:title=""/>
           </v:shape>
-          <o:OLEObject Type="Embed" ProgID="Equation.DSMT4" ShapeID="_x0000_i1295" DrawAspect="Content" ObjectID="_1611677720" r:id="rId511"/>
+          <o:OLEObject Type="Embed" ProgID="Equation.DSMT4" ShapeID="_x0000_i1295" DrawAspect="Content" ObjectID="_1611678821" r:id="rId511"/>
         </w:object>
       </w:r>
       <w:r>
@@ -25960,7 +25960,7 @@
           <v:shape id="_x0000_i1296" type="#_x0000_t75" style="width:18pt;height:18pt" o:ole="">
             <v:imagedata r:id="rId512" o:title=""/>
           </v:shape>
-          <o:OLEObject Type="Embed" ProgID="Equation.DSMT4" ShapeID="_x0000_i1296" DrawAspect="Content" ObjectID="_1611677721" r:id="rId513"/>
+          <o:OLEObject Type="Embed" ProgID="Equation.DSMT4" ShapeID="_x0000_i1296" DrawAspect="Content" ObjectID="_1611678822" r:id="rId513"/>
         </w:object>
       </w:r>
       <w:r>
@@ -26001,7 +26001,7 @@
           <v:shape id="_x0000_i1297" type="#_x0000_t75" style="width:19.5pt;height:18pt" o:ole="">
             <v:imagedata r:id="rId514" o:title=""/>
           </v:shape>
-          <o:OLEObject Type="Embed" ProgID="Equation.DSMT4" ShapeID="_x0000_i1297" DrawAspect="Content" ObjectID="_1611677722" r:id="rId515"/>
+          <o:OLEObject Type="Embed" ProgID="Equation.DSMT4" ShapeID="_x0000_i1297" DrawAspect="Content" ObjectID="_1611678823" r:id="rId515"/>
         </w:object>
       </w:r>
       <w:r>
@@ -26042,7 +26042,7 @@
           <v:shape id="_x0000_i1298" type="#_x0000_t75" style="width:19.5pt;height:18pt" o:ole="">
             <v:imagedata r:id="rId516" o:title=""/>
           </v:shape>
-          <o:OLEObject Type="Embed" ProgID="Equation.DSMT4" ShapeID="_x0000_i1298" DrawAspect="Content" ObjectID="_1611677723" r:id="rId517"/>
+          <o:OLEObject Type="Embed" ProgID="Equation.DSMT4" ShapeID="_x0000_i1298" DrawAspect="Content" ObjectID="_1611678824" r:id="rId517"/>
         </w:object>
       </w:r>
       <w:r>
@@ -26083,7 +26083,7 @@
           <v:shape id="_x0000_i1299" type="#_x0000_t75" style="width:22.5pt;height:18pt" o:ole="">
             <v:imagedata r:id="rId518" o:title=""/>
           </v:shape>
-          <o:OLEObject Type="Embed" ProgID="Equation.DSMT4" ShapeID="_x0000_i1299" DrawAspect="Content" ObjectID="_1611677724" r:id="rId519"/>
+          <o:OLEObject Type="Embed" ProgID="Equation.DSMT4" ShapeID="_x0000_i1299" DrawAspect="Content" ObjectID="_1611678825" r:id="rId519"/>
         </w:object>
       </w:r>
       <w:r>
@@ -26115,7 +26115,7 @@
           <v:shape id="_x0000_i1300" type="#_x0000_t75" style="width:22.5pt;height:19.5pt" o:ole="">
             <v:imagedata r:id="rId520" o:title=""/>
           </v:shape>
-          <o:OLEObject Type="Embed" ProgID="Equation.DSMT4" ShapeID="_x0000_i1300" DrawAspect="Content" ObjectID="_1611677725" r:id="rId521"/>
+          <o:OLEObject Type="Embed" ProgID="Equation.DSMT4" ShapeID="_x0000_i1300" DrawAspect="Content" ObjectID="_1611678826" r:id="rId521"/>
         </w:object>
       </w:r>
       <w:r>
@@ -26159,7 +26159,7 @@
           <v:shape id="_x0000_i1301" type="#_x0000_t75" style="width:231pt;height:19.5pt" o:ole="">
             <v:imagedata r:id="rId522" o:title=""/>
           </v:shape>
-          <o:OLEObject Type="Embed" ProgID="Equation.DSMT4" ShapeID="_x0000_i1301" DrawAspect="Content" ObjectID="_1611677726" r:id="rId523"/>
+          <o:OLEObject Type="Embed" ProgID="Equation.DSMT4" ShapeID="_x0000_i1301" DrawAspect="Content" ObjectID="_1611678827" r:id="rId523"/>
         </w:object>
       </w:r>
       <w:r>
@@ -26203,7 +26203,7 @@
           <v:shape id="_x0000_i1302" type="#_x0000_t75" style="width:39pt;height:16.5pt" o:ole="">
             <v:imagedata r:id="rId524" o:title=""/>
           </v:shape>
-          <o:OLEObject Type="Embed" ProgID="Equation.DSMT4" ShapeID="_x0000_i1302" DrawAspect="Content" ObjectID="_1611677727" r:id="rId525"/>
+          <o:OLEObject Type="Embed" ProgID="Equation.DSMT4" ShapeID="_x0000_i1302" DrawAspect="Content" ObjectID="_1611678828" r:id="rId525"/>
         </w:object>
       </w:r>
       <w:r>
@@ -26235,7 +26235,7 @@
           <v:shape id="_x0000_i1303" type="#_x0000_t75" style="width:18pt;height:13.5pt" o:ole="">
             <v:imagedata r:id="rId526" o:title=""/>
           </v:shape>
-          <o:OLEObject Type="Embed" ProgID="Equation.DSMT4" ShapeID="_x0000_i1303" DrawAspect="Content" ObjectID="_1611677728" r:id="rId527"/>
+          <o:OLEObject Type="Embed" ProgID="Equation.DSMT4" ShapeID="_x0000_i1303" DrawAspect="Content" ObjectID="_1611678829" r:id="rId527"/>
         </w:object>
       </w:r>
       <w:r>
@@ -26285,7 +26285,7 @@
           <v:shape id="_x0000_i1304" type="#_x0000_t75" style="width:108.75pt;height:28.5pt" o:ole="">
             <v:imagedata r:id="rId528" o:title=""/>
           </v:shape>
-          <o:OLEObject Type="Embed" ProgID="Equation.DSMT4" ShapeID="_x0000_i1304" DrawAspect="Content" ObjectID="_1611677729" r:id="rId529"/>
+          <o:OLEObject Type="Embed" ProgID="Equation.DSMT4" ShapeID="_x0000_i1304" DrawAspect="Content" ObjectID="_1611678830" r:id="rId529"/>
         </w:object>
       </w:r>
       <w:r>
@@ -26317,7 +26317,7 @@
           <v:shape id="_x0000_i1305" type="#_x0000_t75" style="width:52.5pt;height:19.5pt" o:ole="">
             <v:imagedata r:id="rId530" o:title=""/>
           </v:shape>
-          <o:OLEObject Type="Embed" ProgID="Equation.DSMT4" ShapeID="_x0000_i1305" DrawAspect="Content" ObjectID="_1611677730" r:id="rId531"/>
+          <o:OLEObject Type="Embed" ProgID="Equation.DSMT4" ShapeID="_x0000_i1305" DrawAspect="Content" ObjectID="_1611678831" r:id="rId531"/>
         </w:object>
       </w:r>
       <w:r>
@@ -26352,7 +26352,7 @@
           <v:shape id="_x0000_i1306" type="#_x0000_t75" style="width:265.5pt;height:37.5pt" o:ole="">
             <v:imagedata r:id="rId532" o:title=""/>
           </v:shape>
-          <o:OLEObject Type="Embed" ProgID="Equation.DSMT4" ShapeID="_x0000_i1306" DrawAspect="Content" ObjectID="_1611677731" r:id="rId533"/>
+          <o:OLEObject Type="Embed" ProgID="Equation.DSMT4" ShapeID="_x0000_i1306" DrawAspect="Content" ObjectID="_1611678832" r:id="rId533"/>
         </w:object>
       </w:r>
       <w:r>
@@ -26405,7 +26405,7 @@
           <v:shape id="_x0000_i1307" type="#_x0000_t75" style="width:2in;height:37.5pt" o:ole="">
             <v:imagedata r:id="rId534" o:title=""/>
           </v:shape>
-          <o:OLEObject Type="Embed" ProgID="Equation.DSMT4" ShapeID="_x0000_i1307" DrawAspect="Content" ObjectID="_1611677732" r:id="rId535"/>
+          <o:OLEObject Type="Embed" ProgID="Equation.DSMT4" ShapeID="_x0000_i1307" DrawAspect="Content" ObjectID="_1611678833" r:id="rId535"/>
         </w:object>
       </w:r>
     </w:p>
@@ -26430,7 +26430,7 @@
           <v:shape id="_x0000_i1308" type="#_x0000_t75" style="width:341.25pt;height:39.75pt" o:ole="">
             <v:imagedata r:id="rId536" o:title=""/>
           </v:shape>
-          <o:OLEObject Type="Embed" ProgID="Equation.DSMT4" ShapeID="_x0000_i1308" DrawAspect="Content" ObjectID="_1611677733" r:id="rId537"/>
+          <o:OLEObject Type="Embed" ProgID="Equation.DSMT4" ShapeID="_x0000_i1308" DrawAspect="Content" ObjectID="_1611678834" r:id="rId537"/>
         </w:object>
       </w:r>
     </w:p>
@@ -26456,7 +26456,7 @@
           <v:shape id="_x0000_i1309" type="#_x0000_t75" style="width:351pt;height:39.75pt" o:ole="">
             <v:imagedata r:id="rId538" o:title=""/>
           </v:shape>
-          <o:OLEObject Type="Embed" ProgID="Equation.DSMT4" ShapeID="_x0000_i1309" DrawAspect="Content" ObjectID="_1611677734" r:id="rId539"/>
+          <o:OLEObject Type="Embed" ProgID="Equation.DSMT4" ShapeID="_x0000_i1309" DrawAspect="Content" ObjectID="_1611678835" r:id="rId539"/>
         </w:object>
       </w:r>
       <w:r>
@@ -26518,7 +26518,7 @@
           <v:shape id="_x0000_i1310" type="#_x0000_t75" style="width:111pt;height:24pt" o:ole="">
             <v:imagedata r:id="rId540" o:title=""/>
           </v:shape>
-          <o:OLEObject Type="Embed" ProgID="Equation.DSMT4" ShapeID="_x0000_i1310" DrawAspect="Content" ObjectID="_1611677735" r:id="rId541"/>
+          <o:OLEObject Type="Embed" ProgID="Equation.DSMT4" ShapeID="_x0000_i1310" DrawAspect="Content" ObjectID="_1611678836" r:id="rId541"/>
         </w:object>
       </w:r>
       <w:r>
@@ -26631,7 +26631,7 @@
           <v:shape id="_x0000_i1311" type="#_x0000_t75" style="width:10.5pt;height:13.5pt" o:ole="">
             <v:imagedata r:id="rId542" o:title=""/>
           </v:shape>
-          <o:OLEObject Type="Embed" ProgID="Equation.DSMT4" ShapeID="_x0000_i1311" DrawAspect="Content" ObjectID="_1611677736" r:id="rId543"/>
+          <o:OLEObject Type="Embed" ProgID="Equation.DSMT4" ShapeID="_x0000_i1311" DrawAspect="Content" ObjectID="_1611678837" r:id="rId543"/>
         </w:object>
       </w:r>
       <w:r>
@@ -26699,7 +26699,7 @@
           <v:shape id="_x0000_i1312" type="#_x0000_t75" style="width:31.5pt;height:13.5pt" o:ole="">
             <v:imagedata r:id="rId544" o:title=""/>
           </v:shape>
-          <o:OLEObject Type="Embed" ProgID="Equation.DSMT4" ShapeID="_x0000_i1312" DrawAspect="Content" ObjectID="_1611677737" r:id="rId545"/>
+          <o:OLEObject Type="Embed" ProgID="Equation.DSMT4" ShapeID="_x0000_i1312" DrawAspect="Content" ObjectID="_1611678838" r:id="rId545"/>
         </w:object>
       </w:r>
       <w:r>
@@ -26722,7 +26722,7 @@
           <v:shape id="_x0000_i1313" type="#_x0000_t75" style="width:37.5pt;height:13.5pt" o:ole="">
             <v:imagedata r:id="rId546" o:title=""/>
           </v:shape>
-          <o:OLEObject Type="Embed" ProgID="Equation.DSMT4" ShapeID="_x0000_i1313" DrawAspect="Content" ObjectID="_1611677738" r:id="rId547"/>
+          <o:OLEObject Type="Embed" ProgID="Equation.DSMT4" ShapeID="_x0000_i1313" DrawAspect="Content" ObjectID="_1611678839" r:id="rId547"/>
         </w:object>
       </w:r>
       <w:r>
@@ -26784,7 +26784,7 @@
           <v:shape id="_x0000_i1314" type="#_x0000_t75" style="width:280.5pt;height:28.5pt" o:ole="">
             <v:imagedata r:id="rId548" o:title=""/>
           </v:shape>
-          <o:OLEObject Type="Embed" ProgID="Equation.DSMT4" ShapeID="_x0000_i1314" DrawAspect="Content" ObjectID="_1611677739" r:id="rId549"/>
+          <o:OLEObject Type="Embed" ProgID="Equation.DSMT4" ShapeID="_x0000_i1314" DrawAspect="Content" ObjectID="_1611678840" r:id="rId549"/>
         </w:object>
       </w:r>
       <w:r>
@@ -26937,7 +26937,7 @@
           <v:shape id="_x0000_i1315" type="#_x0000_t75" style="width:13.5pt;height:18pt" o:ole="">
             <v:imagedata r:id="rId550" o:title=""/>
           </v:shape>
-          <o:OLEObject Type="Embed" ProgID="Equation.DSMT4" ShapeID="_x0000_i1315" DrawAspect="Content" ObjectID="_1611677740" r:id="rId551"/>
+          <o:OLEObject Type="Embed" ProgID="Equation.DSMT4" ShapeID="_x0000_i1315" DrawAspect="Content" ObjectID="_1611678841" r:id="rId551"/>
         </w:object>
       </w:r>
       <w:r>
@@ -27030,7 +27030,7 @@
           <v:shape id="_x0000_i1316" type="#_x0000_t75" style="width:73.5pt;height:18pt" o:ole="">
             <v:imagedata r:id="rId552" o:title=""/>
           </v:shape>
-          <o:OLEObject Type="Embed" ProgID="Equation.DSMT4" ShapeID="_x0000_i1316" DrawAspect="Content" ObjectID="_1611677741" r:id="rId553"/>
+          <o:OLEObject Type="Embed" ProgID="Equation.DSMT4" ShapeID="_x0000_i1316" DrawAspect="Content" ObjectID="_1611678842" r:id="rId553"/>
         </w:object>
       </w:r>
       <w:r>
@@ -27075,7 +27075,7 @@
           <v:shape id="_x0000_i1317" type="#_x0000_t75" style="width:21pt;height:19.5pt" o:ole="">
             <v:imagedata r:id="rId554" o:title=""/>
           </v:shape>
-          <o:OLEObject Type="Embed" ProgID="Equation.DSMT4" ShapeID="_x0000_i1317" DrawAspect="Content" ObjectID="_1611677742" r:id="rId555"/>
+          <o:OLEObject Type="Embed" ProgID="Equation.DSMT4" ShapeID="_x0000_i1317" DrawAspect="Content" ObjectID="_1611678843" r:id="rId555"/>
         </w:object>
       </w:r>
       <w:r>
@@ -27112,7 +27112,7 @@
           <v:shape id="_x0000_i1318" type="#_x0000_t75" style="width:28.5pt;height:16.5pt" o:ole="">
             <v:imagedata r:id="rId556" o:title=""/>
           </v:shape>
-          <o:OLEObject Type="Embed" ProgID="Equation.DSMT4" ShapeID="_x0000_i1318" DrawAspect="Content" ObjectID="_1611677743" r:id="rId557"/>
+          <o:OLEObject Type="Embed" ProgID="Equation.DSMT4" ShapeID="_x0000_i1318" DrawAspect="Content" ObjectID="_1611678844" r:id="rId557"/>
         </w:object>
       </w:r>
       <w:r>
@@ -27149,7 +27149,7 @@
           <v:shape id="_x0000_i1319" type="#_x0000_t75" style="width:30pt;height:19.5pt" o:ole="">
             <v:imagedata r:id="rId558" o:title=""/>
           </v:shape>
-          <o:OLEObject Type="Embed" ProgID="Equation.DSMT4" ShapeID="_x0000_i1319" DrawAspect="Content" ObjectID="_1611677744" r:id="rId559"/>
+          <o:OLEObject Type="Embed" ProgID="Equation.DSMT4" ShapeID="_x0000_i1319" DrawAspect="Content" ObjectID="_1611678845" r:id="rId559"/>
         </w:object>
       </w:r>
       <w:r>
@@ -27256,7 +27256,7 @@
           <v:shape id="_x0000_i1320" type="#_x0000_t75" style="width:40.5pt;height:18pt" o:ole="">
             <v:imagedata r:id="rId560" o:title=""/>
           </v:shape>
-          <o:OLEObject Type="Embed" ProgID="Equation.DSMT4" ShapeID="_x0000_i1320" DrawAspect="Content" ObjectID="_1611677745" r:id="rId561"/>
+          <o:OLEObject Type="Embed" ProgID="Equation.DSMT4" ShapeID="_x0000_i1320" DrawAspect="Content" ObjectID="_1611678846" r:id="rId561"/>
         </w:object>
       </w:r>
       <w:r>
@@ -27315,7 +27315,7 @@
           <v:shape id="_x0000_i1321" type="#_x0000_t75" style="width:12pt;height:18pt" o:ole="">
             <v:imagedata r:id="rId562" o:title=""/>
           </v:shape>
-          <o:OLEObject Type="Embed" ProgID="Equation.DSMT4" ShapeID="_x0000_i1321" DrawAspect="Content" ObjectID="_1611677746" r:id="rId563"/>
+          <o:OLEObject Type="Embed" ProgID="Equation.DSMT4" ShapeID="_x0000_i1321" DrawAspect="Content" ObjectID="_1611678847" r:id="rId563"/>
         </w:object>
       </w:r>
       <w:r>
@@ -27347,7 +27347,7 @@
           <v:shape id="_x0000_i1322" type="#_x0000_t75" style="width:154.5pt;height:17.25pt" o:ole="">
             <v:imagedata r:id="rId564" o:title=""/>
           </v:shape>
-          <o:OLEObject Type="Embed" ProgID="Equation.DSMT4" ShapeID="_x0000_i1322" DrawAspect="Content" ObjectID="_1611677747" r:id="rId565"/>
+          <o:OLEObject Type="Embed" ProgID="Equation.DSMT4" ShapeID="_x0000_i1322" DrawAspect="Content" ObjectID="_1611678848" r:id="rId565"/>
         </w:object>
       </w:r>
       <w:r>
@@ -27409,7 +27409,7 @@
           <v:shape id="_x0000_i1323" type="#_x0000_t75" style="width:102pt;height:34.5pt" o:ole="">
             <v:imagedata r:id="rId566" o:title=""/>
           </v:shape>
-          <o:OLEObject Type="Embed" ProgID="Equation.DSMT4" ShapeID="_x0000_i1323" DrawAspect="Content" ObjectID="_1611677748" r:id="rId567"/>
+          <o:OLEObject Type="Embed" ProgID="Equation.DSMT4" ShapeID="_x0000_i1323" DrawAspect="Content" ObjectID="_1611678849" r:id="rId567"/>
         </w:object>
       </w:r>
       <w:r>
@@ -27444,7 +27444,7 @@
           <v:shape id="_x0000_i1324" type="#_x0000_t75" style="width:280.5pt;height:22.5pt" o:ole="">
             <v:imagedata r:id="rId568" o:title=""/>
           </v:shape>
-          <o:OLEObject Type="Embed" ProgID="Equation.DSMT4" ShapeID="_x0000_i1324" DrawAspect="Content" ObjectID="_1611677749" r:id="rId569"/>
+          <o:OLEObject Type="Embed" ProgID="Equation.DSMT4" ShapeID="_x0000_i1324" DrawAspect="Content" ObjectID="_1611678850" r:id="rId569"/>
         </w:object>
       </w:r>
       <w:r>
@@ -27479,7 +27479,7 @@
           <v:shape id="_x0000_i1325" type="#_x0000_t75" style="width:434.25pt;height:40.5pt" o:ole="">
             <v:imagedata r:id="rId570" o:title=""/>
           </v:shape>
-          <o:OLEObject Type="Embed" ProgID="Equation.DSMT4" ShapeID="_x0000_i1325" DrawAspect="Content" ObjectID="_1611677750" r:id="rId571"/>
+          <o:OLEObject Type="Embed" ProgID="Equation.DSMT4" ShapeID="_x0000_i1325" DrawAspect="Content" ObjectID="_1611678851" r:id="rId571"/>
         </w:object>
       </w:r>
       <w:r>
@@ -27523,7 +27523,7 @@
           <v:shape id="_x0000_i1326" type="#_x0000_t75" style="width:24pt;height:18pt" o:ole="">
             <v:imagedata r:id="rId572" o:title=""/>
           </v:shape>
-          <o:OLEObject Type="Embed" ProgID="Equation.DSMT4" ShapeID="_x0000_i1326" DrawAspect="Content" ObjectID="_1611677751" r:id="rId573"/>
+          <o:OLEObject Type="Embed" ProgID="Equation.DSMT4" ShapeID="_x0000_i1326" DrawAspect="Content" ObjectID="_1611678852" r:id="rId573"/>
         </w:object>
       </w:r>
       <w:r>
@@ -27983,7 +27983,7 @@
           <v:shape id="_x0000_i1327" type="#_x0000_t75" style="width:13.5pt;height:18pt" o:ole="">
             <v:imagedata r:id="rId574" o:title=""/>
           </v:shape>
-          <o:OLEObject Type="Embed" ProgID="Equation.DSMT4" ShapeID="_x0000_i1327" DrawAspect="Content" ObjectID="_1611677752" r:id="rId575"/>
+          <o:OLEObject Type="Embed" ProgID="Equation.DSMT4" ShapeID="_x0000_i1327" DrawAspect="Content" ObjectID="_1611678853" r:id="rId575"/>
         </w:object>
       </w:r>
       <w:r>
@@ -28142,7 +28142,7 @@
           <v:shape id="_x0000_i1328" type="#_x0000_t75" style="width:15pt;height:18pt" o:ole="">
             <v:imagedata r:id="rId576" o:title=""/>
           </v:shape>
-          <o:OLEObject Type="Embed" ProgID="Equation.DSMT4" ShapeID="_x0000_i1328" DrawAspect="Content" ObjectID="_1611677753" r:id="rId577"/>
+          <o:OLEObject Type="Embed" ProgID="Equation.DSMT4" ShapeID="_x0000_i1328" DrawAspect="Content" ObjectID="_1611678854" r:id="rId577"/>
         </w:object>
       </w:r>
       <w:r>
@@ -28237,7 +28237,7 @@
           <v:shape id="_x0000_i1329" type="#_x0000_t75" style="width:28.5pt;height:19.5pt" o:ole="">
             <v:imagedata r:id="rId578" o:title=""/>
           </v:shape>
-          <o:OLEObject Type="Embed" ProgID="Equation.DSMT4" ShapeID="_x0000_i1329" DrawAspect="Content" ObjectID="_1611677754" r:id="rId579"/>
+          <o:OLEObject Type="Embed" ProgID="Equation.DSMT4" ShapeID="_x0000_i1329" DrawAspect="Content" ObjectID="_1611678855" r:id="rId579"/>
         </w:object>
       </w:r>
       <w:r>
@@ -28287,7 +28287,7 @@
           <v:shape id="_x0000_i1330" type="#_x0000_t75" style="width:28.5pt;height:19.5pt" o:ole="">
             <v:imagedata r:id="rId580" o:title=""/>
           </v:shape>
-          <o:OLEObject Type="Embed" ProgID="Equation.DSMT4" ShapeID="_x0000_i1330" DrawAspect="Content" ObjectID="_1611677755" r:id="rId581"/>
+          <o:OLEObject Type="Embed" ProgID="Equation.DSMT4" ShapeID="_x0000_i1330" DrawAspect="Content" ObjectID="_1611678856" r:id="rId581"/>
         </w:object>
       </w:r>
       <w:r>
@@ -28337,7 +28337,7 @@
           <v:shape id="_x0000_i1331" type="#_x0000_t75" style="width:13.5pt;height:18pt" o:ole="">
             <v:imagedata r:id="rId582" o:title=""/>
           </v:shape>
-          <o:OLEObject Type="Embed" ProgID="Equation.DSMT4" ShapeID="_x0000_i1331" DrawAspect="Content" ObjectID="_1611677756" r:id="rId583"/>
+          <o:OLEObject Type="Embed" ProgID="Equation.DSMT4" ShapeID="_x0000_i1331" DrawAspect="Content" ObjectID="_1611678857" r:id="rId583"/>
         </w:object>
       </w:r>
       <w:r>
@@ -28369,7 +28369,7 @@
           <v:shape id="_x0000_i1332" type="#_x0000_t75" style="width:22.5pt;height:19.5pt" o:ole="">
             <v:imagedata r:id="rId584" o:title=""/>
           </v:shape>
-          <o:OLEObject Type="Embed" ProgID="Equation.DSMT4" ShapeID="_x0000_i1332" DrawAspect="Content" ObjectID="_1611677757" r:id="rId585"/>
+          <o:OLEObject Type="Embed" ProgID="Equation.DSMT4" ShapeID="_x0000_i1332" DrawAspect="Content" ObjectID="_1611678858" r:id="rId585"/>
         </w:object>
       </w:r>
       <w:r>
@@ -28401,7 +28401,7 @@
           <v:shape id="_x0000_i1333" type="#_x0000_t75" style="width:22.5pt;height:13.5pt" o:ole="">
             <v:imagedata r:id="rId586" o:title=""/>
           </v:shape>
-          <o:OLEObject Type="Embed" ProgID="Equation.DSMT4" ShapeID="_x0000_i1333" DrawAspect="Content" ObjectID="_1611677758" r:id="rId587"/>
+          <o:OLEObject Type="Embed" ProgID="Equation.DSMT4" ShapeID="_x0000_i1333" DrawAspect="Content" ObjectID="_1611678859" r:id="rId587"/>
         </w:object>
       </w:r>
       <w:r>
@@ -28442,7 +28442,7 @@
           <v:shape id="_x0000_i1334" type="#_x0000_t75" style="width:25.5pt;height:14.25pt" o:ole="">
             <v:imagedata r:id="rId586" o:title=""/>
           </v:shape>
-          <o:OLEObject Type="Embed" ProgID="Equation.DSMT4" ShapeID="_x0000_i1334" DrawAspect="Content" ObjectID="_1611677759" r:id="rId588"/>
+          <o:OLEObject Type="Embed" ProgID="Equation.DSMT4" ShapeID="_x0000_i1334" DrawAspect="Content" ObjectID="_1611678860" r:id="rId588"/>
         </w:object>
       </w:r>
       <w:r>
@@ -28510,7 +28510,7 @@
           <v:shape id="_x0000_i1335" type="#_x0000_t75" style="width:138pt;height:19.5pt" o:ole="">
             <v:imagedata r:id="rId589" o:title=""/>
           </v:shape>
-          <o:OLEObject Type="Embed" ProgID="Equation.DSMT4" ShapeID="_x0000_i1335" DrawAspect="Content" ObjectID="_1611677760" r:id="rId590"/>
+          <o:OLEObject Type="Embed" ProgID="Equation.DSMT4" ShapeID="_x0000_i1335" DrawAspect="Content" ObjectID="_1611678861" r:id="rId590"/>
         </w:object>
       </w:r>
       <w:r>
@@ -28542,7 +28542,7 @@
           <v:shape id="_x0000_i1336" type="#_x0000_t75" style="width:42pt;height:19.5pt" o:ole="">
             <v:imagedata r:id="rId591" o:title=""/>
           </v:shape>
-          <o:OLEObject Type="Embed" ProgID="Equation.DSMT4" ShapeID="_x0000_i1336" DrawAspect="Content" ObjectID="_1611677761" r:id="rId592"/>
+          <o:OLEObject Type="Embed" ProgID="Equation.DSMT4" ShapeID="_x0000_i1336" DrawAspect="Content" ObjectID="_1611678862" r:id="rId592"/>
         </w:object>
       </w:r>
       <w:r>
@@ -28655,7 +28655,7 @@
           <v:shape id="_x0000_i1337" type="#_x0000_t75" style="width:19.5pt;height:18pt" o:ole="">
             <v:imagedata r:id="rId593" o:title=""/>
           </v:shape>
-          <o:OLEObject Type="Embed" ProgID="Equation.DSMT4" ShapeID="_x0000_i1337" DrawAspect="Content" ObjectID="_1611677762" r:id="rId594"/>
+          <o:OLEObject Type="Embed" ProgID="Equation.DSMT4" ShapeID="_x0000_i1337" DrawAspect="Content" ObjectID="_1611678863" r:id="rId594"/>
         </w:object>
       </w:r>
       <w:r>
@@ -28897,7 +28897,7 @@
           <v:shape id="_x0000_i1338" type="#_x0000_t75" style="width:33.75pt;height:18pt" o:ole="">
             <v:imagedata r:id="rId493" o:title=""/>
           </v:shape>
-          <o:OLEObject Type="Embed" ProgID="Equation.DSMT4" ShapeID="_x0000_i1338" DrawAspect="Content" ObjectID="_1611677763" r:id="rId596"/>
+          <o:OLEObject Type="Embed" ProgID="Equation.DSMT4" ShapeID="_x0000_i1338" DrawAspect="Content" ObjectID="_1611678864" r:id="rId596"/>
         </w:object>
       </w:r>
       <w:r>
@@ -28997,7 +28997,7 @@
           <v:shape id="_x0000_i1339" type="#_x0000_t75" style="width:13.5pt;height:18pt" o:ole="">
             <v:imagedata r:id="rId597" o:title=""/>
           </v:shape>
-          <o:OLEObject Type="Embed" ProgID="Equation.DSMT4" ShapeID="_x0000_i1339" DrawAspect="Content" ObjectID="_1611677764" r:id="rId598"/>
+          <o:OLEObject Type="Embed" ProgID="Equation.DSMT4" ShapeID="_x0000_i1339" DrawAspect="Content" ObjectID="_1611678865" r:id="rId598"/>
         </w:object>
       </w:r>
       <w:r>
@@ -29039,7 +29039,7 @@
           <v:shape id="_x0000_i1340" type="#_x0000_t75" style="width:15pt;height:18pt" o:ole="">
             <v:imagedata r:id="rId599" o:title=""/>
           </v:shape>
-          <o:OLEObject Type="Embed" ProgID="Equation.DSMT4" ShapeID="_x0000_i1340" DrawAspect="Content" ObjectID="_1611677765" r:id="rId600"/>
+          <o:OLEObject Type="Embed" ProgID="Equation.DSMT4" ShapeID="_x0000_i1340" DrawAspect="Content" ObjectID="_1611678866" r:id="rId600"/>
         </w:object>
       </w:r>
       <w:r>
@@ -29089,7 +29089,7 @@
           <v:shape id="_x0000_i1341" type="#_x0000_t75" style="width:12pt;height:10.5pt" o:ole="">
             <v:imagedata r:id="rId601" o:title=""/>
           </v:shape>
-          <o:OLEObject Type="Embed" ProgID="Equation.DSMT4" ShapeID="_x0000_i1341" DrawAspect="Content" ObjectID="_1611677766" r:id="rId602"/>
+          <o:OLEObject Type="Embed" ProgID="Equation.DSMT4" ShapeID="_x0000_i1341" DrawAspect="Content" ObjectID="_1611678867" r:id="rId602"/>
         </w:object>
       </w:r>
       <w:r>
@@ -29148,7 +29148,7 @@
           <v:shape id="_x0000_i1342" type="#_x0000_t75" style="width:16.5pt;height:18pt" o:ole="">
             <v:imagedata r:id="rId603" o:title=""/>
           </v:shape>
-          <o:OLEObject Type="Embed" ProgID="Equation.DSMT4" ShapeID="_x0000_i1342" DrawAspect="Content" ObjectID="_1611677767" r:id="rId604"/>
+          <o:OLEObject Type="Embed" ProgID="Equation.DSMT4" ShapeID="_x0000_i1342" DrawAspect="Content" ObjectID="_1611678868" r:id="rId604"/>
         </w:object>
       </w:r>
       <w:r>
@@ -29180,7 +29180,7 @@
           <v:shape id="_x0000_i1343" type="#_x0000_t75" style="width:21pt;height:18pt" o:ole="">
             <v:imagedata r:id="rId605" o:title=""/>
           </v:shape>
-          <o:OLEObject Type="Embed" ProgID="Equation.DSMT4" ShapeID="_x0000_i1343" DrawAspect="Content" ObjectID="_1611677768" r:id="rId606"/>
+          <o:OLEObject Type="Embed" ProgID="Equation.DSMT4" ShapeID="_x0000_i1343" DrawAspect="Content" ObjectID="_1611678869" r:id="rId606"/>
         </w:object>
       </w:r>
       <w:r>
@@ -29239,7 +29239,7 @@
           <v:shape id="_x0000_i1344" type="#_x0000_t75" style="width:49.5pt;height:18pt" o:ole="">
             <v:imagedata r:id="rId607" o:title=""/>
           </v:shape>
-          <o:OLEObject Type="Embed" ProgID="Equation.DSMT4" ShapeID="_x0000_i1344" DrawAspect="Content" ObjectID="_1611677769" r:id="rId608"/>
+          <o:OLEObject Type="Embed" ProgID="Equation.DSMT4" ShapeID="_x0000_i1344" DrawAspect="Content" ObjectID="_1611678870" r:id="rId608"/>
         </w:object>
       </w:r>
       <w:r>
@@ -29262,7 +29262,7 @@
           <v:shape id="_x0000_i1345" type="#_x0000_t75" style="width:54pt;height:18pt" o:ole="">
             <v:imagedata r:id="rId609" o:title=""/>
           </v:shape>
-          <o:OLEObject Type="Embed" ProgID="Equation.DSMT4" ShapeID="_x0000_i1345" DrawAspect="Content" ObjectID="_1611677770" r:id="rId610"/>
+          <o:OLEObject Type="Embed" ProgID="Equation.DSMT4" ShapeID="_x0000_i1345" DrawAspect="Content" ObjectID="_1611678871" r:id="rId610"/>
         </w:object>
       </w:r>
       <w:r>
@@ -29294,7 +29294,7 @@
           <v:shape id="_x0000_i1346" type="#_x0000_t75" style="width:43.5pt;height:18pt" o:ole="">
             <v:imagedata r:id="rId611" o:title=""/>
           </v:shape>
-          <o:OLEObject Type="Embed" ProgID="Equation.DSMT4" ShapeID="_x0000_i1346" DrawAspect="Content" ObjectID="_1611677771" r:id="rId612"/>
+          <o:OLEObject Type="Embed" ProgID="Equation.DSMT4" ShapeID="_x0000_i1346" DrawAspect="Content" ObjectID="_1611678872" r:id="rId612"/>
         </w:object>
       </w:r>
       <w:r>
@@ -29353,7 +29353,7 @@
           <v:shape id="_x0000_i1347" type="#_x0000_t75" style="width:22.5pt;height:19.5pt" o:ole="">
             <v:imagedata r:id="rId613" o:title=""/>
           </v:shape>
-          <o:OLEObject Type="Embed" ProgID="Equation.DSMT4" ShapeID="_x0000_i1347" DrawAspect="Content" ObjectID="_1611677772" r:id="rId614"/>
+          <o:OLEObject Type="Embed" ProgID="Equation.DSMT4" ShapeID="_x0000_i1347" DrawAspect="Content" ObjectID="_1611678873" r:id="rId614"/>
         </w:object>
       </w:r>
       <w:r>
@@ -29376,7 +29376,7 @@
           <v:shape id="_x0000_i1348" type="#_x0000_t75" style="width:12pt;height:10.5pt" o:ole="">
             <v:imagedata r:id="rId615" o:title=""/>
           </v:shape>
-          <o:OLEObject Type="Embed" ProgID="Equation.DSMT4" ShapeID="_x0000_i1348" DrawAspect="Content" ObjectID="_1611677773" r:id="rId616"/>
+          <o:OLEObject Type="Embed" ProgID="Equation.DSMT4" ShapeID="_x0000_i1348" DrawAspect="Content" ObjectID="_1611678874" r:id="rId616"/>
         </w:object>
       </w:r>
       <w:r>
@@ -29660,7 +29660,7 @@
           <v:shape id="_x0000_i1349" type="#_x0000_t75" style="width:51pt;height:18pt" o:ole="">
             <v:imagedata r:id="rId617" o:title=""/>
           </v:shape>
-          <o:OLEObject Type="Embed" ProgID="Equation.DSMT4" ShapeID="_x0000_i1349" DrawAspect="Content" ObjectID="_1611677774" r:id="rId618"/>
+          <o:OLEObject Type="Embed" ProgID="Equation.DSMT4" ShapeID="_x0000_i1349" DrawAspect="Content" ObjectID="_1611678875" r:id="rId618"/>
         </w:object>
       </w:r>
       <w:r>
@@ -29764,7 +29764,7 @@
           <v:shape id="_x0000_i1350" type="#_x0000_t75" style="width:51pt;height:18pt" o:ole="">
             <v:imagedata r:id="rId617" o:title=""/>
           </v:shape>
-          <o:OLEObject Type="Embed" ProgID="Equation.DSMT4" ShapeID="_x0000_i1350" DrawAspect="Content" ObjectID="_1611677775" r:id="rId619"/>
+          <o:OLEObject Type="Embed" ProgID="Equation.DSMT4" ShapeID="_x0000_i1350" DrawAspect="Content" ObjectID="_1611678876" r:id="rId619"/>
         </w:object>
       </w:r>
       <w:r>
@@ -29787,7 +29787,7 @@
           <v:shape id="_x0000_i1351" type="#_x0000_t75" style="width:100.5pt;height:42pt" o:ole="">
             <v:imagedata r:id="rId620" o:title=""/>
           </v:shape>
-          <o:OLEObject Type="Embed" ProgID="Equation.DSMT4" ShapeID="_x0000_i1351" DrawAspect="Content" ObjectID="_1611677776" r:id="rId621"/>
+          <o:OLEObject Type="Embed" ProgID="Equation.DSMT4" ShapeID="_x0000_i1351" DrawAspect="Content" ObjectID="_1611678877" r:id="rId621"/>
         </w:object>
       </w:r>
       <w:r>
@@ -30008,7 +30008,7 @@
           <v:shape id="_x0000_i1352" type="#_x0000_t75" style="width:40.5pt;height:18pt" o:ole="">
             <v:imagedata r:id="rId622" o:title=""/>
           </v:shape>
-          <o:OLEObject Type="Embed" ProgID="Equation.DSMT4" ShapeID="_x0000_i1352" DrawAspect="Content" ObjectID="_1611677777" r:id="rId623"/>
+          <o:OLEObject Type="Embed" ProgID="Equation.DSMT4" ShapeID="_x0000_i1352" DrawAspect="Content" ObjectID="_1611678878" r:id="rId623"/>
         </w:object>
       </w:r>
       <w:r>
@@ -30229,7 +30229,7 @@
           <v:shape id="_x0000_i1353" type="#_x0000_t75" style="width:51pt;height:18pt" o:ole="">
             <v:imagedata r:id="rId617" o:title=""/>
           </v:shape>
-          <o:OLEObject Type="Embed" ProgID="Equation.DSMT4" ShapeID="_x0000_i1353" DrawAspect="Content" ObjectID="_1611677778" r:id="rId624"/>
+          <o:OLEObject Type="Embed" ProgID="Equation.DSMT4" ShapeID="_x0000_i1353" DrawAspect="Content" ObjectID="_1611678879" r:id="rId624"/>
         </w:object>
       </w:r>
       <w:r>
@@ -30378,7 +30378,7 @@
           <v:shape id="_x0000_i1354" type="#_x0000_t75" style="width:31.5pt;height:16.5pt" o:ole="">
             <v:imagedata r:id="rId625" o:title=""/>
           </v:shape>
-          <o:OLEObject Type="Embed" ProgID="Equation.DSMT4" ShapeID="_x0000_i1354" DrawAspect="Content" ObjectID="_1611677779" r:id="rId626"/>
+          <o:OLEObject Type="Embed" ProgID="Equation.DSMT4" ShapeID="_x0000_i1354" DrawAspect="Content" ObjectID="_1611678880" r:id="rId626"/>
         </w:object>
       </w:r>
       <w:r>
@@ -30420,7 +30420,7 @@
           <v:shape id="_x0000_i1355" type="#_x0000_t75" style="width:31.5pt;height:16.5pt" o:ole="">
             <v:imagedata r:id="rId627" o:title=""/>
           </v:shape>
-          <o:OLEObject Type="Embed" ProgID="Equation.DSMT4" ShapeID="_x0000_i1355" DrawAspect="Content" ObjectID="_1611677780" r:id="rId628"/>
+          <o:OLEObject Type="Embed" ProgID="Equation.DSMT4" ShapeID="_x0000_i1355" DrawAspect="Content" ObjectID="_1611678881" r:id="rId628"/>
         </w:object>
       </w:r>
       <w:r>
@@ -30533,7 +30533,7 @@
           <v:shape id="_x0000_i1356" type="#_x0000_t75" style="width:112.5pt;height:18pt" o:ole="">
             <v:imagedata r:id="rId629" o:title=""/>
           </v:shape>
-          <o:OLEObject Type="Embed" ProgID="Equation.DSMT4" ShapeID="_x0000_i1356" DrawAspect="Content" ObjectID="_1611677781" r:id="rId630"/>
+          <o:OLEObject Type="Embed" ProgID="Equation.DSMT4" ShapeID="_x0000_i1356" DrawAspect="Content" ObjectID="_1611678882" r:id="rId630"/>
         </w:object>
       </w:r>
       <w:r>
@@ -30565,7 +30565,7 @@
           <v:shape id="_x0000_i1357" type="#_x0000_t75" style="width:112.5pt;height:18pt" o:ole="">
             <v:imagedata r:id="rId631" o:title=""/>
           </v:shape>
-          <o:OLEObject Type="Embed" ProgID="Equation.DSMT4" ShapeID="_x0000_i1357" DrawAspect="Content" ObjectID="_1611677782" r:id="rId632"/>
+          <o:OLEObject Type="Embed" ProgID="Equation.DSMT4" ShapeID="_x0000_i1357" DrawAspect="Content" ObjectID="_1611678883" r:id="rId632"/>
         </w:object>
       </w:r>
       <w:r>
@@ -30606,7 +30606,7 @@
           <v:shape id="_x0000_i1358" type="#_x0000_t75" style="width:21pt;height:18pt" o:ole="">
             <v:imagedata r:id="rId633" o:title=""/>
           </v:shape>
-          <o:OLEObject Type="Embed" ProgID="Equation.DSMT4" ShapeID="_x0000_i1358" DrawAspect="Content" ObjectID="_1611677783" r:id="rId634"/>
+          <o:OLEObject Type="Embed" ProgID="Equation.DSMT4" ShapeID="_x0000_i1358" DrawAspect="Content" ObjectID="_1611678884" r:id="rId634"/>
         </w:object>
       </w:r>
       <w:r>
@@ -30792,7 +30792,7 @@
           <v:shape id="_x0000_i1359" type="#_x0000_t75" style="width:31.5pt;height:16.5pt" o:ole="">
             <v:imagedata r:id="rId625" o:title=""/>
           </v:shape>
-          <o:OLEObject Type="Embed" ProgID="Equation.DSMT4" ShapeID="_x0000_i1359" DrawAspect="Content" ObjectID="_1611677784" r:id="rId635"/>
+          <o:OLEObject Type="Embed" ProgID="Equation.DSMT4" ShapeID="_x0000_i1359" DrawAspect="Content" ObjectID="_1611678885" r:id="rId635"/>
         </w:object>
       </w:r>
       <w:r>
@@ -30825,7 +30825,7 @@
           <v:shape id="_x0000_i1360" type="#_x0000_t75" style="width:33pt;height:18pt" o:ole="">
             <v:imagedata r:id="rId493" o:title=""/>
           </v:shape>
-          <o:OLEObject Type="Embed" ProgID="Equation.DSMT4" ShapeID="_x0000_i1360" DrawAspect="Content" ObjectID="_1611677785" r:id="rId636"/>
+          <o:OLEObject Type="Embed" ProgID="Equation.DSMT4" ShapeID="_x0000_i1360" DrawAspect="Content" ObjectID="_1611678886" r:id="rId636"/>
         </w:object>
       </w:r>
       <w:r>
@@ -30858,7 +30858,7 @@
           <v:shape id="_x0000_i1361" type="#_x0000_t75" style="width:40.5pt;height:18pt" o:ole="">
             <v:imagedata r:id="rId622" o:title=""/>
           </v:shape>
-          <o:OLEObject Type="Embed" ProgID="Equation.DSMT4" ShapeID="_x0000_i1361" DrawAspect="Content" ObjectID="_1611677786" r:id="rId637"/>
+          <o:OLEObject Type="Embed" ProgID="Equation.DSMT4" ShapeID="_x0000_i1361" DrawAspect="Content" ObjectID="_1611678887" r:id="rId637"/>
         </w:object>
       </w:r>
       <w:r>
@@ -30929,7 +30929,7 @@
           <v:shape id="_x0000_i1362" type="#_x0000_t75" style="width:63pt;height:18pt" o:ole="">
             <v:imagedata r:id="rId638" o:title=""/>
           </v:shape>
-          <o:OLEObject Type="Embed" ProgID="Equation.DSMT4" ShapeID="_x0000_i1362" DrawAspect="Content" ObjectID="_1611677787" r:id="rId639"/>
+          <o:OLEObject Type="Embed" ProgID="Equation.DSMT4" ShapeID="_x0000_i1362" DrawAspect="Content" ObjectID="_1611678888" r:id="rId639"/>
         </w:object>
       </w:r>
       <w:r>
@@ -31014,7 +31014,7 @@
           <v:shape id="_x0000_i1363" type="#_x0000_t75" style="width:19.5pt;height:18pt" o:ole="">
             <v:imagedata r:id="rId640" o:title=""/>
           </v:shape>
-          <o:OLEObject Type="Embed" ProgID="Equation.DSMT4" ShapeID="_x0000_i1363" DrawAspect="Content" ObjectID="_1611677788" r:id="rId641"/>
+          <o:OLEObject Type="Embed" ProgID="Equation.DSMT4" ShapeID="_x0000_i1363" DrawAspect="Content" ObjectID="_1611678889" r:id="rId641"/>
         </w:object>
       </w:r>
       <w:r>
@@ -31195,7 +31195,7 @@
           <v:shape id="_x0000_i1364" type="#_x0000_t75" style="width:13.5pt;height:18pt" o:ole="">
             <v:imagedata r:id="rId550" o:title=""/>
           </v:shape>
-          <o:OLEObject Type="Embed" ProgID="Equation.DSMT4" ShapeID="_x0000_i1364" DrawAspect="Content" ObjectID="_1611677789" r:id="rId642"/>
+          <o:OLEObject Type="Embed" ProgID="Equation.DSMT4" ShapeID="_x0000_i1364" DrawAspect="Content" ObjectID="_1611678890" r:id="rId642"/>
         </w:object>
       </w:r>
       <w:r>
@@ -31593,7 +31593,7 @@
           <v:shape id="_x0000_i1365" type="#_x0000_t75" style="width:16.5pt;height:18pt" o:ole="">
             <v:imagedata r:id="rId603" o:title=""/>
           </v:shape>
-          <o:OLEObject Type="Embed" ProgID="Equation.DSMT4" ShapeID="_x0000_i1365" DrawAspect="Content" ObjectID="_1611677790" r:id="rId643"/>
+          <o:OLEObject Type="Embed" ProgID="Equation.DSMT4" ShapeID="_x0000_i1365" DrawAspect="Content" ObjectID="_1611678891" r:id="rId643"/>
         </w:object>
       </w:r>
       <w:r>
@@ -31634,7 +31634,7 @@
           <v:shape id="_x0000_i1366" type="#_x0000_t75" style="width:21pt;height:18pt" o:ole="">
             <v:imagedata r:id="rId605" o:title=""/>
           </v:shape>
-          <o:OLEObject Type="Embed" ProgID="Equation.DSMT4" ShapeID="_x0000_i1366" DrawAspect="Content" ObjectID="_1611677791" r:id="rId644"/>
+          <o:OLEObject Type="Embed" ProgID="Equation.DSMT4" ShapeID="_x0000_i1366" DrawAspect="Content" ObjectID="_1611678892" r:id="rId644"/>
         </w:object>
       </w:r>
       <w:r>
@@ -31701,7 +31701,7 @@
           <v:shape id="_x0000_i1367" type="#_x0000_t75" style="width:39pt;height:19.5pt" o:ole="">
             <v:imagedata r:id="rId645" o:title=""/>
           </v:shape>
-          <o:OLEObject Type="Embed" ProgID="Equation.DSMT4" ShapeID="_x0000_i1367" DrawAspect="Content" ObjectID="_1611677792" r:id="rId646"/>
+          <o:OLEObject Type="Embed" ProgID="Equation.DSMT4" ShapeID="_x0000_i1367" DrawAspect="Content" ObjectID="_1611678893" r:id="rId646"/>
         </w:object>
       </w:r>
       <w:r>
@@ -31738,7 +31738,7 @@
           <v:shape id="_x0000_i1368" type="#_x0000_t75" style="width:12pt;height:18pt" o:ole="">
             <v:imagedata r:id="rId647" o:title=""/>
           </v:shape>
-          <o:OLEObject Type="Embed" ProgID="Equation.DSMT4" ShapeID="_x0000_i1368" DrawAspect="Content" ObjectID="_1611677793" r:id="rId648"/>
+          <o:OLEObject Type="Embed" ProgID="Equation.DSMT4" ShapeID="_x0000_i1368" DrawAspect="Content" ObjectID="_1611678894" r:id="rId648"/>
         </w:object>
       </w:r>
       <w:r>
@@ -31775,7 +31775,7 @@
           <v:shape id="_x0000_i1369" type="#_x0000_t75" style="width:13.5pt;height:18pt" o:ole="">
             <v:imagedata r:id="rId649" o:title=""/>
           </v:shape>
-          <o:OLEObject Type="Embed" ProgID="Equation.DSMT4" ShapeID="_x0000_i1369" DrawAspect="Content" ObjectID="_1611677794" r:id="rId650"/>
+          <o:OLEObject Type="Embed" ProgID="Equation.DSMT4" ShapeID="_x0000_i1369" DrawAspect="Content" ObjectID="_1611678895" r:id="rId650"/>
         </w:object>
       </w:r>
       <w:r>
@@ -31812,7 +31812,7 @@
           <v:shape id="_x0000_i1370" type="#_x0000_t75" style="width:70.5pt;height:19.5pt" o:ole="">
             <v:imagedata r:id="rId651" o:title=""/>
           </v:shape>
-          <o:OLEObject Type="Embed" ProgID="Equation.DSMT4" ShapeID="_x0000_i1370" DrawAspect="Content" ObjectID="_1611677795" r:id="rId652"/>
+          <o:OLEObject Type="Embed" ProgID="Equation.DSMT4" ShapeID="_x0000_i1370" DrawAspect="Content" ObjectID="_1611678896" r:id="rId652"/>
         </w:object>
       </w:r>
       <w:r>
@@ -31994,7 +31994,7 @@
           <v:shape id="_x0000_i1371" type="#_x0000_t75" style="width:33pt;height:18pt" o:ole="">
             <v:imagedata r:id="rId653" o:title=""/>
           </v:shape>
-          <o:OLEObject Type="Embed" ProgID="Equation.DSMT4" ShapeID="_x0000_i1371" DrawAspect="Content" ObjectID="_1611677796" r:id="rId654"/>
+          <o:OLEObject Type="Embed" ProgID="Equation.DSMT4" ShapeID="_x0000_i1371" DrawAspect="Content" ObjectID="_1611678897" r:id="rId654"/>
         </w:object>
       </w:r>
       <w:r>
@@ -32026,7 +32026,7 @@
           <v:shape id="_x0000_i1372" type="#_x0000_t75" style="width:48pt;height:18pt" o:ole="">
             <v:imagedata r:id="rId655" o:title=""/>
           </v:shape>
-          <o:OLEObject Type="Embed" ProgID="Equation.DSMT4" ShapeID="_x0000_i1372" DrawAspect="Content" ObjectID="_1611677797" r:id="rId656"/>
+          <o:OLEObject Type="Embed" ProgID="Equation.DSMT4" ShapeID="_x0000_i1372" DrawAspect="Content" ObjectID="_1611678898" r:id="rId656"/>
         </w:object>
       </w:r>
       <w:r>
@@ -32134,7 +32134,7 @@
           <v:shape id="_x0000_i1373" type="#_x0000_t75" style="width:12pt;height:18pt" o:ole="">
             <v:imagedata r:id="rId647" o:title=""/>
           </v:shape>
-          <o:OLEObject Type="Embed" ProgID="Equation.DSMT4" ShapeID="_x0000_i1373" DrawAspect="Content" ObjectID="_1611677798" r:id="rId657"/>
+          <o:OLEObject Type="Embed" ProgID="Equation.DSMT4" ShapeID="_x0000_i1373" DrawAspect="Content" ObjectID="_1611678899" r:id="rId657"/>
         </w:object>
       </w:r>
       <w:r>
@@ -32171,7 +32171,7 @@
           <v:shape id="_x0000_i1374" type="#_x0000_t75" style="width:13.5pt;height:18pt" o:ole="">
             <v:imagedata r:id="rId649" o:title=""/>
           </v:shape>
-          <o:OLEObject Type="Embed" ProgID="Equation.DSMT4" ShapeID="_x0000_i1374" DrawAspect="Content" ObjectID="_1611677799" r:id="rId658"/>
+          <o:OLEObject Type="Embed" ProgID="Equation.DSMT4" ShapeID="_x0000_i1374" DrawAspect="Content" ObjectID="_1611678900" r:id="rId658"/>
         </w:object>
       </w:r>
       <w:r>
@@ -32216,7 +32216,7 @@
           <v:shape id="_x0000_i1375" type="#_x0000_t75" style="width:13.5pt;height:18pt" o:ole="">
             <v:imagedata r:id="rId659" o:title=""/>
           </v:shape>
-          <o:OLEObject Type="Embed" ProgID="Equation.DSMT4" ShapeID="_x0000_i1375" DrawAspect="Content" ObjectID="_1611677800" r:id="rId660"/>
+          <o:OLEObject Type="Embed" ProgID="Equation.DSMT4" ShapeID="_x0000_i1375" DrawAspect="Content" ObjectID="_1611678901" r:id="rId660"/>
         </w:object>
       </w:r>
       <w:r>
@@ -32270,7 +32270,7 @@
           <v:shape id="_x0000_i1376" type="#_x0000_t75" style="width:33pt;height:18pt" o:ole="">
             <v:imagedata r:id="rId661" o:title=""/>
           </v:shape>
-          <o:OLEObject Type="Embed" ProgID="Equation.DSMT4" ShapeID="_x0000_i1376" DrawAspect="Content" ObjectID="_1611677801" r:id="rId662"/>
+          <o:OLEObject Type="Embed" ProgID="Equation.DSMT4" ShapeID="_x0000_i1376" DrawAspect="Content" ObjectID="_1611678902" r:id="rId662"/>
         </w:object>
       </w:r>
       <w:r>
@@ -32363,7 +32363,7 @@
                 <v:shape id="_x0000_i1377" type="#_x0000_t75" style="width:19.5pt;height:18pt" o:ole="">
                   <v:imagedata r:id="rId663" o:title=""/>
                 </v:shape>
-                <o:OLEObject Type="Embed" ProgID="Equation.DSMT4" ShapeID="_x0000_i1377" DrawAspect="Content" ObjectID="_1611677802" r:id="rId664"/>
+                <o:OLEObject Type="Embed" ProgID="Equation.DSMT4" ShapeID="_x0000_i1377" DrawAspect="Content" ObjectID="_1611678903" r:id="rId664"/>
               </w:object>
             </w:r>
           </w:p>
@@ -32419,7 +32419,7 @@
                 <v:shape id="_x0000_i1378" type="#_x0000_t75" style="width:34.5pt;height:18pt" o:ole="">
                   <v:imagedata r:id="rId665" o:title=""/>
                 </v:shape>
-                <o:OLEObject Type="Embed" ProgID="Equation.DSMT4" ShapeID="_x0000_i1378" DrawAspect="Content" ObjectID="_1611677803" r:id="rId666"/>
+                <o:OLEObject Type="Embed" ProgID="Equation.DSMT4" ShapeID="_x0000_i1378" DrawAspect="Content" ObjectID="_1611678904" r:id="rId666"/>
               </w:object>
             </w:r>
           </w:p>
@@ -32483,7 +32483,7 @@
                 <v:shape id="_x0000_i1379" type="#_x0000_t75" style="width:25.5pt;height:16.5pt" o:ole="">
                   <v:imagedata r:id="rId667" o:title=""/>
                 </v:shape>
-                <o:OLEObject Type="Embed" ProgID="Equation.DSMT4" ShapeID="_x0000_i1379" DrawAspect="Content" ObjectID="_1611677804" r:id="rId668"/>
+                <o:OLEObject Type="Embed" ProgID="Equation.DSMT4" ShapeID="_x0000_i1379" DrawAspect="Content" ObjectID="_1611678905" r:id="rId668"/>
               </w:object>
             </w:r>
           </w:p>
@@ -32567,7 +32567,7 @@
                 <v:shape id="_x0000_i1380" type="#_x0000_t75" style="width:25.5pt;height:16.5pt" o:ole="">
                   <v:imagedata r:id="rId667" o:title=""/>
                 </v:shape>
-                <o:OLEObject Type="Embed" ProgID="Equation.DSMT4" ShapeID="_x0000_i1380" DrawAspect="Content" ObjectID="_1611677805" r:id="rId669"/>
+                <o:OLEObject Type="Embed" ProgID="Equation.DSMT4" ShapeID="_x0000_i1380" DrawAspect="Content" ObjectID="_1611678906" r:id="rId669"/>
               </w:object>
             </w:r>
           </w:p>
@@ -32660,7 +32660,7 @@
                 <v:shape id="_x0000_i1381" type="#_x0000_t75" style="width:25.5pt;height:16.5pt" o:ole="">
                   <v:imagedata r:id="rId667" o:title=""/>
                 </v:shape>
-                <o:OLEObject Type="Embed" ProgID="Equation.DSMT4" ShapeID="_x0000_i1381" DrawAspect="Content" ObjectID="_1611677806" r:id="rId670"/>
+                <o:OLEObject Type="Embed" ProgID="Equation.DSMT4" ShapeID="_x0000_i1381" DrawAspect="Content" ObjectID="_1611678907" r:id="rId670"/>
               </w:object>
             </w:r>
           </w:p>
@@ -32745,7 +32745,7 @@
                 <v:shape id="_x0000_i1382" type="#_x0000_t75" style="width:25.5pt;height:16.5pt" o:ole="">
                   <v:imagedata r:id="rId667" o:title=""/>
                 </v:shape>
-                <o:OLEObject Type="Embed" ProgID="Equation.DSMT4" ShapeID="_x0000_i1382" DrawAspect="Content" ObjectID="_1611677807" r:id="rId671"/>
+                <o:OLEObject Type="Embed" ProgID="Equation.DSMT4" ShapeID="_x0000_i1382" DrawAspect="Content" ObjectID="_1611678908" r:id="rId671"/>
               </w:object>
             </w:r>
           </w:p>
@@ -32801,7 +32801,7 @@
                 <v:shape id="_x0000_i1383" type="#_x0000_t75" style="width:31.5pt;height:18pt" o:ole="">
                   <v:imagedata r:id="rId672" o:title=""/>
                 </v:shape>
-                <o:OLEObject Type="Embed" ProgID="Equation.DSMT4" ShapeID="_x0000_i1383" DrawAspect="Content" ObjectID="_1611677808" r:id="rId673"/>
+                <o:OLEObject Type="Embed" ProgID="Equation.DSMT4" ShapeID="_x0000_i1383" DrawAspect="Content" ObjectID="_1611678909" r:id="rId673"/>
               </w:object>
             </w:r>
           </w:p>
@@ -32875,7 +32875,7 @@
                 <v:shape id="_x0000_i1384" type="#_x0000_t75" style="width:25.5pt;height:16.5pt" o:ole="">
                   <v:imagedata r:id="rId667" o:title=""/>
                 </v:shape>
-                <o:OLEObject Type="Embed" ProgID="Equation.DSMT4" ShapeID="_x0000_i1384" DrawAspect="Content" ObjectID="_1611677809" r:id="rId674"/>
+                <o:OLEObject Type="Embed" ProgID="Equation.DSMT4" ShapeID="_x0000_i1384" DrawAspect="Content" ObjectID="_1611678910" r:id="rId674"/>
               </w:object>
             </w:r>
           </w:p>
@@ -32961,7 +32961,7 @@
                 <v:shape id="_x0000_i1385" type="#_x0000_t75" style="width:25.5pt;height:16.5pt" o:ole="">
                   <v:imagedata r:id="rId667" o:title=""/>
                 </v:shape>
-                <o:OLEObject Type="Embed" ProgID="Equation.DSMT4" ShapeID="_x0000_i1385" DrawAspect="Content" ObjectID="_1611677810" r:id="rId675"/>
+                <o:OLEObject Type="Embed" ProgID="Equation.DSMT4" ShapeID="_x0000_i1385" DrawAspect="Content" ObjectID="_1611678911" r:id="rId675"/>
               </w:object>
             </w:r>
           </w:p>
@@ -33046,7 +33046,7 @@
                 <v:shape id="_x0000_i1386" type="#_x0000_t75" style="width:25.5pt;height:16.5pt" o:ole="">
                   <v:imagedata r:id="rId667" o:title=""/>
                 </v:shape>
-                <o:OLEObject Type="Embed" ProgID="Equation.DSMT4" ShapeID="_x0000_i1386" DrawAspect="Content" ObjectID="_1611677811" r:id="rId676"/>
+                <o:OLEObject Type="Embed" ProgID="Equation.DSMT4" ShapeID="_x0000_i1386" DrawAspect="Content" ObjectID="_1611678912" r:id="rId676"/>
               </w:object>
             </w:r>
           </w:p>
@@ -33134,7 +33134,7 @@
                 <v:shape id="_x0000_i1387" type="#_x0000_t75" style="width:25.5pt;height:16.5pt" o:ole="">
                   <v:imagedata r:id="rId667" o:title=""/>
                 </v:shape>
-                <o:OLEObject Type="Embed" ProgID="Equation.DSMT4" ShapeID="_x0000_i1387" DrawAspect="Content" ObjectID="_1611677812" r:id="rId677"/>
+                <o:OLEObject Type="Embed" ProgID="Equation.DSMT4" ShapeID="_x0000_i1387" DrawAspect="Content" ObjectID="_1611678913" r:id="rId677"/>
               </w:object>
             </w:r>
           </w:p>
@@ -33192,7 +33192,7 @@
           <v:shape id="_x0000_i1388" type="#_x0000_t75" style="width:37.5pt;height:18pt" o:ole="">
             <v:imagedata r:id="rId678" o:title=""/>
           </v:shape>
-          <o:OLEObject Type="Embed" ProgID="Equation.DSMT4" ShapeID="_x0000_i1388" DrawAspect="Content" ObjectID="_1611677813" r:id="rId679"/>
+          <o:OLEObject Type="Embed" ProgID="Equation.DSMT4" ShapeID="_x0000_i1388" DrawAspect="Content" ObjectID="_1611678914" r:id="rId679"/>
         </w:object>
       </w:r>
       <w:r>
@@ -33214,7 +33214,7 @@
           <v:shape id="_x0000_i1389" type="#_x0000_t75" style="width:34.5pt;height:18pt" o:ole="">
             <v:imagedata r:id="rId665" o:title=""/>
           </v:shape>
-          <o:OLEObject Type="Embed" ProgID="Equation.DSMT4" ShapeID="_x0000_i1389" DrawAspect="Content" ObjectID="_1611677814" r:id="rId680"/>
+          <o:OLEObject Type="Embed" ProgID="Equation.DSMT4" ShapeID="_x0000_i1389" DrawAspect="Content" ObjectID="_1611678915" r:id="rId680"/>
         </w:object>
       </w:r>
       <w:r>
@@ -33243,7 +33243,7 @@
           <v:shape id="_x0000_i1390" type="#_x0000_t75" style="width:33pt;height:18pt" o:ole="">
             <v:imagedata r:id="rId681" o:title=""/>
           </v:shape>
-          <o:OLEObject Type="Embed" ProgID="Equation.DSMT4" ShapeID="_x0000_i1390" DrawAspect="Content" ObjectID="_1611677815" r:id="rId682"/>
+          <o:OLEObject Type="Embed" ProgID="Equation.DSMT4" ShapeID="_x0000_i1390" DrawAspect="Content" ObjectID="_1611678916" r:id="rId682"/>
         </w:object>
       </w:r>
       <w:r>
@@ -33272,7 +33272,7 @@
           <v:shape id="_x0000_i1391" type="#_x0000_t75" style="width:31.5pt;height:18pt" o:ole="">
             <v:imagedata r:id="rId683" o:title=""/>
           </v:shape>
-          <o:OLEObject Type="Embed" ProgID="Equation.DSMT4" ShapeID="_x0000_i1391" DrawAspect="Content" ObjectID="_1611677816" r:id="rId684"/>
+          <o:OLEObject Type="Embed" ProgID="Equation.DSMT4" ShapeID="_x0000_i1391" DrawAspect="Content" ObjectID="_1611678917" r:id="rId684"/>
         </w:object>
       </w:r>
       <w:r>
@@ -33350,7 +33350,7 @@
           <v:shape id="_x0000_i1392" type="#_x0000_t75" style="width:34.5pt;height:18pt" o:ole="">
             <v:imagedata r:id="rId665" o:title=""/>
           </v:shape>
-          <o:OLEObject Type="Embed" ProgID="Equation.DSMT4" ShapeID="_x0000_i1392" DrawAspect="Content" ObjectID="_1611677817" r:id="rId685"/>
+          <o:OLEObject Type="Embed" ProgID="Equation.DSMT4" ShapeID="_x0000_i1392" DrawAspect="Content" ObjectID="_1611678918" r:id="rId685"/>
         </w:object>
       </w:r>
       <w:r>
@@ -33372,7 +33372,7 @@
           <v:shape id="_x0000_i1393" type="#_x0000_t75" style="width:37.5pt;height:18pt" o:ole="">
             <v:imagedata r:id="rId678" o:title=""/>
           </v:shape>
-          <o:OLEObject Type="Embed" ProgID="Equation.DSMT4" ShapeID="_x0000_i1393" DrawAspect="Content" ObjectID="_1611677818" r:id="rId686"/>
+          <o:OLEObject Type="Embed" ProgID="Equation.DSMT4" ShapeID="_x0000_i1393" DrawAspect="Content" ObjectID="_1611678919" r:id="rId686"/>
         </w:object>
       </w:r>
       <w:r>
@@ -33409,7 +33409,7 @@
           <v:shape id="_x0000_i1394" type="#_x0000_t75" style="width:48pt;height:18pt" o:ole="">
             <v:imagedata r:id="rId687" o:title=""/>
           </v:shape>
-          <o:OLEObject Type="Embed" ProgID="Equation.DSMT4" ShapeID="_x0000_i1394" DrawAspect="Content" ObjectID="_1611677819" r:id="rId688"/>
+          <o:OLEObject Type="Embed" ProgID="Equation.DSMT4" ShapeID="_x0000_i1394" DrawAspect="Content" ObjectID="_1611678920" r:id="rId688"/>
         </w:object>
       </w:r>
       <w:r>
@@ -33486,7 +33486,7 @@
           <v:shape id="_x0000_i1395" type="#_x0000_t75" style="width:36pt;height:19.5pt" o:ole="">
             <v:imagedata r:id="rId689" o:title=""/>
           </v:shape>
-          <o:OLEObject Type="Embed" ProgID="Equation.DSMT4" ShapeID="_x0000_i1395" DrawAspect="Content" ObjectID="_1611677820" r:id="rId690"/>
+          <o:OLEObject Type="Embed" ProgID="Equation.DSMT4" ShapeID="_x0000_i1395" DrawAspect="Content" ObjectID="_1611678921" r:id="rId690"/>
         </w:object>
       </w:r>
       <w:r>
@@ -33748,7 +33748,7 @@
           <v:shape id="_x0000_i1396" type="#_x0000_t75" style="width:19.5pt;height:13.5pt" o:ole="">
             <v:imagedata r:id="rId691" o:title=""/>
           </v:shape>
-          <o:OLEObject Type="Embed" ProgID="Equation.DSMT4" ShapeID="_x0000_i1396" DrawAspect="Content" ObjectID="_1611677821" r:id="rId692"/>
+          <o:OLEObject Type="Embed" ProgID="Equation.DSMT4" ShapeID="_x0000_i1396" DrawAspect="Content" ObjectID="_1611678922" r:id="rId692"/>
         </w:object>
       </w:r>
       <w:r>
@@ -33769,7 +33769,7 @@
           <v:shape id="_x0000_i1397" type="#_x0000_t75" style="width:39pt;height:19.5pt" o:ole="">
             <v:imagedata r:id="rId645" o:title=""/>
           </v:shape>
-          <o:OLEObject Type="Embed" ProgID="Equation.DSMT4" ShapeID="_x0000_i1397" DrawAspect="Content" ObjectID="_1611677822" r:id="rId693"/>
+          <o:OLEObject Type="Embed" ProgID="Equation.DSMT4" ShapeID="_x0000_i1397" DrawAspect="Content" ObjectID="_1611678923" r:id="rId693"/>
         </w:object>
       </w:r>
       <w:r>
@@ -33806,7 +33806,7 @@
           <v:shape id="_x0000_i1398" type="#_x0000_t75" style="width:70.5pt;height:19.5pt" o:ole="">
             <v:imagedata r:id="rId694" o:title=""/>
           </v:shape>
-          <o:OLEObject Type="Embed" ProgID="Equation.DSMT4" ShapeID="_x0000_i1398" DrawAspect="Content" ObjectID="_1611677823" r:id="rId695"/>
+          <o:OLEObject Type="Embed" ProgID="Equation.DSMT4" ShapeID="_x0000_i1398" DrawAspect="Content" ObjectID="_1611678924" r:id="rId695"/>
         </w:object>
       </w:r>
       <w:r>
@@ -33859,7 +33859,7 @@
           <v:shape id="_x0000_i1399" type="#_x0000_t75" style="width:19.5pt;height:18pt" o:ole="">
             <v:imagedata r:id="rId696" o:title=""/>
           </v:shape>
-          <o:OLEObject Type="Embed" ProgID="Equation.DSMT4" ShapeID="_x0000_i1399" DrawAspect="Content" ObjectID="_1611677824" r:id="rId697"/>
+          <o:OLEObject Type="Embed" ProgID="Equation.DSMT4" ShapeID="_x0000_i1399" DrawAspect="Content" ObjectID="_1611678925" r:id="rId697"/>
         </w:object>
       </w:r>
       <w:r>
@@ -33928,7 +33928,7 @@
           <v:shape id="_x0000_i1400" type="#_x0000_t75" style="width:19.5pt;height:18pt" o:ole="">
             <v:imagedata r:id="rId696" o:title=""/>
           </v:shape>
-          <o:OLEObject Type="Embed" ProgID="Equation.DSMT4" ShapeID="_x0000_i1400" DrawAspect="Content" ObjectID="_1611677825" r:id="rId698"/>
+          <o:OLEObject Type="Embed" ProgID="Equation.DSMT4" ShapeID="_x0000_i1400" DrawAspect="Content" ObjectID="_1611678926" r:id="rId698"/>
         </w:object>
       </w:r>
       <w:r>
@@ -34516,7 +34516,7 @@
           <v:shape id="_x0000_i1401" type="#_x0000_t75" style="width:33pt;height:18pt" o:ole="">
             <v:imagedata r:id="rId699" o:title=""/>
           </v:shape>
-          <o:OLEObject Type="Embed" ProgID="Equation.DSMT4" ShapeID="_x0000_i1401" DrawAspect="Content" ObjectID="_1611677826" r:id="rId700"/>
+          <o:OLEObject Type="Embed" ProgID="Equation.DSMT4" ShapeID="_x0000_i1401" DrawAspect="Content" ObjectID="_1611678927" r:id="rId700"/>
         </w:object>
       </w:r>
       <w:r>
@@ -34584,7 +34584,7 @@
           <v:shape id="_x0000_i1402" type="#_x0000_t75" style="width:84pt;height:28.5pt" o:ole="">
             <v:imagedata r:id="rId701" o:title=""/>
           </v:shape>
-          <o:OLEObject Type="Embed" ProgID="Equation.DSMT4" ShapeID="_x0000_i1402" DrawAspect="Content" ObjectID="_1611677827" r:id="rId702"/>
+          <o:OLEObject Type="Embed" ProgID="Equation.DSMT4" ShapeID="_x0000_i1402" DrawAspect="Content" ObjectID="_1611678928" r:id="rId702"/>
         </w:object>
       </w:r>
       <w:r>
@@ -34607,7 +34607,7 @@
           <v:shape id="_x0000_i1403" type="#_x0000_t75" style="width:88.5pt;height:28.5pt" o:ole="">
             <v:imagedata r:id="rId703" o:title=""/>
           </v:shape>
-          <o:OLEObject Type="Embed" ProgID="Equation.DSMT4" ShapeID="_x0000_i1403" DrawAspect="Content" ObjectID="_1611677828" r:id="rId704"/>
+          <o:OLEObject Type="Embed" ProgID="Equation.DSMT4" ShapeID="_x0000_i1403" DrawAspect="Content" ObjectID="_1611678929" r:id="rId704"/>
         </w:object>
       </w:r>
       <w:r>
@@ -34774,7 +34774,7 @@
           <v:shape id="_x0000_i1404" type="#_x0000_t75" style="width:19.5pt;height:19.5pt" o:ole="">
             <v:imagedata r:id="rId705" o:title=""/>
           </v:shape>
-          <o:OLEObject Type="Embed" ProgID="Equation.DSMT4" ShapeID="_x0000_i1404" DrawAspect="Content" ObjectID="_1611677829" r:id="rId706"/>
+          <o:OLEObject Type="Embed" ProgID="Equation.DSMT4" ShapeID="_x0000_i1404" DrawAspect="Content" ObjectID="_1611678930" r:id="rId706"/>
         </w:object>
       </w:r>
       <w:r>
@@ -34797,7 +34797,7 @@
           <v:shape id="_x0000_i1405" type="#_x0000_t75" style="width:58.5pt;height:13.5pt" o:ole="">
             <v:imagedata r:id="rId707" o:title=""/>
           </v:shape>
-          <o:OLEObject Type="Embed" ProgID="Equation.DSMT4" ShapeID="_x0000_i1405" DrawAspect="Content" ObjectID="_1611677830" r:id="rId708"/>
+          <o:OLEObject Type="Embed" ProgID="Equation.DSMT4" ShapeID="_x0000_i1405" DrawAspect="Content" ObjectID="_1611678931" r:id="rId708"/>
         </w:object>
       </w:r>
       <w:r>
@@ -34829,7 +34829,7 @@
           <v:shape id="_x0000_i1406" type="#_x0000_t75" style="width:33pt;height:18pt" o:ole="">
             <v:imagedata r:id="rId699" o:title=""/>
           </v:shape>
-          <o:OLEObject Type="Embed" ProgID="Equation.DSMT4" ShapeID="_x0000_i1406" DrawAspect="Content" ObjectID="_1611677831" r:id="rId709"/>
+          <o:OLEObject Type="Embed" ProgID="Equation.DSMT4" ShapeID="_x0000_i1406" DrawAspect="Content" ObjectID="_1611678932" r:id="rId709"/>
         </w:object>
       </w:r>
       <w:r>
@@ -34960,7 +34960,7 @@
           <v:shape id="_x0000_i1407" type="#_x0000_t75" style="width:123pt;height:28.5pt" o:ole="">
             <v:imagedata r:id="rId710" o:title=""/>
           </v:shape>
-          <o:OLEObject Type="Embed" ProgID="Equation.DSMT4" ShapeID="_x0000_i1407" DrawAspect="Content" ObjectID="_1611677832" r:id="rId711"/>
+          <o:OLEObject Type="Embed" ProgID="Equation.DSMT4" ShapeID="_x0000_i1407" DrawAspect="Content" ObjectID="_1611678933" r:id="rId711"/>
         </w:object>
       </w:r>
       <w:r>
@@ -35625,7 +35625,7 @@
           <v:shape id="_x0000_i1408" type="#_x0000_t75" style="width:9pt;height:13.5pt" o:ole="">
             <v:imagedata r:id="rId712" o:title=""/>
           </v:shape>
-          <o:OLEObject Type="Embed" ProgID="Equation.DSMT4" ShapeID="_x0000_i1408" DrawAspect="Content" ObjectID="_1611677833" r:id="rId713"/>
+          <o:OLEObject Type="Embed" ProgID="Equation.DSMT4" ShapeID="_x0000_i1408" DrawAspect="Content" ObjectID="_1611678934" r:id="rId713"/>
         </w:object>
       </w:r>
       <w:r>
@@ -35639,7 +35639,7 @@
           <v:shape id="_x0000_i1409" type="#_x0000_t75" style="width:124.5pt;height:28.5pt" o:ole="">
             <v:imagedata r:id="rId714" o:title=""/>
           </v:shape>
-          <o:OLEObject Type="Embed" ProgID="Equation.DSMT4" ShapeID="_x0000_i1409" DrawAspect="Content" ObjectID="_1611677834" r:id="rId715"/>
+          <o:OLEObject Type="Embed" ProgID="Equation.DSMT4" ShapeID="_x0000_i1409" DrawAspect="Content" ObjectID="_1611678935" r:id="rId715"/>
         </w:object>
       </w:r>
       <w:r>
@@ -35662,7 +35662,7 @@
           <v:shape id="_x0000_i1410" type="#_x0000_t75" style="width:12pt;height:10.5pt" o:ole="">
             <v:imagedata r:id="rId716" o:title=""/>
           </v:shape>
-          <o:OLEObject Type="Embed" ProgID="Equation.DSMT4" ShapeID="_x0000_i1410" DrawAspect="Content" ObjectID="_1611677835" r:id="rId717"/>
+          <o:OLEObject Type="Embed" ProgID="Equation.DSMT4" ShapeID="_x0000_i1410" DrawAspect="Content" ObjectID="_1611678936" r:id="rId717"/>
         </w:object>
       </w:r>
       <w:r>
@@ -36063,7 +36063,7 @@
           <v:shape id="_x0000_i1411" type="#_x0000_t75" style="width:16.5pt;height:18pt" o:ole="">
             <v:imagedata r:id="rId718" o:title=""/>
           </v:shape>
-          <o:OLEObject Type="Embed" ProgID="Equation.DSMT4" ShapeID="_x0000_i1411" DrawAspect="Content" ObjectID="_1611677836" r:id="rId719"/>
+          <o:OLEObject Type="Embed" ProgID="Equation.DSMT4" ShapeID="_x0000_i1411" DrawAspect="Content" ObjectID="_1611678937" r:id="rId719"/>
         </w:object>
       </w:r>
       <w:r>
@@ -36131,7 +36131,7 @@
           <v:shape id="_x0000_i1412" type="#_x0000_t75" style="width:19.5pt;height:19.5pt" o:ole="">
             <v:imagedata r:id="rId720" o:title=""/>
           </v:shape>
-          <o:OLEObject Type="Embed" ProgID="Equation.DSMT4" ShapeID="_x0000_i1412" DrawAspect="Content" ObjectID="_1611677837" r:id="rId721"/>
+          <o:OLEObject Type="Embed" ProgID="Equation.DSMT4" ShapeID="_x0000_i1412" DrawAspect="Content" ObjectID="_1611678938" r:id="rId721"/>
         </w:object>
       </w:r>
       <w:r>
@@ -36254,7 +36254,7 @@
           <v:shape id="_x0000_i1413" type="#_x0000_t75" style="width:250.5pt;height:34.5pt" o:ole="">
             <v:imagedata r:id="rId722" o:title=""/>
           </v:shape>
-          <o:OLEObject Type="Embed" ProgID="Equation.DSMT4" ShapeID="_x0000_i1413" DrawAspect="Content" ObjectID="_1611677838" r:id="rId723"/>
+          <o:OLEObject Type="Embed" ProgID="Equation.DSMT4" ShapeID="_x0000_i1413" DrawAspect="Content" ObjectID="_1611678939" r:id="rId723"/>
         </w:object>
       </w:r>
       <w:r>
@@ -36302,7 +36302,7 @@
           <v:shape id="_x0000_i1414" type="#_x0000_t75" style="width:18pt;height:18pt" o:ole="">
             <v:imagedata r:id="rId724" o:title=""/>
           </v:shape>
-          <o:OLEObject Type="Embed" ProgID="Equation.DSMT4" ShapeID="_x0000_i1414" DrawAspect="Content" ObjectID="_1611677839" r:id="rId725"/>
+          <o:OLEObject Type="Embed" ProgID="Equation.DSMT4" ShapeID="_x0000_i1414" DrawAspect="Content" ObjectID="_1611678940" r:id="rId725"/>
         </w:object>
       </w:r>
       <w:r>
@@ -36323,7 +36323,7 @@
           <v:shape id="_x0000_i1415" type="#_x0000_t75" style="width:16.5pt;height:18pt" o:ole="">
             <v:imagedata r:id="rId726" o:title=""/>
           </v:shape>
-          <o:OLEObject Type="Embed" ProgID="Equation.DSMT4" ShapeID="_x0000_i1415" DrawAspect="Content" ObjectID="_1611677840" r:id="rId727"/>
+          <o:OLEObject Type="Embed" ProgID="Equation.DSMT4" ShapeID="_x0000_i1415" DrawAspect="Content" ObjectID="_1611678941" r:id="rId727"/>
         </w:object>
       </w:r>
       <w:r>
@@ -36344,7 +36344,7 @@
           <v:shape id="_x0000_i1416" type="#_x0000_t75" style="width:16.5pt;height:18pt" o:ole="">
             <v:imagedata r:id="rId728" o:title=""/>
           </v:shape>
-          <o:OLEObject Type="Embed" ProgID="Equation.DSMT4" ShapeID="_x0000_i1416" DrawAspect="Content" ObjectID="_1611677841" r:id="rId729"/>
+          <o:OLEObject Type="Embed" ProgID="Equation.DSMT4" ShapeID="_x0000_i1416" DrawAspect="Content" ObjectID="_1611678942" r:id="rId729"/>
         </w:object>
       </w:r>
       <w:r>
@@ -36390,7 +36390,7 @@
           <v:shape id="_x0000_i1417" type="#_x0000_t75" style="width:12pt;height:13.5pt" o:ole="">
             <v:imagedata r:id="rId730" o:title=""/>
           </v:shape>
-          <o:OLEObject Type="Embed" ProgID="Equation.DSMT4" ShapeID="_x0000_i1417" DrawAspect="Content" ObjectID="_1611677842" r:id="rId731"/>
+          <o:OLEObject Type="Embed" ProgID="Equation.DSMT4" ShapeID="_x0000_i1417" DrawAspect="Content" ObjectID="_1611678943" r:id="rId731"/>
         </w:object>
       </w:r>
       <w:r>
@@ -36422,7 +36422,7 @@
           <v:shape id="_x0000_i1418" type="#_x0000_t75" style="width:9pt;height:10.5pt" o:ole="">
             <v:imagedata r:id="rId732" o:title=""/>
           </v:shape>
-          <o:OLEObject Type="Embed" ProgID="Equation.DSMT4" ShapeID="_x0000_i1418" DrawAspect="Content" ObjectID="_1611677843" r:id="rId733"/>
+          <o:OLEObject Type="Embed" ProgID="Equation.DSMT4" ShapeID="_x0000_i1418" DrawAspect="Content" ObjectID="_1611678944" r:id="rId733"/>
         </w:object>
       </w:r>
       <w:r>
@@ -36454,7 +36454,7 @@
           <v:shape id="_x0000_i1419" type="#_x0000_t75" style="width:16.5pt;height:18pt" o:ole="">
             <v:imagedata r:id="rId734" o:title=""/>
           </v:shape>
-          <o:OLEObject Type="Embed" ProgID="Equation.DSMT4" ShapeID="_x0000_i1419" DrawAspect="Content" ObjectID="_1611677844" r:id="rId735"/>
+          <o:OLEObject Type="Embed" ProgID="Equation.DSMT4" ShapeID="_x0000_i1419" DrawAspect="Content" ObjectID="_1611678945" r:id="rId735"/>
         </w:object>
       </w:r>
       <w:r>
@@ -36486,7 +36486,7 @@
           <v:shape id="_x0000_i1420" type="#_x0000_t75" style="width:12pt;height:10.5pt" o:ole="">
             <v:imagedata r:id="rId736" o:title=""/>
           </v:shape>
-          <o:OLEObject Type="Embed" ProgID="Equation.DSMT4" ShapeID="_x0000_i1420" DrawAspect="Content" ObjectID="_1611677845" r:id="rId737"/>
+          <o:OLEObject Type="Embed" ProgID="Equation.DSMT4" ShapeID="_x0000_i1420" DrawAspect="Content" ObjectID="_1611678946" r:id="rId737"/>
         </w:object>
       </w:r>
       <w:r>
@@ -36620,7 +36620,7 @@
           <v:shape id="_x0000_i1421" type="#_x0000_t75" style="width:181.5pt;height:34.5pt" o:ole="">
             <v:imagedata r:id="rId738" o:title=""/>
           </v:shape>
-          <o:OLEObject Type="Embed" ProgID="Equation.DSMT4" ShapeID="_x0000_i1421" DrawAspect="Content" ObjectID="_1611677846" r:id="rId739"/>
+          <o:OLEObject Type="Embed" ProgID="Equation.DSMT4" ShapeID="_x0000_i1421" DrawAspect="Content" ObjectID="_1611678947" r:id="rId739"/>
         </w:object>
       </w:r>
       <w:r>
@@ -36655,7 +36655,7 @@
           <v:shape id="_x0000_i1422" type="#_x0000_t75" style="width:87pt;height:18pt" o:ole="">
             <v:imagedata r:id="rId740" o:title=""/>
           </v:shape>
-          <o:OLEObject Type="Embed" ProgID="Equation.DSMT4" ShapeID="_x0000_i1422" DrawAspect="Content" ObjectID="_1611677847" r:id="rId741"/>
+          <o:OLEObject Type="Embed" ProgID="Equation.DSMT4" ShapeID="_x0000_i1422" DrawAspect="Content" ObjectID="_1611678948" r:id="rId741"/>
         </w:object>
       </w:r>
       <w:r>
@@ -36709,7 +36709,7 @@
           <v:shape id="_x0000_i1423" type="#_x0000_t75" style="width:15pt;height:18pt" o:ole="">
             <v:imagedata r:id="rId742" o:title=""/>
           </v:shape>
-          <o:OLEObject Type="Embed" ProgID="Equation.DSMT4" ShapeID="_x0000_i1423" DrawAspect="Content" ObjectID="_1611677848" r:id="rId743"/>
+          <o:OLEObject Type="Embed" ProgID="Equation.DSMT4" ShapeID="_x0000_i1423" DrawAspect="Content" ObjectID="_1611678949" r:id="rId743"/>
         </w:object>
       </w:r>
       <w:r>
@@ -36741,7 +36741,7 @@
           <v:shape id="_x0000_i1424" type="#_x0000_t75" style="width:12pt;height:18pt" o:ole="">
             <v:imagedata r:id="rId744" o:title=""/>
           </v:shape>
-          <o:OLEObject Type="Embed" ProgID="Equation.DSMT4" ShapeID="_x0000_i1424" DrawAspect="Content" ObjectID="_1611677849" r:id="rId745"/>
+          <o:OLEObject Type="Embed" ProgID="Equation.DSMT4" ShapeID="_x0000_i1424" DrawAspect="Content" ObjectID="_1611678950" r:id="rId745"/>
         </w:object>
       </w:r>
       <w:r>
@@ -36809,7 +36809,7 @@
           <v:shape id="_x0000_i1425" type="#_x0000_t75" style="width:16.5pt;height:18pt" o:ole="">
             <v:imagedata r:id="rId746" o:title=""/>
           </v:shape>
-          <o:OLEObject Type="Embed" ProgID="Equation.DSMT4" ShapeID="_x0000_i1425" DrawAspect="Content" ObjectID="_1611677850" r:id="rId747"/>
+          <o:OLEObject Type="Embed" ProgID="Equation.DSMT4" ShapeID="_x0000_i1425" DrawAspect="Content" ObjectID="_1611678951" r:id="rId747"/>
         </w:object>
       </w:r>
       <w:r>
@@ -37012,7 +37012,7 @@
           <v:shape id="_x0000_i1426" type="#_x0000_t75" style="width:34.5pt;height:16.5pt" o:ole="">
             <v:imagedata r:id="rId748" o:title=""/>
           </v:shape>
-          <o:OLEObject Type="Embed" ProgID="Equation.DSMT4" ShapeID="_x0000_i1426" DrawAspect="Content" ObjectID="_1611677851" r:id="rId749"/>
+          <o:OLEObject Type="Embed" ProgID="Equation.DSMT4" ShapeID="_x0000_i1426" DrawAspect="Content" ObjectID="_1611678952" r:id="rId749"/>
         </w:object>
       </w:r>
       <w:r>
@@ -37267,7 +37267,7 @@
           <v:shape id="_x0000_i1427" type="#_x0000_t75" style="width:115.5pt;height:34.5pt" o:ole="">
             <v:imagedata r:id="rId750" o:title=""/>
           </v:shape>
-          <o:OLEObject Type="Embed" ProgID="Equation.DSMT4" ShapeID="_x0000_i1427" DrawAspect="Content" ObjectID="_1611677852" r:id="rId751"/>
+          <o:OLEObject Type="Embed" ProgID="Equation.DSMT4" ShapeID="_x0000_i1427" DrawAspect="Content" ObjectID="_1611678953" r:id="rId751"/>
         </w:object>
       </w:r>
       <w:r>
@@ -37672,7 +37672,7 @@
           <v:shape id="_x0000_i1428" type="#_x0000_t75" style="width:16.5pt;height:18pt" o:ole="">
             <v:imagedata r:id="rId734" o:title=""/>
           </v:shape>
-          <o:OLEObject Type="Embed" ProgID="Equation.DSMT4" ShapeID="_x0000_i1428" DrawAspect="Content" ObjectID="_1611677853" r:id="rId752"/>
+          <o:OLEObject Type="Embed" ProgID="Equation.DSMT4" ShapeID="_x0000_i1428" DrawAspect="Content" ObjectID="_1611678954" r:id="rId752"/>
         </w:object>
       </w:r>
       <w:r>
@@ -37830,7 +37830,7 @@
           <v:shape id="_x0000_i1429" type="#_x0000_t75" style="width:16.5pt;height:18pt" o:ole="">
             <v:imagedata r:id="rId734" o:title=""/>
           </v:shape>
-          <o:OLEObject Type="Embed" ProgID="Equation.DSMT4" ShapeID="_x0000_i1429" DrawAspect="Content" ObjectID="_1611677854" r:id="rId753"/>
+          <o:OLEObject Type="Embed" ProgID="Equation.DSMT4" ShapeID="_x0000_i1429" DrawAspect="Content" ObjectID="_1611678955" r:id="rId753"/>
         </w:object>
       </w:r>
       <w:r>
@@ -37862,7 +37862,7 @@
           <v:shape id="_x0000_i1430" type="#_x0000_t75" style="width:16.5pt;height:18pt" o:ole="">
             <v:imagedata r:id="rId754" o:title=""/>
           </v:shape>
-          <o:OLEObject Type="Embed" ProgID="Equation.DSMT4" ShapeID="_x0000_i1430" DrawAspect="Content" ObjectID="_1611677855" r:id="rId755"/>
+          <o:OLEObject Type="Embed" ProgID="Equation.DSMT4" ShapeID="_x0000_i1430" DrawAspect="Content" ObjectID="_1611678956" r:id="rId755"/>
         </w:object>
       </w:r>
       <w:r>
@@ -38264,7 +38264,7 @@
           <v:shape id="_x0000_i1431" type="#_x0000_t75" style="width:37.5pt;height:36pt" o:ole="">
             <v:imagedata r:id="rId756" o:title=""/>
           </v:shape>
-          <o:OLEObject Type="Embed" ProgID="Equation.DSMT4" ShapeID="_x0000_i1431" DrawAspect="Content" ObjectID="_1611677856" r:id="rId757"/>
+          <o:OLEObject Type="Embed" ProgID="Equation.DSMT4" ShapeID="_x0000_i1431" DrawAspect="Content" ObjectID="_1611678957" r:id="rId757"/>
         </w:object>
       </w:r>
       <w:r>
@@ -38299,7 +38299,7 @@
           <v:shape id="_x0000_i1432" type="#_x0000_t75" style="width:28.5pt;height:19.5pt" o:ole="">
             <v:imagedata r:id="rId758" o:title=""/>
           </v:shape>
-          <o:OLEObject Type="Embed" ProgID="Equation.DSMT4" ShapeID="_x0000_i1432" DrawAspect="Content" ObjectID="_1611677857" r:id="rId759"/>
+          <o:OLEObject Type="Embed" ProgID="Equation.DSMT4" ShapeID="_x0000_i1432" DrawAspect="Content" ObjectID="_1611678958" r:id="rId759"/>
         </w:object>
       </w:r>
       <w:r>
@@ -38484,7 +38484,7 @@
           <v:shape id="_x0000_i1433" type="#_x0000_t75" style="width:16.5pt;height:18pt" o:ole="">
             <v:imagedata r:id="rId760" o:title=""/>
           </v:shape>
-          <o:OLEObject Type="Embed" ProgID="Equation.DSMT4" ShapeID="_x0000_i1433" DrawAspect="Content" ObjectID="_1611677858" r:id="rId761"/>
+          <o:OLEObject Type="Embed" ProgID="Equation.DSMT4" ShapeID="_x0000_i1433" DrawAspect="Content" ObjectID="_1611678959" r:id="rId761"/>
         </w:object>
       </w:r>
       <w:r>
@@ -38609,7 +38609,7 @@
           <v:shape id="_x0000_i1434" type="#_x0000_t75" style="width:96pt;height:19.5pt" o:ole="">
             <v:imagedata r:id="rId762" o:title=""/>
           </v:shape>
-          <o:OLEObject Type="Embed" ProgID="Equation.DSMT4" ShapeID="_x0000_i1434" DrawAspect="Content" ObjectID="_1611677859" r:id="rId763"/>
+          <o:OLEObject Type="Embed" ProgID="Equation.DSMT4" ShapeID="_x0000_i1434" DrawAspect="Content" ObjectID="_1611678960" r:id="rId763"/>
         </w:object>
       </w:r>
       <w:r>
@@ -38924,7 +38924,7 @@
           <v:shape id="_x0000_i1435" type="#_x0000_t75" style="width:43.5pt;height:18pt" o:ole="">
             <v:imagedata r:id="rId764" o:title=""/>
           </v:shape>
-          <o:OLEObject Type="Embed" ProgID="Equation.DSMT4" ShapeID="_x0000_i1435" DrawAspect="Content" ObjectID="_1611677860" r:id="rId765"/>
+          <o:OLEObject Type="Embed" ProgID="Equation.DSMT4" ShapeID="_x0000_i1435" DrawAspect="Content" ObjectID="_1611678961" r:id="rId765"/>
         </w:object>
       </w:r>
       <w:r>
@@ -39133,7 +39133,7 @@
           <v:shape id="_x0000_i1436" type="#_x0000_t75" style="width:12pt;height:16.5pt" o:ole="">
             <v:imagedata r:id="rId766" o:title=""/>
           </v:shape>
-          <o:OLEObject Type="Embed" ProgID="Equation.DSMT4" ShapeID="_x0000_i1436" DrawAspect="Content" ObjectID="_1611677861" r:id="rId767"/>
+          <o:OLEObject Type="Embed" ProgID="Equation.DSMT4" ShapeID="_x0000_i1436" DrawAspect="Content" ObjectID="_1611678962" r:id="rId767"/>
         </w:object>
       </w:r>
       <w:r>
@@ -39458,7 +39458,7 @@
           <v:shape id="_x0000_i1437" type="#_x0000_t75" style="width:57pt;height:18pt" o:ole="">
             <v:imagedata r:id="rId768" o:title=""/>
           </v:shape>
-          <o:OLEObject Type="Embed" ProgID="Equation.DSMT4" ShapeID="_x0000_i1437" DrawAspect="Content" ObjectID="_1611677862" r:id="rId769"/>
+          <o:OLEObject Type="Embed" ProgID="Equation.DSMT4" ShapeID="_x0000_i1437" DrawAspect="Content" ObjectID="_1611678963" r:id="rId769"/>
         </w:object>
       </w:r>
       <w:r>
@@ -39493,7 +39493,7 @@
           <v:shape id="_x0000_i1438" type="#_x0000_t75" style="width:66pt;height:18pt" o:ole="">
             <v:imagedata r:id="rId770" o:title=""/>
           </v:shape>
-          <o:OLEObject Type="Embed" ProgID="Equation.DSMT4" ShapeID="_x0000_i1438" DrawAspect="Content" ObjectID="_1611677863" r:id="rId771"/>
+          <o:OLEObject Type="Embed" ProgID="Equation.DSMT4" ShapeID="_x0000_i1438" DrawAspect="Content" ObjectID="_1611678964" r:id="rId771"/>
         </w:object>
       </w:r>
       <w:r>
@@ -39958,7 +39958,7 @@
           <v:shape id="_x0000_i1439" type="#_x0000_t75" style="width:39pt;height:19.5pt" o:ole="">
             <v:imagedata r:id="rId772" o:title=""/>
           </v:shape>
-          <o:OLEObject Type="Embed" ProgID="Equation.DSMT4" ShapeID="_x0000_i1439" DrawAspect="Content" ObjectID="_1611677864" r:id="rId773"/>
+          <o:OLEObject Type="Embed" ProgID="Equation.DSMT4" ShapeID="_x0000_i1439" DrawAspect="Content" ObjectID="_1611678965" r:id="rId773"/>
         </w:object>
       </w:r>
       <w:r>
@@ -40023,7 +40023,7 @@
           <v:shape id="_x0000_i1440" type="#_x0000_t75" style="width:25.5pt;height:18pt" o:ole="">
             <v:imagedata r:id="rId774" o:title=""/>
           </v:shape>
-          <o:OLEObject Type="Embed" ProgID="Equation.DSMT4" ShapeID="_x0000_i1440" DrawAspect="Content" ObjectID="_1611677865" r:id="rId775"/>
+          <o:OLEObject Type="Embed" ProgID="Equation.DSMT4" ShapeID="_x0000_i1440" DrawAspect="Content" ObjectID="_1611678966" r:id="rId775"/>
         </w:object>
       </w:r>
       <w:r>
@@ -40307,7 +40307,7 @@
           <v:shape id="_x0000_i1441" type="#_x0000_t75" style="width:43.5pt;height:19.5pt" o:ole="">
             <v:imagedata r:id="rId777" o:title=""/>
           </v:shape>
-          <o:OLEObject Type="Embed" ProgID="Equation.DSMT4" ShapeID="_x0000_i1441" DrawAspect="Content" ObjectID="_1611677866" r:id="rId778"/>
+          <o:OLEObject Type="Embed" ProgID="Equation.DSMT4" ShapeID="_x0000_i1441" DrawAspect="Content" ObjectID="_1611678967" r:id="rId778"/>
         </w:object>
       </w:r>
       <w:r>
@@ -40830,7 +40830,7 @@
           <v:shape id="_x0000_i1442" type="#_x0000_t75" style="width:126pt;height:37.5pt" o:ole="">
             <v:imagedata r:id="rId779" o:title=""/>
           </v:shape>
-          <o:OLEObject Type="Embed" ProgID="Equation.DSMT4" ShapeID="_x0000_i1442" DrawAspect="Content" ObjectID="_1611677867" r:id="rId780"/>
+          <o:OLEObject Type="Embed" ProgID="Equation.DSMT4" ShapeID="_x0000_i1442" DrawAspect="Content" ObjectID="_1611678968" r:id="rId780"/>
         </w:object>
       </w:r>
     </w:p>
@@ -40892,7 +40892,7 @@
           <v:shape id="_x0000_i1443" type="#_x0000_t75" style="width:15pt;height:18pt" o:ole="">
             <v:imagedata r:id="rId781" o:title=""/>
           </v:shape>
-          <o:OLEObject Type="Embed" ProgID="Equation.DSMT4" ShapeID="_x0000_i1443" DrawAspect="Content" ObjectID="_1611677868" r:id="rId782"/>
+          <o:OLEObject Type="Embed" ProgID="Equation.DSMT4" ShapeID="_x0000_i1443" DrawAspect="Content" ObjectID="_1611678969" r:id="rId782"/>
         </w:object>
       </w:r>
       <w:r>
@@ -40933,7 +40933,7 @@
           <v:shape id="_x0000_i1444" type="#_x0000_t75" style="width:36pt;height:18pt" o:ole="">
             <v:imagedata r:id="rId783" o:title=""/>
           </v:shape>
-          <o:OLEObject Type="Embed" ProgID="Equation.DSMT4" ShapeID="_x0000_i1444" DrawAspect="Content" ObjectID="_1611677869" r:id="rId784"/>
+          <o:OLEObject Type="Embed" ProgID="Equation.DSMT4" ShapeID="_x0000_i1444" DrawAspect="Content" ObjectID="_1611678970" r:id="rId784"/>
         </w:object>
       </w:r>
       <w:r>
@@ -40956,7 +40956,7 @@
           <v:shape id="_x0000_i1445" type="#_x0000_t75" style="width:60pt;height:18pt" o:ole="">
             <v:imagedata r:id="rId785" o:title=""/>
           </v:shape>
-          <o:OLEObject Type="Embed" ProgID="Equation.DSMT4" ShapeID="_x0000_i1445" DrawAspect="Content" ObjectID="_1611677870" r:id="rId786"/>
+          <o:OLEObject Type="Embed" ProgID="Equation.DSMT4" ShapeID="_x0000_i1445" DrawAspect="Content" ObjectID="_1611678971" r:id="rId786"/>
         </w:object>
       </w:r>
       <w:r>
@@ -40979,7 +40979,7 @@
           <v:shape id="_x0000_i1446" type="#_x0000_t75" style="width:69pt;height:18pt" o:ole="">
             <v:imagedata r:id="rId787" o:title=""/>
           </v:shape>
-          <o:OLEObject Type="Embed" ProgID="Equation.DSMT4" ShapeID="_x0000_i1446" DrawAspect="Content" ObjectID="_1611677871" r:id="rId788"/>
+          <o:OLEObject Type="Embed" ProgID="Equation.DSMT4" ShapeID="_x0000_i1446" DrawAspect="Content" ObjectID="_1611678972" r:id="rId788"/>
         </w:object>
       </w:r>
       <w:r>
@@ -41020,7 +41020,7 @@
           <v:shape id="_x0000_i1447" type="#_x0000_t75" style="width:60pt;height:18pt" o:ole="">
             <v:imagedata r:id="rId789" o:title=""/>
           </v:shape>
-          <o:OLEObject Type="Embed" ProgID="Equation.DSMT4" ShapeID="_x0000_i1447" DrawAspect="Content" ObjectID="_1611677872" r:id="rId790"/>
+          <o:OLEObject Type="Embed" ProgID="Equation.DSMT4" ShapeID="_x0000_i1447" DrawAspect="Content" ObjectID="_1611678973" r:id="rId790"/>
         </w:object>
       </w:r>
       <w:r>
@@ -41092,7 +41092,7 @@
           <v:shape id="_x0000_i1448" type="#_x0000_t75" style="width:267pt;height:31.5pt" o:ole="">
             <v:imagedata r:id="rId791" o:title=""/>
           </v:shape>
-          <o:OLEObject Type="Embed" ProgID="Equation.DSMT4" ShapeID="_x0000_i1448" DrawAspect="Content" ObjectID="_1611677873" r:id="rId792"/>
+          <o:OLEObject Type="Embed" ProgID="Equation.DSMT4" ShapeID="_x0000_i1448" DrawAspect="Content" ObjectID="_1611678974" r:id="rId792"/>
         </w:object>
       </w:r>
     </w:p>
@@ -41138,7 +41138,7 @@
           <v:shape id="_x0000_i1449" type="#_x0000_t75" style="width:176.25pt;height:33.75pt" o:ole="">
             <v:imagedata r:id="rId793" o:title=""/>
           </v:shape>
-          <o:OLEObject Type="Embed" ProgID="Equation.DSMT4" ShapeID="_x0000_i1449" DrawAspect="Content" ObjectID="_1611677874" r:id="rId794"/>
+          <o:OLEObject Type="Embed" ProgID="Equation.DSMT4" ShapeID="_x0000_i1449" DrawAspect="Content" ObjectID="_1611678975" r:id="rId794"/>
         </w:object>
       </w:r>
     </w:p>
@@ -41182,7 +41182,7 @@
           <v:shape id="_x0000_i1450" type="#_x0000_t75" style="width:367.5pt;height:37.5pt" o:ole="">
             <v:imagedata r:id="rId795" o:title=""/>
           </v:shape>
-          <o:OLEObject Type="Embed" ProgID="Equation.DSMT4" ShapeID="_x0000_i1450" DrawAspect="Content" ObjectID="_1611677875" r:id="rId796"/>
+          <o:OLEObject Type="Embed" ProgID="Equation.DSMT4" ShapeID="_x0000_i1450" DrawAspect="Content" ObjectID="_1611678976" r:id="rId796"/>
         </w:object>
       </w:r>
     </w:p>
@@ -41226,7 +41226,7 @@
           <v:shape id="_x0000_i1451" type="#_x0000_t75" style="width:75pt;height:31.5pt" o:ole="">
             <v:imagedata r:id="rId797" o:title=""/>
           </v:shape>
-          <o:OLEObject Type="Embed" ProgID="Equation.DSMT4" ShapeID="_x0000_i1451" DrawAspect="Content" ObjectID="_1611677876" r:id="rId798"/>
+          <o:OLEObject Type="Embed" ProgID="Equation.DSMT4" ShapeID="_x0000_i1451" DrawAspect="Content" ObjectID="_1611678977" r:id="rId798"/>
         </w:object>
       </w:r>
       <w:r>
@@ -41315,7 +41315,7 @@
           <v:shape id="_x0000_i1452" type="#_x0000_t75" style="width:10.5pt;height:13.5pt" o:ole="">
             <v:imagedata r:id="rId799" o:title=""/>
           </v:shape>
-          <o:OLEObject Type="Embed" ProgID="Equation.DSMT4" ShapeID="_x0000_i1452" DrawAspect="Content" ObjectID="_1611677877" r:id="rId800"/>
+          <o:OLEObject Type="Embed" ProgID="Equation.DSMT4" ShapeID="_x0000_i1452" DrawAspect="Content" ObjectID="_1611678978" r:id="rId800"/>
         </w:object>
       </w:r>
       <w:r>
@@ -41347,7 +41347,7 @@
           <v:shape id="_x0000_i1453" type="#_x0000_t75" style="width:13.5pt;height:18pt" o:ole="">
             <v:imagedata r:id="rId801" o:title=""/>
           </v:shape>
-          <o:OLEObject Type="Embed" ProgID="Equation.DSMT4" ShapeID="_x0000_i1453" DrawAspect="Content" ObjectID="_1611677878" r:id="rId802"/>
+          <o:OLEObject Type="Embed" ProgID="Equation.DSMT4" ShapeID="_x0000_i1453" DrawAspect="Content" ObjectID="_1611678979" r:id="rId802"/>
         </w:object>
       </w:r>
       <w:r>
@@ -41442,7 +41442,7 @@
           <v:shape id="_x0000_i1454" type="#_x0000_t75" style="width:135.75pt;height:37.5pt" o:ole="">
             <v:imagedata r:id="rId803" o:title=""/>
           </v:shape>
-          <o:OLEObject Type="Embed" ProgID="Equation.DSMT4" ShapeID="_x0000_i1454" DrawAspect="Content" ObjectID="_1611677879" r:id="rId804"/>
+          <o:OLEObject Type="Embed" ProgID="Equation.DSMT4" ShapeID="_x0000_i1454" DrawAspect="Content" ObjectID="_1611678980" r:id="rId804"/>
         </w:object>
       </w:r>
       <w:r>
@@ -41465,7 +41465,7 @@
           <v:shape id="_x0000_i1455" type="#_x0000_t75" style="width:111.75pt;height:33.75pt" o:ole="">
             <v:imagedata r:id="rId805" o:title=""/>
           </v:shape>
-          <o:OLEObject Type="Embed" ProgID="Equation.DSMT4" ShapeID="_x0000_i1455" DrawAspect="Content" ObjectID="_1611677880" r:id="rId806"/>
+          <o:OLEObject Type="Embed" ProgID="Equation.DSMT4" ShapeID="_x0000_i1455" DrawAspect="Content" ObjectID="_1611678981" r:id="rId806"/>
         </w:object>
       </w:r>
       <w:r>
@@ -41677,7 +41677,7 @@
           <v:shape id="_x0000_i1456" type="#_x0000_t75" style="width:13.5pt;height:18pt" o:ole="">
             <v:imagedata r:id="rId801" o:title=""/>
           </v:shape>
-          <o:OLEObject Type="Embed" ProgID="Equation.DSMT4" ShapeID="_x0000_i1456" DrawAspect="Content" ObjectID="_1611677881" r:id="rId807"/>
+          <o:OLEObject Type="Embed" ProgID="Equation.DSMT4" ShapeID="_x0000_i1456" DrawAspect="Content" ObjectID="_1611678982" r:id="rId807"/>
         </w:object>
       </w:r>
       <w:r>
@@ -41898,7 +41898,7 @@
           <v:shape id="_x0000_i1457" type="#_x0000_t75" style="width:10.5pt;height:13.5pt" o:ole="">
             <v:imagedata r:id="rId808" o:title=""/>
           </v:shape>
-          <o:OLEObject Type="Embed" ProgID="Equation.DSMT4" ShapeID="_x0000_i1457" DrawAspect="Content" ObjectID="_1611677882" r:id="rId809"/>
+          <o:OLEObject Type="Embed" ProgID="Equation.DSMT4" ShapeID="_x0000_i1457" DrawAspect="Content" ObjectID="_1611678983" r:id="rId809"/>
         </w:object>
       </w:r>
       <w:r>
@@ -42047,7 +42047,7 @@
           <v:shape id="_x0000_i1458" type="#_x0000_t75" style="width:14.25pt;height:18pt" o:ole="">
             <v:imagedata r:id="rId810" o:title=""/>
           </v:shape>
-          <o:OLEObject Type="Embed" ProgID="Equation.DSMT4" ShapeID="_x0000_i1458" DrawAspect="Content" ObjectID="_1611677883" r:id="rId811"/>
+          <o:OLEObject Type="Embed" ProgID="Equation.DSMT4" ShapeID="_x0000_i1458" DrawAspect="Content" ObjectID="_1611678984" r:id="rId811"/>
         </w:object>
       </w:r>
       <w:r>
@@ -42124,7 +42124,7 @@
           <v:shape id="_x0000_i1459" type="#_x0000_t75" style="width:14.25pt;height:18pt" o:ole="">
             <v:imagedata r:id="rId810" o:title=""/>
           </v:shape>
-          <o:OLEObject Type="Embed" ProgID="Equation.DSMT4" ShapeID="_x0000_i1459" DrawAspect="Content" ObjectID="_1611677884" r:id="rId812"/>
+          <o:OLEObject Type="Embed" ProgID="Equation.DSMT4" ShapeID="_x0000_i1459" DrawAspect="Content" ObjectID="_1611678985" r:id="rId812"/>
         </w:object>
       </w:r>
       <w:r>
@@ -42138,7 +42138,7 @@
           <v:shape id="_x0000_i1460" type="#_x0000_t75" style="width:24pt;height:14.25pt" o:ole="">
             <v:imagedata r:id="rId813" o:title=""/>
           </v:shape>
-          <o:OLEObject Type="Embed" ProgID="Equation.DSMT4" ShapeID="_x0000_i1460" DrawAspect="Content" ObjectID="_1611677885" r:id="rId814"/>
+          <o:OLEObject Type="Embed" ProgID="Equation.DSMT4" ShapeID="_x0000_i1460" DrawAspect="Content" ObjectID="_1611678986" r:id="rId814"/>
         </w:object>
       </w:r>
       <w:r>
@@ -42206,7 +42206,7 @@
           <v:shape id="_x0000_i1461" type="#_x0000_t75" style="width:19.5pt;height:18pt" o:ole="">
             <v:imagedata r:id="rId815" o:title=""/>
           </v:shape>
-          <o:OLEObject Type="Embed" ProgID="Equation.DSMT4" ShapeID="_x0000_i1461" DrawAspect="Content" ObjectID="_1611677886" r:id="rId816"/>
+          <o:OLEObject Type="Embed" ProgID="Equation.DSMT4" ShapeID="_x0000_i1461" DrawAspect="Content" ObjectID="_1611678987" r:id="rId816"/>
         </w:object>
       </w:r>
       <w:r>
@@ -42243,7 +42243,7 @@
           <v:shape id="_x0000_i1462" type="#_x0000_t75" style="width:27pt;height:15.75pt" o:ole="">
             <v:imagedata r:id="rId817" o:title=""/>
           </v:shape>
-          <o:OLEObject Type="Embed" ProgID="Equation.DSMT4" ShapeID="_x0000_i1462" DrawAspect="Content" ObjectID="_1611677887" r:id="rId818"/>
+          <o:OLEObject Type="Embed" ProgID="Equation.DSMT4" ShapeID="_x0000_i1462" DrawAspect="Content" ObjectID="_1611678988" r:id="rId818"/>
         </w:object>
       </w:r>
       <w:r>
@@ -42288,7 +42288,7 @@
           <v:shape id="_x0000_i1463" type="#_x0000_t75" style="width:32.25pt;height:19.5pt" o:ole="">
             <v:imagedata r:id="rId819" o:title=""/>
           </v:shape>
-          <o:OLEObject Type="Embed" ProgID="Equation.DSMT4" ShapeID="_x0000_i1463" DrawAspect="Content" ObjectID="_1611677888" r:id="rId820"/>
+          <o:OLEObject Type="Embed" ProgID="Equation.DSMT4" ShapeID="_x0000_i1463" DrawAspect="Content" ObjectID="_1611678989" r:id="rId820"/>
         </w:object>
       </w:r>
       <w:r>
@@ -42325,7 +42325,7 @@
           <v:shape id="_x0000_i1464" type="#_x0000_t75" style="width:32.25pt;height:18pt" o:ole="">
             <v:imagedata r:id="rId821" o:title=""/>
           </v:shape>
-          <o:OLEObject Type="Embed" ProgID="Equation.DSMT4" ShapeID="_x0000_i1464" DrawAspect="Content" ObjectID="_1611677889" r:id="rId822"/>
+          <o:OLEObject Type="Embed" ProgID="Equation.DSMT4" ShapeID="_x0000_i1464" DrawAspect="Content" ObjectID="_1611678990" r:id="rId822"/>
         </w:object>
       </w:r>
       <w:r>
@@ -42510,7 +42510,7 @@
           <v:shape id="_x0000_i1465" type="#_x0000_t75" style="width:147.75pt;height:40.5pt" o:ole="">
             <v:imagedata r:id="rId823" o:title=""/>
           </v:shape>
-          <o:OLEObject Type="Embed" ProgID="Equation.DSMT4" ShapeID="_x0000_i1465" DrawAspect="Content" ObjectID="_1611677890" r:id="rId824"/>
+          <o:OLEObject Type="Embed" ProgID="Equation.DSMT4" ShapeID="_x0000_i1465" DrawAspect="Content" ObjectID="_1611678991" r:id="rId824"/>
         </w:object>
       </w:r>
       <w:r>
@@ -42542,7 +42542,7 @@
           <v:shape id="_x0000_i1466" type="#_x0000_t75" style="width:94.5pt;height:27.75pt" o:ole="">
             <v:imagedata r:id="rId825" o:title=""/>
           </v:shape>
-          <o:OLEObject Type="Embed" ProgID="Equation.DSMT4" ShapeID="_x0000_i1466" DrawAspect="Content" ObjectID="_1611677891" r:id="rId826"/>
+          <o:OLEObject Type="Embed" ProgID="Equation.DSMT4" ShapeID="_x0000_i1466" DrawAspect="Content" ObjectID="_1611678992" r:id="rId826"/>
         </w:object>
       </w:r>
       <w:r>
@@ -42583,7 +42583,7 @@
           <v:shape id="_x0000_i1467" type="#_x0000_t75" style="width:345.75pt;height:40.5pt" o:ole="">
             <v:imagedata r:id="rId827" o:title=""/>
           </v:shape>
-          <o:OLEObject Type="Embed" ProgID="Equation.DSMT4" ShapeID="_x0000_i1467" DrawAspect="Content" ObjectID="_1611677892" r:id="rId828"/>
+          <o:OLEObject Type="Embed" ProgID="Equation.DSMT4" ShapeID="_x0000_i1467" DrawAspect="Content" ObjectID="_1611678993" r:id="rId828"/>
         </w:object>
       </w:r>
       <w:r>
@@ -42624,7 +42624,7 @@
           <v:shape id="_x0000_i1468" type="#_x0000_t75" style="width:145.5pt;height:27.75pt" o:ole="">
             <v:imagedata r:id="rId829" o:title=""/>
           </v:shape>
-          <o:OLEObject Type="Embed" ProgID="Equation.DSMT4" ShapeID="_x0000_i1468" DrawAspect="Content" ObjectID="_1611677893" r:id="rId830"/>
+          <o:OLEObject Type="Embed" ProgID="Equation.DSMT4" ShapeID="_x0000_i1468" DrawAspect="Content" ObjectID="_1611678994" r:id="rId830"/>
         </w:object>
       </w:r>
       <w:r>
@@ -42755,7 +42755,7 @@
           <v:shape id="_x0000_i1469" type="#_x0000_t75" style="width:9.75pt;height:13.5pt" o:ole="">
             <v:imagedata r:id="rId831" o:title=""/>
           </v:shape>
-          <o:OLEObject Type="Embed" ProgID="Equation.DSMT4" ShapeID="_x0000_i1469" DrawAspect="Content" ObjectID="_1611677894" r:id="rId832"/>
+          <o:OLEObject Type="Embed" ProgID="Equation.DSMT4" ShapeID="_x0000_i1469" DrawAspect="Content" ObjectID="_1611678995" r:id="rId832"/>
         </w:object>
       </w:r>
       <w:r>
@@ -42796,7 +42796,7 @@
           <v:shape id="_x0000_i1470" type="#_x0000_t75" style="width:15pt;height:18pt" o:ole="">
             <v:imagedata r:id="rId833" o:title=""/>
           </v:shape>
-          <o:OLEObject Type="Embed" ProgID="Equation.DSMT4" ShapeID="_x0000_i1470" DrawAspect="Content" ObjectID="_1611677895" r:id="rId834"/>
+          <o:OLEObject Type="Embed" ProgID="Equation.DSMT4" ShapeID="_x0000_i1470" DrawAspect="Content" ObjectID="_1611678996" r:id="rId834"/>
         </w:object>
       </w:r>
       <w:r>
@@ -42837,7 +42837,7 @@
           <v:shape id="_x0000_i1471" type="#_x0000_t75" style="width:32.25pt;height:18pt" o:ole="">
             <v:imagedata r:id="rId835" o:title=""/>
           </v:shape>
-          <o:OLEObject Type="Embed" ProgID="Equation.DSMT4" ShapeID="_x0000_i1471" DrawAspect="Content" ObjectID="_1611677896" r:id="rId836"/>
+          <o:OLEObject Type="Embed" ProgID="Equation.DSMT4" ShapeID="_x0000_i1471" DrawAspect="Content" ObjectID="_1611678997" r:id="rId836"/>
         </w:object>
       </w:r>
       <w:r>
@@ -43112,7 +43112,7 @@
           <v:shape id="_x0000_i1472" type="#_x0000_t75" style="width:15.75pt;height:20.25pt" o:ole="">
             <v:imagedata r:id="rId833" o:title=""/>
           </v:shape>
-          <o:OLEObject Type="Embed" ProgID="Equation.DSMT4" ShapeID="_x0000_i1472" DrawAspect="Content" ObjectID="_1611677897" r:id="rId837"/>
+          <o:OLEObject Type="Embed" ProgID="Equation.DSMT4" ShapeID="_x0000_i1472" DrawAspect="Content" ObjectID="_1611678998" r:id="rId837"/>
         </w:object>
       </w:r>
       <w:r>
@@ -43162,7 +43162,7 @@
           <v:shape id="_x0000_i1473" type="#_x0000_t75" style="width:16.5pt;height:15.75pt" o:ole="">
             <v:imagedata r:id="rId838" o:title=""/>
           </v:shape>
-          <o:OLEObject Type="Embed" ProgID="Equation.DSMT4" ShapeID="_x0000_i1473" DrawAspect="Content" ObjectID="_1611677898" r:id="rId839"/>
+          <o:OLEObject Type="Embed" ProgID="Equation.DSMT4" ShapeID="_x0000_i1473" DrawAspect="Content" ObjectID="_1611678999" r:id="rId839"/>
         </w:object>
       </w:r>
       <w:r>
@@ -43212,7 +43212,7 @@
           <v:shape id="_x0000_i1474" type="#_x0000_t75" style="width:9.75pt;height:14.25pt" o:ole="">
             <v:imagedata r:id="rId840" o:title=""/>
           </v:shape>
-          <o:OLEObject Type="Embed" ProgID="Equation.DSMT4" ShapeID="_x0000_i1474" DrawAspect="Content" ObjectID="_1611677899" r:id="rId841"/>
+          <o:OLEObject Type="Embed" ProgID="Equation.DSMT4" ShapeID="_x0000_i1474" DrawAspect="Content" ObjectID="_1611679000" r:id="rId841"/>
         </w:object>
       </w:r>
       <w:r>
@@ -43344,7 +43344,7 @@
           <v:shape id="_x0000_i1475" type="#_x0000_t75" style="width:32.25pt;height:19.5pt" o:ole="">
             <v:imagedata r:id="rId819" o:title=""/>
           </v:shape>
-          <o:OLEObject Type="Embed" ProgID="Equation.DSMT4" ShapeID="_x0000_i1475" DrawAspect="Content" ObjectID="_1611677900" r:id="rId842"/>
+          <o:OLEObject Type="Embed" ProgID="Equation.DSMT4" ShapeID="_x0000_i1475" DrawAspect="Content" ObjectID="_1611679001" r:id="rId842"/>
         </w:object>
       </w:r>
       <w:r>
@@ -43381,7 +43381,7 @@
           <v:shape id="_x0000_i1476" type="#_x0000_t75" style="width:13.5pt;height:18pt" o:ole="">
             <v:imagedata r:id="rId843" o:title=""/>
           </v:shape>
-          <o:OLEObject Type="Embed" ProgID="Equation.DSMT4" ShapeID="_x0000_i1476" DrawAspect="Content" ObjectID="_1611677901" r:id="rId844"/>
+          <o:OLEObject Type="Embed" ProgID="Equation.DSMT4" ShapeID="_x0000_i1476" DrawAspect="Content" ObjectID="_1611679002" r:id="rId844"/>
         </w:object>
       </w:r>
       <w:r>
@@ -43698,7 +43698,7 @@
           <v:shape id="_x0000_i1477" type="#_x0000_t75" style="width:10.5pt;height:13.5pt" o:ole="">
             <v:imagedata r:id="rId845" o:title=""/>
           </v:shape>
-          <o:OLEObject Type="Embed" ProgID="Equation.DSMT4" ShapeID="_x0000_i1477" DrawAspect="Content" ObjectID="_1611677902" r:id="rId846"/>
+          <o:OLEObject Type="Embed" ProgID="Equation.DSMT4" ShapeID="_x0000_i1477" DrawAspect="Content" ObjectID="_1611679003" r:id="rId846"/>
         </w:object>
       </w:r>
       <w:r>
@@ -43727,7 +43727,7 @@
           <v:shape id="_x0000_i1478" type="#_x0000_t75" style="width:13.5pt;height:18pt" o:ole="">
             <v:imagedata r:id="rId843" o:title=""/>
           </v:shape>
-          <o:OLEObject Type="Embed" ProgID="Equation.DSMT4" ShapeID="_x0000_i1478" DrawAspect="Content" ObjectID="_1611677903" r:id="rId847"/>
+          <o:OLEObject Type="Embed" ProgID="Equation.DSMT4" ShapeID="_x0000_i1478" DrawAspect="Content" ObjectID="_1611679004" r:id="rId847"/>
         </w:object>
       </w:r>
       <w:r>
@@ -44090,7 +44090,7 @@
           <v:shape id="_x0000_i1479" type="#_x0000_t75" style="width:294.75pt;height:24pt" o:ole="">
             <v:imagedata r:id="rId848" o:title=""/>
           </v:shape>
-          <o:OLEObject Type="Embed" ProgID="Equation.DSMT4" ShapeID="_x0000_i1479" DrawAspect="Content" ObjectID="_1611677904" r:id="rId849"/>
+          <o:OLEObject Type="Embed" ProgID="Equation.DSMT4" ShapeID="_x0000_i1479" DrawAspect="Content" ObjectID="_1611679005" r:id="rId849"/>
         </w:object>
       </w:r>
       <w:r>
@@ -44177,7 +44177,7 @@
           <v:shape id="_x0000_i1480" type="#_x0000_t75" style="width:115.5pt;height:19.5pt" o:ole="">
             <v:imagedata r:id="rId850" o:title=""/>
           </v:shape>
-          <o:OLEObject Type="Embed" ProgID="Equation.DSMT4" ShapeID="_x0000_i1480" DrawAspect="Content" ObjectID="_1611677905" r:id="rId851"/>
+          <o:OLEObject Type="Embed" ProgID="Equation.DSMT4" ShapeID="_x0000_i1480" DrawAspect="Content" ObjectID="_1611679006" r:id="rId851"/>
         </w:object>
       </w:r>
       <w:r>
@@ -44198,7 +44198,7 @@
           <v:shape id="_x0000_i1481" type="#_x0000_t75" style="width:16.5pt;height:18pt" o:ole="">
             <v:imagedata r:id="rId852" o:title=""/>
           </v:shape>
-          <o:OLEObject Type="Embed" ProgID="Equation.DSMT4" ShapeID="_x0000_i1481" DrawAspect="Content" ObjectID="_1611677906" r:id="rId853"/>
+          <o:OLEObject Type="Embed" ProgID="Equation.DSMT4" ShapeID="_x0000_i1481" DrawAspect="Content" ObjectID="_1611679007" r:id="rId853"/>
         </w:object>
       </w:r>
       <w:r>
@@ -44299,7 +44299,7 @@
           <v:shape id="_x0000_i1482" type="#_x0000_t75" style="width:103.5pt;height:18pt" o:ole="">
             <v:imagedata r:id="rId854" o:title=""/>
           </v:shape>
-          <o:OLEObject Type="Embed" ProgID="Equation.DSMT4" ShapeID="_x0000_i1482" DrawAspect="Content" ObjectID="_1611677907" r:id="rId855"/>
+          <o:OLEObject Type="Embed" ProgID="Equation.DSMT4" ShapeID="_x0000_i1482" DrawAspect="Content" ObjectID="_1611679008" r:id="rId855"/>
         </w:object>
       </w:r>
       <w:r>
@@ -44656,7 +44656,7 @@
           <v:shape id="_x0000_i1483" type="#_x0000_t75" style="width:34.5pt;height:19.5pt" o:ole="">
             <v:imagedata r:id="rId856" o:title=""/>
           </v:shape>
-          <o:OLEObject Type="Embed" ProgID="Equation.DSMT4" ShapeID="_x0000_i1483" DrawAspect="Content" ObjectID="_1611677908" r:id="rId857"/>
+          <o:OLEObject Type="Embed" ProgID="Equation.DSMT4" ShapeID="_x0000_i1483" DrawAspect="Content" ObjectID="_1611679009" r:id="rId857"/>
         </w:object>
       </w:r>
       <w:r>
@@ -44773,7 +44773,7 @@
           <v:shape id="_x0000_i1484" type="#_x0000_t75" style="width:13.5pt;height:19.5pt" o:ole="">
             <v:imagedata r:id="rId858" o:title=""/>
           </v:shape>
-          <o:OLEObject Type="Embed" ProgID="Equation.DSMT4" ShapeID="_x0000_i1484" DrawAspect="Content" ObjectID="_1611677909" r:id="rId859"/>
+          <o:OLEObject Type="Embed" ProgID="Equation.DSMT4" ShapeID="_x0000_i1484" DrawAspect="Content" ObjectID="_1611679010" r:id="rId859"/>
         </w:object>
       </w:r>
       <w:r>
@@ -44826,7 +44826,7 @@
           <v:shape id="_x0000_i1485" type="#_x0000_t75" style="width:103.5pt;height:16.5pt" o:ole="">
             <v:imagedata r:id="rId860" o:title=""/>
           </v:shape>
-          <o:OLEObject Type="Embed" ProgID="Equation.DSMT4" ShapeID="_x0000_i1485" DrawAspect="Content" ObjectID="_1611677910" r:id="rId861"/>
+          <o:OLEObject Type="Embed" ProgID="Equation.DSMT4" ShapeID="_x0000_i1485" DrawAspect="Content" ObjectID="_1611679011" r:id="rId861"/>
         </w:object>
       </w:r>
       <w:r>
@@ -45305,7 +45305,7 @@
           <v:shape id="_x0000_i1486" type="#_x0000_t75" style="width:60pt;height:18pt" o:ole="">
             <v:imagedata r:id="rId862" o:title=""/>
           </v:shape>
-          <o:OLEObject Type="Embed" ProgID="Equation.DSMT4" ShapeID="_x0000_i1486" DrawAspect="Content" ObjectID="_1611677911" r:id="rId863"/>
+          <o:OLEObject Type="Embed" ProgID="Equation.DSMT4" ShapeID="_x0000_i1486" DrawAspect="Content" ObjectID="_1611679012" r:id="rId863"/>
         </w:object>
       </w:r>
       <w:r>
@@ -45326,7 +45326,7 @@
           <v:shape id="_x0000_i1487" type="#_x0000_t75" style="width:25.5pt;height:18pt" o:ole="">
             <v:imagedata r:id="rId864" o:title=""/>
           </v:shape>
-          <o:OLEObject Type="Embed" ProgID="Equation.DSMT4" ShapeID="_x0000_i1487" DrawAspect="Content" ObjectID="_1611677912" r:id="rId865"/>
+          <o:OLEObject Type="Embed" ProgID="Equation.DSMT4" ShapeID="_x0000_i1487" DrawAspect="Content" ObjectID="_1611679013" r:id="rId865"/>
         </w:object>
       </w:r>
       <w:r>
@@ -45427,7 +45427,7 @@
           <v:shape id="_x0000_i1488" type="#_x0000_t75" style="width:64.5pt;height:18pt" o:ole="">
             <v:imagedata r:id="rId866" o:title=""/>
           </v:shape>
-          <o:OLEObject Type="Embed" ProgID="Equation.DSMT4" ShapeID="_x0000_i1488" DrawAspect="Content" ObjectID="_1611677913" r:id="rId867"/>
+          <o:OLEObject Type="Embed" ProgID="Equation.DSMT4" ShapeID="_x0000_i1488" DrawAspect="Content" ObjectID="_1611679014" r:id="rId867"/>
         </w:object>
       </w:r>
       <w:r>
@@ -45462,7 +45462,7 @@
         </w:rPr>
         <w:t xml:space="preserve"> case of amorphous body in a low intensity limit. </w:t>
       </w:r>
-      <w:commentRangeStart w:id="36"/>
+      <w:commentRangeStart w:id="37"/>
       <w:r>
         <w:rPr>
           <w:rFonts w:ascii="Times New Roman" w:hAnsi="Times New Roman"/>
@@ -45521,7 +45521,7 @@
           <v:shape id="_x0000_i1489" type="#_x0000_t75" style="width:24pt;height:18pt" o:ole="">
             <v:imagedata r:id="rId868" o:title=""/>
           </v:shape>
-          <o:OLEObject Type="Embed" ProgID="Equation.DSMT4" ShapeID="_x0000_i1489" DrawAspect="Content" ObjectID="_1611677914" r:id="rId869"/>
+          <o:OLEObject Type="Embed" ProgID="Equation.DSMT4" ShapeID="_x0000_i1489" DrawAspect="Content" ObjectID="_1611679015" r:id="rId869"/>
         </w:object>
       </w:r>
       <w:r>
@@ -45540,12 +45540,12 @@
         </w:rPr>
         <w:t>.</w:t>
       </w:r>
-      <w:commentRangeEnd w:id="36"/>
+      <w:commentRangeEnd w:id="37"/>
       <w:r>
         <w:rPr>
           <w:rStyle w:val="CommentReference"/>
         </w:rPr>
-        <w:commentReference w:id="36"/>
+        <w:commentReference w:id="37"/>
       </w:r>
     </w:p>
     <w:p>
@@ -45568,7 +45568,7 @@
           <v:shape id="_x0000_i1490" type="#_x0000_t75" style="width:34.5pt;height:19.5pt" o:ole="">
             <v:imagedata r:id="rId856" o:title=""/>
           </v:shape>
-          <o:OLEObject Type="Embed" ProgID="Equation.DSMT4" ShapeID="_x0000_i1490" DrawAspect="Content" ObjectID="_1611677915" r:id="rId870"/>
+          <o:OLEObject Type="Embed" ProgID="Equation.DSMT4" ShapeID="_x0000_i1490" DrawAspect="Content" ObjectID="_1611679016" r:id="rId870"/>
         </w:object>
       </w:r>
       <w:r>
@@ -45637,7 +45637,7 @@
           <v:shape id="_x0000_i1491" type="#_x0000_t75" style="width:55.5pt;height:22.5pt" o:ole="">
             <v:imagedata r:id="rId871" o:title=""/>
           </v:shape>
-          <o:OLEObject Type="Embed" ProgID="Equation.DSMT4" ShapeID="_x0000_i1491" DrawAspect="Content" ObjectID="_1611677916" r:id="rId872"/>
+          <o:OLEObject Type="Embed" ProgID="Equation.DSMT4" ShapeID="_x0000_i1491" DrawAspect="Content" ObjectID="_1611679017" r:id="rId872"/>
         </w:object>
       </w:r>
       <w:r>
@@ -46677,7 +46677,7 @@
           <v:shape id="_x0000_i1492" type="#_x0000_t75" style="width:90pt;height:16.5pt" o:ole="">
             <v:imagedata r:id="rId873" o:title=""/>
           </v:shape>
-          <o:OLEObject Type="Embed" ProgID="Equation.DSMT4" ShapeID="_x0000_i1492" DrawAspect="Content" ObjectID="_1611677917" r:id="rId874"/>
+          <o:OLEObject Type="Embed" ProgID="Equation.DSMT4" ShapeID="_x0000_i1492" DrawAspect="Content" ObjectID="_1611679018" r:id="rId874"/>
         </w:object>
       </w:r>
       <w:r>
@@ -47149,7 +47149,7 @@
         </w:rPr>
         <w:t xml:space="preserve"> </w:t>
       </w:r>
-      <w:del w:id="37" w:author="Thibault Derrien" w:date="2019-02-14T19:16:00Z">
+      <w:del w:id="38" w:author="Thibault Derrien" w:date="2019-02-14T19:16:00Z">
         <w:r>
           <w:rPr>
             <w:rFonts w:ascii="Times New Roman" w:hAnsi="Times New Roman"/>
@@ -47167,7 +47167,7 @@
           <w:delText xml:space="preserve"> </w:delText>
         </w:r>
       </w:del>
-      <w:ins w:id="38" w:author="Thibault Derrien" w:date="2019-02-14T19:16:00Z">
+      <w:ins w:id="39" w:author="Thibault Derrien" w:date="2019-02-14T19:16:00Z">
         <w:r>
           <w:rPr>
             <w:rFonts w:ascii="Times New Roman" w:hAnsi="Times New Roman"/>
@@ -47176,8 +47176,6 @@
           </w:rPr>
           <w:t>electron</w:t>
         </w:r>
-        <w:bookmarkStart w:id="39" w:name="_GoBack"/>
-        <w:bookmarkEnd w:id="39"/>
         <w:r>
           <w:rPr>
             <w:rFonts w:ascii="Times New Roman" w:hAnsi="Times New Roman"/>
@@ -47245,7 +47243,7 @@
           <v:shape id="_x0000_i1493" type="#_x0000_t75" style="width:19.5pt;height:18pt" o:ole="">
             <v:imagedata r:id="rId875" o:title=""/>
           </v:shape>
-          <o:OLEObject Type="Embed" ProgID="Equation.DSMT4" ShapeID="_x0000_i1493" DrawAspect="Content" ObjectID="_1611677918" r:id="rId876"/>
+          <o:OLEObject Type="Embed" ProgID="Equation.DSMT4" ShapeID="_x0000_i1493" DrawAspect="Content" ObjectID="_1611679019" r:id="rId876"/>
         </w:object>
       </w:r>
       <w:r>
@@ -47358,7 +47356,7 @@
           <v:shape id="_x0000_i1494" type="#_x0000_t75" style="width:19.5pt;height:18pt" o:ole="">
             <v:imagedata r:id="rId877" o:title=""/>
           </v:shape>
-          <o:OLEObject Type="Embed" ProgID="Equation.DSMT4" ShapeID="_x0000_i1494" DrawAspect="Content" ObjectID="_1611677919" r:id="rId878"/>
+          <o:OLEObject Type="Embed" ProgID="Equation.DSMT4" ShapeID="_x0000_i1494" DrawAspect="Content" ObjectID="_1611679020" r:id="rId878"/>
         </w:object>
       </w:r>
       <w:r>
@@ -47493,7 +47491,7 @@
           <v:shape id="_x0000_i1495" type="#_x0000_t75" style="width:138pt;height:19.5pt" o:ole="">
             <v:imagedata r:id="rId879" o:title=""/>
           </v:shape>
-          <o:OLEObject Type="Embed" ProgID="Equation.DSMT4" ShapeID="_x0000_i1495" DrawAspect="Content" ObjectID="_1611677920" r:id="rId880"/>
+          <o:OLEObject Type="Embed" ProgID="Equation.DSMT4" ShapeID="_x0000_i1495" DrawAspect="Content" ObjectID="_1611679021" r:id="rId880"/>
         </w:object>
       </w:r>
       <w:r>
@@ -47543,7 +47541,7 @@
           <v:shape id="_x0000_i1496" type="#_x0000_t75" style="width:42pt;height:19.5pt" o:ole="">
             <v:imagedata r:id="rId881" o:title=""/>
           </v:shape>
-          <o:OLEObject Type="Embed" ProgID="Equation.DSMT4" ShapeID="_x0000_i1496" DrawAspect="Content" ObjectID="_1611677921" r:id="rId882"/>
+          <o:OLEObject Type="Embed" ProgID="Equation.DSMT4" ShapeID="_x0000_i1496" DrawAspect="Content" ObjectID="_1611679022" r:id="rId882"/>
         </w:object>
       </w:r>
       <w:r>
@@ -47710,7 +47708,7 @@
           <v:shape id="_x0000_i1497" type="#_x0000_t75" style="width:19.5pt;height:18pt" o:ole="">
             <v:imagedata r:id="rId593" o:title=""/>
           </v:shape>
-          <o:OLEObject Type="Embed" ProgID="Equation.DSMT4" ShapeID="_x0000_i1497" DrawAspect="Content" ObjectID="_1611677922" r:id="rId883"/>
+          <o:OLEObject Type="Embed" ProgID="Equation.DSMT4" ShapeID="_x0000_i1497" DrawAspect="Content" ObjectID="_1611679023" r:id="rId883"/>
         </w:object>
       </w:r>
       <w:r>
@@ -47895,7 +47893,7 @@
           <v:shape id="_x0000_i1498" type="#_x0000_t75" style="width:19.5pt;height:19.5pt" o:ole="">
             <v:imagedata r:id="rId884" o:title=""/>
           </v:shape>
-          <o:OLEObject Type="Embed" ProgID="Equation.DSMT4" ShapeID="_x0000_i1498" DrawAspect="Content" ObjectID="_1611677923" r:id="rId885"/>
+          <o:OLEObject Type="Embed" ProgID="Equation.DSMT4" ShapeID="_x0000_i1498" DrawAspect="Content" ObjectID="_1611679024" r:id="rId885"/>
         </w:object>
       </w:r>
       <w:r>
@@ -47945,7 +47943,7 @@
           <v:shape id="_x0000_i1499" type="#_x0000_t75" style="width:34.5pt;height:18pt" o:ole="">
             <v:imagedata r:id="rId886" o:title=""/>
           </v:shape>
-          <o:OLEObject Type="Embed" ProgID="Equation.DSMT4" ShapeID="_x0000_i1499" DrawAspect="Content" ObjectID="_1611677924" r:id="rId887"/>
+          <o:OLEObject Type="Embed" ProgID="Equation.DSMT4" ShapeID="_x0000_i1499" DrawAspect="Content" ObjectID="_1611679025" r:id="rId887"/>
         </w:object>
       </w:r>
       <w:r>
@@ -48094,7 +48092,7 @@
           <v:shape id="_x0000_i1500" type="#_x0000_t75" style="width:1in;height:19.5pt" o:ole="">
             <v:imagedata r:id="rId888" o:title=""/>
           </v:shape>
-          <o:OLEObject Type="Embed" ProgID="Equation.DSMT4" ShapeID="_x0000_i1500" DrawAspect="Content" ObjectID="_1611677925" r:id="rId889"/>
+          <o:OLEObject Type="Embed" ProgID="Equation.DSMT4" ShapeID="_x0000_i1500" DrawAspect="Content" ObjectID="_1611679026" r:id="rId889"/>
         </w:object>
       </w:r>
       <w:r>
@@ -48171,7 +48169,7 @@
           <v:shape id="_x0000_i1501" type="#_x0000_t75" style="width:43.5pt;height:19.5pt" o:ole="">
             <v:imagedata r:id="rId890" o:title=""/>
           </v:shape>
-          <o:OLEObject Type="Embed" ProgID="Equation.DSMT4" ShapeID="_x0000_i1501" DrawAspect="Content" ObjectID="_1611677926" r:id="rId891"/>
+          <o:OLEObject Type="Embed" ProgID="Equation.DSMT4" ShapeID="_x0000_i1501" DrawAspect="Content" ObjectID="_1611679027" r:id="rId891"/>
         </w:object>
       </w:r>
       <w:r>
@@ -48320,7 +48318,7 @@
           <v:shape id="_x0000_i1502" type="#_x0000_t75" style="width:25.5pt;height:13.5pt" o:ole="">
             <v:imagedata r:id="rId892" o:title=""/>
           </v:shape>
-          <o:OLEObject Type="Embed" ProgID="Equation.DSMT4" ShapeID="_x0000_i1502" DrawAspect="Content" ObjectID="_1611677927" r:id="rId893"/>
+          <o:OLEObject Type="Embed" ProgID="Equation.DSMT4" ShapeID="_x0000_i1502" DrawAspect="Content" ObjectID="_1611679028" r:id="rId893"/>
         </w:object>
       </w:r>
       <w:r>
@@ -48361,7 +48359,7 @@
           <v:shape id="_x0000_i1503" type="#_x0000_t75" style="width:19.5pt;height:19.5pt" o:ole="">
             <v:imagedata r:id="rId894" o:title=""/>
           </v:shape>
-          <o:OLEObject Type="Embed" ProgID="Equation.DSMT4" ShapeID="_x0000_i1503" DrawAspect="Content" ObjectID="_1611677928" r:id="rId895"/>
+          <o:OLEObject Type="Embed" ProgID="Equation.DSMT4" ShapeID="_x0000_i1503" DrawAspect="Content" ObjectID="_1611679029" r:id="rId895"/>
         </w:object>
       </w:r>
       <w:r>
@@ -48640,7 +48638,7 @@
           <v:shape id="_x0000_i1504" type="#_x0000_t75" style="width:211.5pt;height:18pt" o:ole="">
             <v:imagedata r:id="rId896" o:title=""/>
           </v:shape>
-          <o:OLEObject Type="Embed" ProgID="Equation.DSMT4" ShapeID="_x0000_i1504" DrawAspect="Content" ObjectID="_1611677929" r:id="rId897"/>
+          <o:OLEObject Type="Embed" ProgID="Equation.DSMT4" ShapeID="_x0000_i1504" DrawAspect="Content" ObjectID="_1611679030" r:id="rId897"/>
         </w:object>
       </w:r>
       <w:r>
@@ -48717,7 +48715,7 @@
           <v:shape id="_x0000_i1505" type="#_x0000_t75" style="width:27pt;height:18pt" o:ole="">
             <v:imagedata r:id="rId898" o:title=""/>
           </v:shape>
-          <o:OLEObject Type="Embed" ProgID="Equation.DSMT4" ShapeID="_x0000_i1505" DrawAspect="Content" ObjectID="_1611677930" r:id="rId899"/>
+          <o:OLEObject Type="Embed" ProgID="Equation.DSMT4" ShapeID="_x0000_i1505" DrawAspect="Content" ObjectID="_1611679031" r:id="rId899"/>
         </w:object>
       </w:r>
       <w:r>
@@ -48749,7 +48747,7 @@
           <v:shape id="_x0000_i1506" type="#_x0000_t75" style="width:19.5pt;height:18pt" o:ole="">
             <v:imagedata r:id="rId900" o:title=""/>
           </v:shape>
-          <o:OLEObject Type="Embed" ProgID="Equation.DSMT4" ShapeID="_x0000_i1506" DrawAspect="Content" ObjectID="_1611677931" r:id="rId901"/>
+          <o:OLEObject Type="Embed" ProgID="Equation.DSMT4" ShapeID="_x0000_i1506" DrawAspect="Content" ObjectID="_1611679032" r:id="rId901"/>
         </w:object>
       </w:r>
       <w:r>
@@ -48781,7 +48779,7 @@
           <v:shape id="_x0000_i1507" type="#_x0000_t75" style="width:138pt;height:19.5pt" o:ole="">
             <v:imagedata r:id="rId902" o:title=""/>
           </v:shape>
-          <o:OLEObject Type="Embed" ProgID="Equation.DSMT4" ShapeID="_x0000_i1507" DrawAspect="Content" ObjectID="_1611677932" r:id="rId903"/>
+          <o:OLEObject Type="Embed" ProgID="Equation.DSMT4" ShapeID="_x0000_i1507" DrawAspect="Content" ObjectID="_1611679033" r:id="rId903"/>
         </w:object>
       </w:r>
       <w:r>
@@ -48804,7 +48802,7 @@
           <v:shape id="_x0000_i1508" type="#_x0000_t75" style="width:45pt;height:18pt" o:ole="">
             <v:imagedata r:id="rId904" o:title=""/>
           </v:shape>
-          <o:OLEObject Type="Embed" ProgID="Equation.DSMT4" ShapeID="_x0000_i1508" DrawAspect="Content" ObjectID="_1611677933" r:id="rId905"/>
+          <o:OLEObject Type="Embed" ProgID="Equation.DSMT4" ShapeID="_x0000_i1508" DrawAspect="Content" ObjectID="_1611679034" r:id="rId905"/>
         </w:object>
       </w:r>
       <w:r>
@@ -48927,7 +48925,7 @@
           <v:shape id="_x0000_i1509" type="#_x0000_t75" style="width:19.5pt;height:18pt" o:ole="">
             <v:imagedata r:id="rId907" o:title=""/>
           </v:shape>
-          <o:OLEObject Type="Embed" ProgID="Equation.DSMT4" ShapeID="_x0000_i1509" DrawAspect="Content" ObjectID="_1611677934" r:id="rId908"/>
+          <o:OLEObject Type="Embed" ProgID="Equation.DSMT4" ShapeID="_x0000_i1509" DrawAspect="Content" ObjectID="_1611679035" r:id="rId908"/>
         </w:object>
       </w:r>
       <w:r>
@@ -49004,7 +49002,7 @@
           <v:shape id="_x0000_i1510" type="#_x0000_t75" style="width:31.5pt;height:18pt" o:ole="">
             <v:imagedata r:id="rId909" o:title=""/>
           </v:shape>
-          <o:OLEObject Type="Embed" ProgID="Equation.DSMT4" ShapeID="_x0000_i1510" DrawAspect="Content" ObjectID="_1611677935" r:id="rId910"/>
+          <o:OLEObject Type="Embed" ProgID="Equation.DSMT4" ShapeID="_x0000_i1510" DrawAspect="Content" ObjectID="_1611679036" r:id="rId910"/>
         </w:object>
       </w:r>
     </w:p>
@@ -49250,7 +49248,7 @@
           <v:shape id="_x0000_i1511" type="#_x0000_t75" style="width:31.5pt;height:18pt" o:ole="">
             <v:imagedata r:id="rId909" o:title=""/>
           </v:shape>
-          <o:OLEObject Type="Embed" ProgID="Equation.DSMT4" ShapeID="_x0000_i1511" DrawAspect="Content" ObjectID="_1611677936" r:id="rId911"/>
+          <o:OLEObject Type="Embed" ProgID="Equation.DSMT4" ShapeID="_x0000_i1511" DrawAspect="Content" ObjectID="_1611679037" r:id="rId911"/>
         </w:object>
       </w:r>
       <w:r>
@@ -49291,7 +49289,7 @@
           <v:shape id="_x0000_i1512" type="#_x0000_t75" style="width:34.5pt;height:18pt" o:ole="">
             <v:imagedata r:id="rId665" o:title=""/>
           </v:shape>
-          <o:OLEObject Type="Embed" ProgID="Equation.DSMT4" ShapeID="_x0000_i1512" DrawAspect="Content" ObjectID="_1611677937" r:id="rId912"/>
+          <o:OLEObject Type="Embed" ProgID="Equation.DSMT4" ShapeID="_x0000_i1512" DrawAspect="Content" ObjectID="_1611679038" r:id="rId912"/>
         </w:object>
       </w:r>
       <w:r>
@@ -49512,7 +49510,7 @@
           <v:shape id="_x0000_i1513" type="#_x0000_t75" style="width:34.5pt;height:18pt" o:ole="">
             <v:imagedata r:id="rId665" o:title=""/>
           </v:shape>
-          <o:OLEObject Type="Embed" ProgID="Equation.DSMT4" ShapeID="_x0000_i1513" DrawAspect="Content" ObjectID="_1611677938" r:id="rId913"/>
+          <o:OLEObject Type="Embed" ProgID="Equation.DSMT4" ShapeID="_x0000_i1513" DrawAspect="Content" ObjectID="_1611679039" r:id="rId913"/>
         </w:object>
       </w:r>
       <w:r>
@@ -49553,7 +49551,7 @@
           <v:shape id="_x0000_i1514" type="#_x0000_t75" style="width:48pt;height:18pt" o:ole="">
             <v:imagedata r:id="rId914" o:title=""/>
           </v:shape>
-          <o:OLEObject Type="Embed" ProgID="Equation.DSMT4" ShapeID="_x0000_i1514" DrawAspect="Content" ObjectID="_1611677939" r:id="rId915"/>
+          <o:OLEObject Type="Embed" ProgID="Equation.DSMT4" ShapeID="_x0000_i1514" DrawAspect="Content" ObjectID="_1611679040" r:id="rId915"/>
         </w:object>
       </w:r>
       <w:r>
@@ -49814,7 +49812,7 @@
           <v:shape id="_x0000_i1515" type="#_x0000_t75" style="width:31.5pt;height:18pt" o:ole="">
             <v:imagedata r:id="rId909" o:title=""/>
           </v:shape>
-          <o:OLEObject Type="Embed" ProgID="Equation.DSMT4" ShapeID="_x0000_i1515" DrawAspect="Content" ObjectID="_1611677940" r:id="rId916"/>
+          <o:OLEObject Type="Embed" ProgID="Equation.DSMT4" ShapeID="_x0000_i1515" DrawAspect="Content" ObjectID="_1611679041" r:id="rId916"/>
         </w:object>
       </w:r>
       <w:r>
@@ -49855,7 +49853,7 @@
           <v:shape id="_x0000_i1516" type="#_x0000_t75" style="width:22.5pt;height:18pt" o:ole="">
             <v:imagedata r:id="rId917" o:title=""/>
           </v:shape>
-          <o:OLEObject Type="Embed" ProgID="Equation.DSMT4" ShapeID="_x0000_i1516" DrawAspect="Content" ObjectID="_1611677941" r:id="rId918"/>
+          <o:OLEObject Type="Embed" ProgID="Equation.DSMT4" ShapeID="_x0000_i1516" DrawAspect="Content" ObjectID="_1611679042" r:id="rId918"/>
         </w:object>
       </w:r>
       <w:r>
@@ -49896,7 +49894,7 @@
           <v:shape id="_x0000_i1517" type="#_x0000_t75" style="width:13.5pt;height:18pt" o:ole="">
             <v:imagedata r:id="rId919" o:title=""/>
           </v:shape>
-          <o:OLEObject Type="Embed" ProgID="Equation.DSMT4" ShapeID="_x0000_i1517" DrawAspect="Content" ObjectID="_1611677942" r:id="rId920"/>
+          <o:OLEObject Type="Embed" ProgID="Equation.DSMT4" ShapeID="_x0000_i1517" DrawAspect="Content" ObjectID="_1611679043" r:id="rId920"/>
         </w:object>
       </w:r>
       <w:r>
@@ -49955,7 +49953,7 @@
           <v:shape id="_x0000_i1518" type="#_x0000_t75" style="width:12pt;height:18pt" o:ole="">
             <v:imagedata r:id="rId921" o:title=""/>
           </v:shape>
-          <o:OLEObject Type="Embed" ProgID="Equation.DSMT4" ShapeID="_x0000_i1518" DrawAspect="Content" ObjectID="_1611677943" r:id="rId922"/>
+          <o:OLEObject Type="Embed" ProgID="Equation.DSMT4" ShapeID="_x0000_i1518" DrawAspect="Content" ObjectID="_1611679044" r:id="rId922"/>
         </w:object>
       </w:r>
       <w:r>
@@ -49978,7 +49976,7 @@
           <v:shape id="_x0000_i1519" type="#_x0000_t75" style="width:13.5pt;height:18pt" o:ole="">
             <v:imagedata r:id="rId923" o:title=""/>
           </v:shape>
-          <o:OLEObject Type="Embed" ProgID="Equation.DSMT4" ShapeID="_x0000_i1519" DrawAspect="Content" ObjectID="_1611677944" r:id="rId924"/>
+          <o:OLEObject Type="Embed" ProgID="Equation.DSMT4" ShapeID="_x0000_i1519" DrawAspect="Content" ObjectID="_1611679045" r:id="rId924"/>
         </w:object>
       </w:r>
       <w:r>
@@ -50019,7 +50017,7 @@
           <v:shape id="_x0000_i1520" type="#_x0000_t75" style="width:34.5pt;height:19.5pt" o:ole="">
             <v:imagedata r:id="rId925" o:title=""/>
           </v:shape>
-          <o:OLEObject Type="Embed" ProgID="Equation.DSMT4" ShapeID="_x0000_i1520" DrawAspect="Content" ObjectID="_1611677945" r:id="rId926"/>
+          <o:OLEObject Type="Embed" ProgID="Equation.DSMT4" ShapeID="_x0000_i1520" DrawAspect="Content" ObjectID="_1611679046" r:id="rId926"/>
         </w:object>
       </w:r>
       <w:r>
@@ -50150,7 +50148,7 @@
           <v:shape id="_x0000_i1521" type="#_x0000_t75" style="width:52.5pt;height:19.5pt" o:ole="">
             <v:imagedata r:id="rId927" o:title=""/>
           </v:shape>
-          <o:OLEObject Type="Embed" ProgID="Equation.DSMT4" ShapeID="_x0000_i1521" DrawAspect="Content" ObjectID="_1611677946" r:id="rId928"/>
+          <o:OLEObject Type="Embed" ProgID="Equation.DSMT4" ShapeID="_x0000_i1521" DrawAspect="Content" ObjectID="_1611679047" r:id="rId928"/>
         </w:object>
       </w:r>
       <w:r>
@@ -50842,7 +50840,7 @@
           <v:shape id="_x0000_i1522" type="#_x0000_t75" style="width:31.5pt;height:18pt" o:ole="">
             <v:imagedata r:id="rId929" o:title=""/>
           </v:shape>
-          <o:OLEObject Type="Embed" ProgID="Equation.DSMT4" ShapeID="_x0000_i1522" DrawAspect="Content" ObjectID="_1611677947" r:id="rId930"/>
+          <o:OLEObject Type="Embed" ProgID="Equation.DSMT4" ShapeID="_x0000_i1522" DrawAspect="Content" ObjectID="_1611679048" r:id="rId930"/>
         </w:object>
       </w:r>
       <w:r>
@@ -50883,7 +50881,7 @@
           <v:shape id="_x0000_i1523" type="#_x0000_t75" style="width:40.5pt;height:18pt" o:ole="">
             <v:imagedata r:id="rId931" o:title=""/>
           </v:shape>
-          <o:OLEObject Type="Embed" ProgID="Equation.DSMT4" ShapeID="_x0000_i1523" DrawAspect="Content" ObjectID="_1611677948" r:id="rId932"/>
+          <o:OLEObject Type="Embed" ProgID="Equation.DSMT4" ShapeID="_x0000_i1523" DrawAspect="Content" ObjectID="_1611679049" r:id="rId932"/>
         </w:object>
       </w:r>
       <w:r>
@@ -50951,7 +50949,7 @@
           <v:shape id="_x0000_i1524" type="#_x0000_t75" style="width:31.5pt;height:18pt" o:ole="">
             <v:imagedata r:id="rId933" o:title=""/>
           </v:shape>
-          <o:OLEObject Type="Embed" ProgID="Equation.DSMT4" ShapeID="_x0000_i1524" DrawAspect="Content" ObjectID="_1611677949" r:id="rId934"/>
+          <o:OLEObject Type="Embed" ProgID="Equation.DSMT4" ShapeID="_x0000_i1524" DrawAspect="Content" ObjectID="_1611679050" r:id="rId934"/>
         </w:object>
       </w:r>
       <w:r>
@@ -51114,7 +51112,7 @@
           <v:shape id="_x0000_i1525" type="#_x0000_t75" style="width:21pt;height:18pt" o:ole="">
             <v:imagedata r:id="rId936" o:title=""/>
           </v:shape>
-          <o:OLEObject Type="Embed" ProgID="Equation.DSMT4" ShapeID="_x0000_i1525" DrawAspect="Content" ObjectID="_1611677950" r:id="rId937"/>
+          <o:OLEObject Type="Embed" ProgID="Equation.DSMT4" ShapeID="_x0000_i1525" DrawAspect="Content" ObjectID="_1611679051" r:id="rId937"/>
         </w:object>
       </w:r>
       <w:r>
@@ -54932,7 +54930,7 @@
           <v:shape id="_x0000_i1526" type="#_x0000_t75" style="width:19.5pt;height:18pt" o:ole="">
             <v:imagedata r:id="rId907" o:title=""/>
           </v:shape>
-          <o:OLEObject Type="Embed" ProgID="Equation.DSMT4" ShapeID="_x0000_i1526" DrawAspect="Content" ObjectID="_1611677951" r:id="rId938"/>
+          <o:OLEObject Type="Embed" ProgID="Equation.DSMT4" ShapeID="_x0000_i1526" DrawAspect="Content" ObjectID="_1611679052" r:id="rId938"/>
         </w:object>
       </w:r>
       <w:r>
@@ -58579,13 +58577,43 @@
         <w:pStyle w:val="CommentText"/>
       </w:pPr>
       <w:r>
+        <w:t xml:space="preserve">You provided me with </w:t>
+      </w:r>
+      <w:r>
         <w:rPr>
           <w:rStyle w:val="CommentReference"/>
         </w:rPr>
         <w:annotationRef/>
       </w:r>
       <w:r>
-        <w:t xml:space="preserve">Could you provide the results at 800 nm for Si (gap 2.56 eV. And effective mass 0.2226)? Then I could introduce them in my comparison with TDDFT model.  </w:t>
+        <w:t xml:space="preserve">similar reuslts </w:t>
+      </w:r>
+      <w:r>
+        <w:t>at 800 nm for Si (gap 2.56 eV</w:t>
+      </w:r>
+      <w:r>
+        <w:t xml:space="preserve"> a</w:t>
+      </w:r>
+      <w:r>
+        <w:t>nd effective mass 0.2226)</w:t>
+      </w:r>
+      <w:r>
+        <w:t xml:space="preserve">. </w:t>
+      </w:r>
+      <w:r>
+        <w:t xml:space="preserve">Then I </w:t>
+      </w:r>
+      <w:r>
+        <w:t xml:space="preserve">can now </w:t>
+      </w:r>
+      <w:r>
+        <w:t xml:space="preserve">introduce them </w:t>
+      </w:r>
+      <w:r>
+        <w:t>to my comparison with TDDFT simulations</w:t>
+      </w:r>
+      <w:r>
+        <w:t xml:space="preserve">.  </w:t>
       </w:r>
     </w:p>
   </w:comment>
@@ -58654,6 +58682,9 @@
       <w:r>
         <w:t xml:space="preserve">Could I ask which formula this refers to? It would be interesting to discuss this topic further (for future). For example, we could consider using the existing pseudo-potentials to prepare material dependent Keldysh rates, not only as function of the gap energy, but also as function of the atonic potentials themselves. </w:t>
       </w:r>
+      <w:r>
+        <w:t>This night lift up the hydrogenoid hypothesis.</w:t>
+      </w:r>
     </w:p>
   </w:comment>
   <w:comment w:id="9" w:author="Thibault Derrien" w:date="2019-02-14T18:32:00Z" w:initials="TD">
@@ -58678,6 +58709,9 @@
         <w:pStyle w:val="CommentText"/>
       </w:pPr>
       <w:r>
+        <w:t xml:space="preserve">OK. </w:t>
+      </w:r>
+      <w:r>
         <w:rPr>
           <w:rStyle w:val="CommentReference"/>
         </w:rPr>
@@ -58700,7 +58734,16 @@
         <w:annotationRef/>
       </w:r>
       <w:r>
-        <w:t xml:space="preserve">Beyond MPI regime, this approximation is broken. </w:t>
+        <w:t xml:space="preserve">Beyond MPI regime, this approximation is </w:t>
+      </w:r>
+      <w:r>
+        <w:t xml:space="preserve">indeed </w:t>
+      </w:r>
+      <w:r>
+        <w:t xml:space="preserve">broken. </w:t>
+      </w:r>
+      <w:r>
+        <w:t xml:space="preserve">Tunneling models dont really explain the TDDFT results. </w:t>
       </w:r>
     </w:p>
   </w:comment>
@@ -58786,7 +58829,13 @@
         <w:annotationRef/>
       </w:r>
       <w:r>
-        <w:t xml:space="preserve">What is alpha? Is it the fine structure constant? Did you use atomic units or CGS here? In atomic units, alpha is the speed of light in vacuum. </w:t>
+        <w:t>What is alpha</w:t>
+      </w:r>
+      <w:r>
+        <w:t xml:space="preserve"> here</w:t>
+      </w:r>
+      <w:r>
+        <w:t xml:space="preserve">? Is it the fine structure constant? Did you use atomic units or CGS here? In atomic units, alpha is the speed of light in vacuum. </w:t>
       </w:r>
     </w:p>
   </w:comment>
@@ -58818,11 +58867,16 @@
         <w:annotationRef/>
       </w:r>
       <w:r>
-        <w:t>Do you mean that Keldysh’s paper uses a negative charge, but you have used a positive one, yes?</w:t>
+        <w:t>Do you mean that Keldysh’s paper uses a negative charge,</w:t>
+      </w:r>
+      <w:bookmarkStart w:id="23" w:name="_GoBack"/>
+      <w:bookmarkEnd w:id="23"/>
+      <w:r>
+        <w:t xml:space="preserve"> but you have used a positive one, yes?</w:t>
       </w:r>
     </w:p>
   </w:comment>
-  <w:comment w:id="23" w:author="Thibault Derrien" w:date="2019-02-14T18:44:00Z" w:initials="TD">
+  <w:comment w:id="24" w:author="Thibault Derrien" w:date="2019-02-14T18:44:00Z" w:initials="TD">
     <w:p>
       <w:pPr>
         <w:pStyle w:val="CommentText"/>
@@ -58838,7 +58892,7 @@
       </w:r>
     </w:p>
   </w:comment>
-  <w:comment w:id="24" w:author="Thibault Derrien" w:date="2019-02-14T18:47:00Z" w:initials="TD">
+  <w:comment w:id="25" w:author="Thibault Derrien" w:date="2019-02-14T18:47:00Z" w:initials="TD">
     <w:p>
       <w:pPr>
         <w:pStyle w:val="CommentText"/>
@@ -58863,7 +58917,7 @@
       </w:r>
     </w:p>
   </w:comment>
-  <w:comment w:id="25" w:author="Thibault Derrien" w:date="2019-02-14T18:48:00Z" w:initials="TD">
+  <w:comment w:id="26" w:author="Thibault Derrien" w:date="2019-02-14T18:48:00Z" w:initials="TD">
     <w:p>
       <w:pPr>
         <w:pStyle w:val="CommentText"/>
@@ -58879,7 +58933,7 @@
       </w:r>
     </w:p>
   </w:comment>
-  <w:comment w:id="26" w:author="Thibault Derrien" w:date="2019-02-14T18:50:00Z" w:initials="TD">
+  <w:comment w:id="27" w:author="Thibault Derrien" w:date="2019-02-14T18:50:00Z" w:initials="TD">
     <w:p>
       <w:pPr>
         <w:pStyle w:val="CommentText"/>
@@ -58895,7 +58949,7 @@
       </w:r>
     </w:p>
   </w:comment>
-  <w:comment w:id="27" w:author="Thibault Derrien" w:date="2019-02-14T18:49:00Z" w:initials="TD">
+  <w:comment w:id="28" w:author="Thibault Derrien" w:date="2019-02-14T18:49:00Z" w:initials="TD">
     <w:p>
       <w:pPr>
         <w:pStyle w:val="CommentText"/>
@@ -58911,7 +58965,7 @@
       </w:r>
     </w:p>
   </w:comment>
-  <w:comment w:id="28" w:author="Thibault Derrien" w:date="2019-02-14T18:51:00Z" w:initials="TD">
+  <w:comment w:id="29" w:author="Thibault Derrien" w:date="2019-02-14T18:51:00Z" w:initials="TD">
     <w:p>
       <w:pPr>
         <w:pStyle w:val="CommentText"/>
@@ -58927,22 +58981,6 @@
       </w:r>
       <w:r>
         <w:t>cm^-3, maybe</w:t>
-      </w:r>
-    </w:p>
-  </w:comment>
-  <w:comment w:id="29" w:author="Thibault Derrien" w:date="2019-02-14T19:12:00Z" w:initials="TD">
-    <w:p>
-      <w:pPr>
-        <w:pStyle w:val="CommentText"/>
-      </w:pPr>
-      <w:r>
-        <w:rPr>
-          <w:rStyle w:val="CommentReference"/>
-        </w:rPr>
-        <w:annotationRef/>
-      </w:r>
-      <w:r>
-        <w:t xml:space="preserve">Is it related to a parabolic band structure? </w:t>
       </w:r>
     </w:p>
   </w:comment>
@@ -58958,11 +58996,11 @@
         <w:annotationRef/>
       </w:r>
       <w:r>
-        <w:t>Same comment as before: E(t) = E1 e1 cos( ... ) + E2 e2 cos ( ... )</w:t>
+        <w:t xml:space="preserve">Is it related to a parabolic band structure? </w:t>
       </w:r>
     </w:p>
   </w:comment>
-  <w:comment w:id="35" w:author="Thibault Derrien" w:date="2019-02-14T19:14:00Z" w:initials="TD">
+  <w:comment w:id="31" w:author="Thibault Derrien" w:date="2019-02-14T19:12:00Z" w:initials="TD">
     <w:p>
       <w:pPr>
         <w:pStyle w:val="CommentText"/>
@@ -58974,11 +59012,27 @@
         <w:annotationRef/>
       </w:r>
       <w:r>
-        <w:t xml:space="preserve">Same question: what is alpha? Which unit does it has? Maybe this text is repeated? </w:t>
+        <w:t>Same comment as before: E(t) = E1 e1 cos( ... ) + E2 e2 cos ( ... )</w:t>
       </w:r>
     </w:p>
   </w:comment>
-  <w:comment w:id="36" w:author="Thibault Derrien" w:date="2019-02-14T19:15:00Z" w:initials="TD">
+  <w:comment w:id="36" w:author="Thibault Derrien" w:date="2019-02-14T19:14:00Z" w:initials="TD">
+    <w:p>
+      <w:pPr>
+        <w:pStyle w:val="CommentText"/>
+      </w:pPr>
+      <w:r>
+        <w:rPr>
+          <w:rStyle w:val="CommentReference"/>
+        </w:rPr>
+        <w:annotationRef/>
+      </w:r>
+      <w:r>
+        <w:t xml:space="preserve">Same question: what is alpha? Which unit does it has? Maybe this text is repeated? </w:t>
+      </w:r>
+    </w:p>
+  </w:comment>
+  <w:comment w:id="37" w:author="Thibault Derrien" w:date="2019-02-14T19:15:00Z" w:initials="TD">
     <w:p>
       <w:pPr>
         <w:pStyle w:val="CommentText"/>

</xml_diff>